<commit_message>
Restructure around incentive architectures, correct Malaysia coverage claim, add threshold figure and ladder calibration
</commit_message>
<xml_diff>
--- a/revision/02_revised_manuscript.docx
+++ b/revision/02_revised_manuscript.docx
@@ -250,7 +250,7 @@
         <w:pStyle w:val="FirstParagraph"/>
       </w:pPr>
       <w:r>
-        <w:t xml:space="preserve">Governments in Southeast Asia have made artificial intelligence (AI) a pillar of industrial policy, but little is known about which firms their incentive instruments allow in. We ask how the eligibility rules of AI-related investment incentives in Thailand, Vietnam, Malaysia and the Philippines shape entry into four layers of the AI technology stack (applications and models, cloud and compute services, data-centre capacity, hardware), and whether the pattern is better explained by cost necessity, scale-favouring design or administrative habit. We code about 20 instruments from primary legal texts on five dimensions and, for Thailand, compare eligibility rules with published project approvals. All four countries make application-layer support accessible to small firms. Thailand and Malaysia put the main barrier at data-centre capacity, Vietnam puts its boundary at hardware manufacture, and the Philippines applies scale tiers regardless of activity. We found no AI-related instrument for compute provision below facility scale in any of the four. Published cost benchmarks explain the height of infrastructure thresholds but not this gap. The evidence describes legal eligibility, not realised access, and does not show that a middle-technology trap exists. It locates a specific design gap that firm-level studies can test.</w:t>
+        <w:t xml:space="preserve">Governments in Southeast Asia have made artificial intelligence (AI) a pillar of industrial policy, but little is known about which firms their incentive instruments allow in. We ask how the eligibility rules of AI-related investment incentives in Thailand, Vietnam, Malaysia and the Philippines shape entry into four layers of the AI technology stack (applications and models, cloud and compute services, data-centre capacity, hardware), and whether the pattern is better explained by cost necessity, scale-favouring design or administrative habit. We code about 20 instruments from primary legal texts on five dimensions and, for Thailand, compare eligibility rules with published project approvals. All four countries make application-layer support accessible to small firms. Thailand and Malaysia put the main barrier at data-centre capacity, Vietnam puts its boundary at hardware manufacture, and the Philippines applies scale tiers regardless of activity. The four systems fall into four architectures: a single gate (Thailand), a graduated ladder (Malaysia), a priority list without capital rules (Vietnam) and uniform scale tiers (the Philippines). In Thailand, Vietnam and the Philippines we found no AI-related instrument for compute provision below facility scale; Malaysia’s ladder starts closer to that scale, but whether a small provider can use it is not yet verified. Published cost benchmarks explain the height of infrastructure thresholds but not this gap. The evidence describes legal eligibility, not realised access, and does not show that a middle-technology trap exists. It locates a specific design gap that firm-level studies can test.</w:t>
       </w:r>
     </w:p>
     <w:p>
@@ -386,15 +386,15 @@
         <w:pStyle w:val="FirstParagraph"/>
       </w:pPr>
       <w:r>
-        <w:t xml:space="preserve">We code the primary legal texts of the four countries and, for Thailand, set the formal rules against published project approvals. Our main results are as follows. All four countries make application-layer support accessible to small firms, and Vietnam adds an explicit startup track with direct equity access. The boundary above the application layer falls in different places: at data-centre capacity in Thailand (a single capital cutoff) and Malaysia (a graduated scale), at hardware manufacture in Vietnam, and nowhere by activity in the Philippines, which applies firm-scale tiers uniformly. The regularity common to all four is an absence: we found no AI-related instrument aimed at compute provision below facility scale. Cost benchmarks account for the height of the infrastructure thresholds (the most visible pattern, and a weak test of design bias, as we show in Section 3.4) but not for this absence. We emphasise three limits at the outset. The evidence concerns legal eligibility, not realised access or firm outcomes. The coding has not yet been checked by a second coder. And the data do not show that any of the four countries is in a middle-technology trap.</w:t>
-      </w:r>
-    </w:p>
-    <w:p>
-      <w:pPr>
-        <w:pStyle w:val="BodyText"/>
-      </w:pPr>
-      <w:r>
-        <w:t xml:space="preserve">The paper makes three contributions. First, it provides a four-layer coding of AI incentive instruments that distinguishes layer, scale and firm vintage, which a software-versus-hardware split cannot do. Second, it identifies a specific design gap, the absence of instruments below facility scale, and tests it against the best available cost-based explanation. Third, it sets out an evidence matrix that separates the observations that discriminate between explanations from those that do not, so that readers can see which claims rest on which evidence.</w:t>
+        <w:t xml:space="preserve">We code the primary legal texts of the four countries and, for Thailand, set the formal rules against published project approvals. Our main results are as follows. All four countries make application-layer support accessible to small firms, and Vietnam adds an explicit startup track with direct equity access. The boundary above the application layer falls in different places: at data-centre capacity in Thailand (a single capital cutoff) and Malaysia (a graduated scale), at hardware manufacture in Vietnam, and nowhere by activity in the Philippines, which applies firm-scale tiers uniformly. The four systems also differ in architecture: a single gate (Thailand), a graduated ladder (Malaysia), a priority list without capital rules (Vietnam) and uniform scale tiers (the Philippines). In three of the four we found no AI-related instrument aimed at compute provision below facility scale. Malaysia’s ladder starts at a paid-up capital close to the cost of hosting a single fully equipped server, which makes it the one design that could reach that scale, and we have not yet verified whether a small provider can use it. Cost benchmarks account for the height of the infrastructure thresholds (the most visible pattern, and a weak test of design bias, as we show in Section 3.4) but not for the gap in the other three. We emphasise three limits at the outset. The evidence concerns legal eligibility, not realised access or firm outcomes. The coding has not yet been checked by a second coder. And the data do not show that any of the four countries is in a middle-technology trap.</w:t>
+      </w:r>
+    </w:p>
+    <w:p>
+      <w:pPr>
+        <w:pStyle w:val="BodyText"/>
+      </w:pPr>
+      <w:r>
+        <w:t xml:space="preserve">The paper makes four contributions. First, it provides a four-layer coding of AI incentive instruments that distinguishes layer, scale and firm vintage, which a software-versus-hardware split cannot do. Second, it classifies the four systems into four incentive architectures (gate, ladder, list, tier) and states what each implies for a small entrant, a typology other countries and technologies can reuse. Third, it identifies a specific design gap, the absence of instruments below facility scale in three of the four systems, places it on a common cost scale (Figure 1), and tests it against the best available cost-based explanation. Fourth, it sets out an evidence matrix that separates the observations that discriminate between explanations from those that do not, so that readers can see which claims rest on which evidence.</w:t>
       </w:r>
     </w:p>
     <w:p>
@@ -603,7 +603,7 @@
         <w:pStyle w:val="FirstParagraph"/>
       </w:pPr>
       <w:r>
-        <w:t xml:space="preserve">These literatures yield a prediction but no mechanism at the level of policy. The macro models (Cerutti et al., 2025; Alonso et al., 2020) assume an access scenario and do not examine the instruments that determine it. The compute-geography work (Lehdonvirta et al., 2024, 2025) measures where capacity sits, not which policies shape whether domestic firms can provide it. Bahar et al. (2026) examine incentive design, but for research and development tax credits in one advanced economy, and not for AI or for the layers of a technology stack. What is missing is an instrument-level account of eligibility across the AI stack in middle-income economies. That is the gap this paper addresses. Because the macro literature turns on whether domestic firms can enter the layers that supply compute, entry rules are the right object of study.</w:t>
+        <w:t xml:space="preserve">These literatures yield a prediction but no mechanism at the level of policy. The macro models (Cerutti et al., 2025; Alonso et al., 2020) assume an access scenario and do not examine the instruments that determine it. The compute-geography work (Lehdonvirta et al., 2024, 2025) measures where capacity sits, not which policies shape whether domestic firms can provide it. Bahar et al. (2026) examine incentive design, but for research and development tax credits in one advanced economy, and not for AI or for the layers of a technology stack. Evidence that fiscal incentives do change firm behaviour, such as the finding that cutting the cost of research and development raises research spending across OECD countries (Bloom, Griffith and Van Reenen, 2002), makes the question of who is eligible consequential, and the design of tax incentives for business investment in developing countries is a long-standing public-finance concern (Zee, Stotsky and Ley, 2002). What is missing is an instrument-level account of eligibility across the AI stack in middle-income economies. That is the gap this paper addresses. Because the macro literature turns on whether domestic firms can enter the layers that supply compute, entry rules are the right object of study.</w:t>
       </w:r>
     </w:p>
     <w:bookmarkEnd w:id="24"/>
@@ -829,6 +829,24 @@
         <w:t xml:space="preserve">H2 and H3 can generate similar outcomes and differ mainly in origin. Legal texts alone separate H1 from the pair {H2, H3} better than they separate H2 from H3. We state this limit here, not in the discussion, because it governs how far the evidence can be read.</w:t>
       </w:r>
     </w:p>
+    <w:p>
+      <w:pPr>
+        <w:pStyle w:val="BodyText"/>
+      </w:pPr>
+      <w:r>
+        <w:rPr>
+          <w:bCs/>
+          <w:b/>
+        </w:rPr>
+        <w:t xml:space="preserve">Why entry rungs matter.</w:t>
+      </w:r>
+      <w:r>
+        <w:t xml:space="preserve"> </w:t>
+      </w:r>
+      <w:r>
+        <w:t xml:space="preserve">H2 needs a theoretical basis for expecting that missing intermediate rungs matter. We draw it from the self-discovery argument of Hausmann and Rodrik (2003). A country does not know in advance what it can produce at competitive cost, and discovering the cost of a new activity is socially valuable because others can imitate the discovery, so that laissez-faire yields too little investment and entrepreneurship in new activities. Applied here, if the cost of supplying compute from inside a middle-income economy is unknown, small-scale provision is how that cost is discovered. An incentive that begins only at facility scale leaves discovery to the firms that can bear facility-scale risk, which are mostly large or foreign. A ladder, by contrast, lets many small trials occur before a few scale up. This is our application of their argument, not a result they report, and it predicts that rungs matter most where the minimum viable scale of an activity is far below the first eligible scale, which is the comparison Figure 1 makes.</w:t>
+      </w:r>
+    </w:p>
     <w:bookmarkEnd w:id="26"/>
     <w:bookmarkEnd w:id="27"/>
     <w:bookmarkStart w:id="32" w:name="research-design"/>
@@ -1050,7 +1068,7 @@
         <w:pStyle w:val="FirstParagraph"/>
       </w:pPr>
       <w:r>
-        <w:t xml:space="preserve">We code primary legal and regulatory texts, not strategy documents or commentary: Thailand’s Board of Investment announcements and Investment Promotion Guide; Vietnam’s Decree 260/2026 implementing the Law on High Technology and Decision 21/2026 on strategic technologies; Malaysia’s Malaysia Digital tax-incentive guidelines and the Digital Ecosystem Acceleration scheme guidelines; and the Philippines’ CREATE MORE Act with its implementing rules. Table 2 lists each source with its issuing body, date, access route and the amendment check described below.</w:t>
+        <w:t xml:space="preserve">We code primary legal and regulatory texts, not strategy documents or commentary: Thailand’s Board of Investment announcements and Investment Promotion Guide; Vietnam’s Decree 260/2026 implementing the Law on High Technology and Decision 21/2026 on strategic technologies; Malaysia’s Malaysia Digital tax-incentive guidelines and the Digital Ecosystem Acceleration scheme guidelines; and the Philippines’ CREATE MORE Act with its implementing rules. Table 1 lists each source with its issuing body, date, access route and the amendment check described below.</w:t>
       </w:r>
     </w:p>
     <w:p>
@@ -1078,19 +1096,19 @@
           <w:bCs/>
           <w:b/>
         </w:rPr>
-        <w:t xml:space="preserve">[PENDING: complete the amendment and supersession check for every row of Table 2, state the date of each check, and name any provision found to have changed. Until then this paragraph describes the intended procedure, not a completed one.]</w:t>
-      </w:r>
-    </w:p>
-    <w:p>
-      <w:pPr>
-        <w:pStyle w:val="BodyText"/>
-      </w:pPr>
-      <w:r>
-        <w:rPr>
-          <w:bCs/>
-          <w:b/>
-        </w:rPr>
-        <w:t xml:space="preserve">Table 2. Primary sources coded</w:t>
+        <w:t xml:space="preserve">[PENDING: complete the amendment and supersession check for every row of Table 1, state the date of each check, and name any provision found to have changed. Until then this paragraph describes the intended procedure, not a completed one.]</w:t>
+      </w:r>
+    </w:p>
+    <w:p>
+      <w:pPr>
+        <w:pStyle w:val="BodyText"/>
+      </w:pPr>
+      <w:r>
+        <w:rPr>
+          <w:bCs/>
+          <w:b/>
+        </w:rPr>
+        <w:t xml:space="preserve">Table 1. Primary sources coded</w:t>
       </w:r>
     </w:p>
     <w:tbl>
@@ -1827,7 +1845,7 @@
         <w:t xml:space="preserve"> </w:t>
       </w:r>
       <w:r>
-        <w:t xml:space="preserve">Our claim that no AI-related instrument addresses compute provision below facility scale is a claim about absence.</w:t>
+        <w:t xml:space="preserve">Our claim that Thailand, Vietnam and the Philippines have no AI-related instrument addressing compute provision below facility scale, and our reading of the scope of Malaysia’s entry tier, are claims about absence and about coverage.</w:t>
       </w:r>
       <w:r>
         <w:t xml:space="preserve"> </w:t>
@@ -1895,7 +1913,7 @@
           <w:bCs/>
           <w:b/>
         </w:rPr>
-        <w:t xml:space="preserve">Table 1. Rubric for assessing evidence against hypotheses</w:t>
+        <w:t xml:space="preserve">Table 2. Rubric for assessing evidence against hypotheses</w:t>
       </w:r>
     </w:p>
     <w:tbl>
@@ -2189,7 +2207,7 @@
     </w:p>
     <w:bookmarkEnd w:id="31"/>
     <w:bookmarkEnd w:id="32"/>
-    <w:bookmarkStart w:id="38" w:name="findings"/>
+    <w:bookmarkStart w:id="41" w:name="findings"/>
     <w:p>
       <w:pPr>
         <w:pStyle w:val="Heading2"/>
@@ -2453,7 +2471,7 @@
       </w:r>
     </w:p>
     <w:bookmarkEnd w:id="36"/>
-    <w:bookmarkStart w:id="37" w:name="cross-country-synthesis"/>
+    <w:bookmarkStart w:id="40" w:name="cross-country-synthesis"/>
     <w:p>
       <w:pPr>
         <w:pStyle w:val="Heading3"/>
@@ -2818,7 +2836,7 @@
               <w:jc w:val="left"/>
             </w:pPr>
             <w:r>
-              <w:t xml:space="preserve">Instrument below facility scale</w:t>
+              <w:t xml:space="preserve">Instrument aimed at compute provision below facility scale</w:t>
             </w:r>
           </w:p>
         </w:tc>
@@ -2877,7 +2895,10 @@
               <w:jc w:val="left"/>
             </w:pPr>
             <w:r>
-              <w:t xml:space="preserve">None identified (</w:t>
+              <w:t xml:space="preserve">Nearest candidate: DESAC entry tier (RM2.5m paid-up capital); whether a sub-facility provider qualifies is</w:t>
+            </w:r>
+            <w:r>
+              <w:t xml:space="preserve"> </w:t>
             </w:r>
             <w:r>
               <w:rPr>
@@ -2886,9 +2907,6 @@
               </w:rPr>
               <w:t xml:space="preserve">PENDING</w:t>
             </w:r>
-            <w:r>
-              <w:t xml:space="preserve">)</w:t>
-            </w:r>
           </w:p>
         </w:tc>
         <w:tc>
@@ -3377,7 +3395,7 @@
         <w:t xml:space="preserve">[PENDING: dates and rates]</w:t>
       </w:r>
       <w:r>
-        <w:t xml:space="preserve">. Constructed from the primary documents in Table 2. DESAC = Digital Ecosystem Acceleration scheme; FIRB = Fiscal Incentives Review Board.</w:t>
+        <w:t xml:space="preserve">. Constructed from the primary documents in Table 1. DESAC = Digital Ecosystem Acceleration scheme; FIRB = Fiscal Incentives Review Board.</w:t>
       </w:r>
     </w:p>
     <w:p>
@@ -3511,12 +3529,538 @@
         <w:pStyle w:val="BodyText"/>
       </w:pPr>
       <w:r>
-        <w:t xml:space="preserve">The regularity common to all four countries is narrower than a bifurcation claim, and better supported: none provides an AI-related instrument for compute provision below facility scale. Incentives exist for building data centres and, in Vietnam and the Philippines, for providing cloud services. None is aimed at the intermediate forms through which smaller firms obtain or supply compute, such as colocation tenancy, modular or edge deployment, or resale of leased capacity. Section 5.1 assesses what explains it.</w:t>
-      </w:r>
-    </w:p>
-    <w:bookmarkEnd w:id="37"/>
-    <w:bookmarkEnd w:id="38"/>
-    <w:bookmarkStart w:id="43" w:name="discussion"/>
+        <w:rPr>
+          <w:bCs/>
+          <w:b/>
+        </w:rPr>
+        <w:t xml:space="preserve">Four architectures.</w:t>
+      </w:r>
+      <w:r>
+        <w:t xml:space="preserve"> </w:t>
+      </w:r>
+      <w:r>
+        <w:t xml:space="preserve">The differences above group into four ways of setting eligibility, which Table 5 summarises and Figure 1 shows on a common scale.</w:t>
+      </w:r>
+    </w:p>
+    <w:p>
+      <w:pPr>
+        <w:pStyle w:val="BodyText"/>
+      </w:pPr>
+      <w:r>
+        <w:rPr>
+          <w:bCs/>
+          <w:b/>
+        </w:rPr>
+        <w:t xml:space="preserve">Table 5. Four incentive architectures and what they imply for a small entrant at the compute layer</w:t>
+      </w:r>
+    </w:p>
+    <w:tbl>
+      <w:tblPr>
+        <w:tblStyle w:val="Table"/>
+        <w:tblW w:type="pct" w:w="5000"/>
+        <w:tblLook w:firstRow="1" w:lastRow="0" w:firstColumn="0" w:lastColumn="0" w:noHBand="0" w:noVBand="0" w:val="0020"/>
+        <w:jc w:val="start"/>
+      </w:tblPr>
+      <w:tblGrid>
+        <w:gridCol w:w="1320"/>
+        <w:gridCol w:w="1320"/>
+        <w:gridCol w:w="1320"/>
+        <w:gridCol w:w="1320"/>
+        <w:gridCol w:w="1320"/>
+        <w:gridCol w:w="1320"/>
+      </w:tblGrid>
+      <w:tr>
+        <w:trPr>
+          <w:tblHeader w:val="true"/>
+        </w:trPr>
+        <w:tc>
+          <w:tcPr/>
+          <w:p>
+            <w:pPr>
+              <w:pStyle w:val="Compact"/>
+              <w:jc w:val="left"/>
+            </w:pPr>
+            <w:r>
+              <w:t xml:space="preserve">Architecture</w:t>
+            </w:r>
+          </w:p>
+        </w:tc>
+        <w:tc>
+          <w:tcPr/>
+          <w:p>
+            <w:pPr>
+              <w:pStyle w:val="Compact"/>
+              <w:jc w:val="left"/>
+            </w:pPr>
+            <w:r>
+              <w:t xml:space="preserve">Country</w:t>
+            </w:r>
+          </w:p>
+        </w:tc>
+        <w:tc>
+          <w:tcPr/>
+          <w:p>
+            <w:pPr>
+              <w:pStyle w:val="Compact"/>
+              <w:jc w:val="left"/>
+            </w:pPr>
+            <w:r>
+              <w:t xml:space="preserve">How eligibility is set</w:t>
+            </w:r>
+          </w:p>
+        </w:tc>
+        <w:tc>
+          <w:tcPr/>
+          <w:p>
+            <w:pPr>
+              <w:pStyle w:val="Compact"/>
+              <w:jc w:val="left"/>
+            </w:pPr>
+            <w:r>
+              <w:t xml:space="preserve">Where the barrier sits</w:t>
+            </w:r>
+          </w:p>
+        </w:tc>
+        <w:tc>
+          <w:tcPr/>
+          <w:p>
+            <w:pPr>
+              <w:pStyle w:val="Compact"/>
+              <w:jc w:val="left"/>
+            </w:pPr>
+            <w:r>
+              <w:t xml:space="preserve">Implication for a small entrant to compute provision</w:t>
+            </w:r>
+          </w:p>
+        </w:tc>
+        <w:tc>
+          <w:tcPr/>
+          <w:p>
+            <w:pPr>
+              <w:pStyle w:val="Compact"/>
+              <w:jc w:val="left"/>
+            </w:pPr>
+            <w:r>
+              <w:t xml:space="preserve">Main design risk</w:t>
+            </w:r>
+          </w:p>
+        </w:tc>
+      </w:tr>
+      <w:tr>
+        <w:tc>
+          <w:tcPr/>
+          <w:p>
+            <w:pPr>
+              <w:pStyle w:val="Compact"/>
+              <w:jc w:val="left"/>
+            </w:pPr>
+            <w:r>
+              <w:t xml:space="preserve">Single gate</w:t>
+            </w:r>
+          </w:p>
+        </w:tc>
+        <w:tc>
+          <w:tcPr/>
+          <w:p>
+            <w:pPr>
+              <w:pStyle w:val="Compact"/>
+              <w:jc w:val="left"/>
+            </w:pPr>
+            <w:r>
+              <w:t xml:space="preserve">Thailand</w:t>
+            </w:r>
+          </w:p>
+        </w:tc>
+        <w:tc>
+          <w:tcPr/>
+          <w:p>
+            <w:pPr>
+              <w:pStyle w:val="Compact"/>
+              <w:jc w:val="left"/>
+            </w:pPr>
+            <w:r>
+              <w:t xml:space="preserve">Activity-specific minimum capital</w:t>
+            </w:r>
+          </w:p>
+        </w:tc>
+        <w:tc>
+          <w:tcPr/>
+          <w:p>
+            <w:pPr>
+              <w:pStyle w:val="Compact"/>
+              <w:jc w:val="left"/>
+            </w:pPr>
+            <w:r>
+              <w:t xml:space="preserve">A step at the data-hosting activity (about US$140m)</w:t>
+            </w:r>
+          </w:p>
+        </w:tc>
+        <w:tc>
+          <w:tcPr/>
+          <w:p>
+            <w:pPr>
+              <w:pStyle w:val="Compact"/>
+              <w:jc w:val="left"/>
+            </w:pPr>
+            <w:r>
+              <w:t xml:space="preserve">No rung between the software threshold and the data-centre threshold</w:t>
+            </w:r>
+          </w:p>
+        </w:tc>
+        <w:tc>
+          <w:tcPr/>
+          <w:p>
+            <w:pPr>
+              <w:pStyle w:val="Compact"/>
+              <w:jc w:val="left"/>
+            </w:pPr>
+            <w:r>
+              <w:t xml:space="preserve">A large gap between layers</w:t>
+            </w:r>
+          </w:p>
+        </w:tc>
+      </w:tr>
+      <w:tr>
+        <w:tc>
+          <w:tcPr/>
+          <w:p>
+            <w:pPr>
+              <w:pStyle w:val="Compact"/>
+              <w:jc w:val="left"/>
+            </w:pPr>
+            <w:r>
+              <w:t xml:space="preserve">Graduated ladder</w:t>
+            </w:r>
+          </w:p>
+        </w:tc>
+        <w:tc>
+          <w:tcPr/>
+          <w:p>
+            <w:pPr>
+              <w:pStyle w:val="Compact"/>
+              <w:jc w:val="left"/>
+            </w:pPr>
+            <w:r>
+              <w:t xml:space="preserve">Malaysia</w:t>
+            </w:r>
+          </w:p>
+        </w:tc>
+        <w:tc>
+          <w:tcPr/>
+          <w:p>
+            <w:pPr>
+              <w:pStyle w:val="Compact"/>
+              <w:jc w:val="left"/>
+            </w:pPr>
+            <w:r>
+              <w:t xml:space="preserve">Paid-up capital tiers rising to a full benefit at RM1bn capex</w:t>
+            </w:r>
+          </w:p>
+        </w:tc>
+        <w:tc>
+          <w:tcPr/>
+          <w:p>
+            <w:pPr>
+              <w:pStyle w:val="Compact"/>
+              <w:jc w:val="left"/>
+            </w:pPr>
+            <w:r>
+              <w:t xml:space="preserve">Gradual; the top-tier benefit sits at about US$220m</w:t>
+            </w:r>
+          </w:p>
+        </w:tc>
+        <w:tc>
+          <w:tcPr/>
+          <w:p>
+            <w:pPr>
+              <w:pStyle w:val="Compact"/>
+              <w:jc w:val="left"/>
+            </w:pPr>
+            <w:r>
+              <w:t xml:space="preserve">A rung exists on paper from about US$0.55m of paid-up capital; coverage of sub-facility providers unverified</w:t>
+            </w:r>
+          </w:p>
+        </w:tc>
+        <w:tc>
+          <w:tcPr/>
+          <w:p>
+            <w:pPr>
+              <w:pStyle w:val="Compact"/>
+              <w:jc w:val="left"/>
+            </w:pPr>
+            <w:r>
+              <w:t xml:space="preserve">Fixed compliance cost at the lowest tier; entry tier may still presuppose a facility</w:t>
+            </w:r>
+          </w:p>
+        </w:tc>
+      </w:tr>
+      <w:tr>
+        <w:tc>
+          <w:tcPr/>
+          <w:p>
+            <w:pPr>
+              <w:pStyle w:val="Compact"/>
+              <w:jc w:val="left"/>
+            </w:pPr>
+            <w:r>
+              <w:t xml:space="preserve">Priority list</w:t>
+            </w:r>
+          </w:p>
+        </w:tc>
+        <w:tc>
+          <w:tcPr/>
+          <w:p>
+            <w:pPr>
+              <w:pStyle w:val="Compact"/>
+              <w:jc w:val="left"/>
+            </w:pPr>
+            <w:r>
+              <w:t xml:space="preserve">Vietnam</w:t>
+            </w:r>
+          </w:p>
+        </w:tc>
+        <w:tc>
+          <w:tcPr/>
+          <w:p>
+            <w:pPr>
+              <w:pStyle w:val="Compact"/>
+              <w:jc w:val="left"/>
+            </w:pPr>
+            <w:r>
+              <w:t xml:space="preserve">Designation of products into two tiers; no capital rule</w:t>
+            </w:r>
+          </w:p>
+        </w:tc>
+        <w:tc>
+          <w:tcPr/>
+          <w:p>
+            <w:pPr>
+              <w:pStyle w:val="Compact"/>
+              <w:jc w:val="left"/>
+            </w:pPr>
+            <w:r>
+              <w:t xml:space="preserve">At hardware manufacture (lower tier); discretionary designation elsewhere</w:t>
+            </w:r>
+          </w:p>
+        </w:tc>
+        <w:tc>
+          <w:tcPr/>
+          <w:p>
+            <w:pPr>
+              <w:pStyle w:val="Compact"/>
+              <w:jc w:val="left"/>
+            </w:pPr>
+            <w:r>
+              <w:t xml:space="preserve">No capital barrier; access depends on designation and on instruments not yet coded</w:t>
+            </w:r>
+          </w:p>
+        </w:tc>
+        <w:tc>
+          <w:tcPr/>
+          <w:p>
+            <w:pPr>
+              <w:pStyle w:val="Compact"/>
+              <w:jc w:val="left"/>
+            </w:pPr>
+            <w:r>
+              <w:t xml:space="preserve">Discretion and opacity</w:t>
+            </w:r>
+          </w:p>
+        </w:tc>
+      </w:tr>
+      <w:tr>
+        <w:tc>
+          <w:tcPr/>
+          <w:p>
+            <w:pPr>
+              <w:pStyle w:val="Compact"/>
+              <w:jc w:val="left"/>
+            </w:pPr>
+            <w:r>
+              <w:t xml:space="preserve">Uniform scale tiers</w:t>
+            </w:r>
+          </w:p>
+        </w:tc>
+        <w:tc>
+          <w:tcPr/>
+          <w:p>
+            <w:pPr>
+              <w:pStyle w:val="Compact"/>
+              <w:jc w:val="left"/>
+            </w:pPr>
+            <w:r>
+              <w:t xml:space="preserve">Philippines</w:t>
+            </w:r>
+          </w:p>
+        </w:tc>
+        <w:tc>
+          <w:tcPr/>
+          <w:p>
+            <w:pPr>
+              <w:pStyle w:val="Compact"/>
+              <w:jc w:val="left"/>
+            </w:pPr>
+            <w:r>
+              <w:t xml:space="preserve">Firm-scale tiers (PHP 15bn) for all activities; presidential discretion above</w:t>
+            </w:r>
+          </w:p>
+        </w:tc>
+        <w:tc>
+          <w:tcPr/>
+          <w:p>
+            <w:pPr>
+              <w:pStyle w:val="Compact"/>
+              <w:jc w:val="left"/>
+            </w:pPr>
+            <w:r>
+              <w:t xml:space="preserve">Firm scale, not layer</w:t>
+            </w:r>
+          </w:p>
+        </w:tc>
+        <w:tc>
+          <w:tcPr/>
+          <w:p>
+            <w:pPr>
+              <w:pStyle w:val="Compact"/>
+              <w:jc w:val="left"/>
+            </w:pPr>
+            <w:r>
+              <w:t xml:space="preserve">The same rules govern software and data centres; AI-blind</w:t>
+            </w:r>
+          </w:p>
+        </w:tc>
+        <w:tc>
+          <w:tcPr/>
+          <w:p>
+            <w:pPr>
+              <w:pStyle w:val="Compact"/>
+              <w:jc w:val="left"/>
+            </w:pPr>
+            <w:r>
+              <w:t xml:space="preserve">Scale tiers set without reference to the technology</w:t>
+            </w:r>
+          </w:p>
+        </w:tc>
+      </w:tr>
+    </w:tbl>
+    <w:p>
+      <w:pPr>
+        <w:pStyle w:val="BodyText"/>
+      </w:pPr>
+      <w:r>
+        <w:rPr>
+          <w:iCs/>
+          <w:i/>
+        </w:rPr>
+        <w:t xml:space="preserve">Note.</w:t>
+      </w:r>
+      <w:r>
+        <w:t xml:space="preserve"> </w:t>
+      </w:r>
+      <w:r>
+        <w:t xml:space="preserve">Malaysia’s paid-up capital and the other countries’ capital thresholds are different bases (see the note to Figure 1).</w:t>
+      </w:r>
+    </w:p>
+    <w:p>
+      <w:pPr>
+        <w:pStyle w:val="CaptionedFigure"/>
+      </w:pPr>
+      <w:r>
+        <w:drawing>
+          <wp:inline>
+            <wp:extent cx="5334000" cy="3531972"/>
+            <wp:effectExtent b="0" l="0" r="0" t="0"/>
+            <wp:docPr descr="Figure 1. Explicit eligibility thresholds against cost benchmarks, US$ million, log scale. Shaded bands show the capital needed to host the stated capacity, from construction cost alone (US$10.7m per MW; Turner and Townsend, 2025) to fully equipped AI capacity (US$38m per MW; Epoch AI, 2026); the node band assumes 12 kW per eight-accelerator server (CITATION NEEDED). Thresholds are on different bases: Thailand’s software figure is annual salary spend (hollow marker), Thailand’s and the Philippines’ figures are minimum capital or firm scale, Malaysia’s entry tiers are paid-up capital (*) and its top tier is cumulative capex. The bands are therefore benchmarks, not like-for-like tests. Vietnam states no capital threshold." title="" id="38" name="Picture"/>
+            <a:graphic>
+              <a:graphicData uri="http://schemas.openxmlformats.org/drawingml/2006/picture">
+                <pic:pic>
+                  <pic:nvPicPr>
+                    <pic:cNvPr descr="fig1_threshold_ladder.png" id="39" name="Picture"/>
+                    <pic:cNvPicPr>
+                      <a:picLocks noChangeArrowheads="1" noChangeAspect="1"/>
+                    </pic:cNvPicPr>
+                  </pic:nvPicPr>
+                  <pic:blipFill>
+                    <a:blip r:embed="rId37"/>
+                    <a:stretch>
+                      <a:fillRect/>
+                    </a:stretch>
+                  </pic:blipFill>
+                  <pic:spPr bwMode="auto">
+                    <a:xfrm>
+                      <a:off x="0" y="0"/>
+                      <a:ext cx="5334000" cy="3531972"/>
+                    </a:xfrm>
+                    <a:prstGeom prst="rect">
+                      <a:avLst/>
+                    </a:prstGeom>
+                    <a:noFill/>
+                    <a:ln w="9525">
+                      <a:noFill/>
+                      <a:headEnd/>
+                      <a:tailEnd/>
+                    </a:ln>
+                  </pic:spPr>
+                </pic:pic>
+              </a:graphicData>
+            </a:graphic>
+          </wp:inline>
+        </w:drawing>
+      </w:r>
+    </w:p>
+    <w:p>
+      <w:pPr>
+        <w:pStyle w:val="ImageCaption"/>
+      </w:pPr>
+      <w:r>
+        <w:rPr>
+          <w:bCs/>
+          <w:b/>
+        </w:rPr>
+        <w:t xml:space="preserve">Figure 1.</w:t>
+      </w:r>
+      <w:r>
+        <w:t xml:space="preserve"> </w:t>
+      </w:r>
+      <w:r>
+        <w:t xml:space="preserve">Explicit eligibility thresholds against cost benchmarks, US$ million, log scale. Shaded bands show the capital needed to host the stated capacity, from construction cost alone (US$10.7m per MW; Turner and Townsend, 2025) to fully equipped AI capacity (US$38m per MW; Epoch AI, 2026); the node band assumes 12 kW per eight-accelerator server (CITATION NEEDED). Thresholds are on different bases: Thailand’s software figure is annual salary spend (hollow marker), Thailand’s and the Philippines’ figures are minimum capital or firm scale, Malaysia’s entry tiers are paid-up capital (*) and its top tier is cumulative capex. The bands are therefore benchmarks, not like-for-like tests. Vietnam states no capital threshold.</w:t>
+      </w:r>
+    </w:p>
+    <w:p>
+      <w:pPr>
+        <w:pStyle w:val="BodyText"/>
+      </w:pPr>
+      <w:r>
+        <w:t xml:space="preserve">Three readings follow from Figure 1. In Thailand a single step separates software from data hosting, and nothing sits on the scale between them. In Malaysia a rung lies at about the cost of hosting one fully equipped server, and the ladder rises from there to the facility scale. Vietnam and the Philippines do not use capital thresholds by layer, so their barriers must be sought in designation and discretion, not in capital.</w:t>
+      </w:r>
+    </w:p>
+    <w:p>
+      <w:pPr>
+        <w:pStyle w:val="BodyText"/>
+      </w:pPr>
+      <w:r>
+        <w:t xml:space="preserve">The regularity across the countries is narrower than a bifurcation claim, and better supported: in Thailand, Vietnam and the Philippines we found no AI-related instrument for compute provision below facility scale. Incentives exist for building data centres and, in Vietnam and the Philippines, for providing cloud services. None is aimed at the intermediate forms through which smaller firms obtain or supply compute, such as colocation tenancy, modular or edge deployment, or resale of leased capacity. Malaysia is the one country where a graduated structure exists, and</w:t>
+      </w:r>
+      <w:r>
+        <w:t xml:space="preserve"> </w:t>
+      </w:r>
+      <w:r>
+        <w:rPr>
+          <w:bCs/>
+          <w:b/>
+        </w:rPr>
+        <w:t xml:space="preserve">[VERIFY: whether DESAC’s entry tier requires a minimum facility size, a minimum qualifying capex or capacity, or can be used by a firm that leases space and equipment]</w:t>
+      </w:r>
+      <w:r>
+        <w:t xml:space="preserve"> </w:t>
+      </w:r>
+      <w:r>
+        <w:t xml:space="preserve">determines whether it closes the gap. Section 5.1 assesses what explains the gap.</w:t>
+      </w:r>
+    </w:p>
+    <w:bookmarkEnd w:id="40"/>
+    <w:bookmarkEnd w:id="41"/>
+    <w:bookmarkStart w:id="46" w:name="discussion"/>
     <w:p>
       <w:pPr>
         <w:pStyle w:val="Heading2"/>
@@ -3525,7 +4069,7 @@
         <w:t xml:space="preserve">5. Discussion</w:t>
       </w:r>
     </w:p>
-    <w:bookmarkStart w:id="39" w:name="cost-necessity-versus-incentive-design"/>
+    <w:bookmarkStart w:id="42" w:name="cost-necessity-versus-incentive-design"/>
     <w:p>
       <w:pPr>
         <w:pStyle w:val="Heading3"/>
@@ -3594,11 +4138,19 @@
         <w:t xml:space="preserve">[CITATION NEEDED: provider terms or industry source]</w:t>
       </w:r>
       <w:r>
-        <w:t xml:space="preserve">. Firms can and do provide AI compute at this scale. A cost account predicts a high threshold for facility construction. It does not predict the absence of any instrument for compute provision two to three orders of magnitude below facility scale (a facility of tens of megawatts against a rack of ten to twenty kilowatts), while instruments exist for software development at the scale of a small team. Both H2 and H3 predict this absence, with different origins. The absence is a design outcome and not a cost constraint, subject to two checks in Section 3.3 that are still pending: the search protocol and the coding of general-purpose instruments.</w:t>
-      </w:r>
-    </w:p>
-    <w:bookmarkEnd w:id="39"/>
-    <w:bookmarkStart w:id="40" w:name="Xe429b4f7ef8fb24865192b28fb189dc3a50c53d"/>
+        <w:t xml:space="preserve">. Firms can and do provide AI compute at this scale. A cost account predicts a high threshold for facility construction. It does not predict the absence of any instrument for compute provision two to three orders of magnitude below facility scale (a facility of tens of megawatts against a rack of ten to twenty kilowatts), while instruments exist for software development at the scale of a small team. Both H2 and H3 predict this absence, with different origins. For Thailand, Vietnam and the Philippines the absence is a design outcome and not a cost constraint, subject to two checks in Section 3.3 that are still pending: the search protocol and the coding of general-purpose instruments.</w:t>
+      </w:r>
+    </w:p>
+    <w:p>
+      <w:pPr>
+        <w:pStyle w:val="BodyText"/>
+      </w:pPr>
+      <w:r>
+        <w:t xml:space="preserve">Malaysia is the informative case. Its entry tier asks for RM2.5 million of paid-up capital, about US$550,000, which is of the same order as the capital needed to host one fully equipped server on the benchmark of Figure 1 (about US$0.5 million) and well below the capital needed to build a megawatt of capacity (about US$11 million). If a firm that leases space and equipment, or runs a colocation-scale deployment, can qualify, Malaysia shows that a graduated design is feasible, and the cost account cannot explain its absence in the other three. If the tier presupposes a facility, Malaysia joins the other three and the gap is general. The two outcomes carry different lessons, which is why the coverage of this tier is the most consequential open check in the paper. Paid-up capital is not the same as the capital expenditure on a facility, so this comparison indicates feasibility only.</w:t>
+      </w:r>
+    </w:p>
+    <w:bookmarkEnd w:id="42"/>
+    <w:bookmarkStart w:id="43" w:name="Xe429b4f7ef8fb24865192b28fb189dc3a50c53d"/>
     <w:p>
       <w:pPr>
         <w:pStyle w:val="Heading3"/>
@@ -3631,8 +4183,8 @@
         <w:t xml:space="preserve">The two country patterns are different phenomena and imply different questions. In Thailand the question is whether technology-transfer or local-content conditions on foreign investment would change the learning domestic firms gain. In Vietnam it is whether competition or access conditions for smaller firms matter in a market that a single conglomerate leads. Whether Thailand’s ownership gradient holds elsewhere requires approval data these governments do not publish in comparable form.</w:t>
       </w:r>
     </w:p>
-    <w:bookmarkEnd w:id="40"/>
-    <w:bookmarkStart w:id="41" w:name="what-the-evidence-supports"/>
+    <w:bookmarkEnd w:id="43"/>
+    <w:bookmarkStart w:id="44" w:name="what-the-evidence-supports"/>
     <w:p>
       <w:pPr>
         <w:pStyle w:val="Heading3"/>
@@ -3646,7 +4198,7 @@
         <w:pStyle w:val="FirstParagraph"/>
       </w:pPr>
       <w:r>
-        <w:t xml:space="preserve">Table 4 applies the rubric of Table 1 to each item of evidence.</w:t>
+        <w:t xml:space="preserve">Table 4 applies the rubric of Table 2 to each item of evidence.</w:t>
       </w:r>
     </w:p>
     <w:p>
@@ -3873,7 +4425,7 @@
               <w:jc w:val="left"/>
             </w:pPr>
             <w:r>
-              <w:t xml:space="preserve">No AI-related instrument for compute provision below facility scale (all four; provisional, pending search protocol and general-instrument coding)</w:t>
+              <w:t xml:space="preserve">No AI-related instrument for compute provision below facility scale (Thailand, Vietnam, Philippines; Malaysia’s DESAC entry tier unresolved; provisional, pending search protocol and general-instrument coding)</w:t>
             </w:r>
           </w:p>
         </w:tc>
@@ -3933,7 +4485,7 @@
               <w:jc w:val="left"/>
             </w:pPr>
             <w:r>
-              <w:t xml:space="preserve">An applicable general or AI-specific instrument for colocation, resale or modular compute would move H2 to C. Evidence that sub-facility provision is not viable would move H1 to E</w:t>
+              <w:t xml:space="preserve">An applicable general or AI-specific instrument for colocation, resale or modular compute would move H2 to C. Evidence that DESAC’s entry tier covers sub-facility providers would show that a graduated design is feasible and would strengthen the case against H1 elsewhere. Evidence that sub-facility provision is not viable would move H1 to E</w:t>
             </w:r>
           </w:p>
         </w:tc>
@@ -4556,7 +5108,7 @@
         <w:t xml:space="preserve"> </w:t>
       </w:r>
       <w:r>
-        <w:t xml:space="preserve">E = expected; C = compatible; U = unexpected; X = contradicted. The rubric is in Table 1. Ratings of rows that depend on unverified coding are provisional until the verification and reliability checks are complete.</w:t>
+        <w:t xml:space="preserve">E = expected; C = compatible; U = unexpected; X = contradicted. The rubric is in Table 2. Ratings of rows that depend on unverified coding are provisional until the verification and reliability checks are complete.</w:t>
       </w:r>
     </w:p>
     <w:p>
@@ -4637,8 +5189,8 @@
         <w:t xml:space="preserve">A reading that this paper cannot rule out is that no middle-income economy can compete with hyperscale providers at frontier scale, and that concentrating domestic effort on applications while accepting infrastructure dependence is sound specialisation. The evidence that would separate the readings is (a) whether domestic sub-facility compute providers exist, grow and serve domestic AI firms without incentives, (b) the price and availability of compute for domestic AI firms, and (c) outcomes for domestic firms in the application layer. None of this is observed here. We therefore do not claim to adjudicate between a design gap and rational specialisation.</w:t>
       </w:r>
     </w:p>
-    <w:bookmarkEnd w:id="41"/>
-    <w:bookmarkStart w:id="42" w:name="relation-to-the-literature"/>
+    <w:bookmarkEnd w:id="44"/>
+    <w:bookmarkStart w:id="45" w:name="relation-to-the-literature"/>
     <w:p>
       <w:pPr>
         <w:pStyle w:val="Heading3"/>
@@ -4655,9 +5207,9 @@
         <w:t xml:space="preserve">Bahar et al. (2026) show for Japan that incentives delivered through indirect tax credits favour large profitable firms. Our evidence for the same mechanism is limited to specific rules: Thailand’s deepest research tier (E3), Malaysia’s fixed compliance cost (E4), and the fact that three of four countries deliver the accessible tier by indirect instruments (Table 3). The comparison with Japan and the European Union should be drawn carefully. Their problem is misallocation among sectors for established firms, whereas ours is entry to a new technology stack, and the evidence for it is rules, not spending shares. The lesson we draw from Fuest et al. (2024) and Bahar et al. (2026) is about method: to look at instrument design, not aggregate spending. Doner and Schneider (2016) treat firm size as a cleavage that works through political weakness. We find that size can also be written into instruments, through thresholds and tiers, independently of the coalitions that form around them, but we do not observe coalitions. For the AI literature, our finding is relevant to the access scenarios of Cerutti et al. (2025): the macro outcome in those models depends on whether domestic firms can provide compute, and the rules we code show where that entry is and is not open. They do not show what firms do with it.</w:t>
       </w:r>
     </w:p>
-    <w:bookmarkEnd w:id="42"/>
-    <w:bookmarkEnd w:id="43"/>
-    <w:bookmarkStart w:id="44" w:name="policy-implications"/>
+    <w:bookmarkEnd w:id="45"/>
+    <w:bookmarkEnd w:id="46"/>
+    <w:bookmarkStart w:id="47" w:name="policy-implications"/>
     <w:p>
       <w:pPr>
         <w:pStyle w:val="Heading2"/>
@@ -4689,7 +5241,448 @@
         <w:t xml:space="preserve"> </w:t>
       </w:r>
       <w:r>
-        <w:t xml:space="preserve">Finding: no country has an AI-related instrument below facility scale (E2). Options are extending eligibility to colocation tenancy, modular deployment or shared-capacity arrangements, or providing subsidised access to public or consortium compute. Vietnam’s startup track offers a template for the design principle: a parallel, more accessible pathway alongside the demanding thresholds, not a lowering of them. Its transfer depends on administrative capacity to screen eligible firms by technical or commercialisation criteria, not by capital. Risks: subsidising resale of foreign-owned capacity, and fiscal leakage if eligibility is loose. We have not costed any option, so we do not claim that the gap can be closed at modest fiscal cost. A small, time-limited pilot with defined eligibility would allow cost and take-up to be observed before scaling.</w:t>
+        <w:t xml:space="preserve">Finding: three of the four countries have no AI-related instrument below facility scale (E2), and Malaysia’s graduated entry tier shows how one could be built. Options are extending eligibility to colocation tenancy, modular deployment or shared-capacity arrangements, or providing subsidised access to public or consortium compute. Vietnam’s startup track offers a template for the design principle: a parallel, more accessible pathway alongside the demanding thresholds, not a lowering of them. Its transfer depends on administrative capacity to screen eligible firms by technical or commercialisation criteria, not by capital. Risks: subsidising resale of foreign-owned capacity, and fiscal leakage if eligibility is loose. We have not costed any option, so we do not claim that the gap can be closed at modest fiscal cost. A small, time-limited pilot with defined eligibility would allow cost and take-up to be observed before scaling.</w:t>
+      </w:r>
+    </w:p>
+    <w:p>
+      <w:pPr>
+        <w:pStyle w:val="BodyText"/>
+      </w:pPr>
+      <w:r>
+        <w:t xml:space="preserve">Table 6 gives an illustrative calibration of such a ladder, using the same benchmarks as Figure 1. It is meant to show the order of magnitude of each rung and the instrument type each would suit, not to recommend specific thresholds, each of which would need costing and local validation.</w:t>
+      </w:r>
+    </w:p>
+    <w:p>
+      <w:pPr>
+        <w:pStyle w:val="BodyText"/>
+      </w:pPr>
+      <w:r>
+        <w:rPr>
+          <w:bCs/>
+          <w:b/>
+        </w:rPr>
+        <w:t xml:space="preserve">Table 6. Illustrative eligibility ladder calibrated to cost benchmarks</w:t>
+      </w:r>
+    </w:p>
+    <w:tbl>
+      <w:tblPr>
+        <w:tblStyle w:val="Table"/>
+        <w:tblW w:type="pct" w:w="5000"/>
+        <w:tblLook w:firstRow="1" w:lastRow="0" w:firstColumn="0" w:lastColumn="0" w:noHBand="0" w:noVBand="0" w:val="0020"/>
+        <w:jc w:val="start"/>
+      </w:tblPr>
+      <w:tblGrid>
+        <w:gridCol w:w="1584"/>
+        <w:gridCol w:w="1584"/>
+        <w:gridCol w:w="1584"/>
+        <w:gridCol w:w="1584"/>
+        <w:gridCol w:w="1584"/>
+      </w:tblGrid>
+      <w:tr>
+        <w:trPr>
+          <w:tblHeader w:val="true"/>
+        </w:trPr>
+        <w:tc>
+          <w:tcPr/>
+          <w:p>
+            <w:pPr>
+              <w:pStyle w:val="Compact"/>
+              <w:jc w:val="left"/>
+            </w:pPr>
+            <w:r>
+              <w:t xml:space="preserve">Rung</w:t>
+            </w:r>
+          </w:p>
+        </w:tc>
+        <w:tc>
+          <w:tcPr/>
+          <w:p>
+            <w:pPr>
+              <w:pStyle w:val="Compact"/>
+              <w:jc w:val="left"/>
+            </w:pPr>
+            <w:r>
+              <w:t xml:space="preserve">Capacity</w:t>
+            </w:r>
+          </w:p>
+        </w:tc>
+        <w:tc>
+          <w:tcPr/>
+          <w:p>
+            <w:pPr>
+              <w:pStyle w:val="Compact"/>
+              <w:jc w:val="left"/>
+            </w:pPr>
+            <w:r>
+              <w:t xml:space="preserve">Capital to host: construction only to fully equipped (US$ million)</w:t>
+            </w:r>
+          </w:p>
+        </w:tc>
+        <w:tc>
+          <w:tcPr/>
+          <w:p>
+            <w:pPr>
+              <w:pStyle w:val="Compact"/>
+              <w:jc w:val="left"/>
+            </w:pPr>
+            <w:r>
+              <w:t xml:space="preserve">Instrument type that suits the rung</w:t>
+            </w:r>
+          </w:p>
+        </w:tc>
+        <w:tc>
+          <w:tcPr/>
+          <w:p>
+            <w:pPr>
+              <w:pStyle w:val="Compact"/>
+              <w:jc w:val="left"/>
+            </w:pPr>
+            <w:r>
+              <w:t xml:space="preserve">Reason</w:t>
+            </w:r>
+          </w:p>
+        </w:tc>
+      </w:tr>
+      <w:tr>
+        <w:tc>
+          <w:tcPr/>
+          <w:p>
+            <w:pPr>
+              <w:pStyle w:val="Compact"/>
+              <w:jc w:val="left"/>
+            </w:pPr>
+            <w:r>
+              <w:t xml:space="preserve">0</w:t>
+            </w:r>
+          </w:p>
+        </w:tc>
+        <w:tc>
+          <w:tcPr/>
+          <w:p>
+            <w:pPr>
+              <w:pStyle w:val="Compact"/>
+              <w:jc w:val="left"/>
+            </w:pPr>
+            <w:r>
+              <w:t xml:space="preserve">One eight-accelerator server (12 kW)</w:t>
+            </w:r>
+          </w:p>
+        </w:tc>
+        <w:tc>
+          <w:tcPr/>
+          <w:p>
+            <w:pPr>
+              <w:pStyle w:val="Compact"/>
+              <w:jc w:val="left"/>
+            </w:pPr>
+            <w:r>
+              <w:t xml:space="preserve">0.13 to 0.46</w:t>
+            </w:r>
+          </w:p>
+        </w:tc>
+        <w:tc>
+          <w:tcPr/>
+          <w:p>
+            <w:pPr>
+              <w:pStyle w:val="Compact"/>
+              <w:jc w:val="left"/>
+            </w:pPr>
+            <w:r>
+              <w:t xml:space="preserve">Direct: compute vouchers for users, matching grants for small providers</w:t>
+            </w:r>
+          </w:p>
+        </w:tc>
+        <w:tc>
+          <w:tcPr/>
+          <w:p>
+            <w:pPr>
+              <w:pStyle w:val="Compact"/>
+              <w:jc w:val="left"/>
+            </w:pPr>
+            <w:r>
+              <w:t xml:space="preserve">Tax relief presupposes taxable profit, which a new provider lacks</w:t>
+            </w:r>
+          </w:p>
+        </w:tc>
+      </w:tr>
+      <w:tr>
+        <w:tc>
+          <w:tcPr/>
+          <w:p>
+            <w:pPr>
+              <w:pStyle w:val="Compact"/>
+              <w:jc w:val="left"/>
+            </w:pPr>
+            <w:r>
+              <w:t xml:space="preserve">1</w:t>
+            </w:r>
+          </w:p>
+        </w:tc>
+        <w:tc>
+          <w:tcPr/>
+          <w:p>
+            <w:pPr>
+              <w:pStyle w:val="Compact"/>
+              <w:jc w:val="left"/>
+            </w:pPr>
+            <w:r>
+              <w:t xml:space="preserve">100 kW (about eight servers)</w:t>
+            </w:r>
+          </w:p>
+        </w:tc>
+        <w:tc>
+          <w:tcPr/>
+          <w:p>
+            <w:pPr>
+              <w:pStyle w:val="Compact"/>
+              <w:jc w:val="left"/>
+            </w:pPr>
+            <w:r>
+              <w:t xml:space="preserve">1.1 to 3.8</w:t>
+            </w:r>
+          </w:p>
+        </w:tc>
+        <w:tc>
+          <w:tcPr/>
+          <w:p>
+            <w:pPr>
+              <w:pStyle w:val="Compact"/>
+              <w:jc w:val="left"/>
+            </w:pPr>
+            <w:r>
+              <w:t xml:space="preserve">Direct or refundable credit; simple eligibility test</w:t>
+            </w:r>
+          </w:p>
+        </w:tc>
+        <w:tc>
+          <w:tcPr/>
+          <w:p>
+            <w:pPr>
+              <w:pStyle w:val="Compact"/>
+              <w:jc w:val="left"/>
+            </w:pPr>
+            <w:r>
+              <w:t xml:space="preserve">Allows many small trials before any scales up (Hausmann and Rodrik, 2003)</w:t>
+            </w:r>
+          </w:p>
+        </w:tc>
+      </w:tr>
+      <w:tr>
+        <w:tc>
+          <w:tcPr/>
+          <w:p>
+            <w:pPr>
+              <w:pStyle w:val="Compact"/>
+              <w:jc w:val="left"/>
+            </w:pPr>
+            <w:r>
+              <w:t xml:space="preserve">2</w:t>
+            </w:r>
+          </w:p>
+        </w:tc>
+        <w:tc>
+          <w:tcPr/>
+          <w:p>
+            <w:pPr>
+              <w:pStyle w:val="Compact"/>
+              <w:jc w:val="left"/>
+            </w:pPr>
+            <w:r>
+              <w:t xml:space="preserve">1 MW</w:t>
+            </w:r>
+          </w:p>
+        </w:tc>
+        <w:tc>
+          <w:tcPr/>
+          <w:p>
+            <w:pPr>
+              <w:pStyle w:val="Compact"/>
+              <w:jc w:val="left"/>
+            </w:pPr>
+            <w:r>
+              <w:t xml:space="preserve">10.7 to 38</w:t>
+            </w:r>
+          </w:p>
+        </w:tc>
+        <w:tc>
+          <w:tcPr/>
+          <w:p>
+            <w:pPr>
+              <w:pStyle w:val="Compact"/>
+              <w:jc w:val="left"/>
+            </w:pPr>
+            <w:r>
+              <w:t xml:space="preserve">Milestone-based tax incentive with compliance proportional to size</w:t>
+            </w:r>
+          </w:p>
+        </w:tc>
+        <w:tc>
+          <w:tcPr/>
+          <w:p>
+            <w:pPr>
+              <w:pStyle w:val="Compact"/>
+              <w:jc w:val="left"/>
+            </w:pPr>
+            <w:r>
+              <w:t xml:space="preserve">Avoids the fixed audit cost that weighs on the smallest firms (Section 4.3)</w:t>
+            </w:r>
+          </w:p>
+        </w:tc>
+      </w:tr>
+      <w:tr>
+        <w:tc>
+          <w:tcPr/>
+          <w:p>
+            <w:pPr>
+              <w:pStyle w:val="Compact"/>
+              <w:jc w:val="left"/>
+            </w:pPr>
+            <w:r>
+              <w:t xml:space="preserve">3</w:t>
+            </w:r>
+          </w:p>
+        </w:tc>
+        <w:tc>
+          <w:tcPr/>
+          <w:p>
+            <w:pPr>
+              <w:pStyle w:val="Compact"/>
+              <w:jc w:val="left"/>
+            </w:pPr>
+            <w:r>
+              <w:t xml:space="preserve">10 MW</w:t>
+            </w:r>
+          </w:p>
+        </w:tc>
+        <w:tc>
+          <w:tcPr/>
+          <w:p>
+            <w:pPr>
+              <w:pStyle w:val="Compact"/>
+              <w:jc w:val="left"/>
+            </w:pPr>
+            <w:r>
+              <w:t xml:space="preserve">107 to 380</w:t>
+            </w:r>
+          </w:p>
+        </w:tc>
+        <w:tc>
+          <w:tcPr/>
+          <w:p>
+            <w:pPr>
+              <w:pStyle w:val="Compact"/>
+              <w:jc w:val="left"/>
+            </w:pPr>
+            <w:r>
+              <w:t xml:space="preserve">Existing facility-scale tax incentive</w:t>
+            </w:r>
+          </w:p>
+        </w:tc>
+        <w:tc>
+          <w:tcPr/>
+          <w:p>
+            <w:pPr>
+              <w:pStyle w:val="Compact"/>
+              <w:jc w:val="left"/>
+            </w:pPr>
+            <w:r>
+              <w:t xml:space="preserve">Comparable to Thailand’s threshold (about 13 MW on construction cost)</w:t>
+            </w:r>
+          </w:p>
+        </w:tc>
+      </w:tr>
+      <w:tr>
+        <w:tc>
+          <w:tcPr/>
+          <w:p>
+            <w:pPr>
+              <w:pStyle w:val="Compact"/>
+              <w:jc w:val="left"/>
+            </w:pPr>
+            <w:r>
+              <w:t xml:space="preserve">4</w:t>
+            </w:r>
+          </w:p>
+        </w:tc>
+        <w:tc>
+          <w:tcPr/>
+          <w:p>
+            <w:pPr>
+              <w:pStyle w:val="Compact"/>
+              <w:jc w:val="left"/>
+            </w:pPr>
+            <w:r>
+              <w:t xml:space="preserve">40 MW (hyperscale)</w:t>
+            </w:r>
+          </w:p>
+        </w:tc>
+        <w:tc>
+          <w:tcPr/>
+          <w:p>
+            <w:pPr>
+              <w:pStyle w:val="Compact"/>
+              <w:jc w:val="left"/>
+            </w:pPr>
+            <w:r>
+              <w:t xml:space="preserve">428 to 1,520</w:t>
+            </w:r>
+          </w:p>
+        </w:tc>
+        <w:tc>
+          <w:tcPr/>
+          <w:p>
+            <w:pPr>
+              <w:pStyle w:val="Compact"/>
+              <w:jc w:val="left"/>
+            </w:pPr>
+            <w:r>
+              <w:t xml:space="preserve">Existing facility-scale incentive and negotiated packages</w:t>
+            </w:r>
+          </w:p>
+        </w:tc>
+        <w:tc>
+          <w:tcPr/>
+          <w:p>
+            <w:pPr>
+              <w:pStyle w:val="Compact"/>
+              <w:jc w:val="left"/>
+            </w:pPr>
+            <w:r>
+              <w:t xml:space="preserve">Already served by current designs</w:t>
+            </w:r>
+          </w:p>
+        </w:tc>
+      </w:tr>
+    </w:tbl>
+    <w:p>
+      <w:pPr>
+        <w:pStyle w:val="BodyText"/>
+      </w:pPr>
+      <w:r>
+        <w:rPr>
+          <w:iCs/>
+          <w:i/>
+        </w:rPr>
+        <w:t xml:space="preserve">Note.</w:t>
+      </w:r>
+      <w:r>
+        <w:t xml:space="preserve"> </w:t>
+      </w:r>
+      <w:r>
+        <w:t xml:space="preserve">Construction cost of US$10.7m per MW (Turner and Townsend, 2025); fully equipped AI capacity of US$38m per MW (Epoch AI, 2026); 12 kW per server</w:t>
+      </w:r>
+      <w:r>
+        <w:t xml:space="preserve"> </w:t>
+      </w:r>
+      <w:r>
+        <w:rPr>
+          <w:bCs/>
+          <w:b/>
+        </w:rPr>
+        <w:t xml:space="preserve">[CITATION NEEDED]</w:t>
+      </w:r>
+      <w:r>
+        <w:t xml:space="preserve">. Figures are products of these benchmarks, not estimates of this paper. Thailand’s threshold of about US$140m corresponds to about 13 MW on the first benchmark and under four MW on the second.</w:t>
       </w:r>
     </w:p>
     <w:p>
@@ -4728,8 +5721,8 @@
         <w:t xml:space="preserve">If dependence on foreign providers at the infrastructure layer is an acceptable strategic trade-off, it should be stated as a choice, with attention to data-sovereignty implications, not left as a by-product of where thresholds fall. Because we cannot separate this from rational specialisation (Section 5.3), the recommendation is to collect the evidence that would decide it, namely domestic compute price and availability and the growth of small providers, before changing thresholds.</w:t>
       </w:r>
     </w:p>
-    <w:bookmarkEnd w:id="44"/>
-    <w:bookmarkStart w:id="45" w:name="limitations"/>
+    <w:bookmarkEnd w:id="47"/>
+    <w:bookmarkStart w:id="48" w:name="limitations"/>
     <w:p>
       <w:pPr>
         <w:pStyle w:val="Heading2"/>
@@ -4929,8 +5922,8 @@
         <w:t xml:space="preserve">Vietnam’s AI-specific regulatory layer is still developing following the 2025 AI law (Vietnam, 2025). Findings for Vietnam describe a general incentive system that is operational and an AI-specific layer that is still evolving.</w:t>
       </w:r>
     </w:p>
-    <w:bookmarkEnd w:id="45"/>
-    <w:bookmarkStart w:id="46" w:name="conclusion"/>
+    <w:bookmarkEnd w:id="48"/>
+    <w:bookmarkStart w:id="49" w:name="conclusion"/>
     <w:p>
       <w:pPr>
         <w:pStyle w:val="Heading2"/>
@@ -4944,27 +5937,27 @@
         <w:pStyle w:val="FirstParagraph"/>
       </w:pPr>
       <w:r>
-        <w:t xml:space="preserve">This paper asked who can enter the AI industry in four Southeast Asian economies under the incentive rules their governments have written. All four make application development accessible, and Vietnam adds a startup track with direct equity access. Above that layer the boundary falls in different places: at data-centre capacity in Thailand and Malaysia, at hardware manufacture in Vietnam, and by firm scale alone in the Philippines. What is common to all four is an absence. We found no AI-related instrument for compute provision below facility scale, and published cost benchmarks show that capital intensity alone does not account for it.</w:t>
-      </w:r>
-    </w:p>
-    <w:p>
-      <w:pPr>
-        <w:pStyle w:val="BodyText"/>
-      </w:pPr>
-      <w:r>
-        <w:t xml:space="preserve">The claims are limited by the evidence. We observe eligibility rules, not realised access or outcomes. The central absence is provisional until the search protocol and the coding of general-purpose instruments are complete, and the coding awaits an independent check. The data do not distinguish a design gap from rational specialisation, and they do not show that a middle-technology trap exists. They identify a design feature that could contribute to such a trap, an opportunity structure in which domestic firms can enter applications but have no stated route into compute supply below facility scale.</w:t>
-      </w:r>
-    </w:p>
-    <w:p>
-      <w:pPr>
-        <w:pStyle w:val="BodyText"/>
-      </w:pPr>
-      <w:r>
-        <w:t xml:space="preserve">The contribution is a primary-source map of how four governments have built their AI incentive systems, a four-layer, three-dimension coding framework that other countries and technologies can reuse, and an evidence matrix that shows which observations discriminate between explanations and which do not. The next step is to test the opportunity structure against firm behaviour: whether small compute providers exist, how domestic AI firms obtain compute, and whether the rules described here shape either.</w:t>
-      </w:r>
-    </w:p>
-    <w:bookmarkEnd w:id="46"/>
-    <w:bookmarkStart w:id="47" w:name="appendix-a.-coding-rules"/>
+        <w:t xml:space="preserve">This paper asked who can enter the AI industry in four Southeast Asian economies under the incentive rules their governments have written. All four make application development accessible, and Vietnam adds a startup track with direct equity access. Above that layer the four systems use different architectures: a single gate at data-centre capacity in Thailand, a graduated ladder in Malaysia, a priority list that puts its boundary at hardware manufacture in Vietnam, and uniform firm-scale tiers in the Philippines. In Thailand, Vietnam and the Philippines we found no AI-related instrument for compute provision below facility scale, and published cost benchmarks show that capital intensity alone does not account for the gap. Malaysia’s ladder starts closer to that scale, and whether it reaches small providers is the main open question.</w:t>
+      </w:r>
+    </w:p>
+    <w:p>
+      <w:pPr>
+        <w:pStyle w:val="BodyText"/>
+      </w:pPr>
+      <w:r>
+        <w:t xml:space="preserve">The claims are limited by the evidence. We observe eligibility rules, not realised access or outcomes. The central absence is provisional until the search protocol, the coding of general-purpose instruments and the check of Malaysia’s entry tier are complete, and the coding awaits an independent check. The data do not distinguish a design gap from rational specialisation, and they do not show that a middle-technology trap exists. They identify a design feature that could contribute to such a trap, an opportunity structure in which, in three of the four systems, domestic firms can enter applications but have no stated route into compute supply below facility scale.</w:t>
+      </w:r>
+    </w:p>
+    <w:p>
+      <w:pPr>
+        <w:pStyle w:val="BodyText"/>
+      </w:pPr>
+      <w:r>
+        <w:t xml:space="preserve">The contribution is a primary-source map of how four governments have built their AI incentive systems, a four-layer, three-dimension coding framework and a typology of incentive architectures that other countries and technologies can reuse, and an evidence matrix that shows which observations discriminate between explanations and which do not. The next step is to test the opportunity structure against firm behaviour: whether small compute providers exist, how domestic AI firms obtain compute, and whether the rules described here shape either.</w:t>
+      </w:r>
+    </w:p>
+    <w:bookmarkEnd w:id="49"/>
+    <w:bookmarkStart w:id="50" w:name="appendix-a.-coding-rules"/>
     <w:p>
       <w:pPr>
         <w:pStyle w:val="Heading2"/>
@@ -5190,8 +6183,8 @@
         <w:t xml:space="preserve">Compliance burden. Any recurring (annual or ongoing) obligation attached to continued eligibility, distinct from one-off application requirements. Fixed-cost obligations are noted explicitly.</w:t>
       </w:r>
     </w:p>
-    <w:bookmarkEnd w:id="47"/>
-    <w:bookmarkStart w:id="48" w:name="references"/>
+    <w:bookmarkEnd w:id="50"/>
+    <w:bookmarkStart w:id="51" w:name="references"/>
     <w:p>
       <w:pPr>
         <w:pStyle w:val="Heading2"/>
@@ -5331,7 +6324,7 @@
         <w:pStyle w:val="BodyText"/>
       </w:pPr>
       <w:r>
-        <w:t xml:space="preserve">Board of Investment of Thailand. (2022).</w:t>
+        <w:t xml:space="preserve">Bloom, N., Griffith, R., &amp; Van Reenen, J. (2002). Do R&amp;D tax credits work? Evidence from a panel of countries 1979-1997.</w:t>
       </w:r>
       <w:r>
         <w:t xml:space="preserve"> </w:t>
@@ -5341,18 +6334,18 @@
           <w:iCs/>
           <w:i/>
         </w:rPr>
-        <w:t xml:space="preserve">Announcements No. 8/2565, 9/2565 and 10/2565 on investment promotion measures</w:t>
-      </w:r>
-      <w:r>
-        <w:t xml:space="preserve">. Office of the Board of Investment.</w:t>
-      </w:r>
-    </w:p>
-    <w:p>
-      <w:pPr>
-        <w:pStyle w:val="BodyText"/>
-      </w:pPr>
-      <w:r>
-        <w:t xml:space="preserve">Board of Investment of Thailand. (2025).</w:t>
+        <w:t xml:space="preserve">Journal of Public Economics, 85</w:t>
+      </w:r>
+      <w:r>
+        <w:t xml:space="preserve">(1), 1-31. https://doi.org/10.1016/S0047-2727(01)00086-X</w:t>
+      </w:r>
+    </w:p>
+    <w:p>
+      <w:pPr>
+        <w:pStyle w:val="BodyText"/>
+      </w:pPr>
+      <w:r>
+        <w:t xml:space="preserve">Board of Investment of Thailand. (2022).</w:t>
       </w:r>
       <w:r>
         <w:t xml:space="preserve"> </w:t>
@@ -5362,7 +6355,7 @@
           <w:iCs/>
           <w:i/>
         </w:rPr>
-        <w:t xml:space="preserve">A guide to investment promotion 2025</w:t>
+        <w:t xml:space="preserve">Announcements No. 8/2565, 9/2565 and 10/2565 on investment promotion measures</w:t>
       </w:r>
       <w:r>
         <w:t xml:space="preserve">. Office of the Board of Investment.</w:t>
@@ -5373,7 +6366,7 @@
         <w:pStyle w:val="BodyText"/>
       </w:pPr>
       <w:r>
-        <w:t xml:space="preserve">Board of Investment of Thailand. (2026).</w:t>
+        <w:t xml:space="preserve">Board of Investment of Thailand. (2025).</w:t>
       </w:r>
       <w:r>
         <w:t xml:space="preserve"> </w:t>
@@ -5383,18 +6376,18 @@
           <w:iCs/>
           <w:i/>
         </w:rPr>
-        <w:t xml:space="preserve">Investment promotion statistics: Approvals by sub-activity, January to December 2025</w:t>
-      </w:r>
-      <w:r>
-        <w:t xml:space="preserve">. Investment Services Center.</w:t>
-      </w:r>
-    </w:p>
-    <w:p>
-      <w:pPr>
-        <w:pStyle w:val="BodyText"/>
-      </w:pPr>
-      <w:r>
-        <w:t xml:space="preserve">Cerutti, E., Garcia Pascual, A. I., Kido, Y., Li, L., Melina, G., Mendes Tavares, M., &amp; Wingender, P. (2025).</w:t>
+        <w:t xml:space="preserve">A guide to investment promotion 2025</w:t>
+      </w:r>
+      <w:r>
+        <w:t xml:space="preserve">. Office of the Board of Investment.</w:t>
+      </w:r>
+    </w:p>
+    <w:p>
+      <w:pPr>
+        <w:pStyle w:val="BodyText"/>
+      </w:pPr>
+      <w:r>
+        <w:t xml:space="preserve">Board of Investment of Thailand. (2026).</w:t>
       </w:r>
       <w:r>
         <w:t xml:space="preserve"> </w:t>
@@ -5404,21 +6397,18 @@
           <w:iCs/>
           <w:i/>
         </w:rPr>
-        <w:t xml:space="preserve">The global impact of AI: Mind the gap</w:t>
-      </w:r>
-      <w:r>
-        <w:t xml:space="preserve"> </w:t>
-      </w:r>
-      <w:r>
-        <w:t xml:space="preserve">(IMF Working Paper No. 25/76). International Monetary Fund. https://doi.org/10.5089/9798229008570.001</w:t>
-      </w:r>
-    </w:p>
-    <w:p>
-      <w:pPr>
-        <w:pStyle w:val="BodyText"/>
-      </w:pPr>
-      <w:r>
-        <w:t xml:space="preserve">Cohen, J. (1960). A coefficient of agreement for nominal scales.</w:t>
+        <w:t xml:space="preserve">Investment promotion statistics: Approvals by sub-activity, January to December 2025</w:t>
+      </w:r>
+      <w:r>
+        <w:t xml:space="preserve">. Investment Services Center.</w:t>
+      </w:r>
+    </w:p>
+    <w:p>
+      <w:pPr>
+        <w:pStyle w:val="BodyText"/>
+      </w:pPr>
+      <w:r>
+        <w:t xml:space="preserve">Cerutti, E., Garcia Pascual, A. I., Kido, Y., Li, L., Melina, G., Mendes Tavares, M., &amp; Wingender, P. (2025).</w:t>
       </w:r>
       <w:r>
         <w:t xml:space="preserve"> </w:t>
@@ -5428,18 +6418,21 @@
           <w:iCs/>
           <w:i/>
         </w:rPr>
-        <w:t xml:space="preserve">Educational and Psychological Measurement, 20</w:t>
-      </w:r>
-      <w:r>
-        <w:t xml:space="preserve">(1), 37-46.</w:t>
-      </w:r>
-    </w:p>
-    <w:p>
-      <w:pPr>
-        <w:pStyle w:val="BodyText"/>
-      </w:pPr>
-      <w:r>
-        <w:t xml:space="preserve">Collier, D. (2011). Understanding process tracing.</w:t>
+        <w:t xml:space="preserve">The global impact of AI: Mind the gap</w:t>
+      </w:r>
+      <w:r>
+        <w:t xml:space="preserve"> </w:t>
+      </w:r>
+      <w:r>
+        <w:t xml:space="preserve">(IMF Working Paper No. 25/76). International Monetary Fund. https://doi.org/10.5089/9798229008570.001</w:t>
+      </w:r>
+    </w:p>
+    <w:p>
+      <w:pPr>
+        <w:pStyle w:val="BodyText"/>
+      </w:pPr>
+      <w:r>
+        <w:t xml:space="preserve">Cohen, J. (1960). A coefficient of agreement for nominal scales.</w:t>
       </w:r>
       <w:r>
         <w:t xml:space="preserve"> </w:t>
@@ -5449,18 +6442,18 @@
           <w:iCs/>
           <w:i/>
         </w:rPr>
-        <w:t xml:space="preserve">PS: Political Science &amp; Politics, 44</w:t>
-      </w:r>
-      <w:r>
-        <w:t xml:space="preserve">(4), 823-830.</w:t>
-      </w:r>
-    </w:p>
-    <w:p>
-      <w:pPr>
-        <w:pStyle w:val="BodyText"/>
-      </w:pPr>
-      <w:r>
-        <w:t xml:space="preserve">Cucio, M., &amp; Hennig, T. (2025).</w:t>
+        <w:t xml:space="preserve">Educational and Psychological Measurement, 20</w:t>
+      </w:r>
+      <w:r>
+        <w:t xml:space="preserve">(1), 37-46.</w:t>
+      </w:r>
+    </w:p>
+    <w:p>
+      <w:pPr>
+        <w:pStyle w:val="BodyText"/>
+      </w:pPr>
+      <w:r>
+        <w:t xml:space="preserve">Collier, D. (2011). Understanding process tracing.</w:t>
       </w:r>
       <w:r>
         <w:t xml:space="preserve"> </w:t>
@@ -5470,21 +6463,18 @@
           <w:iCs/>
           <w:i/>
         </w:rPr>
-        <w:t xml:space="preserve">Artificial intelligence and the Philippine labor market: Mapping occupational exposure and complementarity</w:t>
-      </w:r>
-      <w:r>
-        <w:t xml:space="preserve"> </w:t>
-      </w:r>
-      <w:r>
-        <w:t xml:space="preserve">(IMF Working Paper No. 25/43). International Monetary Fund. https://doi.org/10.5089/9798229001977.001</w:t>
-      </w:r>
-    </w:p>
-    <w:p>
-      <w:pPr>
-        <w:pStyle w:val="BodyText"/>
-      </w:pPr>
-      <w:r>
-        <w:t xml:space="preserve">Doner, R. F., &amp; Schneider, B. R. (2016). The middle-income trap: More politics than economics.</w:t>
+        <w:t xml:space="preserve">PS: Political Science &amp; Politics, 44</w:t>
+      </w:r>
+      <w:r>
+        <w:t xml:space="preserve">(4), 823-830.</w:t>
+      </w:r>
+    </w:p>
+    <w:p>
+      <w:pPr>
+        <w:pStyle w:val="BodyText"/>
+      </w:pPr>
+      <w:r>
+        <w:t xml:space="preserve">Cucio, M., &amp; Hennig, T. (2025).</w:t>
       </w:r>
       <w:r>
         <w:t xml:space="preserve"> </w:t>
@@ -5494,18 +6484,21 @@
           <w:iCs/>
           <w:i/>
         </w:rPr>
-        <w:t xml:space="preserve">World Politics, 68</w:t>
-      </w:r>
-      <w:r>
-        <w:t xml:space="preserve">(4), 608-644. https://doi.org/10.1017/S0043887116000095</w:t>
-      </w:r>
-    </w:p>
-    <w:p>
-      <w:pPr>
-        <w:pStyle w:val="BodyText"/>
-      </w:pPr>
-      <w:r>
-        <w:t xml:space="preserve">Eichengreen, B., Park, D., &amp; Shin, K. (2012). When fast-growing economies slow down: International evidence and implications for China.</w:t>
+        <w:t xml:space="preserve">Artificial intelligence and the Philippine labor market: Mapping occupational exposure and complementarity</w:t>
+      </w:r>
+      <w:r>
+        <w:t xml:space="preserve"> </w:t>
+      </w:r>
+      <w:r>
+        <w:t xml:space="preserve">(IMF Working Paper No. 25/43). International Monetary Fund. https://doi.org/10.5089/9798229001977.001</w:t>
+      </w:r>
+    </w:p>
+    <w:p>
+      <w:pPr>
+        <w:pStyle w:val="BodyText"/>
+      </w:pPr>
+      <w:r>
+        <w:t xml:space="preserve">Doner, R. F., &amp; Schneider, B. R. (2016). The middle-income trap: More politics than economics.</w:t>
       </w:r>
       <w:r>
         <w:t xml:space="preserve"> </w:t>
@@ -5515,18 +6508,18 @@
           <w:iCs/>
           <w:i/>
         </w:rPr>
-        <w:t xml:space="preserve">Asian Economic Papers, 11</w:t>
-      </w:r>
-      <w:r>
-        <w:t xml:space="preserve">(1), 42-87. https://doi.org/10.1162/ASEP_a_00118</w:t>
-      </w:r>
-    </w:p>
-    <w:p>
-      <w:pPr>
-        <w:pStyle w:val="BodyText"/>
-      </w:pPr>
-      <w:r>
-        <w:t xml:space="preserve">Eichengreen, B., Park, D., &amp; Shin, K. (2014). Growth slowdowns redux: New evidence on the middle-income trap.</w:t>
+        <w:t xml:space="preserve">World Politics, 68</w:t>
+      </w:r>
+      <w:r>
+        <w:t xml:space="preserve">(4), 608-644. https://doi.org/10.1017/S0043887116000095</w:t>
+      </w:r>
+    </w:p>
+    <w:p>
+      <w:pPr>
+        <w:pStyle w:val="BodyText"/>
+      </w:pPr>
+      <w:r>
+        <w:t xml:space="preserve">Eichengreen, B., Park, D., &amp; Shin, K. (2012). When fast-growing economies slow down: International evidence and implications for China.</w:t>
       </w:r>
       <w:r>
         <w:t xml:space="preserve"> </w:t>
@@ -5536,18 +6529,18 @@
           <w:iCs/>
           <w:i/>
         </w:rPr>
-        <w:t xml:space="preserve">Japan and the World Economy, 32</w:t>
-      </w:r>
-      <w:r>
-        <w:t xml:space="preserve">, 65-84. https://doi.org/10.1016/j.japwor.2014.07.003</w:t>
-      </w:r>
-    </w:p>
-    <w:p>
-      <w:pPr>
-        <w:pStyle w:val="BodyText"/>
-      </w:pPr>
-      <w:r>
-        <w:t xml:space="preserve">Epoch AI. (2026).</w:t>
+        <w:t xml:space="preserve">Asian Economic Papers, 11</w:t>
+      </w:r>
+      <w:r>
+        <w:t xml:space="preserve">(1), 42-87. https://doi.org/10.1162/ASEP_a_00118</w:t>
+      </w:r>
+    </w:p>
+    <w:p>
+      <w:pPr>
+        <w:pStyle w:val="BodyText"/>
+      </w:pPr>
+      <w:r>
+        <w:t xml:space="preserve">Eichengreen, B., Park, D., &amp; Shin, K. (2014). Growth slowdowns redux: New evidence on the middle-income trap.</w:t>
       </w:r>
       <w:r>
         <w:t xml:space="preserve"> </w:t>
@@ -5557,18 +6550,18 @@
           <w:iCs/>
           <w:i/>
         </w:rPr>
-        <w:t xml:space="preserve">Total cost of ownership of a one-gigawatt AI data center</w:t>
-      </w:r>
-      <w:r>
-        <w:t xml:space="preserve">. https://epoch.ai/data-insights/ai-datacenter-cost-breakdown</w:t>
-      </w:r>
-    </w:p>
-    <w:p>
-      <w:pPr>
-        <w:pStyle w:val="BodyText"/>
-      </w:pPr>
-      <w:r>
-        <w:t xml:space="preserve">Fairfield, T., &amp; Charman, A. E. (2017). Explicit Bayesian analysis for process tracing: Guidelines, opportunities, and caveats.</w:t>
+        <w:t xml:space="preserve">Japan and the World Economy, 32</w:t>
+      </w:r>
+      <w:r>
+        <w:t xml:space="preserve">, 65-84. https://doi.org/10.1016/j.japwor.2014.07.003</w:t>
+      </w:r>
+    </w:p>
+    <w:p>
+      <w:pPr>
+        <w:pStyle w:val="BodyText"/>
+      </w:pPr>
+      <w:r>
+        <w:t xml:space="preserve">Epoch AI. (2026).</w:t>
       </w:r>
       <w:r>
         <w:t xml:space="preserve"> </w:t>
@@ -5578,18 +6571,18 @@
           <w:iCs/>
           <w:i/>
         </w:rPr>
-        <w:t xml:space="preserve">Political Analysis, 25</w:t>
-      </w:r>
-      <w:r>
-        <w:t xml:space="preserve">(3), 363-380. https://doi.org/10.1017/pan.2017.14</w:t>
-      </w:r>
-    </w:p>
-    <w:p>
-      <w:pPr>
-        <w:pStyle w:val="BodyText"/>
-      </w:pPr>
-      <w:r>
-        <w:t xml:space="preserve">Fuest, C., Gros, D., Mengel, P.-L., Presidente, G., &amp; Tirole, J. (2024).</w:t>
+        <w:t xml:space="preserve">Total cost of ownership of a one-gigawatt AI data center</w:t>
+      </w:r>
+      <w:r>
+        <w:t xml:space="preserve">. https://epoch.ai/data-insights/ai-datacenter-cost-breakdown</w:t>
+      </w:r>
+    </w:p>
+    <w:p>
+      <w:pPr>
+        <w:pStyle w:val="BodyText"/>
+      </w:pPr>
+      <w:r>
+        <w:t xml:space="preserve">Fairfield, T., &amp; Charman, A. E. (2017). Explicit Bayesian analysis for process tracing: Guidelines, opportunities, and caveats.</w:t>
       </w:r>
       <w:r>
         <w:t xml:space="preserve"> </w:t>
@@ -5599,18 +6592,18 @@
           <w:iCs/>
           <w:i/>
         </w:rPr>
-        <w:t xml:space="preserve">EU innovation policy: How to escape the middle technology trap</w:t>
-      </w:r>
-      <w:r>
-        <w:t xml:space="preserve">. EconPol Europe and ifo Institute.</w:t>
-      </w:r>
-    </w:p>
-    <w:p>
-      <w:pPr>
-        <w:pStyle w:val="BodyText"/>
-      </w:pPr>
-      <w:r>
-        <w:t xml:space="preserve">Gill, I., &amp; Kharas, H. (2007).</w:t>
+        <w:t xml:space="preserve">Political Analysis, 25</w:t>
+      </w:r>
+      <w:r>
+        <w:t xml:space="preserve">(3), 363-380. https://doi.org/10.1017/pan.2017.14</w:t>
+      </w:r>
+    </w:p>
+    <w:p>
+      <w:pPr>
+        <w:pStyle w:val="BodyText"/>
+      </w:pPr>
+      <w:r>
+        <w:t xml:space="preserve">Fuest, C., Gros, D., Mengel, P.-L., Presidente, G., &amp; Tirole, J. (2024).</w:t>
       </w:r>
       <w:r>
         <w:t xml:space="preserve"> </w:t>
@@ -5620,18 +6613,18 @@
           <w:iCs/>
           <w:i/>
         </w:rPr>
-        <w:t xml:space="preserve">An East Asian renaissance: Ideas for economic growth</w:t>
-      </w:r>
-      <w:r>
-        <w:t xml:space="preserve">. World Bank.</w:t>
-      </w:r>
-    </w:p>
-    <w:p>
-      <w:pPr>
-        <w:pStyle w:val="BodyText"/>
-      </w:pPr>
-      <w:r>
-        <w:t xml:space="preserve">Glawe, L., &amp; Wagner, H. (2020). The middle-income trap 2.0: The increasing role of human capital in the age of automation and implications for developing Asia.</w:t>
+        <w:t xml:space="preserve">EU innovation policy: How to escape the middle technology trap</w:t>
+      </w:r>
+      <w:r>
+        <w:t xml:space="preserve">. EconPol Europe and ifo Institute.</w:t>
+      </w:r>
+    </w:p>
+    <w:p>
+      <w:pPr>
+        <w:pStyle w:val="BodyText"/>
+      </w:pPr>
+      <w:r>
+        <w:t xml:space="preserve">Gill, I., &amp; Kharas, H. (2007).</w:t>
       </w:r>
       <w:r>
         <w:t xml:space="preserve"> </w:t>
@@ -5641,18 +6634,18 @@
           <w:iCs/>
           <w:i/>
         </w:rPr>
-        <w:t xml:space="preserve">Asian Economic Papers, 19</w:t>
-      </w:r>
-      <w:r>
-        <w:t xml:space="preserve">(3), 40-58. https://doi.org/10.1162/asep_a_00783</w:t>
-      </w:r>
-    </w:p>
-    <w:p>
-      <w:pPr>
-        <w:pStyle w:val="BodyText"/>
-      </w:pPr>
-      <w:r>
-        <w:t xml:space="preserve">Ide, E., &amp; Talamàs, E. (2025). Artificial intelligence in the knowledge economy.</w:t>
+        <w:t xml:space="preserve">An East Asian renaissance: Ideas for economic growth</w:t>
+      </w:r>
+      <w:r>
+        <w:t xml:space="preserve">. World Bank.</w:t>
+      </w:r>
+    </w:p>
+    <w:p>
+      <w:pPr>
+        <w:pStyle w:val="BodyText"/>
+      </w:pPr>
+      <w:r>
+        <w:t xml:space="preserve">Glawe, L., &amp; Wagner, H. (2020). The middle-income trap 2.0: The increasing role of human capital in the age of automation and implications for developing Asia.</w:t>
       </w:r>
       <w:r>
         <w:t xml:space="preserve"> </w:t>
@@ -5662,18 +6655,18 @@
           <w:iCs/>
           <w:i/>
         </w:rPr>
-        <w:t xml:space="preserve">Journal of Political Economy, 133</w:t>
-      </w:r>
-      <w:r>
-        <w:t xml:space="preserve">, 3762-3800. https://doi.org/10.1086/737233</w:t>
-      </w:r>
-    </w:p>
-    <w:p>
-      <w:pPr>
-        <w:pStyle w:val="BodyText"/>
-      </w:pPr>
-      <w:r>
-        <w:t xml:space="preserve">Ide, E., &amp; Talamàs, E. (2026). The impact of AI on global knowledge work.</w:t>
+        <w:t xml:space="preserve">Asian Economic Papers, 19</w:t>
+      </w:r>
+      <w:r>
+        <w:t xml:space="preserve">(3), 40-58. https://doi.org/10.1162/asep_a_00783</w:t>
+      </w:r>
+    </w:p>
+    <w:p>
+      <w:pPr>
+        <w:pStyle w:val="BodyText"/>
+      </w:pPr>
+      <w:r>
+        <w:t xml:space="preserve">Hausmann, R., &amp; Rodrik, D. (2003). Economic development as self-discovery.</w:t>
       </w:r>
       <w:r>
         <w:t xml:space="preserve"> </w:t>
@@ -5683,18 +6676,18 @@
           <w:iCs/>
           <w:i/>
         </w:rPr>
-        <w:t xml:space="preserve">Journal of Monetary Economics, 157</w:t>
-      </w:r>
-      <w:r>
-        <w:t xml:space="preserve">, 103876. https://doi.org/10.1016/j.jmoneco.2025.103876</w:t>
-      </w:r>
-    </w:p>
-    <w:p>
-      <w:pPr>
-        <w:pStyle w:val="BodyText"/>
-      </w:pPr>
-      <w:r>
-        <w:t xml:space="preserve">Imam, P. A., &amp; Temple, J. R. W. (2026). At the threshold: The increasing relevance of the middle-income trap.</w:t>
+        <w:t xml:space="preserve">Journal of Development Economics, 72</w:t>
+      </w:r>
+      <w:r>
+        <w:t xml:space="preserve">(2), 603-633.</w:t>
+      </w:r>
+    </w:p>
+    <w:p>
+      <w:pPr>
+        <w:pStyle w:val="BodyText"/>
+      </w:pPr>
+      <w:r>
+        <w:t xml:space="preserve">Ide, E., &amp; Talamàs, E. (2025). Artificial intelligence in the knowledge economy.</w:t>
       </w:r>
       <w:r>
         <w:t xml:space="preserve"> </w:t>
@@ -5704,18 +6697,18 @@
           <w:iCs/>
           <w:i/>
         </w:rPr>
-        <w:t xml:space="preserve">Scandinavian Journal of Economics</w:t>
-      </w:r>
-      <w:r>
-        <w:t xml:space="preserve">. Advance online publication. https://doi.org/10.1111/sjoe.70036</w:t>
-      </w:r>
-    </w:p>
-    <w:p>
-      <w:pPr>
-        <w:pStyle w:val="BodyText"/>
-      </w:pPr>
-      <w:r>
-        <w:t xml:space="preserve">Ke, Y. (2024). ASEAN Four’s middle income trap dilemma: Evidence of the middle technology trap.</w:t>
+        <w:t xml:space="preserve">Journal of Political Economy, 133</w:t>
+      </w:r>
+      <w:r>
+        <w:t xml:space="preserve">, 3762-3800. https://doi.org/10.1086/737233</w:t>
+      </w:r>
+    </w:p>
+    <w:p>
+      <w:pPr>
+        <w:pStyle w:val="BodyText"/>
+      </w:pPr>
+      <w:r>
+        <w:t xml:space="preserve">Ide, E., &amp; Talamàs, E. (2026). The impact of AI on global knowledge work.</w:t>
       </w:r>
       <w:r>
         <w:t xml:space="preserve"> </w:t>
@@ -5725,18 +6718,18 @@
           <w:iCs/>
           <w:i/>
         </w:rPr>
-        <w:t xml:space="preserve">Asian Review of Political Economy, 3</w:t>
-      </w:r>
-      <w:r>
-        <w:t xml:space="preserve">(1), 1-29. https://doi.org/10.1007/s44216-024-00033-5</w:t>
-      </w:r>
-    </w:p>
-    <w:p>
-      <w:pPr>
-        <w:pStyle w:val="BodyText"/>
-      </w:pPr>
-      <w:r>
-        <w:t xml:space="preserve">Krippendorff, K. (2018).</w:t>
+        <w:t xml:space="preserve">Journal of Monetary Economics, 157</w:t>
+      </w:r>
+      <w:r>
+        <w:t xml:space="preserve">, 103876. https://doi.org/10.1016/j.jmoneco.2025.103876</w:t>
+      </w:r>
+    </w:p>
+    <w:p>
+      <w:pPr>
+        <w:pStyle w:val="BodyText"/>
+      </w:pPr>
+      <w:r>
+        <w:t xml:space="preserve">Imam, P. A., &amp; Temple, J. R. W. (2026). At the threshold: The increasing relevance of the middle-income trap.</w:t>
       </w:r>
       <w:r>
         <w:t xml:space="preserve"> </w:t>
@@ -5746,21 +6739,18 @@
           <w:iCs/>
           <w:i/>
         </w:rPr>
-        <w:t xml:space="preserve">Content analysis: An introduction to its methodology</w:t>
-      </w:r>
-      <w:r>
-        <w:t xml:space="preserve"> </w:t>
-      </w:r>
-      <w:r>
-        <w:t xml:space="preserve">(4th ed.). SAGE.</w:t>
-      </w:r>
-    </w:p>
-    <w:p>
-      <w:pPr>
-        <w:pStyle w:val="BodyText"/>
-      </w:pPr>
-      <w:r>
-        <w:t xml:space="preserve">Lee, K. (2013).</w:t>
+        <w:t xml:space="preserve">Scandinavian Journal of Economics</w:t>
+      </w:r>
+      <w:r>
+        <w:t xml:space="preserve">. Advance online publication. https://doi.org/10.1111/sjoe.70036</w:t>
+      </w:r>
+    </w:p>
+    <w:p>
+      <w:pPr>
+        <w:pStyle w:val="BodyText"/>
+      </w:pPr>
+      <w:r>
+        <w:t xml:space="preserve">Ke, Y. (2024). ASEAN Four’s middle income trap dilemma: Evidence of the middle technology trap.</w:t>
       </w:r>
       <w:r>
         <w:t xml:space="preserve"> </w:t>
@@ -5770,18 +6760,18 @@
           <w:iCs/>
           <w:i/>
         </w:rPr>
-        <w:t xml:space="preserve">Schumpeterian analysis of economic catch-up: Knowledge, path-creation, and the middle-income trap</w:t>
-      </w:r>
-      <w:r>
-        <w:t xml:space="preserve">. Cambridge University Press. https://doi.org/10.1017/CBO9781107337244</w:t>
-      </w:r>
-    </w:p>
-    <w:p>
-      <w:pPr>
-        <w:pStyle w:val="BodyText"/>
-      </w:pPr>
-      <w:r>
-        <w:t xml:space="preserve">Lee, K. (2019).</w:t>
+        <w:t xml:space="preserve">Asian Review of Political Economy, 3</w:t>
+      </w:r>
+      <w:r>
+        <w:t xml:space="preserve">(1), 1-29. https://doi.org/10.1007/s44216-024-00033-5</w:t>
+      </w:r>
+    </w:p>
+    <w:p>
+      <w:pPr>
+        <w:pStyle w:val="BodyText"/>
+      </w:pPr>
+      <w:r>
+        <w:t xml:space="preserve">Krippendorff, K. (2018).</w:t>
       </w:r>
       <w:r>
         <w:t xml:space="preserve"> </w:t>
@@ -5791,18 +6781,21 @@
           <w:iCs/>
           <w:i/>
         </w:rPr>
-        <w:t xml:space="preserve">The art of economic catch-up: Barriers, detours and leapfrogging in innovation systems</w:t>
-      </w:r>
-      <w:r>
-        <w:t xml:space="preserve">. Cambridge University Press. https://doi.org/10.1017/9781108588232</w:t>
-      </w:r>
-    </w:p>
-    <w:p>
-      <w:pPr>
-        <w:pStyle w:val="BodyText"/>
-      </w:pPr>
-      <w:r>
-        <w:t xml:space="preserve">Lee, K., Wong, C.-Y., Intarakumnerd, P., &amp; Limapornvanich, C. (2020). Is the Fourth Industrial Revolution a window of opportunity for upgrading or reinforcing the middle-income trap? Asian model of development in Southeast Asia.</w:t>
+        <w:t xml:space="preserve">Content analysis: An introduction to its methodology</w:t>
+      </w:r>
+      <w:r>
+        <w:t xml:space="preserve"> </w:t>
+      </w:r>
+      <w:r>
+        <w:t xml:space="preserve">(4th ed.). SAGE.</w:t>
+      </w:r>
+    </w:p>
+    <w:p>
+      <w:pPr>
+        <w:pStyle w:val="BodyText"/>
+      </w:pPr>
+      <w:r>
+        <w:t xml:space="preserve">Lee, K. (2013).</w:t>
       </w:r>
       <w:r>
         <w:t xml:space="preserve"> </w:t>
@@ -5812,18 +6805,18 @@
           <w:iCs/>
           <w:i/>
         </w:rPr>
-        <w:t xml:space="preserve">Journal of Economic Policy Reform, 23</w:t>
-      </w:r>
-      <w:r>
-        <w:t xml:space="preserve">(4), 408-425. https://doi.org/10.1080/17487870.2019.1565411</w:t>
-      </w:r>
-    </w:p>
-    <w:p>
-      <w:pPr>
-        <w:pStyle w:val="BodyText"/>
-      </w:pPr>
-      <w:r>
-        <w:t xml:space="preserve">Lehdonvirta, V., Wú, B., &amp; Hawkins, Z. (2024). Compute North vs. Compute South: The uneven possibilities of compute-based AI governance around the globe.</w:t>
+        <w:t xml:space="preserve">Schumpeterian analysis of economic catch-up: Knowledge, path-creation, and the middle-income trap</w:t>
+      </w:r>
+      <w:r>
+        <w:t xml:space="preserve">. Cambridge University Press. https://doi.org/10.1017/CBO9781107337244</w:t>
+      </w:r>
+    </w:p>
+    <w:p>
+      <w:pPr>
+        <w:pStyle w:val="BodyText"/>
+      </w:pPr>
+      <w:r>
+        <w:t xml:space="preserve">Lee, K. (2019).</w:t>
       </w:r>
       <w:r>
         <w:t xml:space="preserve"> </w:t>
@@ -5833,18 +6826,18 @@
           <w:iCs/>
           <w:i/>
         </w:rPr>
-        <w:t xml:space="preserve">Proceedings of the AAAI/ACM Conference on AI, Ethics, and Society, 7</w:t>
-      </w:r>
-      <w:r>
-        <w:t xml:space="preserve">(1), 828-838. https://doi.org/10.1609/aies.v7i1.31683</w:t>
-      </w:r>
-    </w:p>
-    <w:p>
-      <w:pPr>
-        <w:pStyle w:val="BodyText"/>
-      </w:pPr>
-      <w:r>
-        <w:t xml:space="preserve">Lehdonvirta, V., Wú, B., &amp; Hawkins, Z. (2025). Weaponised interdependence in a bipolar world: How economic forces and security interests shape the global reach of US and Chinese cloud data centres.</w:t>
+        <w:t xml:space="preserve">The art of economic catch-up: Barriers, detours and leapfrogging in innovation systems</w:t>
+      </w:r>
+      <w:r>
+        <w:t xml:space="preserve">. Cambridge University Press. https://doi.org/10.1017/9781108588232</w:t>
+      </w:r>
+    </w:p>
+    <w:p>
+      <w:pPr>
+        <w:pStyle w:val="BodyText"/>
+      </w:pPr>
+      <w:r>
+        <w:t xml:space="preserve">Lee, K., Wong, C.-Y., Intarakumnerd, P., &amp; Limapornvanich, C. (2020). Is the Fourth Industrial Revolution a window of opportunity for upgrading or reinforcing the middle-income trap? Asian model of development in Southeast Asia.</w:t>
       </w:r>
       <w:r>
         <w:t xml:space="preserve"> </w:t>
@@ -5854,18 +6847,18 @@
           <w:iCs/>
           <w:i/>
         </w:rPr>
-        <w:t xml:space="preserve">Review of International Political Economy, 32</w:t>
-      </w:r>
-      <w:r>
-        <w:t xml:space="preserve">(5), 1442-1467. https://doi.org/10.1080/09692290.2025.2489077</w:t>
-      </w:r>
-    </w:p>
-    <w:p>
-      <w:pPr>
-        <w:pStyle w:val="BodyText"/>
-      </w:pPr>
-      <w:r>
-        <w:t xml:space="preserve">Mahoney, J. (2012). The logic of process tracing tests in the social sciences.</w:t>
+        <w:t xml:space="preserve">Journal of Economic Policy Reform, 23</w:t>
+      </w:r>
+      <w:r>
+        <w:t xml:space="preserve">(4), 408-425. https://doi.org/10.1080/17487870.2019.1565411</w:t>
+      </w:r>
+    </w:p>
+    <w:p>
+      <w:pPr>
+        <w:pStyle w:val="BodyText"/>
+      </w:pPr>
+      <w:r>
+        <w:t xml:space="preserve">Lehdonvirta, V., Wú, B., &amp; Hawkins, Z. (2024). Compute North vs. Compute South: The uneven possibilities of compute-based AI governance around the globe.</w:t>
       </w:r>
       <w:r>
         <w:t xml:space="preserve"> </w:t>
@@ -5875,18 +6868,18 @@
           <w:iCs/>
           <w:i/>
         </w:rPr>
-        <w:t xml:space="preserve">Sociological Methods &amp; Research, 41</w:t>
-      </w:r>
-      <w:r>
-        <w:t xml:space="preserve">(4), 570-597. https://doi.org/10.1177/0049124112437709</w:t>
-      </w:r>
-    </w:p>
-    <w:p>
-      <w:pPr>
-        <w:pStyle w:val="BodyText"/>
-      </w:pPr>
-      <w:r>
-        <w:t xml:space="preserve">Malaysia Digital Economy Corporation. (2024).</w:t>
+        <w:t xml:space="preserve">Proceedings of the AAAI/ACM Conference on AI, Ethics, and Society, 7</w:t>
+      </w:r>
+      <w:r>
+        <w:t xml:space="preserve">(1), 828-838. https://doi.org/10.1609/aies.v7i1.31683</w:t>
+      </w:r>
+    </w:p>
+    <w:p>
+      <w:pPr>
+        <w:pStyle w:val="BodyText"/>
+      </w:pPr>
+      <w:r>
+        <w:t xml:space="preserve">Lehdonvirta, V., Wú, B., &amp; Hawkins, Z. (2025). Weaponised interdependence in a bipolar world: How economic forces and security interests shape the global reach of US and Chinese cloud data centres.</w:t>
       </w:r>
       <w:r>
         <w:t xml:space="preserve"> </w:t>
@@ -5896,18 +6889,18 @@
           <w:iCs/>
           <w:i/>
         </w:rPr>
-        <w:t xml:space="preserve">Guidelines on Malaysia Digital (MD) tax incentive (new investment incentive)</w:t>
-      </w:r>
-      <w:r>
-        <w:t xml:space="preserve">. MDEC.</w:t>
-      </w:r>
-    </w:p>
-    <w:p>
-      <w:pPr>
-        <w:pStyle w:val="BodyText"/>
-      </w:pPr>
-      <w:r>
-        <w:t xml:space="preserve">Malaysian Investment Development Authority. (2022).</w:t>
+        <w:t xml:space="preserve">Review of International Political Economy, 32</w:t>
+      </w:r>
+      <w:r>
+        <w:t xml:space="preserve">(5), 1442-1467. https://doi.org/10.1080/09692290.2025.2489077</w:t>
+      </w:r>
+    </w:p>
+    <w:p>
+      <w:pPr>
+        <w:pStyle w:val="BodyText"/>
+      </w:pPr>
+      <w:r>
+        <w:t xml:space="preserve">Mahoney, J. (2012). The logic of process tracing tests in the social sciences.</w:t>
       </w:r>
       <w:r>
         <w:t xml:space="preserve"> </w:t>
@@ -5917,18 +6910,18 @@
           <w:iCs/>
           <w:i/>
         </w:rPr>
-        <w:t xml:space="preserve">Guidelines and procedures for the application of the Digital Ecosystem Acceleration (DESAC) scheme</w:t>
-      </w:r>
-      <w:r>
-        <w:t xml:space="preserve">. MIDA.</w:t>
-      </w:r>
-    </w:p>
-    <w:p>
-      <w:pPr>
-        <w:pStyle w:val="BodyText"/>
-      </w:pPr>
-      <w:r>
-        <w:t xml:space="preserve">OECD. (2024).</w:t>
+        <w:t xml:space="preserve">Sociological Methods &amp; Research, 41</w:t>
+      </w:r>
+      <w:r>
+        <w:t xml:space="preserve">(4), 570-597. https://doi.org/10.1177/0049124112437709</w:t>
+      </w:r>
+    </w:p>
+    <w:p>
+      <w:pPr>
+        <w:pStyle w:val="BodyText"/>
+      </w:pPr>
+      <w:r>
+        <w:t xml:space="preserve">Malaysia Digital Economy Corporation. (2024).</w:t>
       </w:r>
       <w:r>
         <w:t xml:space="preserve"> </w:t>
@@ -5938,21 +6931,18 @@
           <w:iCs/>
           <w:i/>
         </w:rPr>
-        <w:t xml:space="preserve">Offshoring, reshoring and the evolving geography of jobs</w:t>
-      </w:r>
-      <w:r>
-        <w:t xml:space="preserve"> </w:t>
-      </w:r>
-      <w:r>
-        <w:t xml:space="preserve">(OECD Social, Employment and Migration Working Paper). OECD Publishing.</w:t>
-      </w:r>
-    </w:p>
-    <w:p>
-      <w:pPr>
-        <w:pStyle w:val="BodyText"/>
-      </w:pPr>
-      <w:r>
-        <w:t xml:space="preserve">Philippines. (2024).</w:t>
+        <w:t xml:space="preserve">Guidelines on Malaysia Digital (MD) tax incentive (new investment incentive)</w:t>
+      </w:r>
+      <w:r>
+        <w:t xml:space="preserve">. MDEC.</w:t>
+      </w:r>
+    </w:p>
+    <w:p>
+      <w:pPr>
+        <w:pStyle w:val="BodyText"/>
+      </w:pPr>
+      <w:r>
+        <w:t xml:space="preserve">Malaysian Investment Development Authority. (2022).</w:t>
       </w:r>
       <w:r>
         <w:t xml:space="preserve"> </w:t>
@@ -5962,18 +6952,18 @@
           <w:iCs/>
           <w:i/>
         </w:rPr>
-        <w:t xml:space="preserve">Republic Act No. 12066: Corporate Recovery and Tax Incentives for Enterprises to Maximize Opportunities for Reinvigorating the Economy (CREATE MORE) Act</w:t>
-      </w:r>
-      <w:r>
-        <w:t xml:space="preserve">. Congress of the Philippines.</w:t>
-      </w:r>
-    </w:p>
-    <w:p>
-      <w:pPr>
-        <w:pStyle w:val="BodyText"/>
-      </w:pPr>
-      <w:r>
-        <w:t xml:space="preserve">Philippines, Fiscal Incentives Review Board. (2025).</w:t>
+        <w:t xml:space="preserve">Guidelines and procedures for the application of the Digital Ecosystem Acceleration (DESAC) scheme</w:t>
+      </w:r>
+      <w:r>
+        <w:t xml:space="preserve">. MIDA.</w:t>
+      </w:r>
+    </w:p>
+    <w:p>
+      <w:pPr>
+        <w:pStyle w:val="BodyText"/>
+      </w:pPr>
+      <w:r>
+        <w:t xml:space="preserve">OECD. (2024).</w:t>
       </w:r>
       <w:r>
         <w:t xml:space="preserve"> </w:t>
@@ -5983,21 +6973,21 @@
           <w:iCs/>
           <w:i/>
         </w:rPr>
-        <w:t xml:space="preserve">Implementing rules and regulations of Title XIII of the National Internal Revenue Code of 1997, as amended by Republic Act No. 12066</w:t>
-      </w:r>
-      <w:r>
-        <w:t xml:space="preserve"> </w:t>
-      </w:r>
-      <w:r>
-        <w:t xml:space="preserve">(FIRB Advisory No. 001-2025). FIRB.</w:t>
-      </w:r>
-    </w:p>
-    <w:p>
-      <w:pPr>
-        <w:pStyle w:val="BodyText"/>
-      </w:pPr>
-      <w:r>
-        <w:t xml:space="preserve">Schellekens, P., &amp; Skilling, D. (2024).</w:t>
+        <w:t xml:space="preserve">Offshoring, reshoring and the evolving geography of jobs</w:t>
+      </w:r>
+      <w:r>
+        <w:t xml:space="preserve"> </w:t>
+      </w:r>
+      <w:r>
+        <w:t xml:space="preserve">(OECD Social, Employment and Migration Working Paper). OECD Publishing.</w:t>
+      </w:r>
+    </w:p>
+    <w:p>
+      <w:pPr>
+        <w:pStyle w:val="BodyText"/>
+      </w:pPr>
+      <w:r>
+        <w:t xml:space="preserve">Philippines. (2024).</w:t>
       </w:r>
       <w:r>
         <w:t xml:space="preserve"> </w:t>
@@ -6007,18 +6997,18 @@
           <w:iCs/>
           <w:i/>
         </w:rPr>
-        <w:t xml:space="preserve">Three reasons why AI may widen global inequality</w:t>
-      </w:r>
-      <w:r>
-        <w:t xml:space="preserve">. Center for Global Development.</w:t>
-      </w:r>
-    </w:p>
-    <w:p>
-      <w:pPr>
-        <w:pStyle w:val="BodyText"/>
-      </w:pPr>
-      <w:r>
-        <w:t xml:space="preserve">Seawright, J., &amp; Gerring, J. (2008). Case selection techniques in case study research: A menu of qualitative and quantitative options.</w:t>
+        <w:t xml:space="preserve">Republic Act No. 12066: Corporate Recovery and Tax Incentives for Enterprises to Maximize Opportunities for Reinvigorating the Economy (CREATE MORE) Act</w:t>
+      </w:r>
+      <w:r>
+        <w:t xml:space="preserve">. Congress of the Philippines.</w:t>
+      </w:r>
+    </w:p>
+    <w:p>
+      <w:pPr>
+        <w:pStyle w:val="BodyText"/>
+      </w:pPr>
+      <w:r>
+        <w:t xml:space="preserve">Philippines, Fiscal Incentives Review Board. (2025).</w:t>
       </w:r>
       <w:r>
         <w:t xml:space="preserve"> </w:t>
@@ -6028,18 +7018,21 @@
           <w:iCs/>
           <w:i/>
         </w:rPr>
-        <w:t xml:space="preserve">Political Research Quarterly, 61</w:t>
-      </w:r>
-      <w:r>
-        <w:t xml:space="preserve">(2), 294-308. https://doi.org/10.1177/1065912907313077</w:t>
-      </w:r>
-    </w:p>
-    <w:p>
-      <w:pPr>
-        <w:pStyle w:val="BodyText"/>
-      </w:pPr>
-      <w:r>
-        <w:t xml:space="preserve">Turner &amp; Townsend. (2025).</w:t>
+        <w:t xml:space="preserve">Implementing rules and regulations of Title XIII of the National Internal Revenue Code of 1997, as amended by Republic Act No. 12066</w:t>
+      </w:r>
+      <w:r>
+        <w:t xml:space="preserve"> </w:t>
+      </w:r>
+      <w:r>
+        <w:t xml:space="preserve">(FIRB Advisory No. 001-2025). FIRB.</w:t>
+      </w:r>
+    </w:p>
+    <w:p>
+      <w:pPr>
+        <w:pStyle w:val="BodyText"/>
+      </w:pPr>
+      <w:r>
+        <w:t xml:space="preserve">Schellekens, P., &amp; Skilling, D. (2024).</w:t>
       </w:r>
       <w:r>
         <w:t xml:space="preserve"> </w:t>
@@ -6049,18 +7042,18 @@
           <w:iCs/>
           <w:i/>
         </w:rPr>
-        <w:t xml:space="preserve">Data centre construction cost index 2025-2026</w:t>
-      </w:r>
-      <w:r>
-        <w:t xml:space="preserve">. Turner &amp; Townsend.</w:t>
-      </w:r>
-    </w:p>
-    <w:p>
-      <w:pPr>
-        <w:pStyle w:val="BodyText"/>
-      </w:pPr>
-      <w:r>
-        <w:t xml:space="preserve">Van Evera, S. (1997).</w:t>
+        <w:t xml:space="preserve">Three reasons why AI may widen global inequality</w:t>
+      </w:r>
+      <w:r>
+        <w:t xml:space="preserve">. Center for Global Development.</w:t>
+      </w:r>
+    </w:p>
+    <w:p>
+      <w:pPr>
+        <w:pStyle w:val="BodyText"/>
+      </w:pPr>
+      <w:r>
+        <w:t xml:space="preserve">Seawright, J., &amp; Gerring, J. (2008). Case selection techniques in case study research: A menu of qualitative and quantitative options.</w:t>
       </w:r>
       <w:r>
         <w:t xml:space="preserve"> </w:t>
@@ -6070,18 +7063,18 @@
           <w:iCs/>
           <w:i/>
         </w:rPr>
-        <w:t xml:space="preserve">Guide to methods for students of political science</w:t>
-      </w:r>
-      <w:r>
-        <w:t xml:space="preserve">. Cornell University Press.</w:t>
-      </w:r>
-    </w:p>
-    <w:p>
-      <w:pPr>
-        <w:pStyle w:val="BodyText"/>
-      </w:pPr>
-      <w:r>
-        <w:t xml:space="preserve">Vietnam. (2025).</w:t>
+        <w:t xml:space="preserve">Political Research Quarterly, 61</w:t>
+      </w:r>
+      <w:r>
+        <w:t xml:space="preserve">(2), 294-308. https://doi.org/10.1177/1065912907313077</w:t>
+      </w:r>
+    </w:p>
+    <w:p>
+      <w:pPr>
+        <w:pStyle w:val="BodyText"/>
+      </w:pPr>
+      <w:r>
+        <w:t xml:space="preserve">Turner &amp; Townsend. (2025).</w:t>
       </w:r>
       <w:r>
         <w:t xml:space="preserve"> </w:t>
@@ -6091,18 +7084,18 @@
           <w:iCs/>
           <w:i/>
         </w:rPr>
-        <w:t xml:space="preserve">Law on Artificial Intelligence, No. 134/2025/QH15</w:t>
-      </w:r>
-      <w:r>
-        <w:t xml:space="preserve">. National Assembly of Vietnam.</w:t>
-      </w:r>
-    </w:p>
-    <w:p>
-      <w:pPr>
-        <w:pStyle w:val="BodyText"/>
-      </w:pPr>
-      <w:r>
-        <w:t xml:space="preserve">Vietnam. (2026a).</w:t>
+        <w:t xml:space="preserve">Data centre construction cost index 2025-2026</w:t>
+      </w:r>
+      <w:r>
+        <w:t xml:space="preserve">. Turner &amp; Townsend.</w:t>
+      </w:r>
+    </w:p>
+    <w:p>
+      <w:pPr>
+        <w:pStyle w:val="BodyText"/>
+      </w:pPr>
+      <w:r>
+        <w:t xml:space="preserve">Van Evera, S. (1997).</w:t>
       </w:r>
       <w:r>
         <w:t xml:space="preserve"> </w:t>
@@ -6112,18 +7105,18 @@
           <w:iCs/>
           <w:i/>
         </w:rPr>
-        <w:t xml:space="preserve">Decree No. 260/2026/ND-CP detailing the implementation of the Law on High Technology</w:t>
-      </w:r>
-      <w:r>
-        <w:t xml:space="preserve">. Government of Vietnam.</w:t>
-      </w:r>
-    </w:p>
-    <w:p>
-      <w:pPr>
-        <w:pStyle w:val="BodyText"/>
-      </w:pPr>
-      <w:r>
-        <w:t xml:space="preserve">Vietnam. (2026b).</w:t>
+        <w:t xml:space="preserve">Guide to methods for students of political science</w:t>
+      </w:r>
+      <w:r>
+        <w:t xml:space="preserve">. Cornell University Press.</w:t>
+      </w:r>
+    </w:p>
+    <w:p>
+      <w:pPr>
+        <w:pStyle w:val="BodyText"/>
+      </w:pPr>
+      <w:r>
+        <w:t xml:space="preserve">Vietnam. (2025).</w:t>
       </w:r>
       <w:r>
         <w:t xml:space="preserve"> </w:t>
@@ -6133,18 +7126,18 @@
           <w:iCs/>
           <w:i/>
         </w:rPr>
-        <w:t xml:space="preserve">Decision No. 21/2026/QD-TTg promulgating the list of strategic technologies and strategic technology products</w:t>
-      </w:r>
-      <w:r>
-        <w:t xml:space="preserve">. Prime Minister of Vietnam.</w:t>
-      </w:r>
-    </w:p>
-    <w:p>
-      <w:pPr>
-        <w:pStyle w:val="BodyText"/>
-      </w:pPr>
-      <w:r>
-        <w:t xml:space="preserve">Vietnam, General Statistics Office. (2024).</w:t>
+        <w:t xml:space="preserve">Law on Artificial Intelligence, No. 134/2025/QH15</w:t>
+      </w:r>
+      <w:r>
+        <w:t xml:space="preserve">. National Assembly of Vietnam.</w:t>
+      </w:r>
+    </w:p>
+    <w:p>
+      <w:pPr>
+        <w:pStyle w:val="BodyText"/>
+      </w:pPr>
+      <w:r>
+        <w:t xml:space="preserve">Vietnam. (2026a).</w:t>
       </w:r>
       <w:r>
         <w:t xml:space="preserve"> </w:t>
@@ -6154,18 +7147,18 @@
           <w:iCs/>
           <w:i/>
         </w:rPr>
-        <w:t xml:space="preserve">Statistical yearbook of Vietnam 2024</w:t>
-      </w:r>
-      <w:r>
-        <w:t xml:space="preserve">. Statistical Publishing House.</w:t>
-      </w:r>
-    </w:p>
-    <w:p>
-      <w:pPr>
-        <w:pStyle w:val="BodyText"/>
-      </w:pPr>
-      <w:r>
-        <w:t xml:space="preserve">Vietnam, Ministry of Information and Communications. (2024).</w:t>
+        <w:t xml:space="preserve">Decree No. 260/2026/ND-CP detailing the implementation of the Law on High Technology</w:t>
+      </w:r>
+      <w:r>
+        <w:t xml:space="preserve">. Government of Vietnam.</w:t>
+      </w:r>
+    </w:p>
+    <w:p>
+      <w:pPr>
+        <w:pStyle w:val="BodyText"/>
+      </w:pPr>
+      <w:r>
+        <w:t xml:space="preserve">Vietnam. (2026b).</w:t>
       </w:r>
       <w:r>
         <w:t xml:space="preserve"> </w:t>
@@ -6175,18 +7168,18 @@
           <w:iCs/>
           <w:i/>
         </w:rPr>
-        <w:t xml:space="preserve">Vietnam information and communication technology industry white book 2024</w:t>
-      </w:r>
-      <w:r>
-        <w:t xml:space="preserve">. Information and Communications Publishing House.</w:t>
-      </w:r>
-    </w:p>
-    <w:p>
-      <w:pPr>
-        <w:pStyle w:val="BodyText"/>
-      </w:pPr>
-      <w:r>
-        <w:t xml:space="preserve">Zheng, Y. (2024). The middle technology trap: China in a comparative perspective.</w:t>
+        <w:t xml:space="preserve">Decision No. 21/2026/QD-TTg promulgating the list of strategic technologies and strategic technology products</w:t>
+      </w:r>
+      <w:r>
+        <w:t xml:space="preserve">. Prime Minister of Vietnam.</w:t>
+      </w:r>
+    </w:p>
+    <w:p>
+      <w:pPr>
+        <w:pStyle w:val="BodyText"/>
+      </w:pPr>
+      <w:r>
+        <w:t xml:space="preserve">Vietnam, General Statistics Office. (2024).</w:t>
       </w:r>
       <w:r>
         <w:t xml:space="preserve"> </w:t>
@@ -6196,13 +7189,76 @@
           <w:iCs/>
           <w:i/>
         </w:rPr>
+        <w:t xml:space="preserve">Statistical yearbook of Vietnam 2024</w:t>
+      </w:r>
+      <w:r>
+        <w:t xml:space="preserve">. Statistical Publishing House.</w:t>
+      </w:r>
+    </w:p>
+    <w:p>
+      <w:pPr>
+        <w:pStyle w:val="BodyText"/>
+      </w:pPr>
+      <w:r>
+        <w:t xml:space="preserve">Vietnam, Ministry of Information and Communications. (2024).</w:t>
+      </w:r>
+      <w:r>
+        <w:t xml:space="preserve"> </w:t>
+      </w:r>
+      <w:r>
+        <w:rPr>
+          <w:iCs/>
+          <w:i/>
+        </w:rPr>
+        <w:t xml:space="preserve">Vietnam information and communication technology industry white book 2024</w:t>
+      </w:r>
+      <w:r>
+        <w:t xml:space="preserve">. Information and Communications Publishing House.</w:t>
+      </w:r>
+    </w:p>
+    <w:p>
+      <w:pPr>
+        <w:pStyle w:val="BodyText"/>
+      </w:pPr>
+      <w:r>
+        <w:t xml:space="preserve">Zee, H. H., Stotsky, J. G., &amp; Ley, E. (2002). Tax incentives for business investment: A primer for policy makers in developing countries.</w:t>
+      </w:r>
+      <w:r>
+        <w:t xml:space="preserve"> </w:t>
+      </w:r>
+      <w:r>
+        <w:rPr>
+          <w:iCs/>
+          <w:i/>
+        </w:rPr>
+        <w:t xml:space="preserve">World Development, 30</w:t>
+      </w:r>
+      <w:r>
+        <w:t xml:space="preserve">(9), 1497-1516.</w:t>
+      </w:r>
+    </w:p>
+    <w:p>
+      <w:pPr>
+        <w:pStyle w:val="BodyText"/>
+      </w:pPr>
+      <w:r>
+        <w:t xml:space="preserve">Zheng, Y. (2024). The middle technology trap: China in a comparative perspective.</w:t>
+      </w:r>
+      <w:r>
+        <w:t xml:space="preserve"> </w:t>
+      </w:r>
+      <w:r>
+        <w:rPr>
+          <w:iCs/>
+          <w:i/>
+        </w:rPr>
         <w:t xml:space="preserve">Asian Review of Political Economy, 3</w:t>
       </w:r>
       <w:r>
         <w:t xml:space="preserve">(1), 11. https://doi.org/10.1007/s44216-024-00030-8</w:t>
       </w:r>
     </w:p>
-    <w:bookmarkEnd w:id="48"/>
+    <w:bookmarkEnd w:id="51"/>
     <w:sectPr/>
   </w:body>
 </w:document>

</xml_diff>

<commit_message>
Update Malaysian sources to 2024-2026 official texts; revise Malaysia coding, figure and evidence matrix
</commit_message>
<xml_diff>
--- a/revision/02_revised_manuscript.docx
+++ b/revision/02_revised_manuscript.docx
@@ -244,7 +244,7 @@
         <w:pStyle w:val="FirstParagraph"/>
       </w:pPr>
       <w:r>
-        <w:t xml:space="preserve">Southeast Asian governments have made artificial intelligence (AI) a pillar of industrial policy, but little is known about which firms their incentive instruments let in. We code about 20 instruments from the primary legal texts of Thailand, Vietnam, Malaysia and the Philippines on five dimensions, place the explicit thresholds on a common cost scale, and ask where in the AI technology stack each system screens entrants and whether cost necessity, scale-favouring design or administrative habit better explains the pattern. The four systems use four architectures: a single capital gate (Thailand), a graduated ladder (Malaysia), a priority list without capital rules (Vietnam) and uniform firm-scale tiers (the Philippines). On the stated thresholds, all four make application-layer support accessible to small firms. Thailand’s smallest eligible infrastructure scale is about two and a half to three orders of magnitude above the capital needed to host one server. Malaysia’s entry tier is within about one order of magnitude of it. Vietnam and the Philippines state no capital rule at the infrastructure layer, so their screen lies in designation and discretion. No country has an instrument aimed at compute provision below facility scale. Cost benchmarks explain the height of Thailand’s threshold but not the absence of rungs below it. The evidence concerns legal eligibility, not realised access, and does not show that a middle-technology trap exists.</w:t>
+        <w:t xml:space="preserve">Southeast Asian governments have made artificial intelligence (AI) a pillar of industrial policy, but little is known about which firms their incentive instruments let in. We code about 20 instruments from the primary legal texts of Thailand, Vietnam, Malaysia and the Philippines on five dimensions, place explicit thresholds on a common cost scale, and ask where each system screens entrants to the AI technology stack and whether cost necessity, scale-favouring design or administrative habit better explains the pattern. The four systems use four architectures: capital-gated activities (Thailand), two parallel tracks (Malaysia), a priority list without capital rules (Vietnam) and uniform firm-scale tiers (the Philippines). On the stated thresholds all four make application-layer support accessible to small firms. Thailand’s gate for GPU data hosting lies two and a half to three orders of magnitude above the capital needed to host one server. Malaysia pairs a low-capital digital track that covers cloud services with a data-centre track whose smallest recognised category is 0.85 MW. Vietnam and the Philippines state no capital rule at the compute layers, so their screens lie in designation and discretion. We found no instrument aimed at compute provision below facility scale, but Malaysia’s low-capital cloud route shows that small providers are not excluded everywhere on paper. Cost benchmarks explain the height of Thailand’s gate, not the pattern across the four. The evidence concerns legal eligibility, not realised access, and does not show that a middle-technology trap exists.</w:t>
       </w:r>
     </w:p>
     <w:p>
@@ -384,7 +384,7 @@
         <w:t xml:space="preserve"> </w:t>
       </w:r>
       <w:r>
-        <w:t xml:space="preserve">How far above the capital needed to host a single server is the smallest scale that each system makes eligible at the compute layers, and does any instrument aim at provision below facility scale?</w:t>
+        <w:t xml:space="preserve">How far above the capital needed to host a single server is the smallest scale that each system makes eligible at the compute layers, and can a small compute provider use any instrument?</w:t>
       </w:r>
     </w:p>
     <w:p>
@@ -414,7 +414,7 @@
         <w:pStyle w:val="FirstParagraph"/>
       </w:pPr>
       <w:r>
-        <w:t xml:space="preserve">We code the primary legal texts of the four countries and, for Thailand, set the formal rules against published project approvals. Our results are as follows. On the stated thresholds, all four countries make application-layer support accessible to small firms, and Vietnam adds an explicit startup track with direct equity access. The four systems use different architectures: a single gate (Thailand), a graduated ladder (Malaysia), a priority list without capital rules (Vietnam) and uniform firm-scale tiers (the Philippines). In Thailand the smallest eligible scale at the infrastructure layer is two and a half to three orders of magnitude above the capital needed to host one server, and nothing lies between. In Malaysia the entry tier lies within about one order of magnitude of that capital. Vietnam and the Philippines state no capital rule at the infrastructure layer, so their screen lies elsewhere. No country has an instrument aimed at compute provision below facility scale. Cost benchmarks explain the height of Thailand’s threshold, the most visible pattern and a weak test of design bias, but they do not explain the absence of rungs below it.</w:t>
+        <w:t xml:space="preserve">We code the primary legal texts of the four countries and, for Thailand, set the formal rules against published project approvals. Our results are as follows. On the stated thresholds, all four countries make application-layer support accessible to small firms, and Vietnam adds an explicit startup track with direct equity access. The four systems use different architectures: capital-gated activities (Thailand), two parallel tracks (Malaysia), a priority list without capital rules (Vietnam) and uniform firm-scale tiers (the Philippines). In Thailand the gate for GPU data hosting lies two and a half to three orders of magnitude above the capital needed to host one server. Malaysia pairs a low-capital digital track that covers cloud services (RM50,000 of paid-up capital) with a data-centre track whose smallest recognised category is 0.85 MW. Vietnam and the Philippines state no capital rule at the compute layers, so their screens lie elsewhere. No instrument we coded is aimed at compute provision below facility scale. Cost benchmarks explain the height of Thailand’s gate, the most visible pattern and a weak test of design bias, but they do not explain why Vietnam and the Philippines need no capital gate or why Malaysia can admit small cloud providers.</w:t>
       </w:r>
     </w:p>
     <w:p>
@@ -430,7 +430,7 @@
         <w:pStyle w:val="BodyText"/>
       </w:pPr>
       <w:r>
-        <w:t xml:space="preserve">The paper makes four contributions. First, it provides a four-layer coding of AI incentive instruments that distinguishes layer, scale and firm vintage, which a software-versus-hardware split cannot do. Second, it classifies the four systems into four incentive architectures (gate, ladder, list, tier) and states what each implies for a small entrant. Third, it places explicit thresholds on a common cost scale and measures the distance between the smallest viable and the smallest eligible provider, which turns a qualitative impression of a gap into a quantity that other countries and technologies can reuse. Fourth, it sets out an evidence matrix that separates observations that discriminate between explanations from those that do not, so that readers can see which claims rest on which evidence.</w:t>
+        <w:t xml:space="preserve">The paper makes four contributions. First, it provides a four-layer coding of AI incentive instruments that distinguishes layer, scale and firm vintage, which a software-versus-hardware split cannot do. Second, it classifies the four systems into four incentive architectures (gate, two-track, list, tier) and states what each implies for a small entrant. Third, it places explicit thresholds on a common cost scale and measures the distance between the smallest viable and the smallest eligible provider, which turns a qualitative impression of a gap into a quantity that other countries and technologies can reuse. Fourth, it sets out an evidence matrix that separates observations that discriminate between explanations from those that do not, so that readers can see which claims rest on which evidence.</w:t>
       </w:r>
     </w:p>
     <w:p>
@@ -1168,7 +1168,7 @@
         <w:t xml:space="preserve"> </w:t>
       </w:r>
       <w:r>
-        <w:t xml:space="preserve">An instrument entered the sample if it met two rules: it is in force in the period studied, and it either names AI, cloud, data centres or digital activity as an eligible or prioritised activity or sets eligibility rules for a scheme under which such activity is registered. For each country we built the list by reading the issuing agency’s own consolidated list of schemes and the instruments those schemes cite, and we treated the instrument text, not agency summaries or press releases, as authoritative. For each source we then recorded (a) the version in force on the date of coding, (b) any amendment, consolidation or repeal found in the issuing body’s own publication record, and (c) any implementing rule or circular that could change how the coded provision is read. Decision 21/2026/QD-TTg shows why this matters: it replaced an earlier 2025 list of strategic technologies (Decision 1131/QD-TTg), and the coding reflects the 2026 decision only. Malaysia has announced a restructuring of its data-centre incentives (Section 4.3), so the currency of the DESAC guidelines is a live question.</w:t>
+        <w:t xml:space="preserve">An instrument entered the sample if it met two rules: it is in force in the period studied, and it either names AI, cloud, data centres or digital activity as an eligible or prioritised activity or sets eligibility rules for a scheme under which such activity is registered. For each country we built the list by reading the issuing agency’s own consolidated list of schemes and the instruments those schemes cite, and we treated the instrument text, not agency summaries or press releases, as authoritative. For each source we then recorded (a) the version in force on the date of coding, (b) any amendment, consolidation or repeal found in the issuing body’s own publication record, and (c) any implementing rule or circular that could change how the coded provision is read. Decision 21/2026/QD-TTg shows why this matters: it replaced an earlier 2025 list of strategic technologies (Decision 1131/QD-TTg), and the coding reflects the 2026 decision only. Malaysia’s New Incentive Framework (Section 4.3) is replacing sector-list incentives in phases, so currency is a live question for Malaysia in particular.</w:t>
       </w:r>
       <w:r>
         <w:t xml:space="preserve"> </w:t>
@@ -1519,83 +1519,67 @@
               <w:jc w:val="left"/>
             </w:pPr>
             <w:r>
-              <w:t xml:space="preserve">Malaysia Digital incentive guidelines (2024); DESAC guidelines (2022)</w:t>
-            </w:r>
-          </w:p>
-        </w:tc>
-        <w:tc>
-          <w:tcPr/>
-          <w:p>
-            <w:pPr>
-              <w:pStyle w:val="Compact"/>
-              <w:jc w:val="left"/>
-            </w:pPr>
-            <w:r>
-              <w:t xml:space="preserve">MDEC; MIDA</w:t>
-            </w:r>
-          </w:p>
-        </w:tc>
-        <w:tc>
-          <w:tcPr/>
-          <w:p>
-            <w:pPr>
-              <w:pStyle w:val="Compact"/>
-              <w:jc w:val="left"/>
-            </w:pPr>
-            <w:r>
-              <w:rPr>
-                <w:bCs/>
-                <w:b/>
-              </w:rPr>
-              <w:t xml:space="preserve">PENDING</w:t>
-            </w:r>
-          </w:p>
-        </w:tc>
-        <w:tc>
-          <w:tcPr/>
-          <w:p>
-            <w:pPr>
-              <w:pStyle w:val="Compact"/>
-              <w:jc w:val="left"/>
-            </w:pPr>
-            <w:r>
-              <w:rPr>
-                <w:bCs/>
-                <w:b/>
-              </w:rPr>
-              <w:t xml:space="preserve">PENDING</w:t>
-            </w:r>
-          </w:p>
-        </w:tc>
-        <w:tc>
-          <w:tcPr/>
-          <w:p>
-            <w:pPr>
-              <w:pStyle w:val="Compact"/>
-              <w:jc w:val="left"/>
-            </w:pPr>
-            <w:r>
-              <w:rPr>
-                <w:bCs/>
-                <w:b/>
-              </w:rPr>
-              <w:t xml:space="preserve">PENDING</w:t>
-            </w:r>
-          </w:p>
-        </w:tc>
-        <w:tc>
-          <w:tcPr/>
-          <w:p>
-            <w:pPr>
-              <w:pStyle w:val="Compact"/>
-              <w:jc w:val="left"/>
-            </w:pPr>
-            <w:r>
-              <w:rPr>
-                <w:bCs/>
-                <w:b/>
-              </w:rPr>
-              <w:t xml:space="preserve">PENDING</w:t>
+              <w:t xml:space="preserve">Guidelines on Malaysia Digital (MD) Tax Incentive, New Investment Incentive (revised 22 July 2025); Guidelines and Procedures for DESAC (version on MIDA’s site, December 2024); Guideline for Sustainable Development of Data Centre (December 2024)</w:t>
+            </w:r>
+          </w:p>
+        </w:tc>
+        <w:tc>
+          <w:tcPr/>
+          <w:p>
+            <w:pPr>
+              <w:pStyle w:val="Compact"/>
+              <w:jc w:val="left"/>
+            </w:pPr>
+            <w:r>
+              <w:t xml:space="preserve">MDEC; MIDA; MITI (hosted by MIDA)</w:t>
+            </w:r>
+          </w:p>
+        </w:tc>
+        <w:tc>
+          <w:tcPr/>
+          <w:p>
+            <w:pPr>
+              <w:pStyle w:val="Compact"/>
+              <w:jc w:val="left"/>
+            </w:pPr>
+            <w:r>
+              <w:t xml:space="preserve">DESAC applications received 1 January 2022 to 31 December 2027; MD guideline July 2025</w:t>
+            </w:r>
+          </w:p>
+        </w:tc>
+        <w:tc>
+          <w:tcPr/>
+          <w:p>
+            <w:pPr>
+              <w:pStyle w:val="Compact"/>
+              <w:jc w:val="left"/>
+            </w:pPr>
+            <w:r>
+              <w:t xml:space="preserve">English (original)</w:t>
+            </w:r>
+          </w:p>
+        </w:tc>
+        <w:tc>
+          <w:tcPr/>
+          <w:p>
+            <w:pPr>
+              <w:pStyle w:val="Compact"/>
+              <w:jc w:val="left"/>
+            </w:pPr>
+            <w:r>
+              <w:t xml:space="preserve">Read 9 October 2026 for this draft (authors to confirm)</w:t>
+            </w:r>
+          </w:p>
+        </w:tc>
+        <w:tc>
+          <w:tcPr/>
+          <w:p>
+            <w:pPr>
+              <w:pStyle w:val="Compact"/>
+              <w:jc w:val="left"/>
+            </w:pPr>
+            <w:r>
+              <w:t xml:space="preserve">New Incentive Framework (manufacturing from 1 March 2026, services from Q2 2026) does not withdraw DESAC, which stays available until its window expires (MIDA NIF FAQ, question 20); checked 9 October 2026</w:t>
             </w:r>
           </w:p>
         </w:tc>
@@ -2516,6 +2500,40 @@
         <w:pStyle w:val="BodyText"/>
       </w:pPr>
       <w:r>
+        <w:t xml:space="preserve">Secondary legal summaries add details that bear on the compute layers</w:t>
+      </w:r>
+      <w:r>
+        <w:t xml:space="preserve"> </w:t>
+      </w:r>
+      <w:r>
+        <w:rPr>
+          <w:bCs/>
+          <w:b/>
+        </w:rPr>
+        <w:t xml:space="preserve">[CITATION NEEDED: the BOI notification; VERIFY every item]</w:t>
+      </w:r>
+      <w:r>
+        <w:t xml:space="preserve">. The THB 5,000 million minimum for Activity 8.2.4 excludes land and working capital, the project must provide an electrical system of at least two megawatts, and it must operate at least two ISO/IEC 27001-certified data centres in Thailand. Data centres under Activity 8.2.1 receive the higher tier only with a power usage effectiveness of 1.3 or lower and at least two megawatts of IT load, and cloud services (Activity 8.2.2) are reported to require two such data centres. If these summaries are right, Thailand’s compute activities start at about two megawatts or at two certified facilities, and the earlier statement that cloud services are not separately provided for is wrong</w:t>
+      </w:r>
+      <w:r>
+        <w:t xml:space="preserve"> </w:t>
+      </w:r>
+      <w:r>
+        <w:rPr>
+          <w:bCs/>
+          <w:b/>
+        </w:rPr>
+        <w:t xml:space="preserve">[PENDING: correct SI row 4 and Table 3 after reading the notification]</w:t>
+      </w:r>
+      <w:r>
+        <w:t xml:space="preserve">.</w:t>
+      </w:r>
+    </w:p>
+    <w:p>
+      <w:pPr>
+        <w:pStyle w:val="BodyText"/>
+      </w:pPr>
+      <w:r>
         <w:t xml:space="preserve">The structure is more than a binary. Baseline research and development qualifies at the same accessible threshold as software. A separate competitiveness-enhancement mechanism lets qualifying firms extend the exemption to thirteen years if they make additional investment of at least 200 million baht (about US$5.6 million), representing a specified minimum share of sales over the following three years (Board of Investment of Thailand, 2022). That tier presupposes a revenue base, and it applies to software, where a cost rationale does not apply.</w:t>
       </w:r>
       <w:r>
@@ -2721,7 +2739,7 @@
         <w:pStyle w:val="FirstParagraph"/>
       </w:pPr>
       <w:r>
-        <w:t xml:space="preserve">Malaysia runs two parallel schemes. The Malaysia Digital tax incentive, covering software and digital services including AI, requires only RM50,000 (about US$11,000) of minimum paid-up capital, the lowest stated entry threshold among the countries that state one (Malaysia Digital Economy Corporation, 2024). Against this stands a recurring compliance burden: an annual self-declaration verified by an externally appointed auditor at the firm’s own expense. The cost is largely fixed, so it weighs more heavily on a firm capitalised at that level</w:t>
+        <w:t xml:space="preserve">Malaysia runs two parallel schemes with different logics. The Malaysia Digital (MD) New Investment Incentive, administered by MDEC, covers any new activity that uses one of ten promoted technology enablers, which include AI and big-data analytics and cloud (Malaysia Digital Economy Corporation, 2025). The applicant must hold MD Status, be a Malaysian-resident company with minimum paid-up capital of RM50,000 (about US$11,000), the lowest stated entry threshold among the countries that state one, and propose a new activity: it must not have issued a sales invoice for the activity before applying, with a narrow exception for firms with 60 per cent Malaysian equity. The incentive is a reduced tax rate or an investment tax allowance for ten years. Minimum conditions require an adequate number of full-time employees, among them knowledge workers earning at least RM5,000 a month, and adequate annual operating expenditure. The company must also submit an annual self-declaration within seven months of the year end, and the information in it must first be verified by an independent external auditor appointed by the company at its own cost. The cost is largely fixed, so it weighs more heavily on a small firm</w:t>
       </w:r>
       <w:r>
         <w:t xml:space="preserve"> </w:t>
@@ -2734,80 +2752,75 @@
         <w:t xml:space="preserve">[PENDING: the size of the audit cost relative to RM50,000]</w:t>
       </w:r>
       <w:r>
-        <w:t xml:space="preserve">. The effect is regressive in firm size, as is the profit-presupposing credit that Bahar et al. (2026) identify for Japan, but it works through a different channel, a fixed cost and not a profit requirement.</w:t>
-      </w:r>
-    </w:p>
-    <w:p>
-      <w:pPr>
-        <w:pStyle w:val="BodyText"/>
-      </w:pPr>
-      <w:r>
-        <w:t xml:space="preserve">DESAC covers data centres and cloud infrastructure and uses a graduated structure (Malaysian Investment Development Authority, 2022). Entry-level eligibility requires RM2.5 million (about US$550,000) of paid-up capital, and the full ten-year highest-rate benefit requires cumulative capital expenditure of RM1 billion (about US$220 million), which exceeds Thailand’s threshold in dollar terms. A separate, lower threshold applies to existing firms expanding. On the benchmarks of Section 3.3, US$0.55 million is about 51 kW of construction or 14 kW of fully equipped capacity, the scale of one server or a rack. The entry tier is paid-up capital, not capital expenditure, so this shows that the tier is not pitched at facility scale in capital terms, not that a rack-scale provider can use it. Secondary summaries describe the qualifying activities as data centre and cloud computing, data centre and data hosting, and submarine cable, and report that data-centre eligibility is tied to separate sustainability guidelines on power and water efficiency, which could themselves screen out small operators</w:t>
-      </w:r>
-      <w:r>
-        <w:t xml:space="preserve"> </w:t>
-      </w:r>
-      <w:r>
-        <w:rPr>
-          <w:bCs/>
-          <w:b/>
-        </w:rPr>
-        <w:t xml:space="preserve">[VERIFY against the primary MIDA and MITI documents]</w:t>
+        <w:t xml:space="preserve">. The effect is regressive in firm size, as is the profit-presupposing credit that Bahar et al. (2026) identify for Japan, but it works through a different channel, a fixed cost and not a profit requirement. Because</w:t>
+      </w:r>
+      <w:r>
+        <w:t xml:space="preserve"> </w:t>
+      </w:r>
+      <w:r>
+        <w:t xml:space="preserve">“</w:t>
+      </w:r>
+      <w:r>
+        <w:t xml:space="preserve">provision of services utilising cloud</w:t>
+      </w:r>
+      <w:r>
+        <w:t xml:space="preserve">”</w:t>
+      </w:r>
+      <w:r>
+        <w:t xml:space="preserve"> </w:t>
+      </w:r>
+      <w:r>
+        <w:t xml:space="preserve">is a Malaysia Digital activity, a small compute provider could in principle apply through this route</w:t>
+      </w:r>
+      <w:r>
+        <w:t xml:space="preserve"> </w:t>
+      </w:r>
+      <w:r>
+        <w:rPr>
+          <w:bCs/>
+          <w:b/>
+        </w:rPr>
+        <w:t xml:space="preserve">[VERIFY with MDEC whether provision of capacity as a service is accepted as an MD activity]</w:t>
       </w:r>
       <w:r>
         <w:t xml:space="preserve">.</w:t>
       </w:r>
-      <w:r>
-        <w:t xml:space="preserve"> </w:t>
-      </w:r>
-      <w:r>
-        <w:rPr>
-          <w:bCs/>
-          <w:b/>
-        </w:rPr>
-        <w:t xml:space="preserve">[VERIFY, the most consequential open check in the paper: the tiers in the DESAC guidelines (the matrix lists a</w:t>
-      </w:r>
-      <w:r>
-        <w:rPr>
-          <w:bCs/>
-          <w:b/>
-        </w:rPr>
-        <w:t xml:space="preserve"> </w:t>
-      </w:r>
-      <w:r>
-        <w:rPr>
-          <w:bCs/>
-          <w:b/>
-        </w:rPr>
-        <w:t xml:space="preserve">“</w:t>
-      </w:r>
-      <w:r>
-        <w:rPr>
-          <w:bCs/>
-          <w:b/>
-        </w:rPr>
-        <w:t xml:space="preserve">Tier 2 entry</w:t>
-      </w:r>
-      <w:r>
-        <w:rPr>
-          <w:bCs/>
-          <w:b/>
-        </w:rPr>
-        <w:t xml:space="preserve">”</w:t>
-      </w:r>
-      <w:r>
-        <w:rPr>
-          <w:bCs/>
-          <w:b/>
-        </w:rPr>
-        <w:t xml:space="preserve"> </w:t>
-      </w:r>
-      <w:r>
-        <w:rPr>
-          <w:bCs/>
-          <w:b/>
-        </w:rPr>
-        <w:t xml:space="preserve">and describes no other tier), what the firm must build or operate to qualify, whether a minimum capacity or qualifying capex applies, and whether a firm that leases space and equipment can qualify.]</w:t>
+    </w:p>
+    <w:p>
+      <w:pPr>
+        <w:pStyle w:val="BodyText"/>
+      </w:pPr>
+      <w:r>
+        <w:t xml:space="preserve">The Digital Ecosystem Acceleration (DESAC) scheme, administered by MIDA, serves a different group (Malaysian Investment Development Authority, 2024). Its qualifying activities are submarine cable including cable landing stations, and data centre and cloud computing or data hosting. The applicant must be a Malaysian-incorporated, resident digital infrastructure provider. The incentive is an investment tax allowance of 100 per cent (Tier 1) or 60 per cent (Tier 2) on qualifying capital investment excluding land, for five or ten years, or a special tax rate of 10 or 15 per cent. Tier 2 requires compliance with minimum conditions: paid-up capital of at least RM2.5 million (about US$550,000), capital expenditure as proposed, full-time Malaysian employees earning at least RM5,000 a month making up at least half of total manpower, at least two local vendor development programmes, adoption of Industry 4.0 elements, and at least one green technology. Tier 1 adds outcome conditions, among them high-value jobs of at least RM10,000 a month and at least three local vendor programmes. The ten-year option requires, in its second five years, cumulative capital expenditure of at least RM1 billion (about US$220 million), which exceeds Thailand’s threshold in dollar terms. For existing companies expanding, Tier 1 adds capital expenditure of at least RM300 million over five years. An application must reach MIDA before the project begins, a National Committee on Investment approves it, and compliance with the minimum conditions is declared with verification by external auditors. For the special-rate option an annual compliance report is also due. Applications are open from 1 January 2022 to 31 December 2027.</w:t>
+      </w:r>
+    </w:p>
+    <w:p>
+      <w:pPr>
+        <w:pStyle w:val="BodyText"/>
+      </w:pPr>
+      <w:r>
+        <w:t xml:space="preserve">DESAC is therefore not a ladder of capital tiers. Both tiers carry the same capitalisation floor, and the two tiers differ in outcome conditions. The scale of the project is left to the proposal, apart from the RM1 billion condition for the second five years. The sustainability guideline that governs data-centre applications received until 31 December 2027 sets design targets for power usage effectiveness (PUE) and water usage effectiveness (WUE) by category of data centre, and its smallest category is a low-voltage facility of 0.85 MW to under 4.25 MW (Malaysia, Ministry of Investment, Trade and Industry, 2024)</w:t>
+      </w:r>
+      <w:r>
+        <w:t xml:space="preserve"> </w:t>
+      </w:r>
+      <w:r>
+        <w:rPr>
+          <w:bCs/>
+          <w:b/>
+        </w:rPr>
+        <w:t xml:space="preserve">[VERIFY issuer and date of the guideline]</w:t>
+      </w:r>
+      <w:r>
+        <w:t xml:space="preserve">. On the benchmarks of Section 3.3, 0.85 MW is about US$9 million to US$32 million of capital to host, 1.3 to 2.4 orders of magnitude above one server. The paid-up capital floor of US$0.55 million measures how well capitalised the company is. It does not measure the scale of the project, so it is not a rung of project size. DESAC conditions are also written for facility operators: the local vendor programmes cover network infrastructure, cooling, electrical components and power systems, and the tax allowance applies to qualifying capital investment, which a firm that leases its space and equipment largely lacks.</w:t>
+      </w:r>
+    </w:p>
+    <w:p>
+      <w:pPr>
+        <w:pStyle w:val="BodyText"/>
+      </w:pPr>
+      <w:r>
+        <w:t xml:space="preserve">Malaysia’s New Incentive Framework, announced in Budget 2026, moves from sector-based qualification and profit-based tax holidays towards tiered, outcome-based assessment against national outcomes. It applied to manufacturing from 1 March 2026 and applies to services from a second-quarter 2026 date still to be announced, and its published FAQ states that existing packages other than those under the Promotion of Investments Act, DESAC among them, remain available until their application windows expire (Malaysian Investment Development Authority, 2026).</w:t>
       </w:r>
     </w:p>
     <w:p>
@@ -2825,7 +2838,7 @@
           <w:bCs/>
           <w:b/>
         </w:rPr>
-        <w:t xml:space="preserve">[VERIFY: speaker names, dates and wording, which are listed as unverified; and whether the DESAC guidelines of 2022 remain in force]</w:t>
+        <w:t xml:space="preserve">[VERIFY: speaker names, dates and wording, which are listed as unverified; the New Incentive Framework above is the documented change, and we have not confirmed that the remarks led to any change in DESAC]</w:t>
       </w:r>
       <w:r>
         <w:t xml:space="preserve">. This shows that policymakers saw a problem with the existing design. It does not show that firm-size bias is the cause, since low employment per unit of capital is also what a capital-intensive activity produces.</w:t>
@@ -2836,7 +2849,7 @@
         <w:pStyle w:val="BodyText"/>
       </w:pPr>
       <w:r>
-        <w:t xml:space="preserve">DESAC also requires that at least half of a data centre’s full-time staff be Malaysian nationals earning above a specified salary level. A proportional requirement is not a scale filter, since a ten-person firm can meet it as readily as a thousand-person firm, and we record it as an exploratory observation outside the central mechanism.</w:t>
+        <w:t xml:space="preserve">The staffing rule is proportional (at least half of manpower, at RM5,000 a month or more). A proportional requirement is not a scale filter, since a ten-person firm can meet it as readily as a thousand-person firm, and we record it as an exploratory observation outside the central mechanism.</w:t>
       </w:r>
     </w:p>
     <w:bookmarkEnd w:id="36"/>
@@ -3078,10 +3091,164 @@
               <w:jc w:val="left"/>
             </w:pPr>
             <w:r>
-              <w:t xml:space="preserve">Minimum capital about US$140 million (Activity 8.2.4); layer assignment</w:t>
+              <w:t xml:space="preserve">Minimum capital about US$140 million, excluding land (Activity 8.2.4); about 2 MW electrical capacity and two certified data centres; Activities 8.2.1 and 8.2.2 also exist (</w:t>
+            </w:r>
+            <w:r>
+              <w:rPr>
+                <w:bCs/>
+                <w:b/>
+              </w:rPr>
+              <w:t xml:space="preserve">VERIFY</w:t>
+            </w:r>
+            <w:r>
+              <w:t xml:space="preserve">)</w:t>
+            </w:r>
+          </w:p>
+        </w:tc>
+        <w:tc>
+          <w:tcPr/>
+          <w:p>
+            <w:pPr>
+              <w:pStyle w:val="Compact"/>
+              <w:jc w:val="left"/>
+            </w:pPr>
+            <w:r>
+              <w:t xml:space="preserve">Cloud-computing platforms in top tier; no capital rule; scope</w:t>
             </w:r>
             <w:r>
               <w:t xml:space="preserve"> </w:t>
+            </w:r>
+            <w:r>
+              <w:rPr>
+                <w:bCs/>
+                <w:b/>
+              </w:rPr>
+              <w:t xml:space="preserve">VERIFY</w:t>
+            </w:r>
+          </w:p>
+        </w:tc>
+        <w:tc>
+          <w:tcPr/>
+          <w:p>
+            <w:pPr>
+              <w:pStyle w:val="Compact"/>
+              <w:jc w:val="left"/>
+            </w:pPr>
+            <w:r>
+              <w:t xml:space="preserve">MD track: cloud is a promoted enabler, RM50,000 paid-up capital (capacity resale</w:t>
+            </w:r>
+            <w:r>
+              <w:t xml:space="preserve"> </w:t>
+            </w:r>
+            <w:r>
+              <w:rPr>
+                <w:bCs/>
+                <w:b/>
+              </w:rPr>
+              <w:t xml:space="preserve">VERIFY</w:t>
+            </w:r>
+            <w:r>
+              <w:t xml:space="preserve">). DESAC: paid-up floor about US$550,000, smallest category 0.85 MW, ten-year condition about US$220 million capex</w:t>
+            </w:r>
+          </w:p>
+        </w:tc>
+        <w:tc>
+          <w:tcPr/>
+          <w:p>
+            <w:pPr>
+              <w:pStyle w:val="Compact"/>
+              <w:jc w:val="left"/>
+            </w:pPr>
+            <w:r>
+              <w:t xml:space="preserve">Same priority tier as AI applications; no minimum; PHP 15 billion firm-scale tier for extended benefits</w:t>
+            </w:r>
+          </w:p>
+        </w:tc>
+      </w:tr>
+      <w:tr>
+        <w:tc>
+          <w:tcPr/>
+          <w:p>
+            <w:pPr>
+              <w:pStyle w:val="Compact"/>
+              <w:jc w:val="left"/>
+            </w:pPr>
+            <w:r>
+              <w:t xml:space="preserve">Layer (iv), hardware</w:t>
+            </w:r>
+          </w:p>
+        </w:tc>
+        <w:tc>
+          <w:tcPr/>
+          <w:p>
+            <w:pPr>
+              <w:pStyle w:val="Compact"/>
+              <w:jc w:val="left"/>
+            </w:pPr>
+            <w:r>
+              <w:t xml:space="preserve">Uncoded (separate activity divisions)</w:t>
+            </w:r>
+          </w:p>
+        </w:tc>
+        <w:tc>
+          <w:tcPr/>
+          <w:p>
+            <w:pPr>
+              <w:pStyle w:val="Compact"/>
+              <w:jc w:val="left"/>
+            </w:pPr>
+            <w:r>
+              <w:t xml:space="preserve">Specialised chips in lower priority tier</w:t>
+            </w:r>
+          </w:p>
+        </w:tc>
+        <w:tc>
+          <w:tcPr/>
+          <w:p>
+            <w:pPr>
+              <w:pStyle w:val="Compact"/>
+              <w:jc w:val="left"/>
+            </w:pPr>
+            <w:r>
+              <w:t xml:space="preserve">Uncoded (separate schemes)</w:t>
+            </w:r>
+          </w:p>
+        </w:tc>
+        <w:tc>
+          <w:tcPr/>
+          <w:p>
+            <w:pPr>
+              <w:pStyle w:val="Compact"/>
+              <w:jc w:val="left"/>
+            </w:pPr>
+            <w:r>
+              <w:t xml:space="preserve">Uncoded (no distinct treatment)</w:t>
+            </w:r>
+          </w:p>
+        </w:tc>
+      </w:tr>
+      <w:tr>
+        <w:tc>
+          <w:tcPr/>
+          <w:p>
+            <w:pPr>
+              <w:pStyle w:val="Compact"/>
+              <w:jc w:val="left"/>
+            </w:pPr>
+            <w:r>
+              <w:t xml:space="preserve">Instrument aimed at compute provision below facility scale</w:t>
+            </w:r>
+          </w:p>
+        </w:tc>
+        <w:tc>
+          <w:tcPr/>
+          <w:p>
+            <w:pPr>
+              <w:pStyle w:val="Compact"/>
+              <w:jc w:val="left"/>
+            </w:pPr>
+            <w:r>
+              <w:t xml:space="preserve">None identified (</w:t>
             </w:r>
             <w:r>
               <w:rPr>
@@ -3090,20 +3257,45 @@
               </w:rPr>
               <w:t xml:space="preserve">PENDING</w:t>
             </w:r>
-          </w:p>
-        </w:tc>
-        <w:tc>
-          <w:tcPr/>
-          <w:p>
-            <w:pPr>
-              <w:pStyle w:val="Compact"/>
-              <w:jc w:val="left"/>
-            </w:pPr>
-            <w:r>
-              <w:t xml:space="preserve">Cloud-computing platforms in top tier; no capital rule; scope</w:t>
-            </w:r>
             <w:r>
               <w:t xml:space="preserve"> </w:t>
+            </w:r>
+            <w:r>
+              <w:t xml:space="preserve">search protocol)</w:t>
+            </w:r>
+          </w:p>
+        </w:tc>
+        <w:tc>
+          <w:tcPr/>
+          <w:p>
+            <w:pPr>
+              <w:pStyle w:val="Compact"/>
+              <w:jc w:val="left"/>
+            </w:pPr>
+            <w:r>
+              <w:t xml:space="preserve">None identified (</w:t>
+            </w:r>
+            <w:r>
+              <w:rPr>
+                <w:bCs/>
+                <w:b/>
+              </w:rPr>
+              <w:t xml:space="preserve">PENDING</w:t>
+            </w:r>
+            <w:r>
+              <w:t xml:space="preserve">)</w:t>
+            </w:r>
+          </w:p>
+        </w:tc>
+        <w:tc>
+          <w:tcPr/>
+          <w:p>
+            <w:pPr>
+              <w:pStyle w:val="Compact"/>
+              <w:jc w:val="left"/>
+            </w:pPr>
+            <w:r>
+              <w:t xml:space="preserve">None aimed at it; the MD track may admit small cloud providers (</w:t>
             </w:r>
             <w:r>
               <w:rPr>
@@ -3112,20 +3304,180 @@
               </w:rPr>
               <w:t xml:space="preserve">VERIFY</w:t>
             </w:r>
-          </w:p>
-        </w:tc>
-        <w:tc>
-          <w:tcPr/>
-          <w:p>
-            <w:pPr>
-              <w:pStyle w:val="Compact"/>
-              <w:jc w:val="left"/>
-            </w:pPr>
-            <w:r>
-              <w:t xml:space="preserve">DESAC: entry about US$550,000 paid-up capital, top tier about US$220 million capex; entry-tier coverage</w:t>
-            </w:r>
-            <w:r>
-              <w:t xml:space="preserve"> </w:t>
+            <w:r>
+              <w:t xml:space="preserve">)</w:t>
+            </w:r>
+          </w:p>
+        </w:tc>
+        <w:tc>
+          <w:tcPr/>
+          <w:p>
+            <w:pPr>
+              <w:pStyle w:val="Compact"/>
+              <w:jc w:val="left"/>
+            </w:pPr>
+            <w:r>
+              <w:t xml:space="preserve">None identified (</w:t>
+            </w:r>
+            <w:r>
+              <w:rPr>
+                <w:bCs/>
+                <w:b/>
+              </w:rPr>
+              <w:t xml:space="preserve">PENDING</w:t>
+            </w:r>
+            <w:r>
+              <w:t xml:space="preserve">)</w:t>
+            </w:r>
+          </w:p>
+        </w:tc>
+      </w:tr>
+      <w:tr>
+        <w:tc>
+          <w:tcPr/>
+          <w:p>
+            <w:pPr>
+              <w:pStyle w:val="Compact"/>
+              <w:jc w:val="left"/>
+            </w:pPr>
+            <w:r>
+              <w:t xml:space="preserve">Explicit accommodation for small or new firms</w:t>
+            </w:r>
+          </w:p>
+        </w:tc>
+        <w:tc>
+          <w:tcPr/>
+          <w:p>
+            <w:pPr>
+              <w:pStyle w:val="Compact"/>
+              <w:jc w:val="left"/>
+            </w:pPr>
+            <w:r>
+              <w:t xml:space="preserve">None explicit (low threshold at layer (i))</w:t>
+            </w:r>
+          </w:p>
+        </w:tc>
+        <w:tc>
+          <w:tcPr/>
+          <w:p>
+            <w:pPr>
+              <w:pStyle w:val="Compact"/>
+              <w:jc w:val="left"/>
+            </w:pPr>
+            <w:r>
+              <w:t xml:space="preserve">Startup track (Decree 260, Art. 11)</w:t>
+            </w:r>
+          </w:p>
+        </w:tc>
+        <w:tc>
+          <w:tcPr/>
+          <w:p>
+            <w:pPr>
+              <w:pStyle w:val="Compact"/>
+              <w:jc w:val="left"/>
+            </w:pPr>
+            <w:r>
+              <w:t xml:space="preserve">None explicit (low entry capital; MD requires a new activity)</w:t>
+            </w:r>
+          </w:p>
+        </w:tc>
+        <w:tc>
+          <w:tcPr/>
+          <w:p>
+            <w:pPr>
+              <w:pStyle w:val="Compact"/>
+              <w:jc w:val="left"/>
+            </w:pPr>
+            <w:r>
+              <w:t xml:space="preserve">None explicit</w:t>
+            </w:r>
+          </w:p>
+        </w:tc>
+      </w:tr>
+      <w:tr>
+        <w:tc>
+          <w:tcPr/>
+          <w:p>
+            <w:pPr>
+              <w:pStyle w:val="Compact"/>
+              <w:jc w:val="left"/>
+            </w:pPr>
+            <w:r>
+              <w:t xml:space="preserve">Delivery mechanism at the accessible tier</w:t>
+            </w:r>
+          </w:p>
+        </w:tc>
+        <w:tc>
+          <w:tcPr/>
+          <w:p>
+            <w:pPr>
+              <w:pStyle w:val="Compact"/>
+              <w:jc w:val="left"/>
+            </w:pPr>
+            <w:r>
+              <w:t xml:space="preserve">Indirect (tax exemption)</w:t>
+            </w:r>
+          </w:p>
+        </w:tc>
+        <w:tc>
+          <w:tcPr/>
+          <w:p>
+            <w:pPr>
+              <w:pStyle w:val="Compact"/>
+              <w:jc w:val="left"/>
+            </w:pPr>
+            <w:r>
+              <w:t xml:space="preserve">Tax plus direct equity access</w:t>
+            </w:r>
+          </w:p>
+        </w:tc>
+        <w:tc>
+          <w:tcPr/>
+          <w:p>
+            <w:pPr>
+              <w:pStyle w:val="Compact"/>
+              <w:jc w:val="left"/>
+            </w:pPr>
+            <w:r>
+              <w:t xml:space="preserve">Indirect (tax exemption)</w:t>
+            </w:r>
+          </w:p>
+        </w:tc>
+        <w:tc>
+          <w:tcPr/>
+          <w:p>
+            <w:pPr>
+              <w:pStyle w:val="Compact"/>
+              <w:jc w:val="left"/>
+            </w:pPr>
+            <w:r>
+              <w:t xml:space="preserve">Indirect (tax exemption)</w:t>
+            </w:r>
+          </w:p>
+        </w:tc>
+      </w:tr>
+      <w:tr>
+        <w:tc>
+          <w:tcPr/>
+          <w:p>
+            <w:pPr>
+              <w:pStyle w:val="Compact"/>
+              <w:jc w:val="left"/>
+            </w:pPr>
+            <w:r>
+              <w:t xml:space="preserve">Recurring compliance burden</w:t>
+            </w:r>
+          </w:p>
+        </w:tc>
+        <w:tc>
+          <w:tcPr/>
+          <w:p>
+            <w:pPr>
+              <w:pStyle w:val="Compact"/>
+              <w:jc w:val="left"/>
+            </w:pPr>
+            <w:r>
+              <w:t xml:space="preserve">ISO/IEC 27001 certification at the infrastructure activities (</w:t>
             </w:r>
             <w:r>
               <w:rPr>
@@ -3134,17 +3486,44 @@
               </w:rPr>
               <w:t xml:space="preserve">VERIFY</w:t>
             </w:r>
-          </w:p>
-        </w:tc>
-        <w:tc>
-          <w:tcPr/>
-          <w:p>
-            <w:pPr>
-              <w:pStyle w:val="Compact"/>
-              <w:jc w:val="left"/>
-            </w:pPr>
-            <w:r>
-              <w:t xml:space="preserve">Same priority tier as AI applications; no minimum; PHP 15 billion firm-scale tier for extended benefits</w:t>
+            <w:r>
+              <w:t xml:space="preserve">)</w:t>
+            </w:r>
+          </w:p>
+        </w:tc>
+        <w:tc>
+          <w:tcPr/>
+          <w:p>
+            <w:pPr>
+              <w:pStyle w:val="Compact"/>
+              <w:jc w:val="left"/>
+            </w:pPr>
+            <w:r>
+              <w:t xml:space="preserve">R&amp;D staffing and spending ratios (research track)</w:t>
+            </w:r>
+          </w:p>
+        </w:tc>
+        <w:tc>
+          <w:tcPr/>
+          <w:p>
+            <w:pPr>
+              <w:pStyle w:val="Compact"/>
+              <w:jc w:val="left"/>
+            </w:pPr>
+            <w:r>
+              <w:t xml:space="preserve">Annual auditor-verified self-declaration at own cost (MD); auditor-verified declaration and annual report (DESAC)</w:t>
+            </w:r>
+          </w:p>
+        </w:tc>
+        <w:tc>
+          <w:tcPr/>
+          <w:p>
+            <w:pPr>
+              <w:pStyle w:val="Compact"/>
+              <w:jc w:val="left"/>
+            </w:pPr>
+            <w:r>
+              <w:t xml:space="preserve">FIRB escalation above PHP 15 billion</w:t>
             </w:r>
           </w:p>
         </w:tc>
@@ -3158,55 +3537,55 @@
               <w:jc w:val="left"/>
             </w:pPr>
             <w:r>
-              <w:t xml:space="preserve">Layer (iv), hardware</w:t>
-            </w:r>
-          </w:p>
-        </w:tc>
-        <w:tc>
-          <w:tcPr/>
-          <w:p>
-            <w:pPr>
-              <w:pStyle w:val="Compact"/>
-              <w:jc w:val="left"/>
-            </w:pPr>
-            <w:r>
-              <w:t xml:space="preserve">Uncoded (separate activity divisions)</w:t>
-            </w:r>
-          </w:p>
-        </w:tc>
-        <w:tc>
-          <w:tcPr/>
-          <w:p>
-            <w:pPr>
-              <w:pStyle w:val="Compact"/>
-              <w:jc w:val="left"/>
-            </w:pPr>
-            <w:r>
-              <w:t xml:space="preserve">Specialised chips in lower priority tier</w:t>
-            </w:r>
-          </w:p>
-        </w:tc>
-        <w:tc>
-          <w:tcPr/>
-          <w:p>
-            <w:pPr>
-              <w:pStyle w:val="Compact"/>
-              <w:jc w:val="left"/>
-            </w:pPr>
-            <w:r>
-              <w:t xml:space="preserve">Uncoded (separate schemes)</w:t>
-            </w:r>
-          </w:p>
-        </w:tc>
-        <w:tc>
-          <w:tcPr/>
-          <w:p>
-            <w:pPr>
-              <w:pStyle w:val="Compact"/>
-              <w:jc w:val="left"/>
-            </w:pPr>
-            <w:r>
-              <w:t xml:space="preserve">Uncoded (no distinct treatment)</w:t>
+              <w:t xml:space="preserve">Where the screen falls</w:t>
+            </w:r>
+          </w:p>
+        </w:tc>
+        <w:tc>
+          <w:tcPr/>
+          <w:p>
+            <w:pPr>
+              <w:pStyle w:val="Compact"/>
+              <w:jc w:val="left"/>
+            </w:pPr>
+            <w:r>
+              <w:t xml:space="preserve">Capital and capacity gate at the data-hosting activity</w:t>
+            </w:r>
+          </w:p>
+        </w:tc>
+        <w:tc>
+          <w:tcPr/>
+          <w:p>
+            <w:pPr>
+              <w:pStyle w:val="Compact"/>
+              <w:jc w:val="left"/>
+            </w:pPr>
+            <w:r>
+              <w:t xml:space="preserve">No capital screen in coded instruments; designation</w:t>
+            </w:r>
+          </w:p>
+        </w:tc>
+        <w:tc>
+          <w:tcPr/>
+          <w:p>
+            <w:pPr>
+              <w:pStyle w:val="Compact"/>
+              <w:jc w:val="left"/>
+            </w:pPr>
+            <w:r>
+              <w:t xml:space="preserve">Two tracks: low capital floor (MD); facility categories from 0.85 MW, outcome conditions and committee approval (DESAC)</w:t>
+            </w:r>
+          </w:p>
+        </w:tc>
+        <w:tc>
+          <w:tcPr/>
+          <w:p>
+            <w:pPr>
+              <w:pStyle w:val="Compact"/>
+              <w:jc w:val="left"/>
+            </w:pPr>
+            <w:r>
+              <w:t xml:space="preserve">Inclusion, evaluation and firm-scale tier for extended benefits</w:t>
             </w:r>
           </w:p>
         </w:tc>
@@ -3220,98 +3599,55 @@
               <w:jc w:val="left"/>
             </w:pPr>
             <w:r>
-              <w:t xml:space="preserve">Instrument aimed at compute provision below facility scale</w:t>
-            </w:r>
-          </w:p>
-        </w:tc>
-        <w:tc>
-          <w:tcPr/>
-          <w:p>
-            <w:pPr>
-              <w:pStyle w:val="Compact"/>
-              <w:jc w:val="left"/>
-            </w:pPr>
-            <w:r>
-              <w:t xml:space="preserve">None identified (</w:t>
-            </w:r>
-            <w:r>
-              <w:rPr>
-                <w:bCs/>
-                <w:b/>
-              </w:rPr>
-              <w:t xml:space="preserve">PENDING</w:t>
-            </w:r>
-            <w:r>
-              <w:t xml:space="preserve"> </w:t>
-            </w:r>
-            <w:r>
-              <w:t xml:space="preserve">search protocol)</w:t>
-            </w:r>
-          </w:p>
-        </w:tc>
-        <w:tc>
-          <w:tcPr/>
-          <w:p>
-            <w:pPr>
-              <w:pStyle w:val="Compact"/>
-              <w:jc w:val="left"/>
-            </w:pPr>
-            <w:r>
-              <w:t xml:space="preserve">None identified (</w:t>
-            </w:r>
-            <w:r>
-              <w:rPr>
-                <w:bCs/>
-                <w:b/>
-              </w:rPr>
-              <w:t xml:space="preserve">PENDING</w:t>
-            </w:r>
-            <w:r>
-              <w:t xml:space="preserve">)</w:t>
-            </w:r>
-          </w:p>
-        </w:tc>
-        <w:tc>
-          <w:tcPr/>
-          <w:p>
-            <w:pPr>
-              <w:pStyle w:val="Compact"/>
-              <w:jc w:val="left"/>
-            </w:pPr>
-            <w:r>
-              <w:t xml:space="preserve">None identified; DESAC entry tier is the nearest candidate (</w:t>
-            </w:r>
-            <w:r>
-              <w:rPr>
-                <w:bCs/>
-                <w:b/>
-              </w:rPr>
-              <w:t xml:space="preserve">VERIFY</w:t>
-            </w:r>
-            <w:r>
-              <w:t xml:space="preserve">)</w:t>
-            </w:r>
-          </w:p>
-        </w:tc>
-        <w:tc>
-          <w:tcPr/>
-          <w:p>
-            <w:pPr>
-              <w:pStyle w:val="Compact"/>
-              <w:jc w:val="left"/>
-            </w:pPr>
-            <w:r>
-              <w:t xml:space="preserve">None identified (</w:t>
-            </w:r>
-            <w:r>
-              <w:rPr>
-                <w:bCs/>
-                <w:b/>
-              </w:rPr>
-              <w:t xml:space="preserve">PENDING</w:t>
-            </w:r>
-            <w:r>
-              <w:t xml:space="preserve">)</w:t>
+              <w:t xml:space="preserve">Thai-held share of registered capital by layer</w:t>
+            </w:r>
+          </w:p>
+        </w:tc>
+        <w:tc>
+          <w:tcPr/>
+          <w:p>
+            <w:pPr>
+              <w:pStyle w:val="Compact"/>
+              <w:jc w:val="left"/>
+            </w:pPr>
+            <w:r>
+              <w:t xml:space="preserve">46% (software), 15% (data centres), 0% (one data-hosting project)</w:t>
+            </w:r>
+          </w:p>
+        </w:tc>
+        <w:tc>
+          <w:tcPr/>
+          <w:p>
+            <w:pPr>
+              <w:pStyle w:val="Compact"/>
+              <w:jc w:val="left"/>
+            </w:pPr>
+            <w:r>
+              <w:t xml:space="preserve">Not published in comparable form</w:t>
+            </w:r>
+          </w:p>
+        </w:tc>
+        <w:tc>
+          <w:tcPr/>
+          <w:p>
+            <w:pPr>
+              <w:pStyle w:val="Compact"/>
+              <w:jc w:val="left"/>
+            </w:pPr>
+            <w:r>
+              <w:t xml:space="preserve">Not published in comparable form</w:t>
+            </w:r>
+          </w:p>
+        </w:tc>
+        <w:tc>
+          <w:tcPr/>
+          <w:p>
+            <w:pPr>
+              <w:pStyle w:val="Compact"/>
+              <w:jc w:val="left"/>
+            </w:pPr>
+            <w:r>
+              <w:t xml:space="preserve">Not published in comparable form</w:t>
             </w:r>
           </w:p>
         </w:tc>
@@ -3325,55 +3661,55 @@
               <w:jc w:val="left"/>
             </w:pPr>
             <w:r>
-              <w:t xml:space="preserve">Explicit accommodation for small or new firms</w:t>
-            </w:r>
-          </w:p>
-        </w:tc>
-        <w:tc>
-          <w:tcPr/>
-          <w:p>
-            <w:pPr>
-              <w:pStyle w:val="Compact"/>
-              <w:jc w:val="left"/>
-            </w:pPr>
-            <w:r>
-              <w:t xml:space="preserve">None explicit (low threshold at layer (i))</w:t>
-            </w:r>
-          </w:p>
-        </w:tc>
-        <w:tc>
-          <w:tcPr/>
-          <w:p>
-            <w:pPr>
-              <w:pStyle w:val="Compact"/>
-              <w:jc w:val="left"/>
-            </w:pPr>
-            <w:r>
-              <w:t xml:space="preserve">Startup track (Decree 260, Art. 11)</w:t>
-            </w:r>
-          </w:p>
-        </w:tc>
-        <w:tc>
-          <w:tcPr/>
-          <w:p>
-            <w:pPr>
-              <w:pStyle w:val="Compact"/>
-              <w:jc w:val="left"/>
-            </w:pPr>
-            <w:r>
-              <w:t xml:space="preserve">None explicit (low entry capital)</w:t>
-            </w:r>
-          </w:p>
-        </w:tc>
-        <w:tc>
-          <w:tcPr/>
-          <w:p>
-            <w:pPr>
-              <w:pStyle w:val="Compact"/>
-              <w:jc w:val="left"/>
-            </w:pPr>
-            <w:r>
-              <w:t xml:space="preserve">None explicit</w:t>
+              <w:t xml:space="preserve">Middle-income trap classification (Bianchi et al., 2024; case selection only)</w:t>
+            </w:r>
+          </w:p>
+        </w:tc>
+        <w:tc>
+          <w:tcPr/>
+          <w:p>
+            <w:pPr>
+              <w:pStyle w:val="Compact"/>
+              <w:jc w:val="left"/>
+            </w:pPr>
+            <w:r>
+              <w:t xml:space="preserve">Trapped by duration, structural progress</w:t>
+            </w:r>
+          </w:p>
+        </w:tc>
+        <w:tc>
+          <w:tcPr/>
+          <w:p>
+            <w:pPr>
+              <w:pStyle w:val="Compact"/>
+              <w:jc w:val="left"/>
+            </w:pPr>
+            <w:r>
+              <w:t xml:space="preserve">Threshold-crossing, no trap history</w:t>
+            </w:r>
+          </w:p>
+        </w:tc>
+        <w:tc>
+          <w:tcPr/>
+          <w:p>
+            <w:pPr>
+              <w:pStyle w:val="Compact"/>
+              <w:jc w:val="left"/>
+            </w:pPr>
+            <w:r>
+              <w:t xml:space="preserve">Trapped by duration, same category as Thailand</w:t>
+            </w:r>
+          </w:p>
+        </w:tc>
+        <w:tc>
+          <w:tcPr/>
+          <w:p>
+            <w:pPr>
+              <w:pStyle w:val="Compact"/>
+              <w:jc w:val="left"/>
+            </w:pPr>
+            <w:r>
+              <w:t xml:space="preserve">Threshold-crossing, prior trap at lower band</w:t>
             </w:r>
           </w:p>
         </w:tc>
@@ -3387,316 +3723,6 @@
               <w:jc w:val="left"/>
             </w:pPr>
             <w:r>
-              <w:t xml:space="preserve">Delivery mechanism at the accessible tier</w:t>
-            </w:r>
-          </w:p>
-        </w:tc>
-        <w:tc>
-          <w:tcPr/>
-          <w:p>
-            <w:pPr>
-              <w:pStyle w:val="Compact"/>
-              <w:jc w:val="left"/>
-            </w:pPr>
-            <w:r>
-              <w:t xml:space="preserve">Indirect (tax exemption)</w:t>
-            </w:r>
-          </w:p>
-        </w:tc>
-        <w:tc>
-          <w:tcPr/>
-          <w:p>
-            <w:pPr>
-              <w:pStyle w:val="Compact"/>
-              <w:jc w:val="left"/>
-            </w:pPr>
-            <w:r>
-              <w:t xml:space="preserve">Tax plus direct equity access</w:t>
-            </w:r>
-          </w:p>
-        </w:tc>
-        <w:tc>
-          <w:tcPr/>
-          <w:p>
-            <w:pPr>
-              <w:pStyle w:val="Compact"/>
-              <w:jc w:val="left"/>
-            </w:pPr>
-            <w:r>
-              <w:t xml:space="preserve">Indirect (tax exemption)</w:t>
-            </w:r>
-          </w:p>
-        </w:tc>
-        <w:tc>
-          <w:tcPr/>
-          <w:p>
-            <w:pPr>
-              <w:pStyle w:val="Compact"/>
-              <w:jc w:val="left"/>
-            </w:pPr>
-            <w:r>
-              <w:t xml:space="preserve">Indirect (tax exemption)</w:t>
-            </w:r>
-          </w:p>
-        </w:tc>
-      </w:tr>
-      <w:tr>
-        <w:tc>
-          <w:tcPr/>
-          <w:p>
-            <w:pPr>
-              <w:pStyle w:val="Compact"/>
-              <w:jc w:val="left"/>
-            </w:pPr>
-            <w:r>
-              <w:t xml:space="preserve">Recurring compliance burden</w:t>
-            </w:r>
-          </w:p>
-        </w:tc>
-        <w:tc>
-          <w:tcPr/>
-          <w:p>
-            <w:pPr>
-              <w:pStyle w:val="Compact"/>
-              <w:jc w:val="left"/>
-            </w:pPr>
-            <w:r>
-              <w:t xml:space="preserve">Certification regime at the infrastructure activity</w:t>
-            </w:r>
-          </w:p>
-        </w:tc>
-        <w:tc>
-          <w:tcPr/>
-          <w:p>
-            <w:pPr>
-              <w:pStyle w:val="Compact"/>
-              <w:jc w:val="left"/>
-            </w:pPr>
-            <w:r>
-              <w:t xml:space="preserve">R&amp;D staffing and spending ratios (research track)</w:t>
-            </w:r>
-          </w:p>
-        </w:tc>
-        <w:tc>
-          <w:tcPr/>
-          <w:p>
-            <w:pPr>
-              <w:pStyle w:val="Compact"/>
-              <w:jc w:val="left"/>
-            </w:pPr>
-            <w:r>
-              <w:t xml:space="preserve">Annual auditor-verified self-declaration at the lowest tier</w:t>
-            </w:r>
-          </w:p>
-        </w:tc>
-        <w:tc>
-          <w:tcPr/>
-          <w:p>
-            <w:pPr>
-              <w:pStyle w:val="Compact"/>
-              <w:jc w:val="left"/>
-            </w:pPr>
-            <w:r>
-              <w:t xml:space="preserve">FIRB escalation above PHP 15 billion</w:t>
-            </w:r>
-          </w:p>
-        </w:tc>
-      </w:tr>
-      <w:tr>
-        <w:tc>
-          <w:tcPr/>
-          <w:p>
-            <w:pPr>
-              <w:pStyle w:val="Compact"/>
-              <w:jc w:val="left"/>
-            </w:pPr>
-            <w:r>
-              <w:t xml:space="preserve">Where the screen falls</w:t>
-            </w:r>
-          </w:p>
-        </w:tc>
-        <w:tc>
-          <w:tcPr/>
-          <w:p>
-            <w:pPr>
-              <w:pStyle w:val="Compact"/>
-              <w:jc w:val="left"/>
-            </w:pPr>
-            <w:r>
-              <w:t xml:space="preserve">Capital gate at the data-hosting activity</w:t>
-            </w:r>
-          </w:p>
-        </w:tc>
-        <w:tc>
-          <w:tcPr/>
-          <w:p>
-            <w:pPr>
-              <w:pStyle w:val="Compact"/>
-              <w:jc w:val="left"/>
-            </w:pPr>
-            <w:r>
-              <w:t xml:space="preserve">No capital screen in coded instruments; designation</w:t>
-            </w:r>
-          </w:p>
-        </w:tc>
-        <w:tc>
-          <w:tcPr/>
-          <w:p>
-            <w:pPr>
-              <w:pStyle w:val="Compact"/>
-              <w:jc w:val="left"/>
-            </w:pPr>
-            <w:r>
-              <w:t xml:space="preserve">Graduated capital tiers</w:t>
-            </w:r>
-          </w:p>
-        </w:tc>
-        <w:tc>
-          <w:tcPr/>
-          <w:p>
-            <w:pPr>
-              <w:pStyle w:val="Compact"/>
-              <w:jc w:val="left"/>
-            </w:pPr>
-            <w:r>
-              <w:t xml:space="preserve">Inclusion, evaluation and firm-scale tier for extended benefits</w:t>
-            </w:r>
-          </w:p>
-        </w:tc>
-      </w:tr>
-      <w:tr>
-        <w:tc>
-          <w:tcPr/>
-          <w:p>
-            <w:pPr>
-              <w:pStyle w:val="Compact"/>
-              <w:jc w:val="left"/>
-            </w:pPr>
-            <w:r>
-              <w:t xml:space="preserve">Thai-held share of registered capital by layer</w:t>
-            </w:r>
-          </w:p>
-        </w:tc>
-        <w:tc>
-          <w:tcPr/>
-          <w:p>
-            <w:pPr>
-              <w:pStyle w:val="Compact"/>
-              <w:jc w:val="left"/>
-            </w:pPr>
-            <w:r>
-              <w:t xml:space="preserve">46% (software), 15% (data centres), 0% (one data-hosting project)</w:t>
-            </w:r>
-          </w:p>
-        </w:tc>
-        <w:tc>
-          <w:tcPr/>
-          <w:p>
-            <w:pPr>
-              <w:pStyle w:val="Compact"/>
-              <w:jc w:val="left"/>
-            </w:pPr>
-            <w:r>
-              <w:t xml:space="preserve">Not published in comparable form</w:t>
-            </w:r>
-          </w:p>
-        </w:tc>
-        <w:tc>
-          <w:tcPr/>
-          <w:p>
-            <w:pPr>
-              <w:pStyle w:val="Compact"/>
-              <w:jc w:val="left"/>
-            </w:pPr>
-            <w:r>
-              <w:t xml:space="preserve">Not published in comparable form</w:t>
-            </w:r>
-          </w:p>
-        </w:tc>
-        <w:tc>
-          <w:tcPr/>
-          <w:p>
-            <w:pPr>
-              <w:pStyle w:val="Compact"/>
-              <w:jc w:val="left"/>
-            </w:pPr>
-            <w:r>
-              <w:t xml:space="preserve">Not published in comparable form</w:t>
-            </w:r>
-          </w:p>
-        </w:tc>
-      </w:tr>
-      <w:tr>
-        <w:tc>
-          <w:tcPr/>
-          <w:p>
-            <w:pPr>
-              <w:pStyle w:val="Compact"/>
-              <w:jc w:val="left"/>
-            </w:pPr>
-            <w:r>
-              <w:t xml:space="preserve">Middle-income trap classification (Bianchi et al., 2024; case selection only)</w:t>
-            </w:r>
-          </w:p>
-        </w:tc>
-        <w:tc>
-          <w:tcPr/>
-          <w:p>
-            <w:pPr>
-              <w:pStyle w:val="Compact"/>
-              <w:jc w:val="left"/>
-            </w:pPr>
-            <w:r>
-              <w:t xml:space="preserve">Trapped by duration, structural progress</w:t>
-            </w:r>
-          </w:p>
-        </w:tc>
-        <w:tc>
-          <w:tcPr/>
-          <w:p>
-            <w:pPr>
-              <w:pStyle w:val="Compact"/>
-              <w:jc w:val="left"/>
-            </w:pPr>
-            <w:r>
-              <w:t xml:space="preserve">Threshold-crossing, no trap history</w:t>
-            </w:r>
-          </w:p>
-        </w:tc>
-        <w:tc>
-          <w:tcPr/>
-          <w:p>
-            <w:pPr>
-              <w:pStyle w:val="Compact"/>
-              <w:jc w:val="left"/>
-            </w:pPr>
-            <w:r>
-              <w:t xml:space="preserve">Trapped by duration, same category as Thailand</w:t>
-            </w:r>
-          </w:p>
-        </w:tc>
-        <w:tc>
-          <w:tcPr/>
-          <w:p>
-            <w:pPr>
-              <w:pStyle w:val="Compact"/>
-              <w:jc w:val="left"/>
-            </w:pPr>
-            <w:r>
-              <w:t xml:space="preserve">Threshold-crossing, prior trap at lower band</w:t>
-            </w:r>
-          </w:p>
-        </w:tc>
-      </w:tr>
-      <w:tr>
-        <w:tc>
-          <w:tcPr/>
-          <w:p>
-            <w:pPr>
-              <w:pStyle w:val="Compact"/>
-              <w:jc w:val="left"/>
-            </w:pPr>
-            <w:r>
               <w:t xml:space="preserve">Covered by the middle-technology trap account of Ke (2024)</w:t>
             </w:r>
           </w:p>
@@ -3797,7 +3823,7 @@
         <w:t xml:space="preserve"> </w:t>
       </w:r>
       <w:r>
-        <w:t xml:space="preserve">Thailand screens at the infrastructure activity. Malaysia screens across graduated tiers. Vietnam’s coded instruments contain no capital screen and rank hardware lower. The Philippines applies the same inclusion and scale rules to all activities. All four make layer (i) accessible on the stated thresholds.</w:t>
+        <w:t xml:space="preserve">Thailand screens at the infrastructure activity. Malaysia runs two tracks, a low-capital digital track and a data-centre track with facility categories and outcome conditions. Vietnam’s coded instruments contain no capital screen and rank hardware lower. The Philippines applies the same inclusion and scale rules to all activities. All four make layer (i) accessible on the stated thresholds.</w:t>
       </w:r>
     </w:p>
     <w:p>
@@ -3815,7 +3841,7 @@
         <w:t xml:space="preserve"> </w:t>
       </w:r>
       <w:r>
-        <w:t xml:space="preserve">At layer (i), stated entry thresholds are low (about US$11,000 in Malaysia and US$42,000 in Thailand, on different bases) or absent (Vietnam, the Philippines). At the compute layers the stated figures run from about US$550,000 of paid-up capital (Malaysia, entry) to about US$140 million of minimum capital (Thailand) and about US$220 million of cumulative capex (Malaysia, top tier). The bases differ, so we read these as orders of magnitude, not as one scale.</w:t>
+        <w:t xml:space="preserve">At layer (i), stated entry thresholds are low (about US$11,000 in Malaysia and US$42,000 in Thailand, on different bases) or absent (Vietnam, the Philippines). At the compute layers the stated figures are of three kinds: company capital (Malaysia’s DESAC floor of about US$550,000 in paid-up capital), project scale (Malaysia’s smallest data-centre category of 0.85 MW, and Thailand’s minimum capital of about US$140 million and about 2 MW), and cumulative spending (Malaysia’s ten-year condition of about US$220 million). The bases differ, so we read these as orders of magnitude, not as one scale.</w:t>
       </w:r>
     </w:p>
     <w:p>
@@ -3851,7 +3877,7 @@
         <w:t xml:space="preserve"> </w:t>
       </w:r>
       <w:r>
-        <w:t xml:space="preserve">Malaysia’s audited declaration at its lowest tier and Thailand’s certification regime at its infrastructure tier are both recurring burdens. They are recorded separately because a fixed cost is neither a scale nor a vintage rule.</w:t>
+        <w:t xml:space="preserve">Malaysia’s audited self-declaration in the low-capital track, borne by the company, and Thailand’s certification regime at its infrastructure activities are both recurring burdens. They are recorded separately because a fixed cost is neither a scale nor a vintage rule.</w:t>
       </w:r>
     </w:p>
     <w:p>
@@ -4049,7 +4075,7 @@
               <w:jc w:val="left"/>
             </w:pPr>
             <w:r>
-              <w:t xml:space="preserve">Single gate</w:t>
+              <w:t xml:space="preserve">Capital-gated activities</w:t>
             </w:r>
           </w:p>
         </w:tc>
@@ -4073,19 +4099,19 @@
               <w:jc w:val="left"/>
             </w:pPr>
             <w:r>
-              <w:t xml:space="preserve">Activity-specific minimum capital</w:t>
-            </w:r>
-          </w:p>
-        </w:tc>
-        <w:tc>
-          <w:tcPr/>
-          <w:p>
-            <w:pPr>
-              <w:pStyle w:val="Compact"/>
-              <w:jc w:val="left"/>
-            </w:pPr>
-            <w:r>
-              <w:t xml:space="preserve">A step at the data-hosting activity (about US$140m)</w:t>
+              <w:t xml:space="preserve">Activity-specific minimum capital and capacity</w:t>
+            </w:r>
+          </w:p>
+        </w:tc>
+        <w:tc>
+          <w:tcPr/>
+          <w:p>
+            <w:pPr>
+              <w:pStyle w:val="Compact"/>
+              <w:jc w:val="left"/>
+            </w:pPr>
+            <w:r>
+              <w:t xml:space="preserve">A step at the data-hosting activity (about US$140m; about 2 MW)</w:t>
             </w:r>
           </w:p>
         </w:tc>
@@ -4123,7 +4149,7 @@
               <w:jc w:val="left"/>
             </w:pPr>
             <w:r>
-              <w:t xml:space="preserve">Graduated ladder</w:t>
+              <w:t xml:space="preserve">Two parallel tracks</w:t>
             </w:r>
           </w:p>
         </w:tc>
@@ -4147,43 +4173,43 @@
               <w:jc w:val="left"/>
             </w:pPr>
             <w:r>
-              <w:t xml:space="preserve">Paid-up capital tiers rising to a full benefit at RM1bn capex</w:t>
-            </w:r>
-          </w:p>
-        </w:tc>
-        <w:tc>
-          <w:tcPr/>
-          <w:p>
-            <w:pPr>
-              <w:pStyle w:val="Compact"/>
-              <w:jc w:val="left"/>
-            </w:pPr>
-            <w:r>
-              <w:t xml:space="preserve">Gradual; the top-tier benefit sits at about US$220m</w:t>
-            </w:r>
-          </w:p>
-        </w:tc>
-        <w:tc>
-          <w:tcPr/>
-          <w:p>
-            <w:pPr>
-              <w:pStyle w:val="Compact"/>
-              <w:jc w:val="left"/>
-            </w:pPr>
-            <w:r>
-              <w:t xml:space="preserve">A rung exists at about US$0.55m of paid-up capital; whether it admits sub-facility providers is unverified</w:t>
-            </w:r>
-          </w:p>
-        </w:tc>
-        <w:tc>
-          <w:tcPr/>
-          <w:p>
-            <w:pPr>
-              <w:pStyle w:val="Compact"/>
-              <w:jc w:val="left"/>
-            </w:pPr>
-            <w:r>
-              <w:t xml:space="preserve">Fixed compliance cost at the lowest tier; the entry tier may still presuppose a facility</w:t>
+              <w:t xml:space="preserve">MD: RM50,000 paid-up capital and a new activity. DESAC: RM2.5m paid-up capital, outcome tiers, committee approval</w:t>
+            </w:r>
+          </w:p>
+        </w:tc>
+        <w:tc>
+          <w:tcPr/>
+          <w:p>
+            <w:pPr>
+              <w:pStyle w:val="Compact"/>
+              <w:jc w:val="left"/>
+            </w:pPr>
+            <w:r>
+              <w:t xml:space="preserve">MD: audit cost. DESAC: facility categories from 0.85 MW and facility-oriented conditions</w:t>
+            </w:r>
+          </w:p>
+        </w:tc>
+        <w:tc>
+          <w:tcPr/>
+          <w:p>
+            <w:pPr>
+              <w:pStyle w:val="Compact"/>
+              <w:jc w:val="left"/>
+            </w:pPr>
+            <w:r>
+              <w:t xml:space="preserve">A small cloud provider may use the MD track; the data-centre track starts at 0.85 MW</w:t>
+            </w:r>
+          </w:p>
+        </w:tc>
+        <w:tc>
+          <w:tcPr/>
+          <w:p>
+            <w:pPr>
+              <w:pStyle w:val="Compact"/>
+              <w:jc w:val="left"/>
+            </w:pPr>
+            <w:r>
+              <w:t xml:space="preserve">Fixed audit cost in the low-capital track; discretionary approval in the facility track</w:t>
             </w:r>
           </w:p>
         </w:tc>
@@ -4473,19 +4499,19 @@
               <w:jc w:val="left"/>
             </w:pPr>
             <w:r>
-              <w:t xml:space="preserve">Thailand, data hosting (8.2.4)</w:t>
-            </w:r>
-          </w:p>
-        </w:tc>
-        <w:tc>
-          <w:tcPr/>
-          <w:p>
-            <w:pPr>
-              <w:pStyle w:val="Compact"/>
-              <w:jc w:val="left"/>
-            </w:pPr>
-            <w:r>
-              <w:t xml:space="preserve">Minimum capital</w:t>
+              <w:t xml:space="preserve">Thailand, data hosting (8.2.4), minimum capital</w:t>
+            </w:r>
+          </w:p>
+        </w:tc>
+        <w:tc>
+          <w:tcPr/>
+          <w:p>
+            <w:pPr>
+              <w:pStyle w:val="Compact"/>
+              <w:jc w:val="left"/>
+            </w:pPr>
+            <w:r>
+              <w:t xml:space="preserve">Minimum capital excluding land</w:t>
             </w:r>
           </w:p>
         </w:tc>
@@ -4535,55 +4561,55 @@
               <w:jc w:val="left"/>
             </w:pPr>
             <w:r>
-              <w:t xml:space="preserve">Malaysia, DESAC entry</w:t>
-            </w:r>
-          </w:p>
-        </w:tc>
-        <w:tc>
-          <w:tcPr/>
-          <w:p>
-            <w:pPr>
-              <w:pStyle w:val="Compact"/>
-              <w:jc w:val="left"/>
-            </w:pPr>
-            <w:r>
-              <w:t xml:space="preserve">Paid-up capital</w:t>
-            </w:r>
-          </w:p>
-        </w:tc>
-        <w:tc>
-          <w:tcPr/>
-          <w:p>
-            <w:pPr>
-              <w:pStyle w:val="Compact"/>
-              <w:jc w:val="left"/>
-            </w:pPr>
-            <w:r>
-              <w:t xml:space="preserve">0.55</w:t>
-            </w:r>
-          </w:p>
-        </w:tc>
-        <w:tc>
-          <w:tcPr/>
-          <w:p>
-            <w:pPr>
-              <w:pStyle w:val="Compact"/>
-              <w:jc w:val="left"/>
-            </w:pPr>
-            <w:r>
-              <w:t xml:space="preserve">51 kW / 14 kW</w:t>
-            </w:r>
-          </w:p>
-        </w:tc>
-        <w:tc>
-          <w:tcPr/>
-          <w:p>
-            <w:pPr>
-              <w:pStyle w:val="Compact"/>
-              <w:jc w:val="left"/>
-            </w:pPr>
-            <w:r>
-              <w:t xml:space="preserve">0.1 to 0.6</w:t>
+              <w:t xml:space="preserve">Thailand, data hosting (8.2.4), electrical capacity (VERIFY)</w:t>
+            </w:r>
+          </w:p>
+        </w:tc>
+        <w:tc>
+          <w:tcPr/>
+          <w:p>
+            <w:pPr>
+              <w:pStyle w:val="Compact"/>
+              <w:jc w:val="left"/>
+            </w:pPr>
+            <w:r>
+              <w:t xml:space="preserve">Power capacity, 2 MW</w:t>
+            </w:r>
+          </w:p>
+        </w:tc>
+        <w:tc>
+          <w:tcPr/>
+          <w:p>
+            <w:pPr>
+              <w:pStyle w:val="Compact"/>
+              <w:jc w:val="left"/>
+            </w:pPr>
+            <w:r>
+              <w:t xml:space="preserve">21.4 to 76 (capital to host)</w:t>
+            </w:r>
+          </w:p>
+        </w:tc>
+        <w:tc>
+          <w:tcPr/>
+          <w:p>
+            <w:pPr>
+              <w:pStyle w:val="Compact"/>
+              <w:jc w:val="left"/>
+            </w:pPr>
+            <w:r>
+              <w:t xml:space="preserve">2 MW</w:t>
+            </w:r>
+          </w:p>
+        </w:tc>
+        <w:tc>
+          <w:tcPr/>
+          <w:p>
+            <w:pPr>
+              <w:pStyle w:val="Compact"/>
+              <w:jc w:val="left"/>
+            </w:pPr>
+            <w:r>
+              <w:t xml:space="preserve">1.7 to 2.8</w:t>
             </w:r>
           </w:p>
         </w:tc>
@@ -4597,7 +4623,131 @@
               <w:jc w:val="left"/>
             </w:pPr>
             <w:r>
-              <w:t xml:space="preserve">Malaysia, DESAC top tier</w:t>
+              <w:t xml:space="preserve">Malaysia, DESAC capitalisation floor</w:t>
+            </w:r>
+          </w:p>
+        </w:tc>
+        <w:tc>
+          <w:tcPr/>
+          <w:p>
+            <w:pPr>
+              <w:pStyle w:val="Compact"/>
+              <w:jc w:val="left"/>
+            </w:pPr>
+            <w:r>
+              <w:t xml:space="preserve">Paid-up capital of the company, not project scale</w:t>
+            </w:r>
+          </w:p>
+        </w:tc>
+        <w:tc>
+          <w:tcPr/>
+          <w:p>
+            <w:pPr>
+              <w:pStyle w:val="Compact"/>
+              <w:jc w:val="left"/>
+            </w:pPr>
+            <w:r>
+              <w:t xml:space="preserve">0.55</w:t>
+            </w:r>
+          </w:p>
+        </w:tc>
+        <w:tc>
+          <w:tcPr/>
+          <w:p>
+            <w:pPr>
+              <w:pStyle w:val="Compact"/>
+              <w:jc w:val="left"/>
+            </w:pPr>
+            <w:r>
+              <w:t xml:space="preserve">not a project scale</w:t>
+            </w:r>
+          </w:p>
+        </w:tc>
+        <w:tc>
+          <w:tcPr/>
+          <w:p>
+            <w:pPr>
+              <w:pStyle w:val="Compact"/>
+              <w:jc w:val="left"/>
+            </w:pPr>
+            <w:r>
+              <w:t xml:space="preserve">not applicable</w:t>
+            </w:r>
+          </w:p>
+        </w:tc>
+      </w:tr>
+      <w:tr>
+        <w:tc>
+          <w:tcPr/>
+          <w:p>
+            <w:pPr>
+              <w:pStyle w:val="Compact"/>
+              <w:jc w:val="left"/>
+            </w:pPr>
+            <w:r>
+              <w:t xml:space="preserve">Malaysia, DESAC smallest data-centre category</w:t>
+            </w:r>
+          </w:p>
+        </w:tc>
+        <w:tc>
+          <w:tcPr/>
+          <w:p>
+            <w:pPr>
+              <w:pStyle w:val="Compact"/>
+              <w:jc w:val="left"/>
+            </w:pPr>
+            <w:r>
+              <w:t xml:space="preserve">Power capacity, 0.85 MW</w:t>
+            </w:r>
+          </w:p>
+        </w:tc>
+        <w:tc>
+          <w:tcPr/>
+          <w:p>
+            <w:pPr>
+              <w:pStyle w:val="Compact"/>
+              <w:jc w:val="left"/>
+            </w:pPr>
+            <w:r>
+              <w:t xml:space="preserve">9.1 to 32.3 (capital to host)</w:t>
+            </w:r>
+          </w:p>
+        </w:tc>
+        <w:tc>
+          <w:tcPr/>
+          <w:p>
+            <w:pPr>
+              <w:pStyle w:val="Compact"/>
+              <w:jc w:val="left"/>
+            </w:pPr>
+            <w:r>
+              <w:t xml:space="preserve">0.85 MW</w:t>
+            </w:r>
+          </w:p>
+        </w:tc>
+        <w:tc>
+          <w:tcPr/>
+          <w:p>
+            <w:pPr>
+              <w:pStyle w:val="Compact"/>
+              <w:jc w:val="left"/>
+            </w:pPr>
+            <w:r>
+              <w:t xml:space="preserve">1.3 to 2.4</w:t>
+            </w:r>
+          </w:p>
+        </w:tc>
+      </w:tr>
+      <w:tr>
+        <w:tc>
+          <w:tcPr/>
+          <w:p>
+            <w:pPr>
+              <w:pStyle w:val="Compact"/>
+              <w:jc w:val="left"/>
+            </w:pPr>
+            <w:r>
+              <w:t xml:space="preserve">Malaysia, DESAC ten-year condition</w:t>
             </w:r>
           </w:p>
         </w:tc>
@@ -4862,7 +5012,7 @@
         <w:t xml:space="preserve"> </w:t>
       </w:r>
       <w:r>
-        <w:t xml:space="preserve">Rung distance is log10 of the threshold over US$0.13m to US$0.46m, the capital to host one eight-accelerator server of about 12 kW on the two benchmarks (CITATION NEEDED for the 12 kW figure). The Philippine figure is an extended-benefit tier, not an entry rule. Bases differ, so rows are indicative.</w:t>
+        <w:t xml:space="preserve">Rung distance is log10 of the threshold over US$0.13m to US$0.46m, the capital to host one eight-accelerator server of about 12 kW on the two benchmarks (CITATION NEEDED for the 12 kW figure). The Philippine figure is an extended-benefit tier, not an entry rule. Malaysia’s paid-up capital measures how well capitalised the company is, so it has no rung distance. Malaysia Digital (RM50,000 paid-up capital) is a company-capital rule on a digital track and is not placed on the scale. Bases differ, so rows are indicative.</w:t>
       </w:r>
     </w:p>
     <w:p>
@@ -4892,7 +5042,7 @@
           <wp:inline>
             <wp:extent cx="5334000" cy="3531972"/>
             <wp:effectExtent b="0" l="0" r="0" t="0"/>
-            <wp:docPr descr="Figure 1. Explicit eligibility thresholds against cost benchmarks, US$ million, log scale. Shaded bands show the capital needed to host the stated capacity, from construction cost alone (US$10.7m per MW; Turner and Townsend, 2025) to fully equipped AI capacity (US$38m per MW; Epoch AI, 2026); the node band assumes 12 kW per eight-accelerator server (CITATION NEEDED). Thresholds are on different bases: Thailand’s software figure is annual salary spend (hollow marker); Thailand’s data-hosting figure is minimum capital; Malaysia’s entry tiers are paid-up capital (*) and its top tier is cumulative capex; the Philippine figure is a firm-scale tier for extended benefits. The bands are benchmarks, not like-for-like tests. Vietnam states no capital threshold." title="" id="39" name="Picture"/>
+            <wp:docPr descr="Figure 1. Explicit eligibility thresholds against cost benchmarks, US$ million, log scale. Shaded bands show the capital needed to host the stated capacity, from construction cost alone (US$10.7m per MW; Turner and Townsend, 2025) to fully equipped AI capacity (US$38m per MW; Epoch AI, 2026); the node band assumes 12 kW per eight-accelerator server (CITATION NEEDED). Thresholds are on different bases: Thailand’s software figure is annual salary spend (hollow marker); Thailand’s data-hosting figure is minimum capital; Malaysia’s two paid-up capital figures are company capital, not project scale (*), the 0.85 MW bar shows the capital to host the smallest DESAC data-centre category (construction to fully equipped), and the right-hand marker is the cumulative capex condition for the second five years; the Philippine figure is a firm-scale tier for extended benefits. The bands are benchmarks, not like-for-like tests. Vietnam states no capital threshold." title="" id="39" name="Picture"/>
             <a:graphic>
               <a:graphicData uri="http://schemas.openxmlformats.org/drawingml/2006/picture">
                 <pic:pic>
@@ -4945,15 +5095,15 @@
         <w:t xml:space="preserve"> </w:t>
       </w:r>
       <w:r>
-        <w:t xml:space="preserve">Explicit eligibility thresholds against cost benchmarks, US$ million, log scale. Shaded bands show the capital needed to host the stated capacity, from construction cost alone (US$10.7m per MW; Turner and Townsend, 2025) to fully equipped AI capacity (US$38m per MW; Epoch AI, 2026); the node band assumes 12 kW per eight-accelerator server (CITATION NEEDED). Thresholds are on different bases: Thailand’s software figure is annual salary spend (hollow marker); Thailand’s data-hosting figure is minimum capital; Malaysia’s entry tiers are paid-up capital (*) and its top tier is cumulative capex; the Philippine figure is a firm-scale tier for extended benefits. The bands are benchmarks, not like-for-like tests. Vietnam states no capital threshold.</w:t>
-      </w:r>
-    </w:p>
-    <w:p>
-      <w:pPr>
-        <w:pStyle w:val="BodyText"/>
-      </w:pPr>
-      <w:r>
-        <w:t xml:space="preserve">Three readings follow. In Thailand a single step of two and a half to three orders of magnitude separates one server from the smallest eligible scale, and nothing coded lies between. In Malaysia the entry tier is within about one order of magnitude of one server, and the ladder rises from there to the facility scale. Vietnam and the Philippines state no capital threshold at the compute layers, so their screens must be sought in designation, inclusion and discretion.</w:t>
+        <w:t xml:space="preserve">Explicit eligibility thresholds against cost benchmarks, US$ million, log scale. Shaded bands show the capital needed to host the stated capacity, from construction cost alone (US$10.7m per MW; Turner and Townsend, 2025) to fully equipped AI capacity (US$38m per MW; Epoch AI, 2026); the node band assumes 12 kW per eight-accelerator server (CITATION NEEDED). Thresholds are on different bases: Thailand’s software figure is annual salary spend (hollow marker); Thailand’s data-hosting figure is minimum capital; Malaysia’s two paid-up capital figures are company capital, not project scale (*), the 0.85 MW bar shows the capital to host the smallest DESAC data-centre category (construction to fully equipped), and the right-hand marker is the cumulative capex condition for the second five years; the Philippine figure is a firm-scale tier for extended benefits. The bands are benchmarks, not like-for-like tests. Vietnam states no capital threshold.</w:t>
+      </w:r>
+    </w:p>
+    <w:p>
+      <w:pPr>
+        <w:pStyle w:val="BodyText"/>
+      </w:pPr>
+      <w:r>
+        <w:t xml:space="preserve">Three readings follow. In Thailand a single step of two and a half to three orders of magnitude separates one server from the smallest eligible scale in capital terms, and nothing coded lies between. In Malaysia the facility track starts at a category of 0.85 MW, 1.3 to 2.4 orders of magnitude above one server, while a separate digital track admits new cloud and AI activities at RM50,000 of paid-up capital. The low DESAC capitalisation floor says little about project scale. Vietnam and the Philippines state no capital threshold at the compute layers, so their screens must be sought in designation, inclusion and discretion.</w:t>
       </w:r>
     </w:p>
     <w:p>
@@ -5085,7 +5235,7 @@
               <w:jc w:val="left"/>
             </w:pPr>
             <w:r>
-              <w:t xml:space="preserve">Ineligible on the coded rules (only coded route is 8.2.4 at US$140m); general instruments</w:t>
+              <w:t xml:space="preserve">Likely ineligible on the coded rules (8.2.4 needs US$140m, about 2 MW and two certified data centres; cloud services under 8.2.2 are reported to need two certified data centres); general instruments</w:t>
             </w:r>
             <w:r>
               <w:t xml:space="preserve"> </w:t>
@@ -5107,7 +5257,20 @@
               <w:jc w:val="left"/>
             </w:pPr>
             <w:r>
-              <w:t xml:space="preserve">Ineligible on the coded rules (1 MW is about US$10.7m to 38m, below US$140m); general instruments</w:t>
+              <w:t xml:space="preserve">Unclear (1 MW is below the 2 MW of the higher tier of 8.2.1 and of 8.2.4; whether a lower tier of 8.2.1 admits it</w:t>
+            </w:r>
+            <w:r>
+              <w:t xml:space="preserve"> </w:t>
+            </w:r>
+            <w:r>
+              <w:rPr>
+                <w:bCs/>
+                <w:b/>
+              </w:rPr>
+              <w:t xml:space="preserve">VERIFY</w:t>
+            </w:r>
+            <w:r>
+              <w:t xml:space="preserve">); general instruments</w:t>
             </w:r>
             <w:r>
               <w:t xml:space="preserve"> </w:t>
@@ -5206,22 +5369,19 @@
               <w:jc w:val="left"/>
             </w:pPr>
             <w:r>
-              <w:t xml:space="preserve">Eligible (RM50,000 paid-up capital; audited annual declaration at own cost)</w:t>
-            </w:r>
-          </w:p>
-        </w:tc>
-        <w:tc>
-          <w:tcPr/>
-          <w:p>
-            <w:pPr>
-              <w:pStyle w:val="Compact"/>
-              <w:jc w:val="left"/>
-            </w:pPr>
-            <w:r>
-              <w:t xml:space="preserve">Unclear (DESAC entry tier RM2.5m paid-up capital; activity conditions</w:t>
-            </w:r>
-            <w:r>
-              <w:t xml:space="preserve"> </w:t>
+              <w:t xml:space="preserve">Eligible (MD: RM50,000 paid-up capital; new activity; audited annual declaration at own cost)</w:t>
+            </w:r>
+          </w:p>
+        </w:tc>
+        <w:tc>
+          <w:tcPr/>
+          <w:p>
+            <w:pPr>
+              <w:pStyle w:val="Compact"/>
+              <w:jc w:val="left"/>
+            </w:pPr>
+            <w:r>
+              <w:t xml:space="preserve">Possibly eligible under the MD track, where cloud is a promoted enabler; unlikely under DESAC, which targets data-centre operators and allows relief on qualifying capital investment excluding land (</w:t>
             </w:r>
             <w:r>
               <w:rPr>
@@ -5231,19 +5391,60 @@
               <w:t xml:space="preserve">VERIFY</w:t>
             </w:r>
             <w:r>
-              <w:t xml:space="preserve">)</w:t>
-            </w:r>
-          </w:p>
-        </w:tc>
-        <w:tc>
-          <w:tcPr/>
-          <w:p>
-            <w:pPr>
-              <w:pStyle w:val="Compact"/>
-              <w:jc w:val="left"/>
-            </w:pPr>
-            <w:r>
-              <w:t xml:space="preserve">Unclear (capital lies between the entry tier and the top tier; activity conditions</w:t>
+              <w:t xml:space="preserve"> </w:t>
+            </w:r>
+            <w:r>
+              <w:t xml:space="preserve">with MDEC)</w:t>
+            </w:r>
+          </w:p>
+        </w:tc>
+        <w:tc>
+          <w:tcPr/>
+          <w:p>
+            <w:pPr>
+              <w:pStyle w:val="Compact"/>
+              <w:jc w:val="left"/>
+            </w:pPr>
+            <w:r>
+              <w:t xml:space="preserve">Eligible to apply under DESAC on the stated conditions: a 1 MW facility falls in the 0.85 MW to 4.25 MW category; RM2.5m paid-up capital; Malaysian staff at RM5,000 a month making up half of manpower; committee approval is discretionary</w:t>
+            </w:r>
+          </w:p>
+        </w:tc>
+      </w:tr>
+      <w:tr>
+        <w:tc>
+          <w:tcPr/>
+          <w:p>
+            <w:pPr>
+              <w:pStyle w:val="Compact"/>
+              <w:jc w:val="left"/>
+            </w:pPr>
+            <w:r>
+              <w:t xml:space="preserve">Philippines</w:t>
+            </w:r>
+          </w:p>
+        </w:tc>
+        <w:tc>
+          <w:tcPr/>
+          <w:p>
+            <w:pPr>
+              <w:pStyle w:val="Compact"/>
+              <w:jc w:val="left"/>
+            </w:pPr>
+            <w:r>
+              <w:t xml:space="preserve">Eligible on stated conditions, subject to inclusion and evaluation</w:t>
+            </w:r>
+          </w:p>
+        </w:tc>
+        <w:tc>
+          <w:tcPr/>
+          <w:p>
+            <w:pPr>
+              <w:pStyle w:val="Compact"/>
+              <w:jc w:val="left"/>
+            </w:pPr>
+            <w:r>
+              <w:t xml:space="preserve">Unclear (Plan treatment of resale</w:t>
             </w:r>
             <w:r>
               <w:t xml:space="preserve"> </w:t>
@@ -5260,41 +5461,15 @@
             </w:r>
           </w:p>
         </w:tc>
-      </w:tr>
-      <w:tr>
-        <w:tc>
-          <w:tcPr/>
-          <w:p>
-            <w:pPr>
-              <w:pStyle w:val="Compact"/>
-              <w:jc w:val="left"/>
-            </w:pPr>
-            <w:r>
-              <w:t xml:space="preserve">Philippines</w:t>
-            </w:r>
-          </w:p>
-        </w:tc>
-        <w:tc>
-          <w:tcPr/>
-          <w:p>
-            <w:pPr>
-              <w:pStyle w:val="Compact"/>
-              <w:jc w:val="left"/>
-            </w:pPr>
-            <w:r>
-              <w:t xml:space="preserve">Eligible on stated conditions, subject to inclusion and evaluation</w:t>
-            </w:r>
-          </w:p>
-        </w:tc>
-        <w:tc>
-          <w:tcPr/>
-          <w:p>
-            <w:pPr>
-              <w:pStyle w:val="Compact"/>
-              <w:jc w:val="left"/>
-            </w:pPr>
-            <w:r>
-              <w:t xml:space="preserve">Unclear (Plan treatment of resale</w:t>
+        <w:tc>
+          <w:tcPr/>
+          <w:p>
+            <w:pPr>
+              <w:pStyle w:val="Compact"/>
+              <w:jc w:val="left"/>
+            </w:pPr>
+            <w:r>
+              <w:t xml:space="preserve">Unclear (Plan groups data-centre infrastructure with AI; no stated minimum;</w:t>
             </w:r>
             <w:r>
               <w:t xml:space="preserve"> </w:t>
@@ -5311,31 +5486,6 @@
             </w:r>
           </w:p>
         </w:tc>
-        <w:tc>
-          <w:tcPr/>
-          <w:p>
-            <w:pPr>
-              <w:pStyle w:val="Compact"/>
-              <w:jc w:val="left"/>
-            </w:pPr>
-            <w:r>
-              <w:t xml:space="preserve">Unclear (Plan groups data-centre infrastructure with AI; no stated minimum;</w:t>
-            </w:r>
-            <w:r>
-              <w:t xml:space="preserve"> </w:t>
-            </w:r>
-            <w:r>
-              <w:rPr>
-                <w:bCs/>
-                <w:b/>
-              </w:rPr>
-              <w:t xml:space="preserve">VERIFY</w:t>
-            </w:r>
-            <w:r>
-              <w:t xml:space="preserve">)</w:t>
-            </w:r>
-          </w:p>
-        </w:tc>
       </w:tr>
     </w:tbl>
     <w:p>
@@ -5379,7 +5529,7 @@
         <w:pStyle w:val="BodyText"/>
       </w:pPr>
       <w:r>
-        <w:t xml:space="preserve">On this reading only Thailand’s coded rules exclude Firms B and C by capital. In the other three countries the answer depends on clauses not yet read, which is why the reading of DESAC, the Vietnamese list and the Philippine Plan decides how far the Thai result generalises.</w:t>
+        <w:t xml:space="preserve">On this reading Thailand’s rules are the most likely to exclude Firm B, and Malaysia is the one country where a reading of the primary text supports a small provider’s eligibility, through the MD track and not through DESAC. In Vietnam and the Philippines the answer depends on clauses not yet read.</w:t>
       </w:r>
     </w:p>
     <w:p>
@@ -5397,7 +5547,7 @@
         <w:t xml:space="preserve"> </w:t>
       </w:r>
       <w:r>
-        <w:t xml:space="preserve">Reading (i) holds on the instruments we coded: no country has an instrument aimed at sub-facility compute provision. Reading (ii) holds provisionally for Thailand and is open for the other three. Reading (iii) fails for Malaysia if the DESAC entry tier is a tier below facility scale.</w:t>
+        <w:t xml:space="preserve">Reading (i) holds on the instruments we coded: no country has an instrument aimed at sub-facility compute provision. Reading (ii) is likely to hold for Thailand and fails provisionally for Malaysia, whose MD track may admit a small cloud provider. It is open for Vietnam and the Philippines. Reading (iii) holds for Malaysia’s data-centre track, whose smallest recognised category is 0.85 MW.</w:t>
       </w:r>
     </w:p>
     <w:bookmarkEnd w:id="41"/>
@@ -5483,7 +5633,20 @@
         <w:pStyle w:val="BodyText"/>
       </w:pPr>
       <w:r>
-        <w:t xml:space="preserve">Malaysia is the informative comparison. Its entry tier asks for paid-up capital of the order of one server’s hosting cost (Table 5). If a firm that leases space and equipment, or runs a rack-scale deployment, can qualify, Malaysia shows that a graduated design is feasible alongside the same cost structure, and cost cannot explain the absence of rungs in Thailand. If the tier presupposes a facility, Malaysia joins Thailand. The two outcomes carry different lessons, which is why the DESAC reading is the check that matters most.</w:t>
+        <w:t xml:space="preserve">Malaysia is the informative comparison. It runs a low-capital digital track that covers cloud (RM50,000 of paid-up capital) beside a data-centre track whose smallest recognised category is 0.85 MW, 1.3 to 2.4 orders of magnitude above one server, and whose conditions are written for facility operators. If the MD track admits a small provider of compute as a service</w:t>
+      </w:r>
+      <w:r>
+        <w:t xml:space="preserve"> </w:t>
+      </w:r>
+      <w:r>
+        <w:rPr>
+          <w:bCs/>
+          <w:b/>
+        </w:rPr>
+        <w:t xml:space="preserve">[VERIFY with MDEC]</w:t>
+      </w:r>
+      <w:r>
+        <w:t xml:space="preserve">, Malaysia shows that a small provider can be admitted on paper at a cost, an annual audit at its own expense, and that the facility threshold in Thailand is not forced by the same cost structure. If it does not, Malaysia joins Thailand. DESAC’s low paid-up capital floor does not change this, because it measures company capital, not project scale.</w:t>
       </w:r>
     </w:p>
     <w:p>
@@ -5783,7 +5946,7 @@
               <w:jc w:val="left"/>
             </w:pPr>
             <w:r>
-              <w:t xml:space="preserve">Malaysia’s graduated tiers, with an entry tier of rack-scale paid-up capital</w:t>
+              <w:t xml:space="preserve">Malaysia’s low-capital digital track covers cloud (RM50,000 paid-up capital), beside a data-centre track whose smallest category is 0.85 MW</w:t>
             </w:r>
           </w:p>
         </w:tc>
@@ -5807,7 +5970,7 @@
               <w:jc w:val="left"/>
             </w:pPr>
             <w:r>
-              <w:t xml:space="preserve">U (P2a, if the tier admits small providers;</w:t>
+              <w:t xml:space="preserve">U (P2a, if the MD track admits capacity resale;</w:t>
             </w:r>
             <w:r>
               <w:t xml:space="preserve"> </w:t>
@@ -5856,7 +6019,7 @@
               <w:jc w:val="left"/>
             </w:pPr>
             <w:r>
-              <w:t xml:space="preserve">The DESAC reading</w:t>
+              <w:t xml:space="preserve">MDEC’s reading of MD activities</w:t>
             </w:r>
           </w:p>
         </w:tc>
@@ -6153,7 +6316,7 @@
               <w:jc w:val="left"/>
             </w:pPr>
             <w:r>
-              <w:t xml:space="preserve">Auditor-verified annual declaration at the lowest tier (Malaysia)</w:t>
+              <w:t xml:space="preserve">Auditor-verified annual self-declaration at the company’s cost in the low-capital track (Malaysia; verified against the July 2025 guideline)</w:t>
             </w:r>
           </w:p>
         </w:tc>
@@ -6201,19 +6364,19 @@
               <w:jc w:val="left"/>
             </w:pPr>
             <w:r>
-              <w:t xml:space="preserve">H1 against H2: Weak to Moderate; unverified row; audit cost unmeasured</w:t>
-            </w:r>
-          </w:p>
-        </w:tc>
-        <w:tc>
-          <w:tcPr/>
-          <w:p>
-            <w:pPr>
-              <w:pStyle w:val="Compact"/>
-              <w:jc w:val="left"/>
-            </w:pPr>
-            <w:r>
-              <w:t xml:space="preserve">Verification; audit cost relative to capital</w:t>
+              <w:t xml:space="preserve">H1 against H2: Moderate; audit cost unmeasured</w:t>
+            </w:r>
+          </w:p>
+        </w:tc>
+        <w:tc>
+          <w:tcPr/>
+          <w:p>
+            <w:pPr>
+              <w:pStyle w:val="Compact"/>
+              <w:jc w:val="left"/>
+            </w:pPr>
+            <w:r>
+              <w:t xml:space="preserve">Audit cost relative to RM50,000 of capital</w:t>
             </w:r>
           </w:p>
         </w:tc>
@@ -6586,7 +6749,7 @@
         <w:pStyle w:val="BodyText"/>
       </w:pPr>
       <w:r>
-        <w:t xml:space="preserve">Four results follow. First, cost explains the height of Thailand’s threshold (E1), and the data cannot distinguish a design reading from it on that point. Second, thresholds are not forced by cost: Vietnam and the Philippines state none at the compute layers (E4, E7), and Malaysia’s ladder starts at rack scale (E2). Third, H1 is also unexpected for two design features that cost cannot generate, a revenue-base tier (E5) and a fixed compliance cost (E6), both on unverified rows. Fourth, E8 is unexpected under all three hypotheses. A deliberate startup track fits none of them, which shows that these governments can and do design for new firms, and limits H2 as a general account. H2 and H3 remain difficult to separate: E3, E5 and E6 are expected or compatible under both, and only E7 favours H3 clearly.</w:t>
+        <w:t xml:space="preserve">Four results follow. First, cost explains the height of Thailand’s threshold (E1), and the data cannot distinguish a design reading from it on that point. Second, thresholds are not forced by cost: Vietnam and the Philippines state none at the compute layers (E4, E7), and Malaysia admits cloud activity at RM50,000 of paid-up capital on a separate track (E2). Third, H1 is also unexpected for two design features that cost cannot generate, a revenue-base tier (E5, on an unverified row) and a fixed compliance cost (E6, verified against the guideline). Fourth, E8 is unexpected under all three hypotheses. A deliberate startup track fits none of them, which shows that these governments can and do design for new firms, and limits H2 as a general account. H2 and H3 remain difficult to separate: E3, E5 and E6 are expected or compatible under both, and only E7 favours H3 clearly.</w:t>
       </w:r>
     </w:p>
     <w:p>
@@ -6612,7 +6775,7 @@
         <w:t xml:space="preserve"> </w:t>
       </w:r>
       <w:r>
-        <w:t xml:space="preserve">Dropping evidence against H1 one row at a time (E3 to E7), the case against H1 survives on the others, so no single row decides it. Dropping the rows that rest on unverified coding (E5, E6, E7) leaves E3 and E4, both of which depend on the search protocol and on the list and Plan readings. Dropping the rows that depend on A1 (E2, E3) leaves E4, E5, E6 and E7. Evidence against H2 (E2, E8) is also tested: dropping E2 leaves E8, which is limited to Vietnam’s application layer. If the DESAC reading shows the entry tier is unusable by small providers, E2 reverses to compatible, and the claim that Malaysia is a counter-example to Thailand falls. No single row decides the conclusion that capital gates are a design choice, but the claim that rungs are missing in Thailand depends on A1 and on the general-instrument coding.</w:t>
+        <w:t xml:space="preserve">Dropping evidence against H1 one row at a time (E3 to E7), the case against H1 survives on the others, so no single row decides it. Dropping the rows that rest on unverified coding (E5, E6, E7) leaves E3 and E4, both of which depend on the search protocol and on the list and Plan readings. Dropping the rows that depend on A1 (E2, E3) leaves E4, E5, E6 and E7. Evidence against H2 (E2, E8) is also tested: dropping E2 leaves E8, which is limited to Vietnam’s application layer. If MDEC does not accept capacity resale as an MD activity, E2 reverses to compatible, and the claim that Malaysia is a counter-example to Thailand falls. No single row decides the conclusion that capital gates are a design choice, but the claim that rungs are missing in Thailand depends on A1 and on the general-instrument coding.</w:t>
       </w:r>
     </w:p>
     <w:p>
@@ -6674,7 +6837,7 @@
         <w:pStyle w:val="BodyText"/>
       </w:pPr>
       <w:r>
-        <w:t xml:space="preserve">Doner and Schneider (2016) treat firm size as a cleavage that works through political weakness. We find that capital screens can be set by instrument type (gate, ladder, list, tier) whatever coalitions form around them, but we do not observe coalitions. For the access scenarios of Cerutti et al. (2025), whose macro outcome depends on whether domestic firms can supply compute, the rules we code show where entry is and is not open on paper. They do not show what firms do with it.</w:t>
+        <w:t xml:space="preserve">Doner and Schneider (2016) treat firm size as a cleavage that works through political weakness. We find that capital screens can be set by instrument type (gate, two-track, list, tier) whatever coalitions form around them, but we do not observe coalitions. For the access scenarios of Cerutti et al. (2025), whose macro outcome depends on whether domestic firms can supply compute, the rules we code show where entry is and is not open on paper. They do not show what firms do with it.</w:t>
       </w:r>
     </w:p>
     <w:p>
@@ -6714,7 +6877,7 @@
         <w:t xml:space="preserve"> </w:t>
       </w:r>
       <w:r>
-        <w:t xml:space="preserve">the rung distance is larger where a single gate is set at facility scale than where eligibility is graduated.</w:t>
+        <w:t xml:space="preserve">the rung distance is larger where a single gate is set at facility scale than where a separate low-capital track covers the same activity.</w:t>
       </w:r>
       <w:r>
         <w:t xml:space="preserve"> </w:t>
@@ -7528,7 +7691,7 @@
         <w:t xml:space="preserve"> </w:t>
       </w:r>
       <w:r>
-        <w:t xml:space="preserve">Vietnam’s AI-specific regulatory layer is still developing following the 2025 AI law (Vietnam, 2025), and Malaysia has announced a restructuring of its data-centre incentives.</w:t>
+        <w:t xml:space="preserve">Vietnam’s AI-specific regulatory layer is still developing following the 2025 AI law (Vietnam, 2025), and Malaysia is phasing in a New Incentive Framework that is moving incentives from sector lists to outcome-based tiers, with the services sector date still to be announced.</w:t>
       </w:r>
     </w:p>
     <w:bookmarkEnd w:id="49"/>
@@ -7546,7 +7709,7 @@
         <w:pStyle w:val="FirstParagraph"/>
       </w:pPr>
       <w:r>
-        <w:t xml:space="preserve">This paper asked where four Southeast Asian incentive systems screen entrants to the AI industry. All four make application development accessible on the stated thresholds, and Vietnam adds a startup track with direct equity access. Above that layer they use four architectures. Thailand sets a single capital gate at data hosting, two and a half to three orders of magnitude above the capital needed to host one server, with nothing coded in between. Malaysia grades its tiers from a rack-scale entry tier. Vietnam ranks technologies by priority and states no capital rule. The Philippines applies the same inclusion and firm-scale rules to every activity. No country has an instrument aimed at compute provision below facility scale. Cost explains the height of Thailand’s threshold, but cost does not explain why Vietnam and the Philippines need no capital gate, why Malaysia can start at rack scale, or why Thailand’s research tier presupposes a sales base.</w:t>
+        <w:t xml:space="preserve">This paper asked where four Southeast Asian incentive systems screen entrants to the AI industry. All four make application development accessible on the stated thresholds, and Vietnam adds a startup track with direct equity access. Above that layer they use four architectures. Thailand gates data hosting by capital and capacity, two and a half to three orders of magnitude above the capital needed to host one server, with nothing coded in between. Malaysia runs a low-capital digital track that covers cloud beside a data-centre track whose smallest recognised category is 0.85 MW. Vietnam ranks technologies by priority and states no capital rule. The Philippines applies the same inclusion and firm-scale rules to every activity. No instrument we coded is aimed at compute provision below facility scale. Cost explains the height of Thailand’s gate, but it does not explain why Vietnam and the Philippines need no capital gate, why Malaysia can run a low-capital cloud track, or why Thailand’s research tier presupposes a sales base.</w:t>
       </w:r>
     </w:p>
     <w:p>
@@ -8554,7 +8717,7 @@
         <w:pStyle w:val="BodyText"/>
       </w:pPr>
       <w:r>
-        <w:t xml:space="preserve">Malaysia Digital Economy Corporation. (2024).</w:t>
+        <w:t xml:space="preserve">Malaysia Digital Economy Corporation. (2025).</w:t>
       </w:r>
       <w:r>
         <w:t xml:space="preserve"> </w:t>
@@ -8567,15 +8730,18 @@
         <w:t xml:space="preserve">Guidelines on Malaysia Digital (MD) tax incentive (new investment incentive)</w:t>
       </w:r>
       <w:r>
-        <w:t xml:space="preserve">. MDEC.</w:t>
-      </w:r>
-    </w:p>
-    <w:p>
-      <w:pPr>
-        <w:pStyle w:val="BodyText"/>
-      </w:pPr>
-      <w:r>
-        <w:t xml:space="preserve">Malaysian Investment Development Authority. (2022).</w:t>
+        <w:t xml:space="preserve"> </w:t>
+      </w:r>
+      <w:r>
+        <w:t xml:space="preserve">(revised 22 July 2025; MOF Approval Ref. MOF.TAX(S) 700-2/7/970 JLD.3 (14)). MDEC. https://www.mdec.my/announcement/md-tax-incentive-revised-guidelines</w:t>
+      </w:r>
+    </w:p>
+    <w:p>
+      <w:pPr>
+        <w:pStyle w:val="BodyText"/>
+      </w:pPr>
+      <w:r>
+        <w:t xml:space="preserve">Malaysia, Ministry of Investment, Trade and Industry. (2024).</w:t>
       </w:r>
       <w:r>
         <w:t xml:space="preserve"> </w:t>
@@ -8585,10 +8751,55 @@
           <w:iCs/>
           <w:i/>
         </w:rPr>
+        <w:t xml:space="preserve">Guideline for sustainable development of data centre</w:t>
+      </w:r>
+      <w:r>
+        <w:t xml:space="preserve">. Hosted by the Malaysian Investment Development Authority. https://www.mida.gov.my/wp-content/uploads/2024/12/Guideline-for-Sustainable-Development-of-Data-Centre.pdf</w:t>
+      </w:r>
+    </w:p>
+    <w:p>
+      <w:pPr>
+        <w:pStyle w:val="BodyText"/>
+      </w:pPr>
+      <w:r>
+        <w:t xml:space="preserve">Malaysian Investment Development Authority. (2024).</w:t>
+      </w:r>
+      <w:r>
+        <w:t xml:space="preserve"> </w:t>
+      </w:r>
+      <w:r>
+        <w:rPr>
+          <w:iCs/>
+          <w:i/>
+        </w:rPr>
         <w:t xml:space="preserve">Guidelines and procedures for the application of the Digital Ecosystem Acceleration (DESAC) scheme</w:t>
       </w:r>
       <w:r>
-        <w:t xml:space="preserve">. MIDA.</w:t>
+        <w:t xml:space="preserve"> </w:t>
+      </w:r>
+      <w:r>
+        <w:t xml:space="preserve">(MOF Approval Ref. MOF.TAX(S)700-2/1/208 JLD.2 (7); version on MIDA’s website, December 2024). MIDA. https://www.mida.gov.my/wp-content/uploads/2024/12/DESAC-Guideline_MIDA.pdf</w:t>
+      </w:r>
+    </w:p>
+    <w:p>
+      <w:pPr>
+        <w:pStyle w:val="BodyText"/>
+      </w:pPr>
+      <w:r>
+        <w:t xml:space="preserve">Malaysian Investment Development Authority. (2026).</w:t>
+      </w:r>
+      <w:r>
+        <w:t xml:space="preserve"> </w:t>
+      </w:r>
+      <w:r>
+        <w:rPr>
+          <w:iCs/>
+          <w:i/>
+        </w:rPr>
+        <w:t xml:space="preserve">New Incentive Framework (NIF): Media release and frequently asked questions</w:t>
+      </w:r>
+      <w:r>
+        <w:t xml:space="preserve">. MIDA. https://www.mida.gov.my/media-release/new-incentive-framework-nif/</w:t>
       </w:r>
     </w:p>
     <w:p>

</xml_diff>

<commit_message>
Verify Thai and Vietnamese rules against BOI guide 2026, BOI announcement Sor. 9/2568 and Decree 260/2026; revise findings
</commit_message>
<xml_diff>
--- a/revision/02_revised_manuscript.docx
+++ b/revision/02_revised_manuscript.docx
@@ -244,7 +244,7 @@
         <w:pStyle w:val="FirstParagraph"/>
       </w:pPr>
       <w:r>
-        <w:t xml:space="preserve">Southeast Asian governments have made artificial intelligence (AI) a pillar of industrial policy, but little is known about which firms their incentive instruments let in. We code about 20 instruments from the primary legal texts of Thailand, Vietnam, Malaysia and the Philippines on five dimensions, place explicit thresholds on a common cost scale, and ask where each system screens entrants to the AI technology stack and whether cost necessity, scale-favouring design or administrative habit better explains the pattern. The four systems use four architectures: capital-gated activities (Thailand), two parallel tracks (Malaysia), a priority list without capital rules (Vietnam) and uniform firm-scale tiers (the Philippines). On the stated thresholds all four make application-layer support accessible to small firms. Thailand’s gate for GPU data hosting lies two and a half to three orders of magnitude above the capital needed to host one server. Malaysia pairs a low-capital digital track that covers cloud services with a data-centre track whose smallest recognised category is 0.85 MW. Vietnam and the Philippines state no capital rule at the compute layers, so their screens lie in designation and discretion. We found no instrument aimed at compute provision below facility scale, but Malaysia’s low-capital cloud route shows that small providers are not excluded everywhere on paper. Cost benchmarks explain the height of Thailand’s gate, not the pattern across the four. The evidence concerns legal eligibility, not realised access, and does not show that a middle-technology trap exists.</w:t>
+        <w:t xml:space="preserve">Southeast Asian governments have made artificial intelligence (AI) a pillar of industrial policy, but little is known about which firms their incentive instruments let in. We code about 20 instruments from the primary legal texts of Thailand, Vietnam, Malaysia and the Philippines on five dimensions, place explicit thresholds on a common cost scale, and ask where each system screens entrants to the AI technology stack and whether cost necessity, scale-favouring design or administrative habit better explains the pattern. The four systems use four architectures: capital-gated activities (Thailand), two parallel tracks (Malaysia), a priority list without capital rules (Vietnam) and uniform firm-scale tiers (the Philippines). On the stated thresholds all four make application-layer support accessible to small firms. Thailand sets capital and capacity gates at GPU data hosting (two and a half to three orders of magnitude above the capital needed to host one server) and at data centres (at least 2 MW), while its cloud-service activity has no capital condition. Malaysia pairs a low-capital digital track that covers cloud services with a data-centre track whose smallest recognised category is 0.85 MW. Where small cloud providers can enter on paper, in Thailand and Malaysia, the screen is a fixed compliance cost. Vietnam and the Philippines state no capital rule at the compute layers, so their screens lie in designation and discretion. We found no instrument aimed at compute provision below facility scale, but low-capital cloud routes exist. Cost benchmarks explain the height of Thailand’s gate, not the pattern across the four. The evidence concerns legal eligibility, not realised access, and does not show that a middle-technology trap exists.</w:t>
       </w:r>
     </w:p>
     <w:p>
@@ -414,7 +414,7 @@
         <w:pStyle w:val="FirstParagraph"/>
       </w:pPr>
       <w:r>
-        <w:t xml:space="preserve">We code the primary legal texts of the four countries and, for Thailand, set the formal rules against published project approvals. Our results are as follows. On the stated thresholds, all four countries make application-layer support accessible to small firms, and Vietnam adds an explicit startup track with direct equity access. The four systems use different architectures: capital-gated activities (Thailand), two parallel tracks (Malaysia), a priority list without capital rules (Vietnam) and uniform firm-scale tiers (the Philippines). In Thailand the gate for GPU data hosting lies two and a half to three orders of magnitude above the capital needed to host one server. Malaysia pairs a low-capital digital track that covers cloud services (RM50,000 of paid-up capital) with a data-centre track whose smallest recognised category is 0.85 MW. Vietnam and the Philippines state no capital rule at the compute layers, so their screens lie elsewhere. No instrument we coded is aimed at compute provision below facility scale. Cost benchmarks explain the height of Thailand’s gate, the most visible pattern and a weak test of design bias, but they do not explain why Vietnam and the Philippines need no capital gate or why Malaysia can admit small cloud providers.</w:t>
+        <w:t xml:space="preserve">We code the primary legal texts of the four countries and, for Thailand, set the formal rules against published project approvals. Our results are as follows. On the stated thresholds, all four countries make application-layer support accessible to small firms, and Vietnam adds an explicit startup track with direct equity access. The four systems use different architectures: capital-gated activities (Thailand), two parallel tracks (Malaysia), a priority list without capital rules (Vietnam) and uniform firm-scale tiers (the Philippines). In Thailand the gate for GPU data hosting lies two and a half to three orders of magnitude above the capital needed to host one server and data centres need at least 2 MW, while the cloud-service activity states no capital condition. Malaysia pairs a low-capital digital track that covers cloud services (RM50,000 of paid-up capital) with a data-centre track whose smallest recognised category is 0.85 MW. Vietnam and the Philippines state no capital rule at the compute layers, so their screens lie elsewhere. Where a small cloud provider can enter on paper, in Thailand and Malaysia, the screen is a fixed compliance cost. No instrument we coded is aimed at compute provision below facility scale. Cost benchmarks explain the height of Thailand’s gate, the most visible pattern and a weak test of design bias, but they do not explain why Vietnam and the Philippines need no capital gate or why Malaysia can admit small cloud providers.</w:t>
       </w:r>
     </w:p>
     <w:p>
@@ -1319,7 +1319,7 @@
               <w:jc w:val="left"/>
             </w:pPr>
             <w:r>
-              <w:t xml:space="preserve">BOI Announcements 8/2565, 9/2565, 10/2565; Guide to Investment Promotion 2025; approval statistics Jan to Dec 2025</w:t>
+              <w:t xml:space="preserve">BOI Investment Promotion Guide 2026; BOI Announcements 9/2565 (8 December 2022), 10/2565, Sor. 5/2568 (5 June 2025) and Sor. 9/2568 (14 November 2025); approval statistics January to December 2025</w:t>
             </w:r>
           </w:p>
         </w:tc>
@@ -1342,6 +1342,45 @@
               <w:pStyle w:val="Compact"/>
               <w:jc w:val="left"/>
             </w:pPr>
+            <w:r>
+              <w:t xml:space="preserve">Sor. 9/2568 applies to applications from 14 November 2025</w:t>
+            </w:r>
+          </w:p>
+        </w:tc>
+        <w:tc>
+          <w:tcPr/>
+          <w:p>
+            <w:pPr>
+              <w:pStyle w:val="Compact"/>
+              <w:jc w:val="left"/>
+            </w:pPr>
+            <w:r>
+              <w:t xml:space="preserve">English (BOI unofficial translation)</w:t>
+            </w:r>
+          </w:p>
+        </w:tc>
+        <w:tc>
+          <w:tcPr/>
+          <w:p>
+            <w:pPr>
+              <w:pStyle w:val="Compact"/>
+              <w:jc w:val="left"/>
+            </w:pPr>
+            <w:r>
+              <w:t xml:space="preserve">Read 9 October 2026 for this draft (authors to confirm)</w:t>
+            </w:r>
+          </w:p>
+        </w:tc>
+        <w:tc>
+          <w:tcPr/>
+          <w:p>
+            <w:pPr>
+              <w:pStyle w:val="Compact"/>
+              <w:jc w:val="left"/>
+            </w:pPr>
+            <w:r>
+              <w:t xml:space="preserve">Guide 2026 and Sor. 9/2568 are the current texts and Sor. 5/2568 and 9/2568 amend 9/2565; the Thai original and Royal Gazette text are to be checked (</w:t>
+            </w:r>
             <w:r>
               <w:rPr>
                 <w:bCs/>
@@ -1349,15 +1388,86 @@
               </w:rPr>
               <w:t xml:space="preserve">PENDING</w:t>
             </w:r>
-          </w:p>
-        </w:tc>
-        <w:tc>
-          <w:tcPr/>
-          <w:p>
-            <w:pPr>
-              <w:pStyle w:val="Compact"/>
-              <w:jc w:val="left"/>
-            </w:pPr>
+            <w:r>
+              <w:t xml:space="preserve">)</w:t>
+            </w:r>
+          </w:p>
+        </w:tc>
+      </w:tr>
+      <w:tr>
+        <w:tc>
+          <w:tcPr/>
+          <w:p>
+            <w:pPr>
+              <w:pStyle w:val="Compact"/>
+              <w:jc w:val="left"/>
+            </w:pPr>
+            <w:r>
+              <w:t xml:space="preserve">Vietnam</w:t>
+            </w:r>
+          </w:p>
+        </w:tc>
+        <w:tc>
+          <w:tcPr/>
+          <w:p>
+            <w:pPr>
+              <w:pStyle w:val="Compact"/>
+              <w:jc w:val="left"/>
+            </w:pPr>
+            <w:r>
+              <w:t xml:space="preserve">Decree 260/2026/ND-CP (30 June 2026; in force 1 July 2026; replaces Decree 10/2024); Decision 21/2026/QD-TTg (replaces Decision 1131/QD-TTg of 2025)</w:t>
+            </w:r>
+          </w:p>
+        </w:tc>
+        <w:tc>
+          <w:tcPr/>
+          <w:p>
+            <w:pPr>
+              <w:pStyle w:val="Compact"/>
+              <w:jc w:val="left"/>
+            </w:pPr>
+            <w:r>
+              <w:t xml:space="preserve">Government; Prime Minister</w:t>
+            </w:r>
+          </w:p>
+        </w:tc>
+        <w:tc>
+          <w:tcPr/>
+          <w:p>
+            <w:pPr>
+              <w:pStyle w:val="Compact"/>
+              <w:jc w:val="left"/>
+            </w:pPr>
+            <w:r>
+              <w:t xml:space="preserve">1 July 2026</w:t>
+            </w:r>
+          </w:p>
+        </w:tc>
+        <w:tc>
+          <w:tcPr/>
+          <w:p>
+            <w:pPr>
+              <w:pStyle w:val="Compact"/>
+              <w:jc w:val="left"/>
+            </w:pPr>
+            <w:r>
+              <w:t xml:space="preserve">Vietnamese original, read through the Thu Vien Phap Luat legal database, not the official gazette</w:t>
+            </w:r>
+          </w:p>
+        </w:tc>
+        <w:tc>
+          <w:tcPr/>
+          <w:p>
+            <w:pPr>
+              <w:pStyle w:val="Compact"/>
+              <w:jc w:val="left"/>
+            </w:pPr>
+            <w:r>
+              <w:t xml:space="preserve">Decree read in full 9 October 2026; Decision 21/2026</w:t>
+            </w:r>
+            <w:r>
+              <w:t xml:space="preserve"> </w:t>
+            </w:r>
             <w:r>
               <w:rPr>
                 <w:bCs/>
@@ -1375,125 +1485,17 @@
               <w:jc w:val="left"/>
             </w:pPr>
             <w:r>
+              <w:t xml:space="preserve">Implementing circulars 38, 40, 42, 48 and 49/2026/TT-BKHCN and Decrees 20/2026 and 264/2025 identified; circulars and Decision 21/2026 not yet read (</w:t>
+            </w:r>
+            <w:r>
               <w:rPr>
                 <w:bCs/>
                 <w:b/>
               </w:rPr>
               <w:t xml:space="preserve">PENDING</w:t>
             </w:r>
-          </w:p>
-        </w:tc>
-        <w:tc>
-          <w:tcPr/>
-          <w:p>
-            <w:pPr>
-              <w:pStyle w:val="Compact"/>
-              <w:jc w:val="left"/>
-            </w:pPr>
-            <w:r>
-              <w:rPr>
-                <w:bCs/>
-                <w:b/>
-              </w:rPr>
-              <w:t xml:space="preserve">PENDING</w:t>
-            </w:r>
-          </w:p>
-        </w:tc>
-      </w:tr>
-      <w:tr>
-        <w:tc>
-          <w:tcPr/>
-          <w:p>
-            <w:pPr>
-              <w:pStyle w:val="Compact"/>
-              <w:jc w:val="left"/>
-            </w:pPr>
-            <w:r>
-              <w:t xml:space="preserve">Vietnam</w:t>
-            </w:r>
-          </w:p>
-        </w:tc>
-        <w:tc>
-          <w:tcPr/>
-          <w:p>
-            <w:pPr>
-              <w:pStyle w:val="Compact"/>
-              <w:jc w:val="left"/>
-            </w:pPr>
-            <w:r>
-              <w:t xml:space="preserve">Decree 260/2026/ND-CP; Decision 21/2026/QD-TTg (replaces Decision 1131/QD-TTg of 2025)</w:t>
-            </w:r>
-          </w:p>
-        </w:tc>
-        <w:tc>
-          <w:tcPr/>
-          <w:p>
-            <w:pPr>
-              <w:pStyle w:val="Compact"/>
-              <w:jc w:val="left"/>
-            </w:pPr>
-            <w:r>
-              <w:t xml:space="preserve">Government; Prime Minister</w:t>
-            </w:r>
-          </w:p>
-        </w:tc>
-        <w:tc>
-          <w:tcPr/>
-          <w:p>
-            <w:pPr>
-              <w:pStyle w:val="Compact"/>
-              <w:jc w:val="left"/>
-            </w:pPr>
-            <w:r>
-              <w:t xml:space="preserve">1 July 2026 (VERIFY)</w:t>
-            </w:r>
-          </w:p>
-        </w:tc>
-        <w:tc>
-          <w:tcPr/>
-          <w:p>
-            <w:pPr>
-              <w:pStyle w:val="Compact"/>
-              <w:jc w:val="left"/>
-            </w:pPr>
-            <w:r>
-              <w:rPr>
-                <w:bCs/>
-                <w:b/>
-              </w:rPr>
-              <w:t xml:space="preserve">PENDING</w:t>
-            </w:r>
-          </w:p>
-        </w:tc>
-        <w:tc>
-          <w:tcPr/>
-          <w:p>
-            <w:pPr>
-              <w:pStyle w:val="Compact"/>
-              <w:jc w:val="left"/>
-            </w:pPr>
-            <w:r>
-              <w:rPr>
-                <w:bCs/>
-                <w:b/>
-              </w:rPr>
-              <w:t xml:space="preserve">PENDING</w:t>
-            </w:r>
-          </w:p>
-        </w:tc>
-        <w:tc>
-          <w:tcPr/>
-          <w:p>
-            <w:pPr>
-              <w:pStyle w:val="Compact"/>
-              <w:jc w:val="left"/>
-            </w:pPr>
-            <w:r>
-              <w:rPr>
-                <w:bCs/>
-                <w:b/>
-              </w:rPr>
-              <w:t xml:space="preserve">PENDING</w:t>
+            <w:r>
+              <w:t xml:space="preserve">)</w:t>
             </w:r>
           </w:p>
         </w:tc>
@@ -2467,29 +2469,25 @@
         <w:pStyle w:val="FirstParagraph"/>
       </w:pPr>
       <w:r>
-        <w:t xml:space="preserve">Thailand’s Board of Investment administers AI-relevant incentives through its Digital, Creative Industries and High-Value Service division, established under two 2022 announcements (Board of Investment of Thailand, 2022, 2025). Software and digital-content development (Activity 8.1.1) qualifies for an uncapped corporate income tax exemption at an annual threshold of approximately 1.5 million baht (about US$42,000), calculated from local staff salary expenditure, which a small technical team can reach. GPU-based data hosting (Activity 8.2.4), the activity most directly involved in training or serving models, requires minimum capital of approximately 5,000 million baht (about US$140 million) and an extensive certification regime. The two thresholds are not strictly comparable, since one is an annual expenditure flow and the other a capital stock, so we compare each with the benchmark of Section 3.3, not with each other. GPU-based hosting could be coded as layer (ii) or (iii), and we code it (ii)+(iii). The coding matrix coded it (iii) and described layer (ii) as</w:t>
-      </w:r>
-      <w:r>
-        <w:t xml:space="preserve"> </w:t>
-      </w:r>
-      <w:r>
-        <w:t xml:space="preserve">“</w:t>
-      </w:r>
-      <w:r>
-        <w:t xml:space="preserve">not separately provided for</w:t>
-      </w:r>
-      <w:r>
-        <w:t xml:space="preserve">”</w:t>
-      </w:r>
-      <w:r>
-        <w:t xml:space="preserve"> </w:t>
-      </w:r>
-      <w:r>
-        <w:rPr>
-          <w:bCs/>
-          <w:b/>
-        </w:rPr>
-        <w:t xml:space="preserve">[PENDING: confirm the layer assignment]</w:t>
+        <w:t xml:space="preserve">Thailand’s Board of Investment (BOI) administers AI-relevant incentives through the digital industry section of its list of promoted activities (Board of Investment of Thailand, 2026a). We read the Investment Promotion Guide 2026 and Announcement No. Sor. 9/2568 of 14 November 2025 (Board of Investment of Thailand, 2025) in full. Software and digital-content development (Activity 8.1.1) is in tier A2, an eight-year corporate income tax exemption capped at 100 per cent of the project’s investment. The investment condition is at least THB 1.5 million a year (about US$42,000), calculated from the salaries of additionally employed Thai information-technology staff, and the annual cap is set at 100 per cent of actual qualifying expenditure: those salaries, temporary IT staff, training, and the cost of ISO 29110 or CMMI certification. The software must be developed in Thailand, retail and wholesale sales are excluded, and full operation is due within 12 months. A small technical team can reach the threshold. Modification of existing software (Activity 8.1.2) is in tier B, which carries no corporate income tax exemption.</w:t>
+      </w:r>
+    </w:p>
+    <w:p>
+      <w:pPr>
+        <w:pStyle w:val="BodyText"/>
+      </w:pPr>
+      <w:r>
+        <w:t xml:space="preserve">The compute activities fall under Activity 8.2. Data centres (8.2.1) require in both tiers an electrical system for at least 2 MW of IT load, four high-speed telecommunication links, concurrent maintainability, redundant power and cooling, ISO/IEC 27001 certification of the data centre, a plan of benefits to Thailand, and Thai personnel in at least half of executive and expert positions within three years. The higher tier also requires a power usage effectiveness of 1.3 or lower (Board of Investment of Thailand, 2025). Cloud services (8.2.2, tier A2) have no minimum capital. The project must be located in at least two ISO/IEC 27001-certified data centres in Thailand, those data centres must be interconnected at 10 Gbps or more with a backup link, and the project must hold ISO/IEC 27001 for cloud security and ISO/IEC 20000-1 before using the exemption. Data hosting that rents computing equipment with advanced processing, such as GPU-based systems (8.2.4.1, tier A2), requires location in at least two certified data centres and a capital investment of at least THB 5,000 million (about US$140 million) excluding land and working capital. Other data hosting (8.2.4.2) has the same capital condition in tier A3 (Board of Investment of Thailand, 2026a). We code 8.2.1 and 8.2.4 as layers (ii)+(iii) and 8.2.2 as layer (ii). The activity most directly involved in training or serving AI models, GPU server rental, therefore carries the highest capital condition, while general cloud services carry certification and location conditions in place of capital. Whether a small GPU provider would be classed under 8.2.2 or 8.2.4.1 is a question for BOI</w:t>
+      </w:r>
+      <w:r>
+        <w:t xml:space="preserve"> </w:t>
+      </w:r>
+      <w:r>
+        <w:rPr>
+          <w:bCs/>
+          <w:b/>
+        </w:rPr>
+        <w:t xml:space="preserve">[VERIFY with BOI]</w:t>
       </w:r>
       <w:r>
         <w:t xml:space="preserve">.</w:t>
@@ -2500,72 +2498,15 @@
         <w:pStyle w:val="BodyText"/>
       </w:pPr>
       <w:r>
-        <w:t xml:space="preserve">Secondary legal summaries add details that bear on the compute layers</w:t>
-      </w:r>
-      <w:r>
-        <w:t xml:space="preserve"> </w:t>
-      </w:r>
-      <w:r>
-        <w:rPr>
-          <w:bCs/>
-          <w:b/>
-        </w:rPr>
-        <w:t xml:space="preserve">[CITATION NEEDED: the BOI notification; VERIFY every item]</w:t>
-      </w:r>
-      <w:r>
-        <w:t xml:space="preserve">. The THB 5,000 million minimum for Activity 8.2.4 excludes land and working capital, the project must provide an electrical system of at least two megawatts, and it must operate at least two ISO/IEC 27001-certified data centres in Thailand. Data centres under Activity 8.2.1 receive the higher tier only with a power usage effectiveness of 1.3 or lower and at least two megawatts of IT load, and cloud services (Activity 8.2.2) are reported to require two such data centres. If these summaries are right, Thailand’s compute activities start at about two megawatts or at two certified facilities, and the earlier statement that cloud services are not separately provided for is wrong</w:t>
-      </w:r>
-      <w:r>
-        <w:t xml:space="preserve"> </w:t>
-      </w:r>
-      <w:r>
-        <w:rPr>
-          <w:bCs/>
-          <w:b/>
-        </w:rPr>
-        <w:t xml:space="preserve">[PENDING: correct SI row 4 and Table 3 after reading the notification]</w:t>
-      </w:r>
-      <w:r>
-        <w:t xml:space="preserve">.</w:t>
-      </w:r>
-    </w:p>
-    <w:p>
-      <w:pPr>
-        <w:pStyle w:val="BodyText"/>
-      </w:pPr>
-      <w:r>
-        <w:t xml:space="preserve">The structure is more than a binary. Baseline research and development qualifies at the same accessible threshold as software. A separate competitiveness-enhancement mechanism lets qualifying firms extend the exemption to thirteen years if they make additional investment of at least 200 million baht (about US$5.6 million), representing a specified minimum share of sales over the following three years (Board of Investment of Thailand, 2022). That tier presupposes a revenue base, and it applies to software, where a cost rationale does not apply.</w:t>
-      </w:r>
-      <w:r>
-        <w:t xml:space="preserve"> </w:t>
-      </w:r>
-      <w:r>
-        <w:rPr>
-          <w:bCs/>
-          <w:b/>
-        </w:rPr>
-        <w:t xml:space="preserve">[VERIFY: the minimum share of sales; whether the mechanism is specific to the digital division or cross-sectoral, which bears on H3; and whether it is an optional add-on to the baseline exemption.]</w:t>
-      </w:r>
-    </w:p>
-    <w:p>
-      <w:pPr>
-        <w:pStyle w:val="BodyText"/>
-      </w:pPr>
-      <w:r>
-        <w:t xml:space="preserve">Realised approvals are consistent with the rules. Approval statistics for January to December 2025 show 96 approved projects under Activity 8.1.1 with combined investment of 933.0 million baht, an average of about 9.7 million baht. Over the same period 24 approved data-centre projects under Activity 8.2.1 carried 457,999.8 million baht, an average of about 19,083 million baht (about US$534 million), and a single data-hosting project under Activity 8.2.4 carried 126,793.0 million baht (Board of Investment of Thailand, 2026). The average data-centre project is about 1,960 times the average software project in approved investment. This compares approved projects, not firms, and the two averages belong to different activities. The coding records the US$140 million threshold only for Activity 8.2.4. If a similar threshold applies to 8.2.1</w:t>
-      </w:r>
-      <w:r>
-        <w:t xml:space="preserve"> </w:t>
-      </w:r>
-      <w:r>
-        <w:rPr>
-          <w:bCs/>
-          <w:b/>
-        </w:rPr>
-        <w:t xml:space="preserve">[VERIFY]</w:t>
-      </w:r>
-      <w:r>
-        <w:t xml:space="preserve">, the average approved data-centre project sits about 3.8 times above it, so the threshold would not determine realised size.</w:t>
+        <w:t xml:space="preserve">The structure is more than a binary. A separate competitiveness-enhancement measure (Announcement No. 10/2565) is cross-sectoral and applies to every activity group. Where investment or expenditure on research and development, licensing of domestic technology, human-resource development or local supplier development reaches at least 1 per cent of sales in the first three years, or at least THB 200 million, whichever is lower, the exemption period extends by one year, and by up to five years at 5 per cent of sales or THB 1,000 million, to a maximum of 13 years in total (Board of Investment of Thailand, 2022, 2026a). The measure is proportional to sales, so a small firm can use it, but it presupposes sales in the first three years, and it is a generic template, not an AI-specific design.</w:t>
+      </w:r>
+    </w:p>
+    <w:p>
+      <w:pPr>
+        <w:pStyle w:val="BodyText"/>
+      </w:pPr>
+      <w:r>
+        <w:t xml:space="preserve">Realised approvals are consistent with the rules. Approval statistics for January to December 2025 show 96 approved projects under Activity 8.1.1 with combined investment of 933.0 million baht, an average of about 9.7 million baht. Over the same period 24 approved data-centre projects under Activity 8.2.1 carried 457,999.8 million baht, an average of about 19,083 million baht (about US$534 million), and a single data-hosting project under Activity 8.2.4 carried 126,793.0 million baht (Board of Investment of Thailand, 2026b). The average data-centre project is about 1,960 times the average software project in approved investment. This compares approved projects, not firms, and the two averages belong to different activities. Activity 8.2.1 carries a capacity condition of at least 2 MW of IT load and no stated capital minimum, so the average approved data-centre project is not compared with a capital threshold.</w:t>
       </w:r>
     </w:p>
     <w:p>
@@ -2599,35 +2540,36 @@
         <w:pStyle w:val="FirstParagraph"/>
       </w:pPr>
       <w:r>
-        <w:t xml:space="preserve">Decree 260/2026, implementing the Law on High Technology, took effect on 1 July 2026 and sets two tracks (Vietnam, 2026a). The first, for recognised research centres, imposes demanding conditions: at least 60 per cent of staff in research and development (70 per cent for strategically designated technology), and research spending of 65 to 70 per cent of annual operating budget. These conditions restrict the track to purpose-built research institutions.</w:t>
-      </w:r>
-      <w:r>
-        <w:t xml:space="preserve"> </w:t>
-      </w:r>
-      <w:r>
-        <w:rPr>
-          <w:bCs/>
-          <w:b/>
-        </w:rPr>
-        <w:t xml:space="preserve">[VERIFY: percentage thresholds against the decree text.]</w:t>
-      </w:r>
-    </w:p>
-    <w:p>
-      <w:pPr>
-        <w:pStyle w:val="BodyText"/>
-      </w:pPr>
-      <w:r>
-        <w:t xml:space="preserve">The second track, for recognised startups, requires only demonstrated revenue growth or a commercialisation-ready technology. Qualifying startups receive the full incentive package, fee exemptions for state research facilities, and priority access to the National Venture Capital Fund, a direct equity instrument distinct from the National Technology Innovation Fund, which provides subsidised lending. This is the clearest instance in our data of explicit accommodation for new firms, and part of it is delivered by direct, not tax-based, means.</w:t>
-      </w:r>
-      <w:r>
-        <w:t xml:space="preserve"> </w:t>
-      </w:r>
-      <w:r>
-        <w:rPr>
-          <w:bCs/>
-          <w:b/>
-        </w:rPr>
-        <w:t xml:space="preserve">[VERIFY: Article 11 provisions and the fund distinction.]</w:t>
+        <w:t xml:space="preserve">Decree 260/2026/ND-CP, dated 30 June 2026 and in force from 1 July 2026, implements the Law on High Technology (No. 133/2025/QH15) and replaces Decree 10/2024 on high-technology zones (Vietnam, 2026a). We read the full text. Support attaches to research and development on technologies in lists issued by the Prime Minister. Research and development tasks on listed high technology can be funded by the State up to 100 per cent. Qualifying organisations and firms also receive import duty exemption on equipment, deduction of research and development costs, personal income tax exemption on research salaries, support for intellectual property costs, and interest support through the National Technology Innovation Fund (NATIF) of 70 per cent of the contract interest rate up to 8 per cent a year for up to five years, or 100 per cent up to 10 per cent a year for strategic technology (Articles 4 and 5). The first track, for recognised research and development centres, imposes demanding conditions: at least 60 per cent of workers in research and development (70 per cent for strategic technology), of whom at least 85 per cent hold a bachelor’s degree or above and at least 10 per cent a master’s degree or above (20 per cent for strategic technology, with at least 5 per cent doctorates), and research and development spending of at least 65 per cent of annual operating expenditure (70 per cent for strategic technology) (Article 8). These conditions restrict the track to purpose-built research institutions.</w:t>
+      </w:r>
+    </w:p>
+    <w:p>
+      <w:pPr>
+        <w:pStyle w:val="BodyText"/>
+      </w:pPr>
+      <w:r>
+        <w:t xml:space="preserve">The second track, for recognised high-technology startups, requires research and development on listed technologies, an innovative solution that either shows average revenue growth of at least 20 per cent a year over two consecutive years (for firms at least three years old) or is ready for transfer or commercialisation with application or test results and a feasible plan, and the capacity to expand its market (Article 11). It bypasses the staffing and spending ratios of the research-centre track. Recognised startups receive the policies for innovative startups, the support of Articles 4 and 5 when they carry out funded tasks, a 100 per cent exemption of fees for the first three years and a 50 per cent reduction afterwards when they use state-invested research centres, testing centres and key laboratories, access to controlled testing, and priority consideration for co-investment, investment, guarantees, technical support or fundraising support from the National Venture Capital Fund, local venture funds and other funds. The provincial People’s Committee recognises startups within 40 days and the recognition lasts five years. Startups report annually, the authority inspects after 12 months and every two years afterwards, and recognition is revoked for false declarations or inactivity for 12 months. This is the clearest instance in our data of explicit accommodation for new firms, and most of it is direct support, not tax relief. NATIF supports interest on bank loans and does not lend directly.</w:t>
+      </w:r>
+    </w:p>
+    <w:p>
+      <w:pPr>
+        <w:pStyle w:val="BodyText"/>
+      </w:pPr>
+      <w:r>
+        <w:t xml:space="preserve">Recognition as a high-technology enterprise carries scale-linked conditions (Articles 14 and 15). Group 2 enterprises must spend at least 0.5 per cent of net revenue less inputs on research and development if total capital is VND 6,000 billion or more, at least 1 per cent if it is VND 100 billion or more, and at least 2 per cent otherwise, and must employ research staff of at least 1, 2.5 or 5 per cent of the workforce on the same tiers. The required ratio falls as the firm grows. High-technology zone projects face similar tiers and a preference for projects whose investment per unit of land exceeds the zone average (Article 26). Decree 260 also defines technology infrastructure to include computing and data infrastructure and supports investment in it for urgent high-technology tasks, with the cost deductible for corporate income tax and no scale threshold (Articles 3, 4(6) and 5(6)). It is the nearest instrument to compute provision in the decree, but it serves research tasks and not commercial compute supply</w:t>
+      </w:r>
+      <w:r>
+        <w:t xml:space="preserve"> </w:t>
+      </w:r>
+      <w:r>
+        <w:rPr>
+          <w:bCs/>
+          <w:b/>
+        </w:rPr>
+        <w:t xml:space="preserve">[VERIFY coverage of a small provider]</w:t>
+      </w:r>
+      <w:r>
+        <w:t xml:space="preserve">.</w:t>
       </w:r>
     </w:p>
     <w:p>
@@ -3029,19 +2971,19 @@
               <w:jc w:val="left"/>
             </w:pPr>
             <w:r>
-              <w:t xml:space="preserve">Accessible: about US$42,000 per year in local salary spend</w:t>
-            </w:r>
-          </w:p>
-        </w:tc>
-        <w:tc>
-          <w:tcPr/>
-          <w:p>
-            <w:pPr>
-              <w:pStyle w:val="Compact"/>
-              <w:jc w:val="left"/>
-            </w:pPr>
-            <w:r>
-              <w:t xml:space="preserve">Accessible: named top-tier strategic priority; startup track</w:t>
+              <w:t xml:space="preserve">Accessible: about US$42,000 per year of Thai IT salary spend; exemption capped at qualifying expenditure</w:t>
+            </w:r>
+          </w:p>
+        </w:tc>
+        <w:tc>
+          <w:tcPr/>
+          <w:p>
+            <w:pPr>
+              <w:pStyle w:val="Compact"/>
+              <w:jc w:val="left"/>
+            </w:pPr>
+            <w:r>
+              <w:t xml:space="preserve">Accessible: startup track (research and development on listed technology; revenue growth or commercialisation-ready; recognition by the provincial authority); named top-tier strategic priority</w:t>
             </w:r>
           </w:p>
         </w:tc>
@@ -3091,7 +3033,22 @@
               <w:jc w:val="left"/>
             </w:pPr>
             <w:r>
-              <w:t xml:space="preserve">Minimum capital about US$140 million, excluding land (Activity 8.2.4); about 2 MW electrical capacity and two certified data centres; Activities 8.2.1 and 8.2.2 also exist (</w:t>
+              <w:t xml:space="preserve">Data centres: at least 2 MW of IT load (8.2.1). Cloud services: no capital minimum, two certified data centres, ISO/IEC 27001 and 20000-1 (8.2.2). GPU hosting: capital of at least about US$140 million excluding land (8.2.4.1)</w:t>
+            </w:r>
+          </w:p>
+        </w:tc>
+        <w:tc>
+          <w:tcPr/>
+          <w:p>
+            <w:pPr>
+              <w:pStyle w:val="Compact"/>
+              <w:jc w:val="left"/>
+            </w:pPr>
+            <w:r>
+              <w:t xml:space="preserve">Cloud-computing platforms in top tier; no capital rule; scope</w:t>
+            </w:r>
+            <w:r>
+              <w:t xml:space="preserve"> </w:t>
             </w:r>
             <w:r>
               <w:rPr>
@@ -3101,19 +3058,19 @@
               <w:t xml:space="preserve">VERIFY</w:t>
             </w:r>
             <w:r>
-              <w:t xml:space="preserve">)</w:t>
-            </w:r>
-          </w:p>
-        </w:tc>
-        <w:tc>
-          <w:tcPr/>
-          <w:p>
-            <w:pPr>
-              <w:pStyle w:val="Compact"/>
-              <w:jc w:val="left"/>
-            </w:pPr>
-            <w:r>
-              <w:t xml:space="preserve">Cloud-computing platforms in top tier; no capital rule; scope</w:t>
+              <w:t xml:space="preserve">. Technology-infrastructure support names computing and data infrastructure, with no threshold</w:t>
+            </w:r>
+          </w:p>
+        </w:tc>
+        <w:tc>
+          <w:tcPr/>
+          <w:p>
+            <w:pPr>
+              <w:pStyle w:val="Compact"/>
+              <w:jc w:val="left"/>
+            </w:pPr>
+            <w:r>
+              <w:t xml:space="preserve">MD track: cloud is a promoted enabler, RM50,000 paid-up capital (capacity resale</w:t>
             </w:r>
             <w:r>
               <w:t xml:space="preserve"> </w:t>
@@ -3125,20 +3082,108 @@
               </w:rPr>
               <w:t xml:space="preserve">VERIFY</w:t>
             </w:r>
-          </w:p>
-        </w:tc>
-        <w:tc>
-          <w:tcPr/>
-          <w:p>
-            <w:pPr>
-              <w:pStyle w:val="Compact"/>
-              <w:jc w:val="left"/>
-            </w:pPr>
-            <w:r>
-              <w:t xml:space="preserve">MD track: cloud is a promoted enabler, RM50,000 paid-up capital (capacity resale</w:t>
-            </w:r>
-            <w:r>
-              <w:t xml:space="preserve"> </w:t>
+            <w:r>
+              <w:t xml:space="preserve">). DESAC: paid-up floor about US$550,000, smallest category 0.85 MW, ten-year condition about US$220 million capex</w:t>
+            </w:r>
+          </w:p>
+        </w:tc>
+        <w:tc>
+          <w:tcPr/>
+          <w:p>
+            <w:pPr>
+              <w:pStyle w:val="Compact"/>
+              <w:jc w:val="left"/>
+            </w:pPr>
+            <w:r>
+              <w:t xml:space="preserve">Same priority tier as AI applications; no minimum; PHP 15 billion firm-scale tier for extended benefits</w:t>
+            </w:r>
+          </w:p>
+        </w:tc>
+      </w:tr>
+      <w:tr>
+        <w:tc>
+          <w:tcPr/>
+          <w:p>
+            <w:pPr>
+              <w:pStyle w:val="Compact"/>
+              <w:jc w:val="left"/>
+            </w:pPr>
+            <w:r>
+              <w:t xml:space="preserve">Layer (iv), hardware</w:t>
+            </w:r>
+          </w:p>
+        </w:tc>
+        <w:tc>
+          <w:tcPr/>
+          <w:p>
+            <w:pPr>
+              <w:pStyle w:val="Compact"/>
+              <w:jc w:val="left"/>
+            </w:pPr>
+            <w:r>
+              <w:t xml:space="preserve">Uncoded (separate activity divisions)</w:t>
+            </w:r>
+          </w:p>
+        </w:tc>
+        <w:tc>
+          <w:tcPr/>
+          <w:p>
+            <w:pPr>
+              <w:pStyle w:val="Compact"/>
+              <w:jc w:val="left"/>
+            </w:pPr>
+            <w:r>
+              <w:t xml:space="preserve">Specialised chips in lower priority tier</w:t>
+            </w:r>
+          </w:p>
+        </w:tc>
+        <w:tc>
+          <w:tcPr/>
+          <w:p>
+            <w:pPr>
+              <w:pStyle w:val="Compact"/>
+              <w:jc w:val="left"/>
+            </w:pPr>
+            <w:r>
+              <w:t xml:space="preserve">Uncoded (separate schemes)</w:t>
+            </w:r>
+          </w:p>
+        </w:tc>
+        <w:tc>
+          <w:tcPr/>
+          <w:p>
+            <w:pPr>
+              <w:pStyle w:val="Compact"/>
+              <w:jc w:val="left"/>
+            </w:pPr>
+            <w:r>
+              <w:t xml:space="preserve">Uncoded (no distinct treatment)</w:t>
+            </w:r>
+          </w:p>
+        </w:tc>
+      </w:tr>
+      <w:tr>
+        <w:tc>
+          <w:tcPr/>
+          <w:p>
+            <w:pPr>
+              <w:pStyle w:val="Compact"/>
+              <w:jc w:val="left"/>
+            </w:pPr>
+            <w:r>
+              <w:t xml:space="preserve">Instrument aimed at compute provision below facility scale</w:t>
+            </w:r>
+          </w:p>
+        </w:tc>
+        <w:tc>
+          <w:tcPr/>
+          <w:p>
+            <w:pPr>
+              <w:pStyle w:val="Compact"/>
+              <w:jc w:val="left"/>
+            </w:pPr>
+            <w:r>
+              <w:t xml:space="preserve">None aimed at it; cloud services (8.2.2) have no capital minimum but need two certified data centres (</w:t>
             </w:r>
             <w:r>
               <w:rPr>
@@ -3148,95 +3193,54 @@
               <w:t xml:space="preserve">VERIFY</w:t>
             </w:r>
             <w:r>
-              <w:t xml:space="preserve">). DESAC: paid-up floor about US$550,000, smallest category 0.85 MW, ten-year condition about US$220 million capex</w:t>
-            </w:r>
-          </w:p>
-        </w:tc>
-        <w:tc>
-          <w:tcPr/>
-          <w:p>
-            <w:pPr>
-              <w:pStyle w:val="Compact"/>
-              <w:jc w:val="left"/>
-            </w:pPr>
-            <w:r>
-              <w:t xml:space="preserve">Same priority tier as AI applications; no minimum; PHP 15 billion firm-scale tier for extended benefits</w:t>
-            </w:r>
-          </w:p>
-        </w:tc>
-      </w:tr>
-      <w:tr>
-        <w:tc>
-          <w:tcPr/>
-          <w:p>
-            <w:pPr>
-              <w:pStyle w:val="Compact"/>
-              <w:jc w:val="left"/>
-            </w:pPr>
-            <w:r>
-              <w:t xml:space="preserve">Layer (iv), hardware</w:t>
-            </w:r>
-          </w:p>
-        </w:tc>
-        <w:tc>
-          <w:tcPr/>
-          <w:p>
-            <w:pPr>
-              <w:pStyle w:val="Compact"/>
-              <w:jc w:val="left"/>
-            </w:pPr>
-            <w:r>
-              <w:t xml:space="preserve">Uncoded (separate activity divisions)</w:t>
-            </w:r>
-          </w:p>
-        </w:tc>
-        <w:tc>
-          <w:tcPr/>
-          <w:p>
-            <w:pPr>
-              <w:pStyle w:val="Compact"/>
-              <w:jc w:val="left"/>
-            </w:pPr>
-            <w:r>
-              <w:t xml:space="preserve">Specialised chips in lower priority tier</w:t>
-            </w:r>
-          </w:p>
-        </w:tc>
-        <w:tc>
-          <w:tcPr/>
-          <w:p>
-            <w:pPr>
-              <w:pStyle w:val="Compact"/>
-              <w:jc w:val="left"/>
-            </w:pPr>
-            <w:r>
-              <w:t xml:space="preserve">Uncoded (separate schemes)</w:t>
-            </w:r>
-          </w:p>
-        </w:tc>
-        <w:tc>
-          <w:tcPr/>
-          <w:p>
-            <w:pPr>
-              <w:pStyle w:val="Compact"/>
-              <w:jc w:val="left"/>
-            </w:pPr>
-            <w:r>
-              <w:t xml:space="preserve">Uncoded (no distinct treatment)</w:t>
-            </w:r>
-          </w:p>
-        </w:tc>
-      </w:tr>
-      <w:tr>
-        <w:tc>
-          <w:tcPr/>
-          <w:p>
-            <w:pPr>
-              <w:pStyle w:val="Compact"/>
-              <w:jc w:val="left"/>
-            </w:pPr>
-            <w:r>
-              <w:t xml:space="preserve">Instrument aimed at compute provision below facility scale</w:t>
+              <w:t xml:space="preserve"> </w:t>
+            </w:r>
+            <w:r>
+              <w:t xml:space="preserve">BOI classification of a small GPU provider)</w:t>
+            </w:r>
+          </w:p>
+        </w:tc>
+        <w:tc>
+          <w:tcPr/>
+          <w:p>
+            <w:pPr>
+              <w:pStyle w:val="Compact"/>
+              <w:jc w:val="left"/>
+            </w:pPr>
+            <w:r>
+              <w:t xml:space="preserve">None identified; nearest is technology-infrastructure support for research tasks (</w:t>
+            </w:r>
+            <w:r>
+              <w:rPr>
+                <w:bCs/>
+                <w:b/>
+              </w:rPr>
+              <w:t xml:space="preserve">VERIFY</w:t>
+            </w:r>
+            <w:r>
+              <w:t xml:space="preserve">)</w:t>
+            </w:r>
+          </w:p>
+        </w:tc>
+        <w:tc>
+          <w:tcPr/>
+          <w:p>
+            <w:pPr>
+              <w:pStyle w:val="Compact"/>
+              <w:jc w:val="left"/>
+            </w:pPr>
+            <w:r>
+              <w:t xml:space="preserve">None aimed at it; the MD track may admit small cloud providers (</w:t>
+            </w:r>
+            <w:r>
+              <w:rPr>
+                <w:bCs/>
+                <w:b/>
+              </w:rPr>
+              <w:t xml:space="preserve">VERIFY</w:t>
+            </w:r>
+            <w:r>
+              <w:t xml:space="preserve">)</w:t>
             </w:r>
           </w:p>
         </w:tc>
@@ -3258,75 +3262,6 @@
               <w:t xml:space="preserve">PENDING</w:t>
             </w:r>
             <w:r>
-              <w:t xml:space="preserve"> </w:t>
-            </w:r>
-            <w:r>
-              <w:t xml:space="preserve">search protocol)</w:t>
-            </w:r>
-          </w:p>
-        </w:tc>
-        <w:tc>
-          <w:tcPr/>
-          <w:p>
-            <w:pPr>
-              <w:pStyle w:val="Compact"/>
-              <w:jc w:val="left"/>
-            </w:pPr>
-            <w:r>
-              <w:t xml:space="preserve">None identified (</w:t>
-            </w:r>
-            <w:r>
-              <w:rPr>
-                <w:bCs/>
-                <w:b/>
-              </w:rPr>
-              <w:t xml:space="preserve">PENDING</w:t>
-            </w:r>
-            <w:r>
-              <w:t xml:space="preserve">)</w:t>
-            </w:r>
-          </w:p>
-        </w:tc>
-        <w:tc>
-          <w:tcPr/>
-          <w:p>
-            <w:pPr>
-              <w:pStyle w:val="Compact"/>
-              <w:jc w:val="left"/>
-            </w:pPr>
-            <w:r>
-              <w:t xml:space="preserve">None aimed at it; the MD track may admit small cloud providers (</w:t>
-            </w:r>
-            <w:r>
-              <w:rPr>
-                <w:bCs/>
-                <w:b/>
-              </w:rPr>
-              <w:t xml:space="preserve">VERIFY</w:t>
-            </w:r>
-            <w:r>
-              <w:t xml:space="preserve">)</w:t>
-            </w:r>
-          </w:p>
-        </w:tc>
-        <w:tc>
-          <w:tcPr/>
-          <w:p>
-            <w:pPr>
-              <w:pStyle w:val="Compact"/>
-              <w:jc w:val="left"/>
-            </w:pPr>
-            <w:r>
-              <w:t xml:space="preserve">None identified (</w:t>
-            </w:r>
-            <w:r>
-              <w:rPr>
-                <w:bCs/>
-                <w:b/>
-              </w:rPr>
-              <w:t xml:space="preserve">PENDING</w:t>
-            </w:r>
-            <w:r>
               <w:t xml:space="preserve">)</w:t>
             </w:r>
           </w:p>
@@ -3415,19 +3350,19 @@
               <w:jc w:val="left"/>
             </w:pPr>
             <w:r>
-              <w:t xml:space="preserve">Indirect (tax exemption)</w:t>
-            </w:r>
-          </w:p>
-        </w:tc>
-        <w:tc>
-          <w:tcPr/>
-          <w:p>
-            <w:pPr>
-              <w:pStyle w:val="Compact"/>
-              <w:jc w:val="left"/>
-            </w:pPr>
-            <w:r>
-              <w:t xml:space="preserve">Tax plus direct equity access</w:t>
+              <w:t xml:space="preserve">Indirect (capped tax exemption)</w:t>
+            </w:r>
+          </w:p>
+        </w:tc>
+        <w:tc>
+          <w:tcPr/>
+          <w:p>
+            <w:pPr>
+              <w:pStyle w:val="Compact"/>
+              <w:jc w:val="left"/>
+            </w:pPr>
+            <w:r>
+              <w:t xml:space="preserve">Direct funding of tasks, fee waivers, interest support and venture-equity priority, plus tax measures</w:t>
             </w:r>
           </w:p>
         </w:tc>
@@ -3477,29 +3412,19 @@
               <w:jc w:val="left"/>
             </w:pPr>
             <w:r>
-              <w:t xml:space="preserve">ISO/IEC 27001 certification at the infrastructure activities (</w:t>
-            </w:r>
-            <w:r>
-              <w:rPr>
-                <w:bCs/>
-                <w:b/>
-              </w:rPr>
-              <w:t xml:space="preserve">VERIFY</w:t>
-            </w:r>
-            <w:r>
-              <w:t xml:space="preserve">)</w:t>
-            </w:r>
-          </w:p>
-        </w:tc>
-        <w:tc>
-          <w:tcPr/>
-          <w:p>
-            <w:pPr>
-              <w:pStyle w:val="Compact"/>
-              <w:jc w:val="left"/>
-            </w:pPr>
-            <w:r>
-              <w:t xml:space="preserve">R&amp;D staffing and spending ratios (research track)</w:t>
+              <w:t xml:space="preserve">ISO/IEC 27001 certification at data centres and, for cloud, ISO/IEC 20000-1 and two certified data centres</w:t>
+            </w:r>
+          </w:p>
+        </w:tc>
+        <w:tc>
+          <w:tcPr/>
+          <w:p>
+            <w:pPr>
+              <w:pStyle w:val="Compact"/>
+              <w:jc w:val="left"/>
+            </w:pPr>
+            <w:r>
+              <w:t xml:space="preserve">R&amp;D staffing and spending ratios (research centres); annual report and inspections of recognised startups</w:t>
             </w:r>
           </w:p>
         </w:tc>
@@ -3549,19 +3474,19 @@
               <w:jc w:val="left"/>
             </w:pPr>
             <w:r>
-              <w:t xml:space="preserve">Capital and capacity gate at the data-hosting activity</w:t>
-            </w:r>
-          </w:p>
-        </w:tc>
-        <w:tc>
-          <w:tcPr/>
-          <w:p>
-            <w:pPr>
-              <w:pStyle w:val="Compact"/>
-              <w:jc w:val="left"/>
-            </w:pPr>
-            <w:r>
-              <w:t xml:space="preserve">No capital screen in coded instruments; designation</w:t>
+              <w:t xml:space="preserve">Capacity and capital gates at data-centre and GPU-hosting activities; certification and location at cloud services</w:t>
+            </w:r>
+          </w:p>
+        </w:tc>
+        <w:tc>
+          <w:tcPr/>
+          <w:p>
+            <w:pPr>
+              <w:pStyle w:val="Compact"/>
+              <w:jc w:val="left"/>
+            </w:pPr>
+            <w:r>
+              <w:t xml:space="preserve">No capital screen in coded instruments; listed technology, recognition by the authority and designation</w:t>
             </w:r>
           </w:p>
         </w:tc>
@@ -3877,7 +3802,7 @@
         <w:t xml:space="preserve"> </w:t>
       </w:r>
       <w:r>
-        <w:t xml:space="preserve">Malaysia’s audited self-declaration in the low-capital track, borne by the company, and Thailand’s certification regime at its infrastructure activities are both recurring burdens. They are recorded separately because a fixed cost is neither a scale nor a vintage rule.</w:t>
+        <w:t xml:space="preserve">Thailand’s certification conditions for cloud services (ISO/IEC 27001 and 20000-1, two certified data centres), Malaysia’s audited self-declaration in the Digital track, and Vietnam’s annual reports and inspections of recognised startups are recurring burdens. They are recorded separately because a fixed cost is neither a scale nor a vintage rule.</w:t>
       </w:r>
     </w:p>
     <w:p>
@@ -3895,7 +3820,7 @@
         <w:t xml:space="preserve"> </w:t>
       </w:r>
       <w:r>
-        <w:t xml:space="preserve">Three of the four deliver the accessible tier entirely through indirect, tax-based instruments, which presuppose taxable profit. Only Vietnam adds a direct instrument.</w:t>
+        <w:t xml:space="preserve">Thailand, Malaysia and the Philippines deliver the accessible tier through indirect, tax-based instruments, which presuppose taxable profit. Vietnam adds several direct instruments: funding of tasks up to 100 per cent, fee waivers, interest support and priority for venture equity.</w:t>
       </w:r>
     </w:p>
     <w:p>
@@ -4099,43 +4024,43 @@
               <w:jc w:val="left"/>
             </w:pPr>
             <w:r>
-              <w:t xml:space="preserve">Activity-specific minimum capital and capacity</w:t>
-            </w:r>
-          </w:p>
-        </w:tc>
-        <w:tc>
-          <w:tcPr/>
-          <w:p>
-            <w:pPr>
-              <w:pStyle w:val="Compact"/>
-              <w:jc w:val="left"/>
-            </w:pPr>
-            <w:r>
-              <w:t xml:space="preserve">A step at the data-hosting activity (about US$140m; about 2 MW)</w:t>
-            </w:r>
-          </w:p>
-        </w:tc>
-        <w:tc>
-          <w:tcPr/>
-          <w:p>
-            <w:pPr>
-              <w:pStyle w:val="Compact"/>
-              <w:jc w:val="left"/>
-            </w:pPr>
-            <w:r>
-              <w:t xml:space="preserve">No coded rung between the software threshold and the data-hosting threshold</w:t>
-            </w:r>
-          </w:p>
-        </w:tc>
-        <w:tc>
-          <w:tcPr/>
-          <w:p>
-            <w:pPr>
-              <w:pStyle w:val="Compact"/>
-              <w:jc w:val="left"/>
-            </w:pPr>
-            <w:r>
-              <w:t xml:space="preserve">A large gap between layers</w:t>
+              <w:t xml:space="preserve">Activity-specific capital and capacity conditions; certification conditions for cloud</w:t>
+            </w:r>
+          </w:p>
+        </w:tc>
+        <w:tc>
+          <w:tcPr/>
+          <w:p>
+            <w:pPr>
+              <w:pStyle w:val="Compact"/>
+              <w:jc w:val="left"/>
+            </w:pPr>
+            <w:r>
+              <w:t xml:space="preserve">Capacity (2 MW) at data centres and capital (about US$140m) at GPU hosting; certification and location at cloud services</w:t>
+            </w:r>
+          </w:p>
+        </w:tc>
+        <w:tc>
+          <w:tcPr/>
+          <w:p>
+            <w:pPr>
+              <w:pStyle w:val="Compact"/>
+              <w:jc w:val="left"/>
+            </w:pPr>
+            <w:r>
+              <w:t xml:space="preserve">A low-capital route exists for cloud services and is screened by certification; GPU rental and data centres are gated by capital and capacity</w:t>
+            </w:r>
+          </w:p>
+        </w:tc>
+        <w:tc>
+          <w:tcPr/>
+          <w:p>
+            <w:pPr>
+              <w:pStyle w:val="Compact"/>
+              <w:jc w:val="left"/>
+            </w:pPr>
+            <w:r>
+              <w:t xml:space="preserve">Fixed certification cost on the cloud route; a large gap between layers</w:t>
             </w:r>
           </w:p>
         </w:tc>
@@ -4499,19 +4424,19 @@
               <w:jc w:val="left"/>
             </w:pPr>
             <w:r>
-              <w:t xml:space="preserve">Thailand, data hosting (8.2.4), minimum capital</w:t>
-            </w:r>
-          </w:p>
-        </w:tc>
-        <w:tc>
-          <w:tcPr/>
-          <w:p>
-            <w:pPr>
-              <w:pStyle w:val="Compact"/>
-              <w:jc w:val="left"/>
-            </w:pPr>
-            <w:r>
-              <w:t xml:space="preserve">Minimum capital excluding land</w:t>
+              <w:t xml:space="preserve">Thailand, GPU data hosting (8.2.4.1), minimum capital</w:t>
+            </w:r>
+          </w:p>
+        </w:tc>
+        <w:tc>
+          <w:tcPr/>
+          <w:p>
+            <w:pPr>
+              <w:pStyle w:val="Compact"/>
+              <w:jc w:val="left"/>
+            </w:pPr>
+            <w:r>
+              <w:t xml:space="preserve">Capital excluding land and working capital</w:t>
             </w:r>
           </w:p>
         </w:tc>
@@ -4561,7 +4486,7 @@
               <w:jc w:val="left"/>
             </w:pPr>
             <w:r>
-              <w:t xml:space="preserve">Thailand, data hosting (8.2.4), electrical capacity (VERIFY)</w:t>
+              <w:t xml:space="preserve">Thailand, data centres (8.2.1), IT load</w:t>
             </w:r>
           </w:p>
         </w:tc>
@@ -4610,6 +4535,68 @@
             </w:pPr>
             <w:r>
               <w:t xml:space="preserve">1.7 to 2.8</w:t>
+            </w:r>
+          </w:p>
+        </w:tc>
+      </w:tr>
+      <w:tr>
+        <w:tc>
+          <w:tcPr/>
+          <w:p>
+            <w:pPr>
+              <w:pStyle w:val="Compact"/>
+              <w:jc w:val="left"/>
+            </w:pPr>
+            <w:r>
+              <w:t xml:space="preserve">Thailand, cloud services (8.2.2)</w:t>
+            </w:r>
+          </w:p>
+        </w:tc>
+        <w:tc>
+          <w:tcPr/>
+          <w:p>
+            <w:pPr>
+              <w:pStyle w:val="Compact"/>
+              <w:jc w:val="left"/>
+            </w:pPr>
+            <w:r>
+              <w:t xml:space="preserve">No capital condition</w:t>
+            </w:r>
+          </w:p>
+        </w:tc>
+        <w:tc>
+          <w:tcPr/>
+          <w:p>
+            <w:pPr>
+              <w:pStyle w:val="Compact"/>
+              <w:jc w:val="left"/>
+            </w:pPr>
+            <w:r>
+              <w:t xml:space="preserve">not defined</w:t>
+            </w:r>
+          </w:p>
+        </w:tc>
+        <w:tc>
+          <w:tcPr/>
+          <w:p>
+            <w:pPr>
+              <w:pStyle w:val="Compact"/>
+              <w:jc w:val="left"/>
+            </w:pPr>
+            <w:r>
+              <w:t xml:space="preserve">not defined</w:t>
+            </w:r>
+          </w:p>
+        </w:tc>
+        <w:tc>
+          <w:tcPr/>
+          <w:p>
+            <w:pPr>
+              <w:pStyle w:val="Compact"/>
+              <w:jc w:val="left"/>
+            </w:pPr>
+            <w:r>
+              <w:t xml:space="preserve">not defined</w:t>
             </w:r>
           </w:p>
         </w:tc>
@@ -5103,7 +5090,7 @@
         <w:pStyle w:val="BodyText"/>
       </w:pPr>
       <w:r>
-        <w:t xml:space="preserve">Three readings follow. In Thailand a single step of two and a half to three orders of magnitude separates one server from the smallest eligible scale in capital terms, and nothing coded lies between. In Malaysia the facility track starts at a category of 0.85 MW, 1.3 to 2.4 orders of magnitude above one server, while a separate digital track admits new cloud and AI activities at RM50,000 of paid-up capital. The low DESAC capitalisation floor says little about project scale. Vietnam and the Philippines state no capital threshold at the compute layers, so their screens must be sought in designation, inclusion and discretion.</w:t>
+        <w:t xml:space="preserve">Three readings follow. In Thailand the GPU-hosting gate lies two and a half to three orders of magnitude above one server and the data-centre capacity condition 1.7 to 2.8 orders, while the cloud-service activity states no capital condition. In Malaysia the data-centre track starts at a 0.85 MW category, 1.3 to 2.4 orders of magnitude above one server, while the Digital track admits new cloud and AI activities at RM50,000 of paid-up capital. Vietnam and the Philippines state no capital threshold at the compute layers. In the two countries with a low-capital cloud route, the screen is a fixed compliance cost, certification in Thailand and audit in Malaysia.</w:t>
       </w:r>
     </w:p>
     <w:p>
@@ -5223,41 +5210,19 @@
               <w:jc w:val="left"/>
             </w:pPr>
             <w:r>
-              <w:t xml:space="preserve">Eligible (Activity 8.1.1, about US$42,000 annual salary spend)</w:t>
-            </w:r>
-          </w:p>
-        </w:tc>
-        <w:tc>
-          <w:tcPr/>
-          <w:p>
-            <w:pPr>
-              <w:pStyle w:val="Compact"/>
-              <w:jc w:val="left"/>
-            </w:pPr>
-            <w:r>
-              <w:t xml:space="preserve">Likely ineligible on the coded rules (8.2.4 needs US$140m, about 2 MW and two certified data centres; cloud services under 8.2.2 are reported to need two certified data centres); general instruments</w:t>
-            </w:r>
-            <w:r>
-              <w:t xml:space="preserve"> </w:t>
-            </w:r>
-            <w:r>
-              <w:rPr>
-                <w:bCs/>
-                <w:b/>
-              </w:rPr>
-              <w:t xml:space="preserve">PENDING</w:t>
-            </w:r>
-          </w:p>
-        </w:tc>
-        <w:tc>
-          <w:tcPr/>
-          <w:p>
-            <w:pPr>
-              <w:pStyle w:val="Compact"/>
-              <w:jc w:val="left"/>
-            </w:pPr>
-            <w:r>
-              <w:t xml:space="preserve">Unclear (1 MW is below the 2 MW of the higher tier of 8.2.1 and of 8.2.4; whether a lower tier of 8.2.1 admits it</w:t>
+              <w:t xml:space="preserve">Eligible (Activity 8.1.1, about US$42,000 of Thai IT salary spend)</w:t>
+            </w:r>
+          </w:p>
+        </w:tc>
+        <w:tc>
+          <w:tcPr/>
+          <w:p>
+            <w:pPr>
+              <w:pStyle w:val="Compact"/>
+              <w:jc w:val="left"/>
+            </w:pPr>
+            <w:r>
+              <w:t xml:space="preserve">Possibly eligible as a cloud service (8.2.2 has no capital minimum, but needs location in two ISO/IEC 27001-certified data centres, 10 Gbps interconnection and ISO/IEC 27001 and 20000-1 certification); GPU server rental falls under 8.2.4.1 (about US$140m); classification</w:t>
             </w:r>
             <w:r>
               <w:t xml:space="preserve"> </w:t>
@@ -5270,17 +5235,22 @@
               <w:t xml:space="preserve">VERIFY</w:t>
             </w:r>
             <w:r>
-              <w:t xml:space="preserve">); general instruments</w:t>
-            </w:r>
-            <w:r>
               <w:t xml:space="preserve"> </w:t>
             </w:r>
             <w:r>
-              <w:rPr>
-                <w:bCs/>
-                <w:b/>
-              </w:rPr>
-              <w:t xml:space="preserve">PENDING</w:t>
+              <w:t xml:space="preserve">with BOI</w:t>
+            </w:r>
+          </w:p>
+        </w:tc>
+        <w:tc>
+          <w:tcPr/>
+          <w:p>
+            <w:pPr>
+              <w:pStyle w:val="Compact"/>
+              <w:jc w:val="left"/>
+            </w:pPr>
+            <w:r>
+              <w:t xml:space="preserve">Ineligible under 8.2.1, which requires at least 2 MW of IT load</w:t>
             </w:r>
           </w:p>
         </w:tc>
@@ -5306,19 +5276,19 @@
               <w:jc w:val="left"/>
             </w:pPr>
             <w:r>
-              <w:t xml:space="preserve">Eligible (startup track; list item)</w:t>
-            </w:r>
-          </w:p>
-        </w:tc>
-        <w:tc>
-          <w:tcPr/>
-          <w:p>
-            <w:pPr>
-              <w:pStyle w:val="Compact"/>
-              <w:jc w:val="left"/>
-            </w:pPr>
-            <w:r>
-              <w:t xml:space="preserve">Unclear (cloud-computing platforms are listed with no capital rule; coverage of capacity resale</w:t>
+              <w:t xml:space="preserve">Eligible (startup track, subject to recognition; list item)</w:t>
+            </w:r>
+          </w:p>
+        </w:tc>
+        <w:tc>
+          <w:tcPr/>
+          <w:p>
+            <w:pPr>
+              <w:pStyle w:val="Compact"/>
+              <w:jc w:val="left"/>
+            </w:pPr>
+            <w:r>
+              <w:t xml:space="preserve">Unclear (startup recognition needs research and development on listed technology; cloud-computing platforms are listed with no capital rule, capacity resale</w:t>
             </w:r>
             <w:r>
               <w:t xml:space="preserve"> </w:t>
@@ -5331,57 +5301,22 @@
               <w:t xml:space="preserve">VERIFY</w:t>
             </w:r>
             <w:r>
-              <w:t xml:space="preserve">)</w:t>
-            </w:r>
-          </w:p>
-        </w:tc>
-        <w:tc>
-          <w:tcPr/>
-          <w:p>
-            <w:pPr>
-              <w:pStyle w:val="Compact"/>
-              <w:jc w:val="left"/>
-            </w:pPr>
-            <w:r>
-              <w:t xml:space="preserve">Unclear (data-centre capacity not named in coded list items)</w:t>
-            </w:r>
-          </w:p>
-        </w:tc>
-      </w:tr>
-      <w:tr>
-        <w:tc>
-          <w:tcPr/>
-          <w:p>
-            <w:pPr>
-              <w:pStyle w:val="Compact"/>
-              <w:jc w:val="left"/>
-            </w:pPr>
-            <w:r>
-              <w:t xml:space="preserve">Malaysia</w:t>
-            </w:r>
-          </w:p>
-        </w:tc>
-        <w:tc>
-          <w:tcPr/>
-          <w:p>
-            <w:pPr>
-              <w:pStyle w:val="Compact"/>
-              <w:jc w:val="left"/>
-            </w:pPr>
-            <w:r>
-              <w:t xml:space="preserve">Eligible (MD: RM50,000 paid-up capital; new activity; audited annual declaration at own cost)</w:t>
-            </w:r>
-          </w:p>
-        </w:tc>
-        <w:tc>
-          <w:tcPr/>
-          <w:p>
-            <w:pPr>
-              <w:pStyle w:val="Compact"/>
-              <w:jc w:val="left"/>
-            </w:pPr>
-            <w:r>
-              <w:t xml:space="preserve">Possibly eligible under the MD track, where cloud is a promoted enabler; unlikely under DESAC, which targets data-centre operators and allows relief on qualifying capital investment excluding land (</w:t>
+              <w:t xml:space="preserve">; technology-infrastructure support serves research tasks)</w:t>
+            </w:r>
+          </w:p>
+        </w:tc>
+        <w:tc>
+          <w:tcPr/>
+          <w:p>
+            <w:pPr>
+              <w:pStyle w:val="Compact"/>
+              <w:jc w:val="left"/>
+            </w:pPr>
+            <w:r>
+              <w:t xml:space="preserve">Unclear (no data-centre category in Decree 260; Decision 21/2026</w:t>
+            </w:r>
+            <w:r>
+              <w:t xml:space="preserve"> </w:t>
             </w:r>
             <w:r>
               <w:rPr>
@@ -5391,22 +5326,7 @@
               <w:t xml:space="preserve">VERIFY</w:t>
             </w:r>
             <w:r>
-              <w:t xml:space="preserve"> </w:t>
-            </w:r>
-            <w:r>
-              <w:t xml:space="preserve">with MDEC)</w:t>
-            </w:r>
-          </w:p>
-        </w:tc>
-        <w:tc>
-          <w:tcPr/>
-          <w:p>
-            <w:pPr>
-              <w:pStyle w:val="Compact"/>
-              <w:jc w:val="left"/>
-            </w:pPr>
-            <w:r>
-              <w:t xml:space="preserve">Eligible to apply under DESAC on the stated conditions: a 1 MW facility falls in the 0.85 MW to 4.25 MW category; RM2.5m paid-up capital; Malaysian staff at RM5,000 a month making up half of manpower; committee approval is discretionary</w:t>
+              <w:t xml:space="preserve">)</w:t>
             </w:r>
           </w:p>
         </w:tc>
@@ -5420,34 +5340,31 @@
               <w:jc w:val="left"/>
             </w:pPr>
             <w:r>
-              <w:t xml:space="preserve">Philippines</w:t>
-            </w:r>
-          </w:p>
-        </w:tc>
-        <w:tc>
-          <w:tcPr/>
-          <w:p>
-            <w:pPr>
-              <w:pStyle w:val="Compact"/>
-              <w:jc w:val="left"/>
-            </w:pPr>
-            <w:r>
-              <w:t xml:space="preserve">Eligible on stated conditions, subject to inclusion and evaluation</w:t>
-            </w:r>
-          </w:p>
-        </w:tc>
-        <w:tc>
-          <w:tcPr/>
-          <w:p>
-            <w:pPr>
-              <w:pStyle w:val="Compact"/>
-              <w:jc w:val="left"/>
-            </w:pPr>
-            <w:r>
-              <w:t xml:space="preserve">Unclear (Plan treatment of resale</w:t>
-            </w:r>
-            <w:r>
-              <w:t xml:space="preserve"> </w:t>
+              <w:t xml:space="preserve">Malaysia</w:t>
+            </w:r>
+          </w:p>
+        </w:tc>
+        <w:tc>
+          <w:tcPr/>
+          <w:p>
+            <w:pPr>
+              <w:pStyle w:val="Compact"/>
+              <w:jc w:val="left"/>
+            </w:pPr>
+            <w:r>
+              <w:t xml:space="preserve">Eligible (MD: RM50,000 paid-up capital; new activity; audited annual declaration at own cost)</w:t>
+            </w:r>
+          </w:p>
+        </w:tc>
+        <w:tc>
+          <w:tcPr/>
+          <w:p>
+            <w:pPr>
+              <w:pStyle w:val="Compact"/>
+              <w:jc w:val="left"/>
+            </w:pPr>
+            <w:r>
+              <w:t xml:space="preserve">Possibly eligible under the MD track, where cloud is a promoted enabler; unlikely under DESAC, which targets data-centre operators and allows relief on qualifying capital investment excluding land (</w:t>
             </w:r>
             <w:r>
               <w:rPr>
@@ -5457,19 +5374,60 @@
               <w:t xml:space="preserve">VERIFY</w:t>
             </w:r>
             <w:r>
-              <w:t xml:space="preserve">)</w:t>
-            </w:r>
-          </w:p>
-        </w:tc>
-        <w:tc>
-          <w:tcPr/>
-          <w:p>
-            <w:pPr>
-              <w:pStyle w:val="Compact"/>
-              <w:jc w:val="left"/>
-            </w:pPr>
-            <w:r>
-              <w:t xml:space="preserve">Unclear (Plan groups data-centre infrastructure with AI; no stated minimum;</w:t>
+              <w:t xml:space="preserve"> </w:t>
+            </w:r>
+            <w:r>
+              <w:t xml:space="preserve">with MDEC)</w:t>
+            </w:r>
+          </w:p>
+        </w:tc>
+        <w:tc>
+          <w:tcPr/>
+          <w:p>
+            <w:pPr>
+              <w:pStyle w:val="Compact"/>
+              <w:jc w:val="left"/>
+            </w:pPr>
+            <w:r>
+              <w:t xml:space="preserve">Eligible to apply under DESAC on the stated conditions: a 1 MW facility falls in the 0.85 MW to 4.25 MW category; RM2.5m paid-up capital; Malaysian staff at RM5,000 a month making up half of manpower; committee approval is discretionary</w:t>
+            </w:r>
+          </w:p>
+        </w:tc>
+      </w:tr>
+      <w:tr>
+        <w:tc>
+          <w:tcPr/>
+          <w:p>
+            <w:pPr>
+              <w:pStyle w:val="Compact"/>
+              <w:jc w:val="left"/>
+            </w:pPr>
+            <w:r>
+              <w:t xml:space="preserve">Philippines</w:t>
+            </w:r>
+          </w:p>
+        </w:tc>
+        <w:tc>
+          <w:tcPr/>
+          <w:p>
+            <w:pPr>
+              <w:pStyle w:val="Compact"/>
+              <w:jc w:val="left"/>
+            </w:pPr>
+            <w:r>
+              <w:t xml:space="preserve">Eligible on stated conditions, subject to inclusion and evaluation</w:t>
+            </w:r>
+          </w:p>
+        </w:tc>
+        <w:tc>
+          <w:tcPr/>
+          <w:p>
+            <w:pPr>
+              <w:pStyle w:val="Compact"/>
+              <w:jc w:val="left"/>
+            </w:pPr>
+            <w:r>
+              <w:t xml:space="preserve">Unclear (Plan treatment of resale</w:t>
             </w:r>
             <w:r>
               <w:t xml:space="preserve"> </w:t>
@@ -5486,6 +5444,31 @@
             </w:r>
           </w:p>
         </w:tc>
+        <w:tc>
+          <w:tcPr/>
+          <w:p>
+            <w:pPr>
+              <w:pStyle w:val="Compact"/>
+              <w:jc w:val="left"/>
+            </w:pPr>
+            <w:r>
+              <w:t xml:space="preserve">Unclear (Plan groups data-centre infrastructure with AI; no stated minimum;</w:t>
+            </w:r>
+            <w:r>
+              <w:t xml:space="preserve"> </w:t>
+            </w:r>
+            <w:r>
+              <w:rPr>
+                <w:bCs/>
+                <w:b/>
+              </w:rPr>
+              <w:t xml:space="preserve">VERIFY</w:t>
+            </w:r>
+            <w:r>
+              <w:t xml:space="preserve">)</w:t>
+            </w:r>
+          </w:p>
+        </w:tc>
       </w:tr>
     </w:tbl>
     <w:p>
@@ -5529,7 +5512,7 @@
         <w:pStyle w:val="BodyText"/>
       </w:pPr>
       <w:r>
-        <w:t xml:space="preserve">On this reading Thailand’s rules are the most likely to exclude Firm B, and Malaysia is the one country where a reading of the primary text supports a small provider’s eligibility, through the MD track and not through DESAC. In Vietnam and the Philippines the answer depends on clauses not yet read.</w:t>
+        <w:t xml:space="preserve">On this reading, small providers are excluded by capital or capacity from Thai data centres and GPU hosting (Firm C by the 2 MW condition; Firm B if its service is classed as GPU hosting) and from Malaysian data centres, and are admitted on paper, subject to fixed compliance costs, through Thailand’s cloud-service activity and Malaysia’s Digital track. In Vietnam and the Philippines the answer depends on clauses not yet read.</w:t>
       </w:r>
     </w:p>
     <w:p>
@@ -5547,7 +5530,7 @@
         <w:t xml:space="preserve"> </w:t>
       </w:r>
       <w:r>
-        <w:t xml:space="preserve">Reading (i) holds on the instruments we coded: no country has an instrument aimed at sub-facility compute provision. Reading (ii) is likely to hold for Thailand and fails provisionally for Malaysia, whose MD track may admit a small cloud provider. It is open for Vietnam and the Philippines. Reading (iii) holds for Malaysia’s data-centre track, whose smallest recognised category is 0.85 MW.</w:t>
+        <w:t xml:space="preserve">Reading (i) holds on the instruments we coded: no instrument is aimed at small compute providers as such. Reading (ii) fails on paper for generic cloud in Thailand and Malaysia, subject to certification and audit costs, and holds for GPU server rental in Thailand and for facility activities in both countries. It is open for Vietnam and the Philippines. Reading (iii) holds for facility activities: Thailand’s data-centre minimum is 2 MW and Malaysia’s smallest category is 0.85 MW.</w:t>
       </w:r>
     </w:p>
     <w:bookmarkEnd w:id="41"/>
@@ -5596,7 +5579,7 @@
         <w:pStyle w:val="BodyText"/>
       </w:pPr>
       <w:r>
-        <w:t xml:space="preserve">Cost does not by itself explain what lies below the threshold. In Thailand the rung distance is two and a half to three orders of magnitude (Table 5). Whether that distance is a cost constraint depends on A1: whether a commercially viable provider exists at that scale. A server of about twelve kilowatts can be hosted in colocation space</w:t>
+        <w:t xml:space="preserve">Cost does not by itself explain what lies below the threshold. In Thailand the GPU-hosting gate and the data-centre capacity condition are 2.5 to 3.0 and 1.7 to 2.8 orders of magnitude above one server (Table 5), while cloud services carry no capital condition. Whether that distance is a cost constraint depends on A1: whether a commercially viable provider exists at that scale. A server of about twelve kilowatts can be hosted in colocation space</w:t>
       </w:r>
       <w:r>
         <w:t xml:space="preserve"> </w:t>
@@ -5625,7 +5608,7 @@
         <w:t xml:space="preserve"> </w:t>
       </w:r>
       <w:r>
-        <w:t xml:space="preserve">If the benchmark shows that viability requires scale, A1 fails and H1 explains the absence. If it shows that small providers can compete, the absence is a design outcome (H2 or H3) and proposition M applies to Thailand.</w:t>
+        <w:t xml:space="preserve">If the benchmark shows that viability requires scale, A1 fails and H1 explains the absence. If it shows that small providers can compete, the absence is a design outcome (H2 or H3) and proposition M applies to Thai GPU hosting and data centres.</w:t>
       </w:r>
     </w:p>
     <w:p>
@@ -5847,7 +5830,7 @@
               <w:jc w:val="left"/>
             </w:pPr>
             <w:r>
-              <w:t xml:space="preserve">Software threshold far below data-hosting threshold (Thailand)</w:t>
+              <w:t xml:space="preserve">Software threshold far below GPU-hosting capital condition (Thailand)</w:t>
             </w:r>
           </w:p>
         </w:tc>
@@ -5883,20 +5866,7 @@
               <w:jc w:val="left"/>
             </w:pPr>
             <w:r>
-              <w:t xml:space="preserve">C (E if the activity thresholds pre-date AI;</w:t>
-            </w:r>
-            <w:r>
-              <w:t xml:space="preserve"> </w:t>
-            </w:r>
-            <w:r>
-              <w:rPr>
-                <w:bCs/>
-                <w:b/>
-              </w:rPr>
-              <w:t xml:space="preserve">PENDING</w:t>
-            </w:r>
-            <w:r>
-              <w:t xml:space="preserve">)</w:t>
+              <w:t xml:space="preserve">C</w:t>
             </w:r>
           </w:p>
         </w:tc>
@@ -6217,7 +6187,7 @@
               <w:jc w:val="left"/>
             </w:pPr>
             <w:r>
-              <w:t xml:space="preserve">Most generous tier requires further investment against a sales base (Thailand)</w:t>
+              <w:t xml:space="preserve">Extension of the exemption tied to spending of at least 1% of sales, or THB 200m if lower, in the first three years (Thailand; cross-sectoral measure, verified)</w:t>
             </w:r>
           </w:p>
         </w:tc>
@@ -6253,44 +6223,31 @@
               <w:jc w:val="left"/>
             </w:pPr>
             <w:r>
-              <w:t xml:space="preserve">C (E if cross-sectoral;</w:t>
-            </w:r>
-            <w:r>
-              <w:t xml:space="preserve"> </w:t>
-            </w:r>
-            <w:r>
-              <w:rPr>
-                <w:bCs/>
-                <w:b/>
-              </w:rPr>
-              <w:t xml:space="preserve">VERIFY</w:t>
-            </w:r>
-            <w:r>
-              <w:t xml:space="preserve">)</w:t>
-            </w:r>
-          </w:p>
-        </w:tc>
-        <w:tc>
-          <w:tcPr/>
-          <w:p>
-            <w:pPr>
-              <w:pStyle w:val="Compact"/>
-              <w:jc w:val="left"/>
-            </w:pPr>
-            <w:r>
-              <w:t xml:space="preserve">H1 against H2: Moderate; unverified row</w:t>
-            </w:r>
-          </w:p>
-        </w:tc>
-        <w:tc>
-          <w:tcPr/>
-          <w:p>
-            <w:pPr>
-              <w:pStyle w:val="Compact"/>
-              <w:jc w:val="left"/>
-            </w:pPr>
-            <w:r>
-              <w:t xml:space="preserve">Verification; whether the mechanism is cross-sectoral</w:t>
+              <w:t xml:space="preserve">E (P3a)</w:t>
+            </w:r>
+          </w:p>
+        </w:tc>
+        <w:tc>
+          <w:tcPr/>
+          <w:p>
+            <w:pPr>
+              <w:pStyle w:val="Compact"/>
+              <w:jc w:val="left"/>
+            </w:pPr>
+            <w:r>
+              <w:t xml:space="preserve">H1 against {H2, H3}: Moderate</w:t>
+            </w:r>
+          </w:p>
+        </w:tc>
+        <w:tc>
+          <w:tcPr/>
+          <w:p>
+            <w:pPr>
+              <w:pStyle w:val="Compact"/>
+              <w:jc w:val="left"/>
+            </w:pPr>
+            <w:r>
+              <w:t xml:space="preserve">How BOI applies the measure to firms without early sales</w:t>
             </w:r>
           </w:p>
         </w:tc>
@@ -6488,7 +6445,7 @@
               <w:jc w:val="left"/>
             </w:pPr>
             <w:r>
-              <w:t xml:space="preserve">Explicit startup track with direct equity (Vietnam)</w:t>
+              <w:t xml:space="preserve">Explicit startup track with direct support and recognition by the provincial authority (Vietnam; verified against Decree 260/2026, Article 11)</w:t>
             </w:r>
           </w:p>
         </w:tc>
@@ -6725,6 +6682,178 @@
           </w:p>
         </w:tc>
       </w:tr>
+      <w:tr>
+        <w:tc>
+          <w:tcPr/>
+          <w:p>
+            <w:pPr>
+              <w:pStyle w:val="Compact"/>
+              <w:jc w:val="left"/>
+            </w:pPr>
+            <w:r>
+              <w:t xml:space="preserve">E11</w:t>
+            </w:r>
+          </w:p>
+        </w:tc>
+        <w:tc>
+          <w:tcPr/>
+          <w:p>
+            <w:pPr>
+              <w:pStyle w:val="Compact"/>
+              <w:jc w:val="left"/>
+            </w:pPr>
+            <w:r>
+              <w:t xml:space="preserve">Low-capital cloud routes screened by fixed compliance costs: Thai cloud services (certification, two certified data centres) and the Malaysian Digital track (annual audit)</w:t>
+            </w:r>
+          </w:p>
+        </w:tc>
+        <w:tc>
+          <w:tcPr/>
+          <w:p>
+            <w:pPr>
+              <w:pStyle w:val="Compact"/>
+              <w:jc w:val="left"/>
+            </w:pPr>
+            <w:r>
+              <w:t xml:space="preserve">U (P1d)</w:t>
+            </w:r>
+          </w:p>
+        </w:tc>
+        <w:tc>
+          <w:tcPr/>
+          <w:p>
+            <w:pPr>
+              <w:pStyle w:val="Compact"/>
+              <w:jc w:val="left"/>
+            </w:pPr>
+            <w:r>
+              <w:t xml:space="preserve">E (P2b)</w:t>
+            </w:r>
+          </w:p>
+        </w:tc>
+        <w:tc>
+          <w:tcPr/>
+          <w:p>
+            <w:pPr>
+              <w:pStyle w:val="Compact"/>
+              <w:jc w:val="left"/>
+            </w:pPr>
+            <w:r>
+              <w:t xml:space="preserve">C</w:t>
+            </w:r>
+          </w:p>
+        </w:tc>
+        <w:tc>
+          <w:tcPr/>
+          <w:p>
+            <w:pPr>
+              <w:pStyle w:val="Compact"/>
+              <w:jc w:val="left"/>
+            </w:pPr>
+            <w:r>
+              <w:t xml:space="preserve">H1 against H2: Moderate; verified against the guides, cost size unmeasured</w:t>
+            </w:r>
+          </w:p>
+        </w:tc>
+        <w:tc>
+          <w:tcPr/>
+          <w:p>
+            <w:pPr>
+              <w:pStyle w:val="Compact"/>
+              <w:jc w:val="left"/>
+            </w:pPr>
+            <w:r>
+              <w:t xml:space="preserve">Cost of certification and audit relative to a small provider’s capital</w:t>
+            </w:r>
+          </w:p>
+        </w:tc>
+      </w:tr>
+      <w:tr>
+        <w:tc>
+          <w:tcPr/>
+          <w:p>
+            <w:pPr>
+              <w:pStyle w:val="Compact"/>
+              <w:jc w:val="left"/>
+            </w:pPr>
+            <w:r>
+              <w:t xml:space="preserve">E12</w:t>
+            </w:r>
+          </w:p>
+        </w:tc>
+        <w:tc>
+          <w:tcPr/>
+          <w:p>
+            <w:pPr>
+              <w:pStyle w:val="Compact"/>
+              <w:jc w:val="left"/>
+            </w:pPr>
+            <w:r>
+              <w:t xml:space="preserve">Required research ratio falls as total capital rises (VND 100 billion and 6,000 billion tiers) in high-technology enterprise criteria (Vietnam; verified)</w:t>
+            </w:r>
+          </w:p>
+        </w:tc>
+        <w:tc>
+          <w:tcPr/>
+          <w:p>
+            <w:pPr>
+              <w:pStyle w:val="Compact"/>
+              <w:jc w:val="left"/>
+            </w:pPr>
+            <w:r>
+              <w:t xml:space="preserve">U (P1d)</w:t>
+            </w:r>
+          </w:p>
+        </w:tc>
+        <w:tc>
+          <w:tcPr/>
+          <w:p>
+            <w:pPr>
+              <w:pStyle w:val="Compact"/>
+              <w:jc w:val="left"/>
+            </w:pPr>
+            <w:r>
+              <w:t xml:space="preserve">E (P2b)</w:t>
+            </w:r>
+          </w:p>
+        </w:tc>
+        <w:tc>
+          <w:tcPr/>
+          <w:p>
+            <w:pPr>
+              <w:pStyle w:val="Compact"/>
+              <w:jc w:val="left"/>
+            </w:pPr>
+            <w:r>
+              <w:t xml:space="preserve">C</w:t>
+            </w:r>
+          </w:p>
+        </w:tc>
+        <w:tc>
+          <w:tcPr/>
+          <w:p>
+            <w:pPr>
+              <w:pStyle w:val="Compact"/>
+              <w:jc w:val="left"/>
+            </w:pPr>
+            <w:r>
+              <w:t xml:space="preserve">H1 against H2: Moderate; applies to enterprise recognition, not to compute provision</w:t>
+            </w:r>
+          </w:p>
+        </w:tc>
+        <w:tc>
+          <w:tcPr/>
+          <w:p>
+            <w:pPr>
+              <w:pStyle w:val="Compact"/>
+              <w:jc w:val="left"/>
+            </w:pPr>
+            <w:r>
+              <w:t xml:space="preserve">Whether the criteria apply to compute providers</w:t>
+            </w:r>
+          </w:p>
+        </w:tc>
+      </w:tr>
     </w:tbl>
     <w:p>
       <w:pPr>
@@ -6749,7 +6878,7 @@
         <w:pStyle w:val="BodyText"/>
       </w:pPr>
       <w:r>
-        <w:t xml:space="preserve">Four results follow. First, cost explains the height of Thailand’s threshold (E1), and the data cannot distinguish a design reading from it on that point. Second, thresholds are not forced by cost: Vietnam and the Philippines state none at the compute layers (E4, E7), and Malaysia admits cloud activity at RM50,000 of paid-up capital on a separate track (E2). Third, H1 is also unexpected for two design features that cost cannot generate, a revenue-base tier (E5, on an unverified row) and a fixed compliance cost (E6, verified against the guideline). Fourth, E8 is unexpected under all three hypotheses. A deliberate startup track fits none of them, which shows that these governments can and do design for new firms, and limits H2 as a general account. H2 and H3 remain difficult to separate: E3, E5 and E6 are expected or compatible under both, and only E7 favours H3 clearly.</w:t>
+        <w:t xml:space="preserve">Four results follow. First, cost explains the height of Thailand’s threshold (E1), and the data cannot distinguish a design reading from it on that point. Second, thresholds are not forced by cost: Vietnam and the Philippines state none at the compute layers (E4, E7), and Malaysia admits cloud activity at RM50,000 of paid-up capital on a separate track (E2). Third, H1 is also unexpected for design features that cost cannot generate: a sales-based extension of the exemption (E5), fixed certification and audit costs on the low-capital cloud routes (E6, E11) and research-intensity ratios that fall with firm size (E12), all verified against the primary texts, with the sizes of the costs still unmeasured. Fourth, E8 is unexpected under all three hypotheses. A deliberate startup track fits none of them, which shows that these governments can and do design for new firms, and limits H2 as a general account. H2 and H3 remain difficult to separate: E3, E5 and E6 are expected or compatible under both, and only E7 favours H3 clearly.</w:t>
       </w:r>
     </w:p>
     <w:p>
@@ -6775,7 +6904,7 @@
         <w:t xml:space="preserve"> </w:t>
       </w:r>
       <w:r>
-        <w:t xml:space="preserve">Dropping evidence against H1 one row at a time (E3 to E7), the case against H1 survives on the others, so no single row decides it. Dropping the rows that rest on unverified coding (E5, E6, E7) leaves E3 and E4, both of which depend on the search protocol and on the list and Plan readings. Dropping the rows that depend on A1 (E2, E3) leaves E4, E5, E6 and E7. Evidence against H2 (E2, E8) is also tested: dropping E2 leaves E8, which is limited to Vietnam’s application layer. If MDEC does not accept capacity resale as an MD activity, E2 reverses to compatible, and the claim that Malaysia is a counter-example to Thailand falls. No single row decides the conclusion that capital gates are a design choice, but the claim that rungs are missing in Thailand depends on A1 and on the general-instrument coding.</w:t>
+        <w:t xml:space="preserve">Dropping evidence against H1 one row at a time (E3 to E7, E11, E12), the case against H1 survives on the others, so no single row decides it. Dropping the rows that rest on unverified coding (E4 and E7, which depend on Decision 21/2026 and the Philippine Plan) leaves E3, E5, E6, E11 and E12, which rest on verified Thai, Malaysian and Vietnamese texts but depend on A1 or on the size of fixed costs. Dropping the rows that depend on A1 (E2, E3) leaves E4, E5, E6 and E7. Evidence against H2 (E2, E8) is also tested: dropping E2 leaves E8, which is limited to Vietnam’s application layer. If MDEC does not accept capacity resale as an MD activity, E2 reverses to compatible, and the claim that Malaysia is a counter-example to Thailand falls. No single row decides the conclusion that capital gates are a design choice, but the claim that rungs are missing in Thailand depends on A1 and on the general-instrument coding.</w:t>
       </w:r>
     </w:p>
     <w:p>
@@ -6930,7 +7059,7 @@
         <w:t xml:space="preserve"> </w:t>
       </w:r>
       <w:r>
-        <w:t xml:space="preserve">Finding: the exclusion of small compute providers is shown on the coded rules only for Thailand, and the other three countries depend on clauses not yet read (Table 6). An eligibility audit with hypothetical firms, as in Section 3.4, would show governments which of their own instruments a Firm B or Firm C could use, at low cost. Where the audit shows exclusion, the options are extending eligibility to colocation tenancy, modular deployment or shared-capacity arrangements, or providing subsidised access to public or consortium compute. Existing public compute programmes may already fill part of the gap</w:t>
+        <w:t xml:space="preserve">Finding: capital or capacity conditions exclude small providers from Thai GPU hosting and data centres and from Malaysian data centres, while generic cloud routes in Thailand and Malaysia admit them subject to fixed certification and audit costs, and the Vietnamese and Philippine answer depends on clauses not yet read (Table 6). An eligibility audit with hypothetical firms, as in Section 3.4, would show governments which of their own instruments a Firm B or Firm C could use, at low cost. Where the audit shows exclusion, the options are extending eligibility to colocation tenancy, modular deployment or shared-capacity arrangements, lowering the fixed certification and audit costs for small providers, or providing subsidised access to public or consortium compute. Existing public compute programmes may already fill part of the gap</w:t>
       </w:r>
       <w:r>
         <w:t xml:space="preserve"> </w:t>
@@ -7709,15 +7838,15 @@
         <w:pStyle w:val="FirstParagraph"/>
       </w:pPr>
       <w:r>
-        <w:t xml:space="preserve">This paper asked where four Southeast Asian incentive systems screen entrants to the AI industry. All four make application development accessible on the stated thresholds, and Vietnam adds a startup track with direct equity access. Above that layer they use four architectures. Thailand gates data hosting by capital and capacity, two and a half to three orders of magnitude above the capital needed to host one server, with nothing coded in between. Malaysia runs a low-capital digital track that covers cloud beside a data-centre track whose smallest recognised category is 0.85 MW. Vietnam ranks technologies by priority and states no capital rule. The Philippines applies the same inclusion and firm-scale rules to every activity. No instrument we coded is aimed at compute provision below facility scale. Cost explains the height of Thailand’s gate, but it does not explain why Vietnam and the Philippines need no capital gate, why Malaysia can run a low-capital cloud track, or why Thailand’s research tier presupposes a sales base.</w:t>
-      </w:r>
-    </w:p>
-    <w:p>
-      <w:pPr>
-        <w:pStyle w:val="BodyText"/>
-      </w:pPr>
-      <w:r>
-        <w:t xml:space="preserve">The claims are limited by the evidence. We observe eligibility rules, not realised access or outcomes. The Thai result depends on an assumption about the viability of small providers and on a documented search for absence, and for the other three countries it depends on clauses not yet read. The coding awaits an independent check. The data do not distinguish a design gap from rational specialisation and do not show a middle-technology trap. They identify a feature of design that could contribute to one: where a gate sits far above the smallest viable provider and nothing aims at the scales between, domestic entry into compute supply is restricted to firms that can bear facility-scale risk.</w:t>
+        <w:t xml:space="preserve">This paper asked where four Southeast Asian incentive systems screen entrants to the AI industry. All four make application development accessible on the stated thresholds, and Vietnam adds a startup track with direct equity access. Above that layer they use four architectures. Thailand gates data centres by capacity (at least 2 MW) and GPU hosting by capital, 1.7 to 3.0 orders of magnitude above one server, while cloud services carry certification conditions in place of capital. Malaysia runs a low-capital digital track that covers cloud beside a data-centre track whose smallest recognised category is 0.85 MW. Vietnam ranks technologies by priority and states no capital rule. The Philippines applies the same inclusion and firm-scale rules to every activity. No instrument we coded is aimed at compute provision below facility scale. Cost explains the height of Thailand’s gate, but it does not explain why Vietnam and the Philippines need no capital gate, why Malaysia can run a low-capital cloud track, or why Thailand’s research tier presupposes a sales base.</w:t>
+      </w:r>
+    </w:p>
+    <w:p>
+      <w:pPr>
+        <w:pStyle w:val="BodyText"/>
+      </w:pPr>
+      <w:r>
+        <w:t xml:space="preserve">The claims are limited by the evidence. We observe eligibility rules, not realised access or outcomes. Whether a small GPU provider is classed as cloud or as GPU hosting in Thailand, and whether MDEC accepts capacity resale as a Malaysian Digital activity, are questions for the agencies, and the Vietnamese and Philippine results depend on clauses not yet read. The coding awaits an independent check. The data do not distinguish a design gap from rational specialisation and do not show a middle-technology trap. They identify a feature of design that could contribute to one: where capital or capacity gates sit far above the smallest viable provider and the low-capital routes are screened by fixed compliance costs, domestic entry into compute supply is restricted to firms that can bear facility-scale risk or fixed certification and audit costs.</w:t>
       </w:r>
     </w:p>
     <w:p>
@@ -8172,18 +8301,42 @@
           <w:iCs/>
           <w:i/>
         </w:rPr>
-        <w:t xml:space="preserve">A guide to investment promotion 2025</w:t>
-      </w:r>
-      <w:r>
-        <w:t xml:space="preserve">. Office of the Board of Investment.</w:t>
-      </w:r>
-    </w:p>
-    <w:p>
-      <w:pPr>
-        <w:pStyle w:val="BodyText"/>
-      </w:pPr>
-      <w:r>
-        <w:t xml:space="preserve">Board of Investment of Thailand. (2026).</w:t>
+        <w:t xml:space="preserve">Announcement of the Board of Investment No. Sor. 9/2568: Amendment to list of activities eligible for investment promotion under Announcement No. 9/2565</w:t>
+      </w:r>
+      <w:r>
+        <w:t xml:space="preserve"> </w:t>
+      </w:r>
+      <w:r>
+        <w:t xml:space="preserve">(unofficial translation, 14 November 2025). Office of the Board of Investment. https://www.boi.go.th/upload/content/sor9_2568EN.pdf</w:t>
+      </w:r>
+    </w:p>
+    <w:p>
+      <w:pPr>
+        <w:pStyle w:val="BodyText"/>
+      </w:pPr>
+      <w:r>
+        <w:t xml:space="preserve">Board of Investment of Thailand. (2026a).</w:t>
+      </w:r>
+      <w:r>
+        <w:t xml:space="preserve"> </w:t>
+      </w:r>
+      <w:r>
+        <w:rPr>
+          <w:iCs/>
+          <w:i/>
+        </w:rPr>
+        <w:t xml:space="preserve">Investment promotion guide 2026</w:t>
+      </w:r>
+      <w:r>
+        <w:t xml:space="preserve">. Office of the Board of Investment. https://www.boi.go.th/upload/content/BOI_A_Guide_EN.pdf</w:t>
+      </w:r>
+    </w:p>
+    <w:p>
+      <w:pPr>
+        <w:pStyle w:val="BodyText"/>
+      </w:pPr>
+      <w:r>
+        <w:t xml:space="preserve">Board of Investment of Thailand. (2026b).</w:t>
       </w:r>
       <w:r>
         <w:t xml:space="preserve"> </w:t>

</xml_diff>

<commit_message>
Read RA 12066, Memorandum Order 47 (2026 SIPP) and Decision 21/2026; rewrite Philippine section, correct Vietnam list wording, update tables, figure and data pack
</commit_message>
<xml_diff>
--- a/revision/02_revised_manuscript.docx
+++ b/revision/02_revised_manuscript.docx
@@ -244,7 +244,7 @@
         <w:pStyle w:val="FirstParagraph"/>
       </w:pPr>
       <w:r>
-        <w:t xml:space="preserve">Southeast Asian governments have made artificial intelligence (AI) a pillar of industrial policy, but little is known about which firms their incentive instruments let in. We code about 20 instruments from the primary legal texts of Thailand, Vietnam, Malaysia and the Philippines on five dimensions, place explicit thresholds on a common cost scale, and ask where each system screens entrants to the AI technology stack and whether cost necessity, scale-favouring design or administrative habit better explains the pattern. The four systems use four architectures: capital-gated activities (Thailand), two parallel tracks (Malaysia), a priority list without capital rules (Vietnam) and uniform firm-scale tiers (the Philippines). On the stated thresholds all four make application-layer support accessible to small firms. Thailand sets capital and capacity gates at GPU data hosting (two and a half to three orders of magnitude above the capital needed to host one server) and at data centres (at least 2 MW), while its cloud-service activity has no capital condition. Malaysia pairs a low-capital digital track that covers cloud services with a data-centre track whose smallest recognised category is 0.85 MW. Where small cloud providers can enter on paper, in Thailand and Malaysia, the screen is a fixed compliance cost. Vietnam and the Philippines state no capital rule at the compute layers, so their screens lie in designation and discretion. We found no instrument aimed at compute provision below facility scale, but low-capital cloud routes exist. Cost benchmarks explain the height of Thailand’s gate, not the pattern across the four. The evidence concerns legal eligibility, not realised access, and does not show that a middle-technology trap exists.</w:t>
+        <w:t xml:space="preserve">Southeast Asian governments have made artificial intelligence (AI) a pillar of industrial policy, but little is known about which firms their incentive instruments let in. We code about 20 instruments from the primary legal texts of Thailand, Vietnam, Malaysia and the Philippines on five dimensions, place explicit thresholds on a common cost scale, and ask where each system screens entrants to the AI technology stack and whether cost necessity, scale-favouring design or administrative habit better explains the pattern. The four systems use four architectures: capital-gated activities (Thailand), two parallel tracks (Malaysia), a strategic-technology list without capital rules (Vietnam) and activity tiers with a common firm-scale boundary (the Philippines). On the stated thresholds all four make application-layer support accessible to small firms. Thailand sets capital and capacity gates at GPU data hosting (two and a half to three orders of magnitude above the capital needed to host one server) and at data centres (at least 2 MW), while its cloud-service activity has no capital condition. Malaysia pairs a low-capital digital track that covers cloud services with a data-centre track whose smallest recognised category is 0.85 MW. Where small cloud providers can enter on paper, in Thailand and Malaysia, the screen is a fixed compliance cost. Vietnam and the Philippines state no capital rule at the compute layers, so their screens lie in designation, listing and discretion. We found no instrument aimed at compute provision below facility scale, but low-capital cloud routes exist. Cost benchmarks explain the height of Thailand’s gate, not the pattern across the four. The evidence concerns legal eligibility, not realised access, and does not show that a middle-technology trap exists.</w:t>
       </w:r>
     </w:p>
     <w:p>
@@ -414,7 +414,7 @@
         <w:pStyle w:val="FirstParagraph"/>
       </w:pPr>
       <w:r>
-        <w:t xml:space="preserve">We code the primary legal texts of the four countries and, for Thailand, set the formal rules against published project approvals. Our results are as follows. On the stated thresholds, all four countries make application-layer support accessible to small firms, and Vietnam adds an explicit startup track with direct equity access. The four systems use different architectures: capital-gated activities (Thailand), two parallel tracks (Malaysia), a priority list without capital rules (Vietnam) and uniform firm-scale tiers (the Philippines). In Thailand the gate for GPU data hosting lies two and a half to three orders of magnitude above the capital needed to host one server and data centres need at least 2 MW, while the cloud-service activity states no capital condition. Malaysia pairs a low-capital digital track that covers cloud services (RM50,000 of paid-up capital) with a data-centre track whose smallest recognised category is 0.85 MW. Vietnam and the Philippines state no capital rule at the compute layers, so their screens lie elsewhere. Where a small cloud provider can enter on paper, in Thailand and Malaysia, the screen is a fixed compliance cost. No instrument we coded is aimed at compute provision below facility scale. Cost benchmarks explain the height of Thailand’s gate, the most visible pattern and a weak test of design bias, but they do not explain why Vietnam and the Philippines need no capital gate or why Malaysia can admit small cloud providers.</w:t>
+        <w:t xml:space="preserve">We code the primary legal texts of the four countries and, for Thailand, set the formal rules against published project approvals. Our results are as follows. On the stated thresholds, all four countries make application-layer support accessible to small firms, and Vietnam adds an explicit startup track with direct equity access. The four systems use different architectures: capital-gated activities (Thailand), two parallel tracks (Malaysia), a strategic-technology list without capital rules (Vietnam) and activity tiers with a common firm-scale boundary (the Philippines). In Thailand the gate for GPU data hosting lies two and a half to three orders of magnitude above the capital needed to host one server and data centres need at least 2 MW, while the cloud-service activity states no capital condition. Malaysia pairs a low-capital digital track that covers cloud services (RM50,000 of paid-up capital) with a data-centre track whose smallest recognised category is 0.85 MW. Vietnam and the Philippines state no capital rule at the compute layers, so their screens lie elsewhere. Where a small cloud provider can enter on paper, in Thailand and Malaysia, the screen is a fixed compliance cost. No instrument we coded is aimed at compute provision below facility scale. Cost benchmarks explain the height of Thailand’s gate, the most visible pattern and a weak test of design bias, but they do not explain why Vietnam and the Philippines need no capital gate or why Malaysia can admit small cloud providers.</w:t>
       </w:r>
     </w:p>
     <w:p>
@@ -1150,7 +1150,7 @@
         <w:pStyle w:val="FirstParagraph"/>
       </w:pPr>
       <w:r>
-        <w:t xml:space="preserve">We code primary legal and regulatory texts, not strategy documents or commentary: Thailand’s Board of Investment announcements and Investment Promotion Guide; Vietnam’s Decree 260/2026 implementing the Law on High Technology and Decision 21/2026 on strategic technologies; Malaysia’s Malaysia Digital tax-incentive guidelines and the Digital Ecosystem Acceleration (DESAC) scheme guidelines; and the Philippines’ CREATE MORE Act with its implementing rules. Table 1 lists each source with its issuing body, date, access route and the amendment check described below.</w:t>
+        <w:t xml:space="preserve">We code primary legal and regulatory texts, not strategy documents or commentary: Thailand’s Board of Investment announcements and Investment Promotion Guide; Vietnam’s Decree 260/2026 implementing the Law on High Technology and Decision 21/2026 on strategic technologies; Malaysia’s Malaysia Digital tax-incentive guidelines and the Digital Ecosystem Acceleration (DESAC) scheme guidelines; and the Philippines’ CREATE MORE Act with the 2026 Strategic Investment Priority Plan (its implementing rules are not yet read). Table 1 lists each source with its issuing body, date, access route and the amendment check described below.</w:t>
       </w:r>
     </w:p>
     <w:p>
@@ -1463,10 +1463,19 @@
               <w:jc w:val="left"/>
             </w:pPr>
             <w:r>
-              <w:t xml:space="preserve">Decree read in full 9 October 2026; Decision 21/2026</w:t>
-            </w:r>
-            <w:r>
-              <w:t xml:space="preserve"> </w:t>
+              <w:t xml:space="preserve">Decree 260 and Decision 21/2026 read in full 9 October 2026</w:t>
+            </w:r>
+          </w:p>
+        </w:tc>
+        <w:tc>
+          <w:tcPr/>
+          <w:p>
+            <w:pPr>
+              <w:pStyle w:val="Compact"/>
+              <w:jc w:val="left"/>
+            </w:pPr>
+            <w:r>
+              <w:t xml:space="preserve">Implementing circulars 38, 40, 42, 48 and 49/2026/TT-BKHCN and Decrees 20/2026 and 264/2025 identified; the circulars (including Circular 34/2025/TT-BKHCN on procurement preference) not yet read (</w:t>
             </w:r>
             <w:r>
               <w:rPr>
@@ -1475,17 +1484,180 @@
               </w:rPr>
               <w:t xml:space="preserve">PENDING</w:t>
             </w:r>
-          </w:p>
-        </w:tc>
-        <w:tc>
-          <w:tcPr/>
-          <w:p>
-            <w:pPr>
-              <w:pStyle w:val="Compact"/>
-              <w:jc w:val="left"/>
-            </w:pPr>
-            <w:r>
-              <w:t xml:space="preserve">Implementing circulars 38, 40, 42, 48 and 49/2026/TT-BKHCN and Decrees 20/2026 and 264/2025 identified; circulars and Decision 21/2026 not yet read (</w:t>
+            <w:r>
+              <w:t xml:space="preserve">)</w:t>
+            </w:r>
+          </w:p>
+        </w:tc>
+      </w:tr>
+      <w:tr>
+        <w:tc>
+          <w:tcPr/>
+          <w:p>
+            <w:pPr>
+              <w:pStyle w:val="Compact"/>
+              <w:jc w:val="left"/>
+            </w:pPr>
+            <w:r>
+              <w:t xml:space="preserve">Malaysia</w:t>
+            </w:r>
+          </w:p>
+        </w:tc>
+        <w:tc>
+          <w:tcPr/>
+          <w:p>
+            <w:pPr>
+              <w:pStyle w:val="Compact"/>
+              <w:jc w:val="left"/>
+            </w:pPr>
+            <w:r>
+              <w:t xml:space="preserve">Guidelines on Malaysia Digital (MD) Tax Incentive, New Investment Incentive (revised 22 July 2025); Guidelines and Procedures for DESAC (version on MIDA’s site, December 2024); Guideline for Sustainable Development of Data Centre (December 2024)</w:t>
+            </w:r>
+          </w:p>
+        </w:tc>
+        <w:tc>
+          <w:tcPr/>
+          <w:p>
+            <w:pPr>
+              <w:pStyle w:val="Compact"/>
+              <w:jc w:val="left"/>
+            </w:pPr>
+            <w:r>
+              <w:t xml:space="preserve">MDEC; MIDA; MITI (hosted by MIDA)</w:t>
+            </w:r>
+          </w:p>
+        </w:tc>
+        <w:tc>
+          <w:tcPr/>
+          <w:p>
+            <w:pPr>
+              <w:pStyle w:val="Compact"/>
+              <w:jc w:val="left"/>
+            </w:pPr>
+            <w:r>
+              <w:t xml:space="preserve">DESAC applications received 1 January 2022 to 31 December 2027; MD guideline July 2025</w:t>
+            </w:r>
+          </w:p>
+        </w:tc>
+        <w:tc>
+          <w:tcPr/>
+          <w:p>
+            <w:pPr>
+              <w:pStyle w:val="Compact"/>
+              <w:jc w:val="left"/>
+            </w:pPr>
+            <w:r>
+              <w:t xml:space="preserve">English (original)</w:t>
+            </w:r>
+          </w:p>
+        </w:tc>
+        <w:tc>
+          <w:tcPr/>
+          <w:p>
+            <w:pPr>
+              <w:pStyle w:val="Compact"/>
+              <w:jc w:val="left"/>
+            </w:pPr>
+            <w:r>
+              <w:t xml:space="preserve">Read 9 October 2026 for this draft (authors to confirm)</w:t>
+            </w:r>
+          </w:p>
+        </w:tc>
+        <w:tc>
+          <w:tcPr/>
+          <w:p>
+            <w:pPr>
+              <w:pStyle w:val="Compact"/>
+              <w:jc w:val="left"/>
+            </w:pPr>
+            <w:r>
+              <w:t xml:space="preserve">New Incentive Framework (manufacturing from 1 March 2026, services from Q2 2026) does not withdraw DESAC, which stays available until its window expires (MIDA NIF FAQ, question 20); checked 9 October 2026</w:t>
+            </w:r>
+          </w:p>
+        </w:tc>
+      </w:tr>
+      <w:tr>
+        <w:tc>
+          <w:tcPr/>
+          <w:p>
+            <w:pPr>
+              <w:pStyle w:val="Compact"/>
+              <w:jc w:val="left"/>
+            </w:pPr>
+            <w:r>
+              <w:t xml:space="preserve">Philippines</w:t>
+            </w:r>
+          </w:p>
+        </w:tc>
+        <w:tc>
+          <w:tcPr/>
+          <w:p>
+            <w:pPr>
+              <w:pStyle w:val="Compact"/>
+              <w:jc w:val="left"/>
+            </w:pPr>
+            <w:r>
+              <w:t xml:space="preserve">Republic Act 12066 (CREATE MORE), signed 11 November 2024; Memorandum Order 47 of 21 May 2026 approving the 2026 SIPP; FIRB Advisory 001-2025</w:t>
+            </w:r>
+          </w:p>
+        </w:tc>
+        <w:tc>
+          <w:tcPr/>
+          <w:p>
+            <w:pPr>
+              <w:pStyle w:val="Compact"/>
+              <w:jc w:val="left"/>
+            </w:pPr>
+            <w:r>
+              <w:t xml:space="preserve">Congress; Office of the President; FIRB</w:t>
+            </w:r>
+          </w:p>
+        </w:tc>
+        <w:tc>
+          <w:tcPr/>
+          <w:p>
+            <w:pPr>
+              <w:pStyle w:val="Compact"/>
+              <w:jc w:val="left"/>
+            </w:pPr>
+            <w:r>
+              <w:t xml:space="preserve">Act 2024; SIPP 2026</w:t>
+            </w:r>
+          </w:p>
+        </w:tc>
+        <w:tc>
+          <w:tcPr/>
+          <w:p>
+            <w:pPr>
+              <w:pStyle w:val="Compact"/>
+              <w:jc w:val="left"/>
+            </w:pPr>
+            <w:r>
+              <w:t xml:space="preserve">English (original)</w:t>
+            </w:r>
+          </w:p>
+        </w:tc>
+        <w:tc>
+          <w:tcPr/>
+          <w:p>
+            <w:pPr>
+              <w:pStyle w:val="Compact"/>
+              <w:jc w:val="left"/>
+            </w:pPr>
+            <w:r>
+              <w:t xml:space="preserve">Act and Memorandum Order read 9 October 2026 for this draft (authors to confirm); FIRB Advisory 001-2025 not read</w:t>
+            </w:r>
+          </w:p>
+        </w:tc>
+        <w:tc>
+          <w:tcPr/>
+          <w:p>
+            <w:pPr>
+              <w:pStyle w:val="Compact"/>
+              <w:jc w:val="left"/>
+            </w:pPr>
+            <w:r>
+              <w:t xml:space="preserve">Implementing rules, FIRB Advisory 001-2025 and the SIPP qualification guidelines not yet read (</w:t>
             </w:r>
             <w:r>
               <w:rPr>
@@ -1496,194 +1668,6 @@
             </w:r>
             <w:r>
               <w:t xml:space="preserve">)</w:t>
-            </w:r>
-          </w:p>
-        </w:tc>
-      </w:tr>
-      <w:tr>
-        <w:tc>
-          <w:tcPr/>
-          <w:p>
-            <w:pPr>
-              <w:pStyle w:val="Compact"/>
-              <w:jc w:val="left"/>
-            </w:pPr>
-            <w:r>
-              <w:t xml:space="preserve">Malaysia</w:t>
-            </w:r>
-          </w:p>
-        </w:tc>
-        <w:tc>
-          <w:tcPr/>
-          <w:p>
-            <w:pPr>
-              <w:pStyle w:val="Compact"/>
-              <w:jc w:val="left"/>
-            </w:pPr>
-            <w:r>
-              <w:t xml:space="preserve">Guidelines on Malaysia Digital (MD) Tax Incentive, New Investment Incentive (revised 22 July 2025); Guidelines and Procedures for DESAC (version on MIDA’s site, December 2024); Guideline for Sustainable Development of Data Centre (December 2024)</w:t>
-            </w:r>
-          </w:p>
-        </w:tc>
-        <w:tc>
-          <w:tcPr/>
-          <w:p>
-            <w:pPr>
-              <w:pStyle w:val="Compact"/>
-              <w:jc w:val="left"/>
-            </w:pPr>
-            <w:r>
-              <w:t xml:space="preserve">MDEC; MIDA; MITI (hosted by MIDA)</w:t>
-            </w:r>
-          </w:p>
-        </w:tc>
-        <w:tc>
-          <w:tcPr/>
-          <w:p>
-            <w:pPr>
-              <w:pStyle w:val="Compact"/>
-              <w:jc w:val="left"/>
-            </w:pPr>
-            <w:r>
-              <w:t xml:space="preserve">DESAC applications received 1 January 2022 to 31 December 2027; MD guideline July 2025</w:t>
-            </w:r>
-          </w:p>
-        </w:tc>
-        <w:tc>
-          <w:tcPr/>
-          <w:p>
-            <w:pPr>
-              <w:pStyle w:val="Compact"/>
-              <w:jc w:val="left"/>
-            </w:pPr>
-            <w:r>
-              <w:t xml:space="preserve">English (original)</w:t>
-            </w:r>
-          </w:p>
-        </w:tc>
-        <w:tc>
-          <w:tcPr/>
-          <w:p>
-            <w:pPr>
-              <w:pStyle w:val="Compact"/>
-              <w:jc w:val="left"/>
-            </w:pPr>
-            <w:r>
-              <w:t xml:space="preserve">Read 9 October 2026 for this draft (authors to confirm)</w:t>
-            </w:r>
-          </w:p>
-        </w:tc>
-        <w:tc>
-          <w:tcPr/>
-          <w:p>
-            <w:pPr>
-              <w:pStyle w:val="Compact"/>
-              <w:jc w:val="left"/>
-            </w:pPr>
-            <w:r>
-              <w:t xml:space="preserve">New Incentive Framework (manufacturing from 1 March 2026, services from Q2 2026) does not withdraw DESAC, which stays available until its window expires (MIDA NIF FAQ, question 20); checked 9 October 2026</w:t>
-            </w:r>
-          </w:p>
-        </w:tc>
-      </w:tr>
-      <w:tr>
-        <w:tc>
-          <w:tcPr/>
-          <w:p>
-            <w:pPr>
-              <w:pStyle w:val="Compact"/>
-              <w:jc w:val="left"/>
-            </w:pPr>
-            <w:r>
-              <w:t xml:space="preserve">Philippines</w:t>
-            </w:r>
-          </w:p>
-        </w:tc>
-        <w:tc>
-          <w:tcPr/>
-          <w:p>
-            <w:pPr>
-              <w:pStyle w:val="Compact"/>
-              <w:jc w:val="left"/>
-            </w:pPr>
-            <w:r>
-              <w:t xml:space="preserve">Republic Act 12066 (CREATE MORE); FIRB Advisory 001-2025</w:t>
-            </w:r>
-          </w:p>
-        </w:tc>
-        <w:tc>
-          <w:tcPr/>
-          <w:p>
-            <w:pPr>
-              <w:pStyle w:val="Compact"/>
-              <w:jc w:val="left"/>
-            </w:pPr>
-            <w:r>
-              <w:t xml:space="preserve">Congress; FIRB</w:t>
-            </w:r>
-          </w:p>
-        </w:tc>
-        <w:tc>
-          <w:tcPr/>
-          <w:p>
-            <w:pPr>
-              <w:pStyle w:val="Compact"/>
-              <w:jc w:val="left"/>
-            </w:pPr>
-            <w:r>
-              <w:rPr>
-                <w:bCs/>
-                <w:b/>
-              </w:rPr>
-              <w:t xml:space="preserve">PENDING</w:t>
-            </w:r>
-          </w:p>
-        </w:tc>
-        <w:tc>
-          <w:tcPr/>
-          <w:p>
-            <w:pPr>
-              <w:pStyle w:val="Compact"/>
-              <w:jc w:val="left"/>
-            </w:pPr>
-            <w:r>
-              <w:rPr>
-                <w:bCs/>
-                <w:b/>
-              </w:rPr>
-              <w:t xml:space="preserve">PENDING</w:t>
-            </w:r>
-          </w:p>
-        </w:tc>
-        <w:tc>
-          <w:tcPr/>
-          <w:p>
-            <w:pPr>
-              <w:pStyle w:val="Compact"/>
-              <w:jc w:val="left"/>
-            </w:pPr>
-            <w:r>
-              <w:rPr>
-                <w:bCs/>
-                <w:b/>
-              </w:rPr>
-              <w:t xml:space="preserve">PENDING</w:t>
-            </w:r>
-          </w:p>
-        </w:tc>
-        <w:tc>
-          <w:tcPr/>
-          <w:p>
-            <w:pPr>
-              <w:pStyle w:val="Compact"/>
-              <w:jc w:val="left"/>
-            </w:pPr>
-            <w:r>
-              <w:rPr>
-                <w:bCs/>
-                <w:b/>
-              </w:rPr>
-              <w:t xml:space="preserve">PENDING</w:t>
             </w:r>
           </w:p>
         </w:tc>
@@ -2577,7 +2561,7 @@
         <w:pStyle w:val="BodyText"/>
       </w:pPr>
       <w:r>
-        <w:t xml:space="preserve">Decision 21/2026, which replaced a 2025 list, groups thirty strategic technology products into two priority tiers (Vietnam, 2026b). The top tier, of market-ready products with large direct economic impact, includes Vietnamese-language large language models, virtual assistants and specialised AI systems, and also cloud-computing platforms as a separate line item. The lower tier, of future and foundational technologies, includes specialised chips, quantum technologies and satellite systems.</w:t>
+        <w:t xml:space="preserve">Decision 21/2026 (30 April 2026; in force 1 July 2026), which replaced Decision 1131 of 2025, issues two annexes: ten strategic technologies, the first of which is digital technology (artificial intelligence, big data, digital twins, cloud and edge computing, the Internet of Things and blockchain), and thirty strategic technology products in two groups (Vietnam, 2026b). Group 1 has 22 products that already have a market and can have a large, direct effect on economic development. It includes Vietnamese-language large language models, virtual assistants and specialised AI, edge-processing AI cameras, digital-twin platforms and a line item for cloud-computing platforms. Group 2 has eight products, among them specialised chips, quantum technologies and satellite systems. The Decision does not rank the two groups and attaches no benefit to either. It is a classification that other instruments use.</w:t>
       </w:r>
       <w:r>
         <w:t xml:space="preserve"> </w:t>
@@ -2595,20 +2579,20 @@
         <w:t xml:space="preserve"> </w:t>
       </w:r>
       <w:r>
-        <w:t xml:space="preserve">is a product category and may refer to platform software, not capacity provision, so it is weak evidence on compute provision</w:t>
-      </w:r>
-      <w:r>
-        <w:t xml:space="preserve"> </w:t>
-      </w:r>
-      <w:r>
-        <w:rPr>
-          <w:bCs/>
-          <w:b/>
-        </w:rPr>
-        <w:t xml:space="preserve">[VERIFY: the list entry’s definition and the benefits attached to it]</w:t>
-      </w:r>
-      <w:r>
-        <w:t xml:space="preserve">. Edge-processing AI cameras and digital-twin platforms are also top-tier items, but they are application products, and we do not count them as evidence about compute</w:t>
+        <w:t xml:space="preserve">is a product category with no definition in the Decision and may refer to platform software, not capacity provision, so it is weak evidence on compute provision</w:t>
+      </w:r>
+      <w:r>
+        <w:t xml:space="preserve"> </w:t>
+      </w:r>
+      <w:r>
+        <w:rPr>
+          <w:bCs/>
+          <w:b/>
+        </w:rPr>
+        <w:t xml:space="preserve">[VERIFY: how the circulars define the item and which benefits attach to it]</w:t>
+      </w:r>
+      <w:r>
+        <w:t xml:space="preserve">. Edge-processing AI cameras and digital-twin platforms are application products, and we do not count them as evidence about compute</w:t>
       </w:r>
       <w:r>
         <w:t xml:space="preserve"> </w:t>
@@ -2621,15 +2605,41 @@
         <w:t xml:space="preserve">[PENDING: the first coding placed them in layer (ii); recode them as layer (i) in Table S1]</w:t>
       </w:r>
       <w:r>
-        <w:t xml:space="preserve">. Priority ranking is not blocked access (Section 2.5). Vietnam’s coded instruments therefore contain no capital screen at any layer; specialised chips are ranked lower, and no instrument we coded excludes a firm from hardware manufacture. Hardware is coded for Vietnam only (SI row 13) and is uncoded for the other three countries, so we do not compare hardware across countries.</w:t>
-      </w:r>
-    </w:p>
-    <w:p>
-      <w:pPr>
-        <w:pStyle w:val="BodyText"/>
-      </w:pPr>
-      <w:r>
-        <w:t xml:space="preserve">Vietnam’s design differs from Thailand’s in kind. Thailand and Malaysia define eligibility through activity-specific capital thresholds. Vietnam sets priority through a list of strategic technologies that carries no stated capital rule. A list-based design does not generate a capital gradient, which may be why none appears. The same design moves screening to designation and to instruments we have not coded, so this is a hypothesis about origin, not a finding about access.</w:t>
+        <w:t xml:space="preserve">. The benefit attached to a listed product runs mainly through Decree 260. A strategic-technology enterprise must earn at least 80 per cent of its annual net revenue from strategic products, spend at least 1 per cent of net revenue less inputs on research and development in Vietnam, have research staff with college degrees or higher of at least 10 per cent of its workforce, and reach at least 40 per cent local content (Article 16). These ratios are proportional, not capital thresholds, but the revenue condition presupposes a product already earning revenue, so it is a condition of vintage</w:t>
+      </w:r>
+      <w:r>
+        <w:t xml:space="preserve"> </w:t>
+      </w:r>
+      <w:r>
+        <w:rPr>
+          <w:bCs/>
+          <w:b/>
+        </w:rPr>
+        <w:t xml:space="preserve">[VERIFY: how the criterion applies to a firm that has not yet launched]</w:t>
+      </w:r>
+      <w:r>
+        <w:t xml:space="preserve">. Circular 34/2025/TT-BKHCN, which gives procurement preference to listed digital products bought with state funds, has been identified and not read</w:t>
+      </w:r>
+      <w:r>
+        <w:t xml:space="preserve"> </w:t>
+      </w:r>
+      <w:r>
+        <w:rPr>
+          <w:bCs/>
+          <w:b/>
+        </w:rPr>
+        <w:t xml:space="preserve">[PENDING]</w:t>
+      </w:r>
+      <w:r>
+        <w:t xml:space="preserve">. Group membership is not blocked access (Section 2.5). Vietnam’s coded instruments contain no capital screen at any layer, and since the Decision does not rank the groups we draw no inference about the priority of hardware. Hardware is coded for Vietnam only (SI row 13) and is uncoded for the other three countries, so we do not compare hardware across countries.</w:t>
+      </w:r>
+    </w:p>
+    <w:p>
+      <w:pPr>
+        <w:pStyle w:val="BodyText"/>
+      </w:pPr>
+      <w:r>
+        <w:t xml:space="preserve">Vietnam’s design differs from Thailand’s in kind. Thailand and Malaysia define eligibility through activity-specific capital thresholds. Vietnam names strategic technologies and products in a list that carries no stated capital rule. A list-based design does not generate a capital gradient, which may be why none appears. The same design moves screening to designation, to enterprise criteria and to instruments we have not coded, so this is a hypothesis about origin, not a finding about access.</w:t>
       </w:r>
     </w:p>
     <w:p>
@@ -2809,36 +2819,75 @@
         <w:pStyle w:val="FirstParagraph"/>
       </w:pPr>
       <w:r>
-        <w:t xml:space="preserve">The Philippine architecture, established under the CREATE MORE Act, differs structurally from the other three (Philippines, 2024; Philippines, Fiscal Incentives Review Board, 2025). Standard registration carries no stated minimum investment; eligibility depends on inclusion in the Strategic Investment Priority Plan, on ownership qualifications and on a cost-benefit evaluation, not on firm size directly. Application-layer support is therefore accessible on its stated conditions, but it is subject to a discretionary inclusion and evaluation step.</w:t>
-      </w:r>
-    </w:p>
-    <w:p>
-      <w:pPr>
-        <w:pStyle w:val="BodyText"/>
-      </w:pPr>
-      <w:r>
-        <w:t xml:space="preserve">Above this baseline sits a firm-scale tier at PHP 15 billion (about US$260 million), which defines a high-value domestic market enterprise and determines whether incentives are granted by the investment promotion agency or escalated to the Fiscal Incentives Review Board, with availment periods reaching 24 to 27 years. Beyond this the President may modify the mix, period and manner of availment, or craft a bespoke package, for a project designated highly desirable, with total incentives capped at forty years. This presidential mechanism is discretionary and, in the statutory text we examined, is not tied to a stated investment figure.</w:t>
-      </w:r>
-    </w:p>
-    <w:p>
-      <w:pPr>
-        <w:pStyle w:val="BodyText"/>
-      </w:pPr>
-      <w:r>
-        <w:t xml:space="preserve">These firm-scale tiers apply uniformly regardless of activity type, and the Strategic Investment Priority Plan groups AI and data-centre infrastructure in the same priority tier</w:t>
-      </w:r>
-      <w:r>
-        <w:t xml:space="preserve"> </w:t>
-      </w:r>
-      <w:r>
-        <w:rPr>
-          <w:bCs/>
-          <w:b/>
-        </w:rPr>
-        <w:t xml:space="preserve">[VERIFY: edition and date of the Plan and its exact treatment of AI relative to data-centre infrastructure]</w:t>
-      </w:r>
-      <w:r>
-        <w:t xml:space="preserve">. The Philippines therefore encodes no capital screen specific to the compute layers. The PHP 15 billion tier is a top-up for extended benefits, not an entry rule. Cucio and Hennig (2025) find that roughly one third of Philippine occupations are highly exposed to AI, with around 60 per cent of that exposed employment complementary to AI and not substitutable by it, which suggests augmentation more than displacement for much of the exposed workforce.</w:t>
+        <w:t xml:space="preserve">The Philippine architecture rests on the CREATE MORE Act (Republic Act 12066, 2024), which amends the National Internal Revenue Code, and on the 2026 Strategic Investment Priority Plan (SIPP), approved by Memorandum Order 47 of 21 May 2026 (Philippines, 2024; Philippines, Office of the President, 2026). Under the Act, tax incentives go only to the extent of a registered project or activity listed in the SIPP, which assigns activities to three tiers by national industrial strategy. An application for incentives must be accompanied by a cost-benefit analysis prepared under methods prescribed by the Fiscal Incentives Review Board (FIRB). The Act states no minimum investment for ordinary registration. Whether the implementing rules add one has not been checked</w:t>
+      </w:r>
+      <w:r>
+        <w:t xml:space="preserve"> </w:t>
+      </w:r>
+      <w:r>
+        <w:rPr>
+          <w:bCs/>
+          <w:b/>
+        </w:rPr>
+        <w:t xml:space="preserve">[PENDING: implementing rules and FIRB Advisory 001-2025 (Philippines, Fiscal Incentives Review Board, 2025), not yet read]</w:t>
+      </w:r>
+      <w:r>
+        <w:t xml:space="preserve">. Application-layer support is therefore accessible on the stated conditions, but it is subject to listing and to a discretionary evaluation.</w:t>
+      </w:r>
+    </w:p>
+    <w:p>
+      <w:pPr>
+        <w:pStyle w:val="BodyText"/>
+      </w:pPr>
+      <w:r>
+        <w:t xml:space="preserve">The 2026 SIPP names AI and data infrastructure, and splits them across tiers. Software development, including software as a service, and hyperscalers are listed as IT-enabled services in Tier I. Data centres that rely on the grid are covered in Tier I as upstream telecommunications infrastructure. Activities developing AI and data-science solutions or providing related services are in Tier III, as are data centres with their own power supply, which the Plan lists among science, technology and innovation support facilities. The Tier III definition names cyber-security, AI and data-centre facilities as activities critical to the structural transformation of the economy. A footnote defines a data centre as a purpose-built commercial facility, dedicated or multi-tenant, that provides infrastructure such as colocation. The Plan states no size or capital condition for any of these entries, and its qualification guidelines are still to come</w:t>
+      </w:r>
+      <w:r>
+        <w:t xml:space="preserve"> </w:t>
+      </w:r>
+      <w:r>
+        <w:rPr>
+          <w:bCs/>
+          <w:b/>
+        </w:rPr>
+        <w:t xml:space="preserve">[VERIFY: whether guidelines have been issued]</w:t>
+      </w:r>
+      <w:r>
+        <w:t xml:space="preserve">.</w:t>
+      </w:r>
+    </w:p>
+    <w:p>
+      <w:pPr>
+        <w:pStyle w:val="BodyText"/>
+      </w:pPr>
+      <w:r>
+        <w:t xml:space="preserve">Above this baseline the Act sets a firm-scale boundary at PHP 15 billion of investment capital (about US$260 million). The investment promotion agencies grant incentives to listed projects at or below it, larger projects go to the FIRB, and the FIRB may raise the figure. A</w:t>
+      </w:r>
+      <w:r>
+        <w:t xml:space="preserve"> </w:t>
+      </w:r>
+      <w:r>
+        <w:t xml:space="preserve">“</w:t>
+      </w:r>
+      <w:r>
+        <w:t xml:space="preserve">high-value domestic market enterprise</w:t>
+      </w:r>
+      <w:r>
+        <w:t xml:space="preserve">”</w:t>
+      </w:r>
+      <w:r>
+        <w:t xml:space="preserve"> </w:t>
+      </w:r>
+      <w:r>
+        <w:t xml:space="preserve">is one with more than PHP 15 billion of capital in import-substituting sectors, or with export sales of at least US$100 million. Availment periods reach 14 to 17 years under the agency tier and 24 to 27 years under the FIRB tier, and an extension is allowed only for a project that employs at least 10,000 direct local workers. Beyond this the President may modify the mix, period and manner of availment, or craft a bespoke package, for a highly desirable project or a specific industrial activity (Section 301). The FIRB must find that the benefits are clear and convincing and far outweigh the cost, the project must have a sustainable development plan, and it must show minimum investment capital of PHP 50 billion (about US$865 million) or at least 10,000 direct local jobs within three years. Total income-tax incentives are capped at forty years, and the thresholds are reviewed every three years.</w:t>
+      </w:r>
+    </w:p>
+    <w:p>
+      <w:pPr>
+        <w:pStyle w:val="BodyText"/>
+      </w:pPr>
+      <w:r>
+        <w:t xml:space="preserve">The firm-scale boundary applies to every activity, so the capital rule is generic, while the activity tiers are AI-aware and place AI services and own-power data centres in Tier III beside grid-reliant data centres in Tier I. The Philippines therefore encodes no capital screen specific to the compute layers, and the tier of a data centre depends on its power source, not its size. The PHP 15 billion boundary routes projects to the FIRB and extends benefits. It is not an entry rule. Cucio and Hennig (2025) find that roughly one third of Philippine occupations are highly exposed to AI, with around 60 per cent of that exposed employment complementary to AI and not substitutable by it, which suggests augmentation more than displacement for much of the exposed workforce.</w:t>
       </w:r>
     </w:p>
     <w:bookmarkEnd w:id="37"/>
@@ -2983,7 +3032,7 @@
               <w:jc w:val="left"/>
             </w:pPr>
             <w:r>
-              <w:t xml:space="preserve">Accessible: startup track (research and development on listed technology; revenue growth or commercialisation-ready; recognition by the provincial authority); named top-tier strategic priority</w:t>
+              <w:t xml:space="preserve">Accessible: startup track (research and development on listed technology; revenue growth or commercialisation-ready; recognition by the provincial authority); named Group 1 strategic product (AI models, assistants, specialised AI)</w:t>
             </w:r>
           </w:p>
         </w:tc>
@@ -3007,7 +3056,7 @@
               <w:jc w:val="left"/>
             </w:pPr>
             <w:r>
-              <w:t xml:space="preserve">Accessible on stated conditions: no minimum, subject to inclusion and evaluation</w:t>
+              <w:t xml:space="preserve">Accessible on stated conditions: no minimum in the Act; software and SaaS in Tier I, AI and data science in Tier III; subject to listing and cost-benefit evaluation</w:t>
             </w:r>
           </w:p>
         </w:tc>
@@ -3045,7 +3094,7 @@
               <w:jc w:val="left"/>
             </w:pPr>
             <w:r>
-              <w:t xml:space="preserve">Cloud-computing platforms in top tier; no capital rule; scope</w:t>
+              <w:t xml:space="preserve">Cloud-computing platforms in Group 1 (no definition); no capital rule; scope</w:t>
             </w:r>
             <w:r>
               <w:t xml:space="preserve"> </w:t>
@@ -3095,7 +3144,7 @@
               <w:jc w:val="left"/>
             </w:pPr>
             <w:r>
-              <w:t xml:space="preserve">Same priority tier as AI applications; no minimum; PHP 15 billion firm-scale tier for extended benefits</w:t>
+              <w:t xml:space="preserve">Hyperscalers and grid-reliant data centres in Tier I; data centres with own power supply in Tier III; no size condition; PHP 15 billion firm-scale boundary routes projects to the FIRB</w:t>
             </w:r>
           </w:p>
         </w:tc>
@@ -3133,7 +3182,7 @@
               <w:jc w:val="left"/>
             </w:pPr>
             <w:r>
-              <w:t xml:space="preserve">Specialised chips in lower priority tier</w:t>
+              <w:t xml:space="preserve">Specialised chips in Group 2 (groups not ranked)</w:t>
             </w:r>
           </w:p>
         </w:tc>
@@ -3252,7 +3301,7 @@
               <w:jc w:val="left"/>
             </w:pPr>
             <w:r>
-              <w:t xml:space="preserve">None identified (</w:t>
+              <w:t xml:space="preserve">None identified in the Act or the 2026 SIPP (</w:t>
             </w:r>
             <w:r>
               <w:rPr>
@@ -3262,7 +3311,7 @@
               <w:t xml:space="preserve">PENDING</w:t>
             </w:r>
             <w:r>
-              <w:t xml:space="preserve">)</w:t>
+              <w:t xml:space="preserve">: implementing rules)</w:t>
             </w:r>
           </w:p>
         </w:tc>
@@ -3448,7 +3497,7 @@
               <w:jc w:val="left"/>
             </w:pPr>
             <w:r>
-              <w:t xml:space="preserve">FIRB escalation above PHP 15 billion</w:t>
+              <w:t xml:space="preserve">Cost-benefit analysis at application; FIRB monitoring and performance review; FIRB escalation above PHP 15 billion</w:t>
             </w:r>
           </w:p>
         </w:tc>
@@ -3486,7 +3535,7 @@
               <w:jc w:val="left"/>
             </w:pPr>
             <w:r>
-              <w:t xml:space="preserve">No capital screen in coded instruments; listed technology, recognition by the authority and designation</w:t>
+              <w:t xml:space="preserve">No capital screen in coded instruments; listed technology, recognition by the authority and designation; for strategic-technology enterprises, proportional revenue, research, staffing and local-content criteria (Decree 260, Art. 16)</w:t>
             </w:r>
           </w:p>
         </w:tc>
@@ -3510,7 +3559,7 @@
               <w:jc w:val="left"/>
             </w:pPr>
             <w:r>
-              <w:t xml:space="preserve">Inclusion, evaluation and firm-scale tier for extended benefits</w:t>
+              <w:t xml:space="preserve">Listing in the SIPP, cost-benefit evaluation, and firm-scale routing at PHP 15 billion; activity tier depends on power source for data centres</w:t>
             </w:r>
           </w:p>
         </w:tc>
@@ -3748,7 +3797,7 @@
         <w:t xml:space="preserve"> </w:t>
       </w:r>
       <w:r>
-        <w:t xml:space="preserve">Thailand screens at the infrastructure activity. Malaysia runs two tracks, a low-capital digital track and a data-centre track with facility categories and outcome conditions. Vietnam’s coded instruments contain no capital screen and rank hardware lower. The Philippines applies the same inclusion and scale rules to all activities. All four make layer (i) accessible on the stated thresholds.</w:t>
+        <w:t xml:space="preserve">Thailand screens at the infrastructure activity. Malaysia runs two tracks, a low-capital digital track and a data-centre track with facility categories and outcome conditions. Vietnam’s coded instruments contain no capital screen. The Philippines lists activities by tier, with different tiers for grid-reliant and own-power data centres, and applies one firm-scale boundary to all activities. All four make layer (i) accessible on the stated thresholds.</w:t>
       </w:r>
     </w:p>
     <w:p>
@@ -3838,7 +3887,7 @@
         <w:t xml:space="preserve"> </w:t>
       </w:r>
       <w:r>
-        <w:t xml:space="preserve">The Philippines’ uniform tiers and Thailand’s competitiveness mechanism look like generic investment-promotion templates under which AI was placed, a reading consistent with H3.</w:t>
+        <w:t xml:space="preserve">The Philippines’ firm-scale boundary, which the Act applies to all registered activities, and Thailand’s competitiveness mechanism look like generic investment-promotion templates under which AI was placed, a reading consistent with H3.</w:t>
       </w:r>
       <w:r>
         <w:t xml:space="preserve"> </w:t>
@@ -3866,7 +3915,7 @@
         <w:t xml:space="preserve"> </w:t>
       </w:r>
       <w:r>
-        <w:t xml:space="preserve">The most direct explanation is the instrument type noted in Section 4.2: a priority list without capital rules against activity-specific thresholds. Vietnam’s law is also the most recent of the four, written after cloud and AI became explicit policy priorities. We offer these as hypotheses that the present data cannot test.</w:t>
+        <w:t xml:space="preserve">The most direct explanation is the instrument type noted in Section 4.2: a strategic-technology list without capital rules against activity-specific thresholds. Vietnam’s law is also the most recent of the four, written after cloud and AI became explicit policy priorities. We offer these as hypotheses that the present data cannot test.</w:t>
       </w:r>
     </w:p>
     <w:p>
@@ -4148,7 +4197,7 @@
               <w:jc w:val="left"/>
             </w:pPr>
             <w:r>
-              <w:t xml:space="preserve">Priority list</w:t>
+              <w:t xml:space="preserve">Strategic-technology list</w:t>
             </w:r>
           </w:p>
         </w:tc>
@@ -4172,43 +4221,43 @@
               <w:jc w:val="left"/>
             </w:pPr>
             <w:r>
-              <w:t xml:space="preserve">Designation of products in two tiers; no capital rule</w:t>
-            </w:r>
-          </w:p>
-        </w:tc>
-        <w:tc>
-          <w:tcPr/>
-          <w:p>
-            <w:pPr>
-              <w:pStyle w:val="Compact"/>
-              <w:jc w:val="left"/>
-            </w:pPr>
-            <w:r>
-              <w:t xml:space="preserve">Designation, not capital</w:t>
-            </w:r>
-          </w:p>
-        </w:tc>
-        <w:tc>
-          <w:tcPr/>
-          <w:p>
-            <w:pPr>
-              <w:pStyle w:val="Compact"/>
-              <w:jc w:val="left"/>
-            </w:pPr>
-            <w:r>
-              <w:t xml:space="preserve">No capital barrier; access depends on designation and on instruments not yet coded</w:t>
-            </w:r>
-          </w:p>
-        </w:tc>
-        <w:tc>
-          <w:tcPr/>
-          <w:p>
-            <w:pPr>
-              <w:pStyle w:val="Compact"/>
-              <w:jc w:val="left"/>
-            </w:pPr>
-            <w:r>
-              <w:t xml:space="preserve">Discretion and opacity</w:t>
+              <w:t xml:space="preserve">Designation of technologies and products in two unranked groups; enterprise criteria in Decree 260; no capital rule</w:t>
+            </w:r>
+          </w:p>
+        </w:tc>
+        <w:tc>
+          <w:tcPr/>
+          <w:p>
+            <w:pPr>
+              <w:pStyle w:val="Compact"/>
+              <w:jc w:val="left"/>
+            </w:pPr>
+            <w:r>
+              <w:t xml:space="preserve">Designation and enterprise criteria, not capital</w:t>
+            </w:r>
+          </w:p>
+        </w:tc>
+        <w:tc>
+          <w:tcPr/>
+          <w:p>
+            <w:pPr>
+              <w:pStyle w:val="Compact"/>
+              <w:jc w:val="left"/>
+            </w:pPr>
+            <w:r>
+              <w:t xml:space="preserve">No capital barrier; access depends on designation, on proportional enterprise criteria and on instruments not yet coded</w:t>
+            </w:r>
+          </w:p>
+        </w:tc>
+        <w:tc>
+          <w:tcPr/>
+          <w:p>
+            <w:pPr>
+              <w:pStyle w:val="Compact"/>
+              <w:jc w:val="left"/>
+            </w:pPr>
+            <w:r>
+              <w:t xml:space="preserve">Discretion and opacity; revenue condition presupposes a product on the market</w:t>
             </w:r>
           </w:p>
         </w:tc>
@@ -4222,7 +4271,7 @@
               <w:jc w:val="left"/>
             </w:pPr>
             <w:r>
-              <w:t xml:space="preserve">Uniform scale tiers</w:t>
+              <w:t xml:space="preserve">Activity tiers with a common firm-scale boundary</w:t>
             </w:r>
           </w:p>
         </w:tc>
@@ -4246,43 +4295,43 @@
               <w:jc w:val="left"/>
             </w:pPr>
             <w:r>
-              <w:t xml:space="preserve">Inclusion and evaluation; firm-scale tier (PHP 15bn) for extended benefits; presidential discretion above</w:t>
-            </w:r>
-          </w:p>
-        </w:tc>
-        <w:tc>
-          <w:tcPr/>
-          <w:p>
-            <w:pPr>
-              <w:pStyle w:val="Compact"/>
-              <w:jc w:val="left"/>
-            </w:pPr>
-            <w:r>
-              <w:t xml:space="preserve">Inclusion step and firm scale, not layer</w:t>
-            </w:r>
-          </w:p>
-        </w:tc>
-        <w:tc>
-          <w:tcPr/>
-          <w:p>
-            <w:pPr>
-              <w:pStyle w:val="Compact"/>
-              <w:jc w:val="left"/>
-            </w:pPr>
-            <w:r>
-              <w:t xml:space="preserve">The same rules govern software and data centres; the system is AI-blind</w:t>
-            </w:r>
-          </w:p>
-        </w:tc>
-        <w:tc>
-          <w:tcPr/>
-          <w:p>
-            <w:pPr>
-              <w:pStyle w:val="Compact"/>
-              <w:jc w:val="left"/>
-            </w:pPr>
-            <w:r>
-              <w:t xml:space="preserve">Scale tiers set without reference to the technology</w:t>
+              <w:t xml:space="preserve">Listing in the SIPP by activity tier; cost-benefit evaluation; PHP 15bn routing boundary; presidential package for projects of PHP 50bn or 10,000 jobs</w:t>
+            </w:r>
+          </w:p>
+        </w:tc>
+        <w:tc>
+          <w:tcPr/>
+          <w:p>
+            <w:pPr>
+              <w:pStyle w:val="Compact"/>
+              <w:jc w:val="left"/>
+            </w:pPr>
+            <w:r>
+              <w:t xml:space="preserve">Listing step and firm scale; for data centres, power source</w:t>
+            </w:r>
+          </w:p>
+        </w:tc>
+        <w:tc>
+          <w:tcPr/>
+          <w:p>
+            <w:pPr>
+              <w:pStyle w:val="Compact"/>
+              <w:jc w:val="left"/>
+            </w:pPr>
+            <w:r>
+              <w:t xml:space="preserve">Software, AI and data centres are tiered by activity and power source with no size condition; the firm-scale boundary is common to all activities</w:t>
+            </w:r>
+          </w:p>
+        </w:tc>
+        <w:tc>
+          <w:tcPr/>
+          <w:p>
+            <w:pPr>
+              <w:pStyle w:val="Compact"/>
+              <w:jc w:val="left"/>
+            </w:pPr>
+            <w:r>
+              <w:t xml:space="preserve">A generic scale boundary; tier by power source, not by size</w:t>
             </w:r>
           </w:p>
         </w:tc>
@@ -4796,19 +4845,19 @@
               <w:jc w:val="left"/>
             </w:pPr>
             <w:r>
-              <w:t xml:space="preserve">Philippines, firm-scale tier</w:t>
-            </w:r>
-          </w:p>
-        </w:tc>
-        <w:tc>
-          <w:tcPr/>
-          <w:p>
-            <w:pPr>
-              <w:pStyle w:val="Compact"/>
-              <w:jc w:val="left"/>
-            </w:pPr>
-            <w:r>
-              <w:t xml:space="preserve">Investment capital, extended benefits only</w:t>
+              <w:t xml:space="preserve">Philippines, firm-scale boundary</w:t>
+            </w:r>
+          </w:p>
+        </w:tc>
+        <w:tc>
+          <w:tcPr/>
+          <w:p>
+            <w:pPr>
+              <w:pStyle w:val="Compact"/>
+              <w:jc w:val="left"/>
+            </w:pPr>
+            <w:r>
+              <w:t xml:space="preserve">Investment capital; routes projects to the FIRB and extends benefits</w:t>
             </w:r>
           </w:p>
         </w:tc>
@@ -4845,6 +4894,68 @@
             </w:pPr>
             <w:r>
               <w:t xml:space="preserve">2.8 to 3.3</w:t>
+            </w:r>
+          </w:p>
+        </w:tc>
+      </w:tr>
+      <w:tr>
+        <w:tc>
+          <w:tcPr/>
+          <w:p>
+            <w:pPr>
+              <w:pStyle w:val="Compact"/>
+              <w:jc w:val="left"/>
+            </w:pPr>
+            <w:r>
+              <w:t xml:space="preserve">Philippines, presidential package (Section 301)</w:t>
+            </w:r>
+          </w:p>
+        </w:tc>
+        <w:tc>
+          <w:tcPr/>
+          <w:p>
+            <w:pPr>
+              <w:pStyle w:val="Compact"/>
+              <w:jc w:val="left"/>
+            </w:pPr>
+            <w:r>
+              <w:t xml:space="preserve">Investment capital, or alternatively 10,000 direct jobs</w:t>
+            </w:r>
+          </w:p>
+        </w:tc>
+        <w:tc>
+          <w:tcPr/>
+          <w:p>
+            <w:pPr>
+              <w:pStyle w:val="Compact"/>
+              <w:jc w:val="left"/>
+            </w:pPr>
+            <w:r>
+              <w:t xml:space="preserve">865</w:t>
+            </w:r>
+          </w:p>
+        </w:tc>
+        <w:tc>
+          <w:tcPr/>
+          <w:p>
+            <w:pPr>
+              <w:pStyle w:val="Compact"/>
+              <w:jc w:val="left"/>
+            </w:pPr>
+            <w:r>
+              <w:t xml:space="preserve">80.8 MW / 22.8 MW</w:t>
+            </w:r>
+          </w:p>
+        </w:tc>
+        <w:tc>
+          <w:tcPr/>
+          <w:p>
+            <w:pPr>
+              <w:pStyle w:val="Compact"/>
+              <w:jc w:val="left"/>
+            </w:pPr>
+            <w:r>
+              <w:t xml:space="preserve">3.3 to 3.8</w:t>
             </w:r>
           </w:p>
         </w:tc>
@@ -4999,7 +5110,7 @@
         <w:t xml:space="preserve"> </w:t>
       </w:r>
       <w:r>
-        <w:t xml:space="preserve">Rung distance is log10 of the threshold over US$0.13m to US$0.46m, the capital to host one eight-accelerator server of about 12 kW on the two benchmarks (CITATION NEEDED for the 12 kW figure). The Philippine figure is an extended-benefit tier, not an entry rule. Malaysia’s paid-up capital measures how well capitalised the company is, so it has no rung distance. Malaysia Digital (RM50,000 paid-up capital) is a company-capital rule on a digital track and is not placed on the scale. Bases differ, so rows are indicative.</w:t>
+        <w:t xml:space="preserve">Rung distance is log10 of the threshold over US$0.13m to US$0.46m, the capital to host one eight-accelerator server of about 12 kW on the two benchmarks (CITATION NEEDED for the 12 kW figure). The Philippine figures are a routing boundary and a condition for a presidential package, not entry rules. Malaysia’s paid-up capital measures how well capitalised the company is, so it has no rung distance. Malaysia Digital (RM50,000 paid-up capital) is a company-capital rule on a digital track and is not placed on the scale. Bases differ, so rows are indicative.</w:t>
       </w:r>
     </w:p>
     <w:p>
@@ -5029,7 +5140,7 @@
           <wp:inline>
             <wp:extent cx="5334000" cy="3531972"/>
             <wp:effectExtent b="0" l="0" r="0" t="0"/>
-            <wp:docPr descr="Figure 1. Explicit eligibility thresholds against cost benchmarks, US$ million, log scale. Shaded bands show the capital needed to host the stated capacity, from construction cost alone (US$10.7m per MW; Turner and Townsend, 2025) to fully equipped AI capacity (US$38m per MW; Epoch AI, 2026); the node band assumes 12 kW per eight-accelerator server (CITATION NEEDED). Thresholds are on different bases: Thailand’s software figure is annual salary spend (hollow marker); Thailand’s data-hosting figure is minimum capital; Malaysia’s two paid-up capital figures are company capital, not project scale (*), the 0.85 MW bar shows the capital to host the smallest DESAC data-centre category (construction to fully equipped), and the right-hand marker is the cumulative capex condition for the second five years; the Philippine figure is a firm-scale tier for extended benefits. The bands are benchmarks, not like-for-like tests. Vietnam states no capital threshold." title="" id="39" name="Picture"/>
+            <wp:docPr descr="Figure 1. Explicit eligibility thresholds against cost benchmarks, US$ million, log scale. Shaded bands show the capital needed to host the stated capacity, from construction cost alone (US$10.7m per MW; Turner and Townsend, 2025) to fully equipped AI capacity (US$38m per MW; Epoch AI, 2026); the node band assumes 12 kW per eight-accelerator server (CITATION NEEDED). Thresholds are on different bases: Thailand’s software figure is annual salary spend (hollow marker); Thailand’s data-hosting figure is minimum capital; Malaysia’s two paid-up capital figures are company capital, not project scale (*), the 0.85 MW bar shows the capital to host the smallest DESAC data-centre category (construction to fully equipped), and the right-hand marker is the cumulative capex condition for the second five years; the Philippine figures are the firm-scale boundary and the condition for a presidential package. The bands are benchmarks, not like-for-like tests. Vietnam states no capital threshold in the instruments coded." title="" id="39" name="Picture"/>
             <a:graphic>
               <a:graphicData uri="http://schemas.openxmlformats.org/drawingml/2006/picture">
                 <pic:pic>
@@ -5082,7 +5193,7 @@
         <w:t xml:space="preserve"> </w:t>
       </w:r>
       <w:r>
-        <w:t xml:space="preserve">Explicit eligibility thresholds against cost benchmarks, US$ million, log scale. Shaded bands show the capital needed to host the stated capacity, from construction cost alone (US$10.7m per MW; Turner and Townsend, 2025) to fully equipped AI capacity (US$38m per MW; Epoch AI, 2026); the node band assumes 12 kW per eight-accelerator server (CITATION NEEDED). Thresholds are on different bases: Thailand’s software figure is annual salary spend (hollow marker); Thailand’s data-hosting figure is minimum capital; Malaysia’s two paid-up capital figures are company capital, not project scale (*), the 0.85 MW bar shows the capital to host the smallest DESAC data-centre category (construction to fully equipped), and the right-hand marker is the cumulative capex condition for the second five years; the Philippine figure is a firm-scale tier for extended benefits. The bands are benchmarks, not like-for-like tests. Vietnam states no capital threshold.</w:t>
+        <w:t xml:space="preserve">Explicit eligibility thresholds against cost benchmarks, US$ million, log scale. Shaded bands show the capital needed to host the stated capacity, from construction cost alone (US$10.7m per MW; Turner and Townsend, 2025) to fully equipped AI capacity (US$38m per MW; Epoch AI, 2026); the node band assumes 12 kW per eight-accelerator server (CITATION NEEDED). Thresholds are on different bases: Thailand’s software figure is annual salary spend (hollow marker); Thailand’s data-hosting figure is minimum capital; Malaysia’s two paid-up capital figures are company capital, not project scale (*), the 0.85 MW bar shows the capital to host the smallest DESAC data-centre category (construction to fully equipped), and the right-hand marker is the cumulative capex condition for the second five years; the Philippine figures are the firm-scale boundary and the condition for a presidential package. The bands are benchmarks, not like-for-like tests. Vietnam states no capital threshold in the instruments coded.</w:t>
       </w:r>
     </w:p>
     <w:p>
@@ -5288,7 +5399,7 @@
               <w:jc w:val="left"/>
             </w:pPr>
             <w:r>
-              <w:t xml:space="preserve">Unclear (startup recognition needs research and development on listed technology; cloud-computing platforms are listed with no capital rule, capacity resale</w:t>
+              <w:t xml:space="preserve">Unclear (startup recognition needs research and development on listed technology; cloud-computing platforms are listed in Group 1 with no capital rule and no definition, capacity resale</w:t>
             </w:r>
             <w:r>
               <w:t xml:space="preserve"> </w:t>
@@ -5313,10 +5424,45 @@
               <w:jc w:val="left"/>
             </w:pPr>
             <w:r>
-              <w:t xml:space="preserve">Unclear (no data-centre category in Decree 260; Decision 21/2026</w:t>
-            </w:r>
-            <w:r>
-              <w:t xml:space="preserve"> </w:t>
+              <w:t xml:space="preserve">Unclear (no data-centre category in Decree 260 or Decision 21/2026; Group 1 lists cloud-computing platforms without definition)</w:t>
+            </w:r>
+          </w:p>
+        </w:tc>
+      </w:tr>
+      <w:tr>
+        <w:tc>
+          <w:tcPr/>
+          <w:p>
+            <w:pPr>
+              <w:pStyle w:val="Compact"/>
+              <w:jc w:val="left"/>
+            </w:pPr>
+            <w:r>
+              <w:t xml:space="preserve">Malaysia</w:t>
+            </w:r>
+          </w:p>
+        </w:tc>
+        <w:tc>
+          <w:tcPr/>
+          <w:p>
+            <w:pPr>
+              <w:pStyle w:val="Compact"/>
+              <w:jc w:val="left"/>
+            </w:pPr>
+            <w:r>
+              <w:t xml:space="preserve">Eligible (MD: RM50,000 paid-up capital; new activity; audited annual declaration at own cost)</w:t>
+            </w:r>
+          </w:p>
+        </w:tc>
+        <w:tc>
+          <w:tcPr/>
+          <w:p>
+            <w:pPr>
+              <w:pStyle w:val="Compact"/>
+              <w:jc w:val="left"/>
+            </w:pPr>
+            <w:r>
+              <w:t xml:space="preserve">Possibly eligible under the MD track, where cloud is a promoted enabler; unlikely under DESAC, which targets data-centre operators and allows relief on qualifying capital investment excluding land (</w:t>
             </w:r>
             <w:r>
               <w:rPr>
@@ -5326,7 +5472,22 @@
               <w:t xml:space="preserve">VERIFY</w:t>
             </w:r>
             <w:r>
-              <w:t xml:space="preserve">)</w:t>
+              <w:t xml:space="preserve"> </w:t>
+            </w:r>
+            <w:r>
+              <w:t xml:space="preserve">with MDEC)</w:t>
+            </w:r>
+          </w:p>
+        </w:tc>
+        <w:tc>
+          <w:tcPr/>
+          <w:p>
+            <w:pPr>
+              <w:pStyle w:val="Compact"/>
+              <w:jc w:val="left"/>
+            </w:pPr>
+            <w:r>
+              <w:t xml:space="preserve">Eligible to apply under DESAC on the stated conditions: a 1 MW facility falls in the 0.85 MW to 4.25 MW category; RM2.5m paid-up capital; Malaysian staff at RM5,000 a month making up half of manpower; committee approval is discretionary</w:t>
             </w:r>
           </w:p>
         </w:tc>
@@ -5340,31 +5501,34 @@
               <w:jc w:val="left"/>
             </w:pPr>
             <w:r>
-              <w:t xml:space="preserve">Malaysia</w:t>
-            </w:r>
-          </w:p>
-        </w:tc>
-        <w:tc>
-          <w:tcPr/>
-          <w:p>
-            <w:pPr>
-              <w:pStyle w:val="Compact"/>
-              <w:jc w:val="left"/>
-            </w:pPr>
-            <w:r>
-              <w:t xml:space="preserve">Eligible (MD: RM50,000 paid-up capital; new activity; audited annual declaration at own cost)</w:t>
-            </w:r>
-          </w:p>
-        </w:tc>
-        <w:tc>
-          <w:tcPr/>
-          <w:p>
-            <w:pPr>
-              <w:pStyle w:val="Compact"/>
-              <w:jc w:val="left"/>
-            </w:pPr>
-            <w:r>
-              <w:t xml:space="preserve">Possibly eligible under the MD track, where cloud is a promoted enabler; unlikely under DESAC, which targets data-centre operators and allows relief on qualifying capital investment excluding land (</w:t>
+              <w:t xml:space="preserve">Philippines</w:t>
+            </w:r>
+          </w:p>
+        </w:tc>
+        <w:tc>
+          <w:tcPr/>
+          <w:p>
+            <w:pPr>
+              <w:pStyle w:val="Compact"/>
+              <w:jc w:val="left"/>
+            </w:pPr>
+            <w:r>
+              <w:t xml:space="preserve">Eligible on stated conditions if listed (software and SaaS in Tier I; AI services in Tier III), subject to cost-benefit evaluation</w:t>
+            </w:r>
+          </w:p>
+        </w:tc>
+        <w:tc>
+          <w:tcPr/>
+          <w:p>
+            <w:pPr>
+              <w:pStyle w:val="Compact"/>
+              <w:jc w:val="left"/>
+            </w:pPr>
+            <w:r>
+              <w:t xml:space="preserve">Unclear (a reseller on leased colocation is not clearly a hyperscaler or a data centre as the Plan defines it;</w:t>
+            </w:r>
+            <w:r>
+              <w:t xml:space="preserve"> </w:t>
             </w:r>
             <w:r>
               <w:rPr>
@@ -5374,60 +5538,19 @@
               <w:t xml:space="preserve">VERIFY</w:t>
             </w:r>
             <w:r>
-              <w:t xml:space="preserve"> </w:t>
-            </w:r>
-            <w:r>
-              <w:t xml:space="preserve">with MDEC)</w:t>
-            </w:r>
-          </w:p>
-        </w:tc>
-        <w:tc>
-          <w:tcPr/>
-          <w:p>
-            <w:pPr>
-              <w:pStyle w:val="Compact"/>
-              <w:jc w:val="left"/>
-            </w:pPr>
-            <w:r>
-              <w:t xml:space="preserve">Eligible to apply under DESAC on the stated conditions: a 1 MW facility falls in the 0.85 MW to 4.25 MW category; RM2.5m paid-up capital; Malaysian staff at RM5,000 a month making up half of manpower; committee approval is discretionary</w:t>
-            </w:r>
-          </w:p>
-        </w:tc>
-      </w:tr>
-      <w:tr>
-        <w:tc>
-          <w:tcPr/>
-          <w:p>
-            <w:pPr>
-              <w:pStyle w:val="Compact"/>
-              <w:jc w:val="left"/>
-            </w:pPr>
-            <w:r>
-              <w:t xml:space="preserve">Philippines</w:t>
-            </w:r>
-          </w:p>
-        </w:tc>
-        <w:tc>
-          <w:tcPr/>
-          <w:p>
-            <w:pPr>
-              <w:pStyle w:val="Compact"/>
-              <w:jc w:val="left"/>
-            </w:pPr>
-            <w:r>
-              <w:t xml:space="preserve">Eligible on stated conditions, subject to inclusion and evaluation</w:t>
-            </w:r>
-          </w:p>
-        </w:tc>
-        <w:tc>
-          <w:tcPr/>
-          <w:p>
-            <w:pPr>
-              <w:pStyle w:val="Compact"/>
-              <w:jc w:val="left"/>
-            </w:pPr>
-            <w:r>
-              <w:t xml:space="preserve">Unclear (Plan treatment of resale</w:t>
+              <w:t xml:space="preserve">)</w:t>
+            </w:r>
+          </w:p>
+        </w:tc>
+        <w:tc>
+          <w:tcPr/>
+          <w:p>
+            <w:pPr>
+              <w:pStyle w:val="Compact"/>
+              <w:jc w:val="left"/>
+            </w:pPr>
+            <w:r>
+              <w:t xml:space="preserve">Possibly eligible (a colocation facility fits the Plan’s data-centre definition; Tier I if grid-reliant, with no size condition; subject to cost-benefit evaluation;</w:t>
             </w:r>
             <w:r>
               <w:t xml:space="preserve"> </w:t>
@@ -5440,32 +5563,10 @@
               <w:t xml:space="preserve">VERIFY</w:t>
             </w:r>
             <w:r>
-              <w:t xml:space="preserve">)</w:t>
-            </w:r>
-          </w:p>
-        </w:tc>
-        <w:tc>
-          <w:tcPr/>
-          <w:p>
-            <w:pPr>
-              <w:pStyle w:val="Compact"/>
-              <w:jc w:val="left"/>
-            </w:pPr>
-            <w:r>
-              <w:t xml:space="preserve">Unclear (Plan groups data-centre infrastructure with AI; no stated minimum;</w:t>
-            </w:r>
-            <w:r>
               <w:t xml:space="preserve"> </w:t>
             </w:r>
             <w:r>
-              <w:rPr>
-                <w:bCs/>
-                <w:b/>
-              </w:rPr>
-              <w:t xml:space="preserve">VERIFY</w:t>
-            </w:r>
-            <w:r>
-              <w:t xml:space="preserve">)</w:t>
+              <w:t xml:space="preserve">the qualification guidelines)</w:t>
             </w:r>
           </w:p>
         </w:tc>
@@ -5512,7 +5613,7 @@
         <w:pStyle w:val="BodyText"/>
       </w:pPr>
       <w:r>
-        <w:t xml:space="preserve">On this reading, small providers are excluded by capital or capacity from Thai data centres and GPU hosting (Firm C by the 2 MW condition; Firm B if its service is classed as GPU hosting) and from Malaysian data centres, and are admitted on paper, subject to fixed compliance costs, through Thailand’s cloud-service activity and Malaysia’s Digital track. In Vietnam and the Philippines the answer depends on clauses not yet read.</w:t>
+        <w:t xml:space="preserve">On this reading, small providers are excluded by capital or capacity from Thai data centres and GPU hosting (Firm C by the 2 MW condition; Firm B if its service is classed as GPU hosting) and from Malaysian data centres, and are admitted on paper, subject to fixed compliance costs, through Thailand’s cloud-service activity and Malaysia’s Digital track. In Vietnam the answer depends on circulars not yet read, and in the Philippines on the implementing rules and the Plan’s qualification guidelines.</w:t>
       </w:r>
     </w:p>
     <w:p>
@@ -6149,19 +6250,19 @@
               <w:jc w:val="left"/>
             </w:pPr>
             <w:r>
-              <w:t xml:space="preserve">H1 against {H2, H3}: Moderate; rests on the list and Plan readings</w:t>
-            </w:r>
-          </w:p>
-        </w:tc>
-        <w:tc>
-          <w:tcPr/>
-          <w:p>
-            <w:pPr>
-              <w:pStyle w:val="Compact"/>
-              <w:jc w:val="left"/>
-            </w:pPr>
-            <w:r>
-              <w:t xml:space="preserve">The Decision 21/2026 and Plan readings</w:t>
+              <w:t xml:space="preserve">H1 against {H2, H3}: Moderate; rests on Decision 21/2026, Decree 260 and the Act and Plan, with circulars and implementing rules unread</w:t>
+            </w:r>
+          </w:p>
+        </w:tc>
+        <w:tc>
+          <w:tcPr/>
+          <w:p>
+            <w:pPr>
+              <w:pStyle w:val="Compact"/>
+              <w:jc w:val="left"/>
+            </w:pPr>
+            <w:r>
+              <w:t xml:space="preserve">The circulars and the implementing rules</w:t>
             </w:r>
           </w:p>
         </w:tc>
@@ -6359,7 +6460,7 @@
               <w:jc w:val="left"/>
             </w:pPr>
             <w:r>
-              <w:t xml:space="preserve">Uniform firm-scale tiers for all activities (Philippines)</w:t>
+              <w:t xml:space="preserve">Common firm-scale boundary for all activities in the Act (Philippines); activity tiers that name AI and data centres</w:t>
             </w:r>
           </w:p>
         </w:tc>
@@ -6395,31 +6496,31 @@
               <w:jc w:val="left"/>
             </w:pPr>
             <w:r>
-              <w:t xml:space="preserve">E (P3a)</w:t>
-            </w:r>
-          </w:p>
-        </w:tc>
-        <w:tc>
-          <w:tcPr/>
-          <w:p>
-            <w:pPr>
-              <w:pStyle w:val="Compact"/>
-              <w:jc w:val="left"/>
-            </w:pPr>
-            <w:r>
-              <w:t xml:space="preserve">H3 against H1: Moderate; unverified Plan reading</w:t>
-            </w:r>
-          </w:p>
-        </w:tc>
-        <w:tc>
-          <w:tcPr/>
-          <w:p>
-            <w:pPr>
-              <w:pStyle w:val="Compact"/>
-              <w:jc w:val="left"/>
-            </w:pPr>
-            <w:r>
-              <w:t xml:space="preserve">Pre-AI instruments with the same tiers</w:t>
+              <w:t xml:space="preserve">E (P3a) for the boundary; U for the tiers, which name AI</w:t>
+            </w:r>
+          </w:p>
+        </w:tc>
+        <w:tc>
+          <w:tcPr/>
+          <w:p>
+            <w:pPr>
+              <w:pStyle w:val="Compact"/>
+              <w:jc w:val="left"/>
+            </w:pPr>
+            <w:r>
+              <w:t xml:space="preserve">H3 against H1: Weak to Moderate; Act and Plan read, implementing rules unread</w:t>
+            </w:r>
+          </w:p>
+        </w:tc>
+        <w:tc>
+          <w:tcPr/>
+          <w:p>
+            <w:pPr>
+              <w:pStyle w:val="Compact"/>
+              <w:jc w:val="left"/>
+            </w:pPr>
+            <w:r>
+              <w:t xml:space="preserve">Pre-AI instruments with the same boundary; implementing rules</w:t>
             </w:r>
           </w:p>
         </w:tc>
@@ -6878,7 +6979,7 @@
         <w:pStyle w:val="BodyText"/>
       </w:pPr>
       <w:r>
-        <w:t xml:space="preserve">Four results follow. First, cost explains the height of Thailand’s threshold (E1), and the data cannot distinguish a design reading from it on that point. Second, thresholds are not forced by cost: Vietnam and the Philippines state none at the compute layers (E4, E7), and Malaysia admits cloud activity at RM50,000 of paid-up capital on a separate track (E2). Third, H1 is also unexpected for design features that cost cannot generate: a sales-based extension of the exemption (E5), fixed certification and audit costs on the low-capital cloud routes (E6, E11) and research-intensity ratios that fall with firm size (E12), all verified against the primary texts, with the sizes of the costs still unmeasured. Fourth, E8 is unexpected under all three hypotheses. A deliberate startup track fits none of them, which shows that these governments can and do design for new firms, and limits H2 as a general account. H2 and H3 remain difficult to separate: E3, E5 and E6 are expected or compatible under both, and only E7 favours H3 clearly.</w:t>
+        <w:t xml:space="preserve">Four results follow. First, cost explains the height of Thailand’s threshold (E1), and the data cannot distinguish a design reading from it on that point. Second, thresholds are not forced by cost: Vietnam and the Philippines state none at the compute layers (E4), and Malaysia admits cloud activity at RM50,000 of paid-up capital on a separate track (E2). Third, H1 is also unexpected for design features that cost cannot generate: a sales-based extension of the exemption (E5), fixed certification and audit costs on the low-capital cloud routes (E6, E11) and research-intensity ratios that fall with firm size (E12), all verified against the primary texts, with the sizes of the costs still unmeasured. Fourth, E8 is unexpected under all three hypotheses. A deliberate startup track fits none of them, which shows that these governments can and do design for new firms, and limits H2 as a general account. H2 and H3 remain difficult to separate: E3, E5 and E6 are expected or compatible under both, and only E7, and only partly, favours H3.</w:t>
       </w:r>
     </w:p>
     <w:p>
@@ -7838,7 +7939,7 @@
         <w:pStyle w:val="FirstParagraph"/>
       </w:pPr>
       <w:r>
-        <w:t xml:space="preserve">This paper asked where four Southeast Asian incentive systems screen entrants to the AI industry. All four make application development accessible on the stated thresholds, and Vietnam adds a startup track with direct equity access. Above that layer they use four architectures. Thailand gates data centres by capacity (at least 2 MW) and GPU hosting by capital, 1.7 to 3.0 orders of magnitude above one server, while cloud services carry certification conditions in place of capital. Malaysia runs a low-capital digital track that covers cloud beside a data-centre track whose smallest recognised category is 0.85 MW. Vietnam ranks technologies by priority and states no capital rule. The Philippines applies the same inclusion and firm-scale rules to every activity. No instrument we coded is aimed at compute provision below facility scale. Cost explains the height of Thailand’s gate, but it does not explain why Vietnam and the Philippines need no capital gate, why Malaysia can run a low-capital cloud track, or why Thailand’s research tier presupposes a sales base.</w:t>
+        <w:t xml:space="preserve">This paper asked where four Southeast Asian incentive systems screen entrants to the AI industry. All four make application development accessible on the stated thresholds, and Vietnam adds a startup track with direct equity access. Above that layer they use four architectures. Thailand gates data centres by capacity (at least 2 MW) and GPU hosting by capital, 1.7 to 3.0 orders of magnitude above one server, while cloud services carry certification conditions in place of capital. Malaysia runs a low-capital digital track that covers cloud beside a data-centre track whose smallest recognised category is 0.85 MW. Vietnam lists strategic technologies and products without ranking them and states no capital rule. The Philippines lists activities by tier and applies one firm-scale boundary to every activity. No instrument we coded is aimed at compute provision below facility scale. Cost explains the height of Thailand’s gate, but it does not explain why Vietnam and the Philippines need no capital gate, why Malaysia can run a low-capital cloud track, or why Thailand’s research tier presupposes a sales base.</w:t>
       </w:r>
     </w:p>
     <w:p>
@@ -9022,6 +9123,30 @@
       </w:r>
       <w:r>
         <w:t xml:space="preserve">(FIRB Advisory No. 001-2025). FIRB.</w:t>
+      </w:r>
+    </w:p>
+    <w:p>
+      <w:pPr>
+        <w:pStyle w:val="BodyText"/>
+      </w:pPr>
+      <w:r>
+        <w:t xml:space="preserve">Philippines, Office of the President. (2026).</w:t>
+      </w:r>
+      <w:r>
+        <w:t xml:space="preserve"> </w:t>
+      </w:r>
+      <w:r>
+        <w:rPr>
+          <w:iCs/>
+          <w:i/>
+        </w:rPr>
+        <w:t xml:space="preserve">Memorandum Order No. 47: Approving the 2026 Strategic Investment Priority Plan</w:t>
+      </w:r>
+      <w:r>
+        <w:t xml:space="preserve"> </w:t>
+      </w:r>
+      <w:r>
+        <w:t xml:space="preserve">(21 May 2026). Malacañang.</w:t>
       </w:r>
     </w:p>
     <w:p>

</xml_diff>

<commit_message>
Read implementing rules of RA 12066; replace advisory reference, update Philippine section and tables
</commit_message>
<xml_diff>
--- a/revision/02_revised_manuscript.docx
+++ b/revision/02_revised_manuscript.docx
@@ -1150,7 +1150,7 @@
         <w:pStyle w:val="FirstParagraph"/>
       </w:pPr>
       <w:r>
-        <w:t xml:space="preserve">We code primary legal and regulatory texts, not strategy documents or commentary: Thailand’s Board of Investment announcements and Investment Promotion Guide; Vietnam’s Decree 260/2026 implementing the Law on High Technology and Decision 21/2026 on strategic technologies; Malaysia’s Malaysia Digital tax-incentive guidelines and the Digital Ecosystem Acceleration (DESAC) scheme guidelines; and the Philippines’ CREATE MORE Act with the 2026 Strategic Investment Priority Plan (its implementing rules are not yet read). Table 1 lists each source with its issuing body, date, access route and the amendment check described below.</w:t>
+        <w:t xml:space="preserve">We code primary legal and regulatory texts, not strategy documents or commentary: Thailand’s Board of Investment announcements and Investment Promotion Guide; Vietnam’s Decree 260/2026 implementing the Law on High Technology and Decision 21/2026 on strategic technologies; Malaysia’s Malaysia Digital tax-incentive guidelines and the Digital Ecosystem Acceleration (DESAC) scheme guidelines; and the Philippines’ CREATE MORE Act with the 2026 Strategic Investment Priority Plan and its implementing rules and regulations. Table 1 lists each source with its issuing body, date, access route and the amendment check described below.</w:t>
       </w:r>
     </w:p>
     <w:p>
@@ -1597,31 +1597,31 @@
               <w:jc w:val="left"/>
             </w:pPr>
             <w:r>
-              <w:t xml:space="preserve">Republic Act 12066 (CREATE MORE), signed 11 November 2024; Memorandum Order 47 of 21 May 2026 approving the 2026 SIPP; FIRB Advisory 001-2025</w:t>
-            </w:r>
-          </w:p>
-        </w:tc>
-        <w:tc>
-          <w:tcPr/>
-          <w:p>
-            <w:pPr>
-              <w:pStyle w:val="Compact"/>
-              <w:jc w:val="left"/>
-            </w:pPr>
-            <w:r>
-              <w:t xml:space="preserve">Congress; Office of the President; FIRB</w:t>
-            </w:r>
-          </w:p>
-        </w:tc>
-        <w:tc>
-          <w:tcPr/>
-          <w:p>
-            <w:pPr>
-              <w:pStyle w:val="Compact"/>
-              <w:jc w:val="left"/>
-            </w:pPr>
-            <w:r>
-              <w:t xml:space="preserve">Act 2024; SIPP 2026</w:t>
+              <w:t xml:space="preserve">Republic Act 12066 (CREATE MORE), signed 11 November 2024; implementing rules and regulations of Title XIII of the Tax Code (signed 17 February 2025, in force 20 February 2025, circularized by FIRB Advisory 001-2025); Memorandum Order 47 of 21 May 2026 approving the 2026 SIPP</w:t>
+            </w:r>
+          </w:p>
+        </w:tc>
+        <w:tc>
+          <w:tcPr/>
+          <w:p>
+            <w:pPr>
+              <w:pStyle w:val="Compact"/>
+              <w:jc w:val="left"/>
+            </w:pPr>
+            <w:r>
+              <w:t xml:space="preserve">Congress; Department of Finance and Department of Trade and Industry; Office of the President</w:t>
+            </w:r>
+          </w:p>
+        </w:tc>
+        <w:tc>
+          <w:tcPr/>
+          <w:p>
+            <w:pPr>
+              <w:pStyle w:val="Compact"/>
+              <w:jc w:val="left"/>
+            </w:pPr>
+            <w:r>
+              <w:t xml:space="preserve">Act 2024; rules February 2025; SIPP 2026</w:t>
             </w:r>
           </w:p>
         </w:tc>
@@ -1645,19 +1645,19 @@
               <w:jc w:val="left"/>
             </w:pPr>
             <w:r>
-              <w:t xml:space="preserve">Act and Memorandum Order read 9 October 2026 for this draft (authors to confirm); FIRB Advisory 001-2025 not read</w:t>
-            </w:r>
-          </w:p>
-        </w:tc>
-        <w:tc>
-          <w:tcPr/>
-          <w:p>
-            <w:pPr>
-              <w:pStyle w:val="Compact"/>
-              <w:jc w:val="left"/>
-            </w:pPr>
-            <w:r>
-              <w:t xml:space="preserve">Implementing rules, FIRB Advisory 001-2025 and the SIPP qualification guidelines not yet read (</w:t>
+              <w:t xml:space="preserve">All three read in full 9 October 2026 for this draft (authors to confirm)</w:t>
+            </w:r>
+          </w:p>
+        </w:tc>
+        <w:tc>
+          <w:tcPr/>
+          <w:p>
+            <w:pPr>
+              <w:pStyle w:val="Compact"/>
+              <w:jc w:val="left"/>
+            </w:pPr>
+            <w:r>
+              <w:t xml:space="preserve">FIRB Advisory 009-2026 circularizing the 2026 SIPP identified; the SIPP qualification guidelines and the FIRB’s published amendments not yet read (</w:t>
             </w:r>
             <w:r>
               <w:rPr>
@@ -2819,20 +2819,7 @@
         <w:pStyle w:val="FirstParagraph"/>
       </w:pPr>
       <w:r>
-        <w:t xml:space="preserve">The Philippine architecture rests on the CREATE MORE Act (Republic Act 12066, 2024), which amends the National Internal Revenue Code, and on the 2026 Strategic Investment Priority Plan (SIPP), approved by Memorandum Order 47 of 21 May 2026 (Philippines, 2024; Philippines, Office of the President, 2026). Under the Act, tax incentives go only to the extent of a registered project or activity listed in the SIPP, which assigns activities to three tiers by national industrial strategy. An application for incentives must be accompanied by a cost-benefit analysis prepared under methods prescribed by the Fiscal Incentives Review Board (FIRB). The Act states no minimum investment for ordinary registration. Whether the implementing rules add one has not been checked</w:t>
-      </w:r>
-      <w:r>
-        <w:t xml:space="preserve"> </w:t>
-      </w:r>
-      <w:r>
-        <w:rPr>
-          <w:bCs/>
-          <w:b/>
-        </w:rPr>
-        <w:t xml:space="preserve">[PENDING: implementing rules and FIRB Advisory 001-2025 (Philippines, Fiscal Incentives Review Board, 2025), not yet read]</w:t>
-      </w:r>
-      <w:r>
-        <w:t xml:space="preserve">. Application-layer support is therefore accessible on the stated conditions, but it is subject to listing and to a discretionary evaluation.</w:t>
+        <w:t xml:space="preserve">The Philippine architecture rests on the CREATE MORE Act (Republic Act 12066, 2024), which amends the National Internal Revenue Code, and on the 2026 Strategic Investment Priority Plan (SIPP), approved by Memorandum Order 47 of 21 May 2026 (Philippines, 2024; Philippines, Office of the President, 2026). Under the Act, tax incentives go only to the extent of a registered project or activity listed in the SIPP, which assigns activities to three tiers by national industrial strategy. An application for incentives must be accompanied by a cost-benefit analysis prepared under methods prescribed by the Fiscal Incentives Review Board (FIRB). Neither the Act nor the implementing rules state a minimum investment for registration (Philippines, Department of Finance and Department of Trade and Industry, 2025). The rules give the investment promotion agency exclusive jurisdiction to register any listed project regardless of its capital, require the applicant to satisfy the Plan’s qualifications, ownership rules and corporate powers, and require documents that include the latest audited financial statements where applicable, projected financial statements without incentives and a projected tax payment schedule for the whole incentive period. The agency compares the projected cost of incentives with the projected taxes paid, and a negative preliminary ratio does not by itself disqualify the applicant. The documentation is a fixed cost of the kind we record under compliance. Application-layer support is therefore accessible on the stated conditions, but it is subject to listing and to a discretionary evaluation.</w:t>
       </w:r>
     </w:p>
     <w:p>
@@ -2850,7 +2837,7 @@
           <w:bCs/>
           <w:b/>
         </w:rPr>
-        <w:t xml:space="preserve">[VERIFY: whether guidelines have been issued]</w:t>
+        <w:t xml:space="preserve">[VERIFY: whether guidelines have been issued; FIRB Advisory 009-2026 circularizes the Plan]</w:t>
       </w:r>
       <w:r>
         <w:t xml:space="preserve">.</w:t>
@@ -3301,17 +3288,7 @@
               <w:jc w:val="left"/>
             </w:pPr>
             <w:r>
-              <w:t xml:space="preserve">None identified in the Act or the 2026 SIPP (</w:t>
-            </w:r>
-            <w:r>
-              <w:rPr>
-                <w:bCs/>
-                <w:b/>
-              </w:rPr>
-              <w:t xml:space="preserve">PENDING</w:t>
-            </w:r>
-            <w:r>
-              <w:t xml:space="preserve">: implementing rules)</w:t>
+              <w:t xml:space="preserve">None identified in the Act, the implementing rules or the 2026 SIPP</w:t>
             </w:r>
           </w:p>
         </w:tc>
@@ -5566,7 +5543,7 @@
               <w:t xml:space="preserve"> </w:t>
             </w:r>
             <w:r>
-              <w:t xml:space="preserve">the qualification guidelines)</w:t>
+              <w:t xml:space="preserve">the qualification guidelines; the implementing rules add no size condition)</w:t>
             </w:r>
           </w:p>
         </w:tc>
@@ -5613,7 +5590,7 @@
         <w:pStyle w:val="BodyText"/>
       </w:pPr>
       <w:r>
-        <w:t xml:space="preserve">On this reading, small providers are excluded by capital or capacity from Thai data centres and GPU hosting (Firm C by the 2 MW condition; Firm B if its service is classed as GPU hosting) and from Malaysian data centres, and are admitted on paper, subject to fixed compliance costs, through Thailand’s cloud-service activity and Malaysia’s Digital track. In Vietnam the answer depends on circulars not yet read, and in the Philippines on the implementing rules and the Plan’s qualification guidelines.</w:t>
+        <w:t xml:space="preserve">On this reading, small providers are excluded by capital or capacity from Thai data centres and GPU hosting (Firm C by the 2 MW condition; Firm B if its service is classed as GPU hosting) and from Malaysian data centres, and are admitted on paper, subject to fixed compliance costs, through Thailand’s cloud-service activity and Malaysia’s Digital track. In Vietnam the answer depends on circulars not yet read, and in the Philippines on the Plan’s qualification guidelines.</w:t>
       </w:r>
     </w:p>
     <w:p>
@@ -6250,19 +6227,19 @@
               <w:jc w:val="left"/>
             </w:pPr>
             <w:r>
-              <w:t xml:space="preserve">H1 against {H2, H3}: Moderate; rests on Decision 21/2026, Decree 260 and the Act and Plan, with circulars and implementing rules unread</w:t>
-            </w:r>
-          </w:p>
-        </w:tc>
-        <w:tc>
-          <w:tcPr/>
-          <w:p>
-            <w:pPr>
-              <w:pStyle w:val="Compact"/>
-              <w:jc w:val="left"/>
-            </w:pPr>
-            <w:r>
-              <w:t xml:space="preserve">The circulars and the implementing rules</w:t>
+              <w:t xml:space="preserve">H1 against {H2, H3}: Moderate; rests on Decision 21/2026, Decree 260 and the Act and Plan, with the Vietnamese circulars and the Philippine qualification guidelines unread</w:t>
+            </w:r>
+          </w:p>
+        </w:tc>
+        <w:tc>
+          <w:tcPr/>
+          <w:p>
+            <w:pPr>
+              <w:pStyle w:val="Compact"/>
+              <w:jc w:val="left"/>
+            </w:pPr>
+            <w:r>
+              <w:t xml:space="preserve">The circulars and the guidelines</w:t>
             </w:r>
           </w:p>
         </w:tc>
@@ -6508,19 +6485,19 @@
               <w:jc w:val="left"/>
             </w:pPr>
             <w:r>
-              <w:t xml:space="preserve">H3 against H1: Weak to Moderate; Act and Plan read, implementing rules unread</w:t>
-            </w:r>
-          </w:p>
-        </w:tc>
-        <w:tc>
-          <w:tcPr/>
-          <w:p>
-            <w:pPr>
-              <w:pStyle w:val="Compact"/>
-              <w:jc w:val="left"/>
-            </w:pPr>
-            <w:r>
-              <w:t xml:space="preserve">Pre-AI instruments with the same boundary; implementing rules</w:t>
+              <w:t xml:space="preserve">H3 against H1: Weak to Moderate; Act, implementing rules and Plan read</w:t>
+            </w:r>
+          </w:p>
+        </w:tc>
+        <w:tc>
+          <w:tcPr/>
+          <w:p>
+            <w:pPr>
+              <w:pStyle w:val="Compact"/>
+              <w:jc w:val="left"/>
+            </w:pPr>
+            <w:r>
+              <w:t xml:space="preserve">Pre-AI instruments with the same boundary; Plan guidelines</w:t>
             </w:r>
           </w:p>
         </w:tc>
@@ -9106,7 +9083,7 @@
         <w:pStyle w:val="BodyText"/>
       </w:pPr>
       <w:r>
-        <w:t xml:space="preserve">Philippines, Fiscal Incentives Review Board. (2025).</w:t>
+        <w:t xml:space="preserve">Philippines, Department of Finance, &amp; Department of Trade and Industry. (2025).</w:t>
       </w:r>
       <w:r>
         <w:t xml:space="preserve"> </w:t>
@@ -9122,7 +9099,7 @@
         <w:t xml:space="preserve"> </w:t>
       </w:r>
       <w:r>
-        <w:t xml:space="preserve">(FIRB Advisory No. 001-2025). FIRB.</w:t>
+        <w:t xml:space="preserve">(signed 17 February 2025; circularized by FIRB Advisory No. 001-2025). Fiscal Incentives Review Board.</w:t>
       </w:r>
     </w:p>
     <w:p>

</xml_diff>

<commit_message>
Rewrite supporting information to 29 instruments with corrected coding; update manuscript counts, blind coding sheet and data pack
</commit_message>
<xml_diff>
--- a/revision/02_revised_manuscript.docx
+++ b/revision/02_revised_manuscript.docx
@@ -244,7 +244,7 @@
         <w:pStyle w:val="FirstParagraph"/>
       </w:pPr>
       <w:r>
-        <w:t xml:space="preserve">Southeast Asian governments have made artificial intelligence (AI) a pillar of industrial policy, but little is known about which firms their incentive instruments let in. We code about 20 instruments from the primary legal texts of Thailand, Vietnam, Malaysia and the Philippines on five dimensions, place explicit thresholds on a common cost scale, and ask where each system screens entrants to the AI technology stack and whether cost necessity, scale-favouring design or administrative habit better explains the pattern. The four systems use four architectures: capital-gated activities (Thailand), two parallel tracks (Malaysia), a strategic-technology list without capital rules (Vietnam) and activity tiers with a common firm-scale boundary (the Philippines). On the stated thresholds all four make application-layer support accessible to small firms. Thailand sets capital and capacity gates at GPU data hosting (two and a half to three orders of magnitude above the capital needed to host one server) and at data centres (at least 2 MW), while its cloud-service activity has no capital condition. Malaysia pairs a low-capital digital track that covers cloud services with a data-centre track whose smallest recognised category is 0.85 MW. Where small cloud providers can enter on paper, in Thailand and Malaysia, the screen is a fixed compliance cost. Vietnam and the Philippines state no capital rule at the compute layers, so their screens lie in designation, listing and discretion. We found no instrument aimed at compute provision below facility scale, but low-capital cloud routes exist. Cost benchmarks explain the height of Thailand’s gate, not the pattern across the four. The evidence concerns legal eligibility, not realised access, and does not show that a middle-technology trap exists.</w:t>
+        <w:t xml:space="preserve">Southeast Asian governments have made artificial intelligence (AI) a pillar of industrial policy, but little is known about which firms their incentive instruments let in. We code 29 instruments from the primary legal texts of Thailand, Vietnam, Malaysia and the Philippines on five dimensions, place explicit thresholds on a common cost scale, and ask where each system screens entrants to the AI technology stack and whether cost necessity, scale-favouring design or administrative habit better explains the pattern. The four systems use four architectures: capital-gated activities (Thailand), two parallel tracks (Malaysia), a strategic-technology list without capital rules (Vietnam) and activity tiers with a common firm-scale boundary (the Philippines). On the stated thresholds all four make application-layer support accessible to small firms. Thailand sets capital and capacity gates at GPU data hosting (two and a half to three orders of magnitude above the capital needed to host one server) and at data centres (at least 2 MW), while its cloud-service activity has no capital condition. Malaysia pairs a low-capital digital track that covers cloud services with a data-centre track whose smallest recognised category is 0.85 MW. Where small cloud providers can enter on paper, in Thailand and Malaysia, the screen is a fixed compliance cost. Vietnam and the Philippines state no capital rule at the compute layers, so their screens lie in designation, listing and discretion. We found no instrument aimed at compute provision below facility scale, but low-capital cloud routes exist. Cost benchmarks explain the height of Thailand’s gate, not the pattern across the four. The evidence concerns legal eligibility, not realised access, and does not show that a middle-technology trap exists.</w:t>
       </w:r>
     </w:p>
     <w:p>
@@ -1709,7 +1709,7 @@
         <w:pStyle w:val="FirstParagraph"/>
       </w:pPr>
       <w:r>
-        <w:t xml:space="preserve">The unit of analysis is the instrument, a specific exemption, grant or eligibility rule, not the strategy document. Twenty instruments were coded across the four countries (Supporting Information, Table S1); five of them (SI rows 5, 6, 18, 19 and 20) are cross-cutting rules that apply beyond AI. Each is coded on five dimensions:</w:t>
+        <w:t xml:space="preserve">The unit of analysis is the instrument, a specific exemption, grant or eligibility rule, not the strategy document. Twenty-nine instruments were coded across the four countries (Supporting Information, Table S1); eight of them (SI rows 3, 5, 6, 18, 19, 20, 25 and 26) are cross-cutting rules that apply beyond AI. Each is coded on five dimensions:</w:t>
       </w:r>
       <w:r>
         <w:t xml:space="preserve"> </w:t>
@@ -1853,7 +1853,7 @@
           <w:bCs/>
           <w:b/>
         </w:rPr>
-        <w:t xml:space="preserve">[PENDING: inter-coder reliability. A second coder will code all 20 instruments independently, blind to the first coder’s codes, using Appendix A. We will report percentage agreement and Cohen’s kappa (Cohen, 1960) per dimension, with Krippendorff’s alpha (Krippendorff, 2018) as a check given the small number of units, report agreement before and after discussion, and log every resolved disagreement. Layer assignment has already changed once (SI row 12) and the accommodation coding in the first matrix did not follow the codebook, so agreement may be low on those two dimensions. Replace this paragraph with the results.]</w:t>
+        <w:t xml:space="preserve">[PENDING: inter-coder reliability. A second coder will code all 29 instruments independently, blind to the first coder’s codes, using Appendix A. We will report percentage agreement and Cohen’s kappa (Cohen, 1960) per dimension, with Krippendorff’s alpha (Krippendorff, 2018) as a check given the small number of units, report agreement before and after discussion, and log every resolved disagreement. Layer assignment has already changed once (SI row 12, now recoded to layer (i)) and the accommodation coding in the first matrix did not follow the codebook, so agreement may be low on those two dimensions. Replace this paragraph with the results.]</w:t>
       </w:r>
     </w:p>
     <w:p>
@@ -1875,7 +1875,7 @@
           <w:bCs/>
           <w:b/>
         </w:rPr>
-        <w:t xml:space="preserve">[PENDING: every figure in Table 3 and Supporting Information Table S1 is to be re-checked against the primary text, with the date of checking recorded. At the time of drafting, 14 of the 20 instrument rows were marked as not independently re-verified, including all Thai and Malaysian rows. Replace this paragraph with the result.]</w:t>
+        <w:t xml:space="preserve">[PENDING: every figure in Table 3 and Supporting Information Table S1 is to be re-checked against the primary text, with the date of checking recorded. All 29 rows were checked by the first coder against the cited primary texts on 9 October 2026, and the Vietnamese texts were read through a commercial legal database, not the official gazette. Replace this paragraph with the independent check, including the Thai originals, the Vietnamese circulars and the Philippine qualification guidelines.]</w:t>
       </w:r>
     </w:p>
     <w:p>
@@ -3756,7 +3756,7 @@
         <w:t xml:space="preserve">[PENDING: dates]</w:t>
       </w:r>
       <w:r>
-        <w:t xml:space="preserve">. Constructed from the primary documents in Table 1. Layers (ii) and (iii) are coded together because several instruments do not distinguish them. The coding matrix coded Thai, Malaysian and Philippine accommodation Yes or Implicit where the threshold was low. Appendix A codes only explicit provisions, and SI rows 1, 2, 14 and 18 are to be recoded. DESAC = Digital Ecosystem Acceleration scheme; FIRB = Fiscal Incentives Review Board.</w:t>
+        <w:t xml:space="preserve">. Constructed from the primary documents in Table 1. Layers (ii) and (iii) are coded together because several instruments do not distinguish them. The coding matrix coded Thai, Malaysian and Philippine accommodation Yes or Implicit where the threshold was low. Appendix A codes only explicit provisions, and SI rows 1, 2, 14 and 18 have been recoded accordingly in Table S1. DESAC = Digital Ecosystem Acceleration scheme; FIRB = Fiscal Incentives Review Board.</w:t>
       </w:r>
     </w:p>
     <w:p>
@@ -7702,7 +7702,7 @@
         <w:t xml:space="preserve"> </w:t>
       </w:r>
       <w:r>
-        <w:t xml:space="preserve">The coding has not been checked by a second coder, 14 of 20 rows have not been re-verified against the primary text, and the amendment check is incomplete.</w:t>
+        <w:t xml:space="preserve">The coding has not been checked by a second coder, the 29 rows have been checked by one coder against English or database texts and not independently, and the amendment check is incomplete.</w:t>
       </w:r>
       <w:r>
         <w:t xml:space="preserve"> </w:t>

</xml_diff>